<commit_message>
Fix the FLA title and opening for a step-by-step reading copy
Drop names and Chinese characters from the manuscript, use a short no-colon title, and rebuild only manuscript.docx.

Co-authored-by: kristinehina23-rgb <kristinehina23-rgb@users.noreply.github.com>
</commit_message>
<xml_diff>
--- a/papers/q1-masters-covid/word/manuscript.docx
+++ b/papers/q1-masters-covid/word/manuscript.docx
@@ -2,13 +2,13 @@
 <file path=word/document.xml><?xml version="1.0" encoding="utf-8"?>
 <w:document xmlns:w="http://schemas.openxmlformats.org/wordprocessingml/2006/main" xmlns:m="http://schemas.openxmlformats.org/officeDocument/2006/math" xmlns:r="http://schemas.openxmlformats.org/officeDocument/2006/relationships" xmlns:o="urn:schemas-microsoft-com:office:office" xmlns:v="urn:schemas-microsoft-com:vml" xmlns:w10="urn:schemas-microsoft-com:office:word" xmlns:a="http://schemas.openxmlformats.org/drawingml/2006/main" xmlns:pic="http://schemas.openxmlformats.org/drawingml/2006/picture" xmlns:wp="http://schemas.openxmlformats.org/drawingml/2006/wordprocessingDrawing">
   <w:body>
-    <w:bookmarkStart w:id="51" w:name="Xfe8d4829385d4367282f3ebdb9ea45ec57d310c"/>
+    <w:bookmarkStart w:id="51" w:name="X93c39fec4510a5d3ad14aecff5d2131a9fc6cdc"/>
     <w:p>
       <w:pPr>
         <w:pStyle w:val="Heading1"/>
       </w:pPr>
       <w:r>
-        <w:t xml:space="preserve">Household infrastructure and platform access in online Chinese teaching: Localization of delivery in a travelling course</w:t>
+        <w:t xml:space="preserve">Home conditions and platform access for online Chinese learners</w:t>
       </w:r>
     </w:p>
     <w:p>
@@ -26,133 +26,7 @@
         <w:t xml:space="preserve"> </w:t>
       </w:r>
       <w:r>
-        <w:t xml:space="preserve">Online Chinese teaching: household and platform access</w:t>
-      </w:r>
-    </w:p>
-    <w:p>
-      <w:pPr>
-        <w:pStyle w:val="BodyText"/>
-      </w:pPr>
-      <w:r>
-        <w:t xml:space="preserve">Heena Rathore (corresponding author)</w:t>
-      </w:r>
-      <w:r>
-        <w:br/>
-      </w:r>
-      <w:r>
-        <w:t xml:space="preserve">PhD student, School of Foreign Languages, Sun Yat-sen University, Guangzhou, China</w:t>
-      </w:r>
-      <w:r>
-        <w:br/>
-      </w:r>
-      <w:r>
-        <w:t xml:space="preserve">Email: kristine_2020@qq.com</w:t>
-      </w:r>
-    </w:p>
-    <w:p>
-      <w:pPr>
-        <w:pStyle w:val="BodyText"/>
-      </w:pPr>
-      <w:r>
-        <w:t xml:space="preserve">Cao Huimin</w:t>
-      </w:r>
-      <w:r>
-        <w:br/>
-      </w:r>
-      <w:r>
-        <w:t xml:space="preserve">Institute for International Communication of Chinese Culture, Beijing Foreign Studies University, Beijing, China</w:t>
-      </w:r>
-    </w:p>
-    <w:p>
-      <w:pPr>
-        <w:pStyle w:val="BodyText"/>
-      </w:pPr>
-      <w:r>
-        <w:t xml:space="preserve">Xu Yiru (徐翌茹)</w:t>
-      </w:r>
-      <w:r>
-        <w:br/>
-      </w:r>
-      <w:r>
-        <w:t xml:space="preserve">School of Foreign Languages, Sun Yat-sen University, Guangzhou, China</w:t>
-      </w:r>
-      <w:r>
-        <w:br/>
-      </w:r>
-      <w:r>
-        <w:t xml:space="preserve">Email: xuyiru@mail.sysu.edu.cn</w:t>
-      </w:r>
-    </w:p>
-    <w:p>
-      <w:pPr>
-        <w:pStyle w:val="BodyText"/>
-      </w:pPr>
-      <w:r>
-        <w:rPr>
-          <w:bCs/>
-          <w:b/>
-        </w:rPr>
-        <w:t xml:space="preserve">Acknowledgments.</w:t>
-      </w:r>
-      <w:r>
-        <w:t xml:space="preserve"> </w:t>
-      </w:r>
-      <w:r>
-        <w:t xml:space="preserve">Data were collected while the first author was an M.Phil. scholar at the School of International Cultural Exchange, Central China Normal University. We thank the students who took part.</w:t>
-      </w:r>
-    </w:p>
-    <w:p>
-      <w:pPr>
-        <w:pStyle w:val="BodyText"/>
-      </w:pPr>
-      <w:r>
-        <w:rPr>
-          <w:bCs/>
-          <w:b/>
-        </w:rPr>
-        <w:t xml:space="preserve">Conflict of interest.</w:t>
-      </w:r>
-      <w:r>
-        <w:t xml:space="preserve"> </w:t>
-      </w:r>
-      <w:r>
-        <w:t xml:space="preserve">The authors declare no conflict of interest.</w:t>
-      </w:r>
-    </w:p>
-    <w:p>
-      <w:pPr>
-        <w:pStyle w:val="BodyText"/>
-      </w:pPr>
-      <w:r>
-        <w:rPr>
-          <w:bCs/>
-          <w:b/>
-        </w:rPr>
-        <w:t xml:space="preserve">Funding.</w:t>
-      </w:r>
-      <w:r>
-        <w:t xml:space="preserve"> </w:t>
-      </w:r>
-      <w:r>
-        <w:t xml:space="preserve">None.</w:t>
-      </w:r>
-    </w:p>
-    <w:p>
-      <w:pPr>
-        <w:pStyle w:val="BodyText"/>
-      </w:pPr>
-      <w:r>
-        <w:rPr>
-          <w:bCs/>
-          <w:b/>
-        </w:rPr>
-        <w:t xml:space="preserve">Data availability.</w:t>
-      </w:r>
-      <w:r>
-        <w:t xml:space="preserve"> </w:t>
-      </w:r>
-      <w:r>
-        <w:t xml:space="preserve">A de-identified analytical dataset, codebook, and analysis syntax are available in a public repository. Variables that could increase re-identification risk in this small convenience sample have been removed or coarsened. Files containing names, IP addresses, timestamps, or device identifiers will not be shared.</w:t>
+        <w:t xml:space="preserve">Home and platform access</w:t>
       </w:r>
     </w:p>
     <w:bookmarkStart w:id="20" w:name="abstract"/>
@@ -169,43 +43,7 @@
         <w:pStyle w:val="FirstParagraph"/>
       </w:pPr>
       <w:r>
-        <w:t xml:space="preserve">Online Chinese teaching can fail as delivery: content may remain appropriate while the class is closed if household power, network speed, or platform access does not support the required timetable, platforms, oral tasks, and assessment. The study proposes localization of delivery—the fit of time, platform, task, participation mode, and assessment to the receiving context—as a distinct layer of localization work for a travelling online Chinese course. A Chinese-language questionnaire asked 38 self-selected respondents (37 selected Pakistani nationality) about those learner-side conditions. Unstable networks and power interruptions were common. Home affecting study</w:t>
-      </w:r>
-      <w:r>
-        <w:t xml:space="preserve"> </w:t>
-      </w:r>
-      <w:r>
-        <w:t xml:space="preserve">“</w:t>
-      </w:r>
-      <w:r>
-        <w:t xml:space="preserve">very much</w:t>
-      </w:r>
-      <w:r>
-        <w:t xml:space="preserve">”</w:t>
-      </w:r>
-      <w:r>
-        <w:t xml:space="preserve"> </w:t>
-      </w:r>
-      <w:r>
-        <w:t xml:space="preserve">co-occurred with</w:t>
-      </w:r>
-      <w:r>
-        <w:t xml:space="preserve"> </w:t>
-      </w:r>
-      <w:r>
-        <w:t xml:space="preserve">“</w:t>
-      </w:r>
-      <w:r>
-        <w:t xml:space="preserve">very high stress,</w:t>
-      </w:r>
-      <w:r>
-        <w:t xml:space="preserve">”</w:t>
-      </w:r>
-      <w:r>
-        <w:t xml:space="preserve"> </w:t>
-      </w:r>
-      <w:r>
-        <w:t xml:space="preserve">and worse reported internet speed was associated with a more negative appraisal of online learning. QQ and Chaoxing were often marked unusable; Zoom and WhatsApp were more often marked available. Findings are exploratory and specific to a small convenience sample during emergency remote teaching; they are not evidence about current hybrid practice.</w:t>
+        <w:t xml:space="preserve">An online Chinese course can keep its hours, platforms, oral tasks, and tests, and still be a course learners cannot take. If home power, network speed, or a required application does not support those arrangements, the content may still be sound while the class is closed. Thirty-eight people who said they were taking online Chinese courses completed a questionnaire written in Chinese. Thirty-seven selected Pakistani nationality. Unstable networks and power interruptions were common. Respondents who said home conditions affected study very much also more often selected very high stress. Worse reported internet speed went with a more negative view of online learning. QQ and Chaoxing were often marked unusable. Zoom and WhatsApp were more often marked available. The sample is small. The questionnaires were collected in February 2022, during emergency remote teaching, so the results do not describe current hybrid practice.</w:t>
       </w:r>
     </w:p>
     <w:p>
@@ -241,7 +79,7 @@
         <w:pStyle w:val="FirstParagraph"/>
       </w:pPr>
       <w:r>
-        <w:t xml:space="preserve">When a Chinese course moves online, programs still have to decide the hour, the application, the oral task, and the form of assessment. If household power, network speed, or a required platform does not support those decisions, how should the program treat the failure: as a technical inconvenience, or as a teaching problem?</w:t>
+        <w:t xml:space="preserve">If the hour, the application, the oral task, and the test all assume a quiet home and a stable connection, what should a program do when those conditions are not there?</w:t>
       </w:r>
     </w:p>
     <w:bookmarkEnd w:id="21"/>
@@ -259,7 +97,7 @@
         <w:pStyle w:val="FirstParagraph"/>
       </w:pPr>
       <w:r>
-        <w:t xml:space="preserve">An online Chinese course can keep its hours, platforms, oral tasks, and assessment, and still be a course learners cannot take. Online language programs commonly retain the timetable and classroom tasks of the sending class. Task guides still assume that learners can join a live or collaborative session (Gacs et al., 2020; González-Lloret, 2020; Hodges et al., 2020; Payne, 2020; Stockwell &amp; Wang, 2023). That assumption is already known to fail. Research on online language teaching, and on online international Chinese teaching, has documented unstable networks, platforms that are hard to open, thinner interaction, and learner strain (Li &amp; Li, 2024; Moser et al., 2021; Qi, 2025; Russell, 2020; Tao &amp; Gao, 2022). Owning a device is not participation when power, speed, or a usable application is missing (Ali, 2020; Beaunoyer et al., 2020; Guo &amp; Wan, 2022; Vishnu et al., 2024; Warschauer, 2003). Distance language learning had already asked whether a remote class was feasible (White, 2006). If those conditions do not support the required class, the content may remain appropriate while the class is closed. That is a delivery problem, not a content problem.</w:t>
+        <w:t xml:space="preserve">When Chinese teaching moved online, many programs kept the sending class’s timetable and classroom tasks. Task guides still assume that students can join a live session (Gacs et al., 2020; González-Lloret, 2020; Hodges et al., 2020; Payne, 2020; Stockwell &amp; Wang, 2023). That assumption often fails. Studies of online language teaching, including online Chinese, have already noted unstable networks, platforms that are hard to open, thinner talk, and strain (Li &amp; Li, 2024; Moser et al., 2021; Qi, 2025; Russell, 2020; Tao &amp; Gao, 2022). A device in the house is not enough if there is no power, little speed, or no usable application (Ali, 2020; Beaunoyer et al., 2020; Guo &amp; Wan, 2022; Vishnu et al., 2024; Warschauer, 2003). Distance language learning had already asked whether a remote class was even feasible (White, 2006). When those conditions do not hold, the content may still be sound, but the class is closed.</w:t>
       </w:r>
     </w:p>
     <w:p>
@@ -267,52 +105,7 @@
         <w:pStyle w:val="BodyText"/>
       </w:pPr>
       <w:r>
-        <w:t xml:space="preserve">What existing work has not done is to make those learner-side delivery conditions the primary object of study for online international Chinese teaching. Emergency writing used the failure as a setting for teacher workload, sending-side adaptation, or a videoconference copy of the campus hour (MacIntyre et al., 2020; Moser et al., 2021; Xu et al., 2022). Later work asked what should remain of emergency practice (Moorhouse, 2023; Stockwell &amp; Wang, 2023). Reviews still list technical trouble and still leave household access and digital equity under-examined (Li &amp; Li, 2024; Xu, 2024; Zhang &amp; Osborne, 2026). Designed online courses and studies of learner emotion show what planned online Chinese teaching can look like (Guenier et al., 2026; Qi, 2025; Wen &amp; Liu, 2025). They do not show whether a</w:t>
-      </w:r>
-      <w:r>
-        <w:t xml:space="preserve"> </w:t>
-      </w:r>
-      <w:r>
-        <w:rPr>
-          <w:iCs/>
-          <w:i/>
-        </w:rPr>
-        <w:t xml:space="preserve">travelling course</w:t>
-      </w:r>
-      <w:r>
-        <w:t xml:space="preserve">—this article’s term, from Gacs et al. (2020), for a course designed in one institutional setting and taught in another—could still be taken where learners sat. International Chinese language education has said more about what a course</w:t>
-      </w:r>
-      <w:r>
-        <w:t xml:space="preserve"> </w:t>
-      </w:r>
-      <w:r>
-        <w:rPr>
-          <w:iCs/>
-          <w:i/>
-        </w:rPr>
-        <w:t xml:space="preserve">says</w:t>
-      </w:r>
-      <w:r>
-        <w:t xml:space="preserve"> </w:t>
-      </w:r>
-      <w:r>
-        <w:t xml:space="preserve">than about whether it can still be</w:t>
-      </w:r>
-      <w:r>
-        <w:t xml:space="preserve"> </w:t>
-      </w:r>
-      <w:r>
-        <w:rPr>
-          <w:iCs/>
-          <w:i/>
-        </w:rPr>
-        <w:t xml:space="preserve">taken</w:t>
-      </w:r>
-      <w:r>
-        <w:t xml:space="preserve"> </w:t>
-      </w:r>
-      <w:r>
-        <w:t xml:space="preserve">(Gong et al., 2020b; Lu et al., 2024; Zhao, 2020). Listing the difficulty is not the same as measuring the conditions that produce it.</w:t>
+        <w:t xml:space="preserve">Those difficulties are often named. They are less often measured from the learner’s side. Emergency papers used them as a backdrop for teacher workload, sending-side adaptation, or a video copy of the campus hour (MacIntyre et al., 2020; Moser et al., 2021; Xu et al., 2022). Later papers asked what should remain of that emergency practice (Moorhouse, 2023; Stockwell &amp; Wang, 2023). Reviews still list technical trouble and still say little about household access (Li &amp; Li, 2024; Xu, 2024; Zhang &amp; Osborne, 2026). Planned online courses and studies of learner emotion show what designed online Chinese teaching can look like (Guenier et al., 2026; Qi, 2025; Wen &amp; Liu, 2025). They do not show whether a travelling course could still be taken where learners sat. That term is used here, following Gacs et al. (2020), for a course designed in one institutional setting and taught in another. Work on international Chinese teaching has said more about what a course says than about whether learners can enter it (Gong et al., 2020b; Lu et al., 2024; Zhao, 2020).</w:t>
       </w:r>
     </w:p>
     <w:p>
@@ -320,7 +113,7 @@
         <w:pStyle w:val="BodyText"/>
       </w:pPr>
       <w:r>
-        <w:t xml:space="preserve">This study treats that gap as a research problem. Empirical work in this journal has already treated online world-language teaching as a problem of access, task design, interaction, anxiety, and emergency adaptation (Gacs et al., 2020; González-Lloret, 2020; Jin et al., 2023; Lomicka, 2020; Payne, 2020; Russell, 2020; Xu et al., 2022; Zhang &amp; Liu, 2023). The same move is required here for the conditions of a travelling Chinese course. A Chinese-language questionnaire asked a self-selected group of respondents reporting participation in online Chinese-language courses what household, connectivity, and platform-access conditions they faced, and how those conditions sat alongside stress and appraisals of online learning. The instrument cannot show how institutions adapted. It can show the conditions against which those arrangements have to be judged. Time-zone difference and the absence of a Chinese-speaking environment were not measured, so they are left aside. Respondents are not treated as students who had returned home or who were unable to re-enter campus. Those were common emergency-period situations; they are not established facts in this dataset.</w:t>
+        <w:t xml:space="preserve">Access, tasks, interaction, anxiety, and emergency adaptation are already familiar topics in this journal (Gacs et al., 2020; González-Lloret, 2020; Jin et al., 2023; Lomicka, 2020; Payne, 2020; Russell, 2020; Xu et al., 2022; Zhang &amp; Liu, 2023). This study asked a related question from the learner side. Thirty-eight people who reported taking online Chinese courses completed a questionnaire written in Chinese. They were asked about home conditions, connectivity, and platform access, and about stress and their view of online learning. The form cannot show how institutions adapted. It can show the conditions those arrangements had to meet. Time-zone difference and the lack of a Chinese-speaking environment were not measured. Respondents are not treated here as people who had gone home or who could not re-enter campus. Those were common situations in that period. The questionnaire does not record them.</w:t>
       </w:r>
     </w:p>
     <w:p>
@@ -328,7 +121,201 @@
         <w:pStyle w:val="BodyText"/>
       </w:pPr>
       <w:r>
-        <w:t xml:space="preserve">Thirty-eight complete responses were collected during emergency remote teaching. Thirty-seven respondents selected Pakistani nationality. Nationality is the only Pakistan connection in the dataset. Residence, recruitment pathway, institutional affiliation, program status, and physical location were not verified. Literature on Pakistani educational mobility and university e-learning is used only as background for that reported nationality (Butt &amp; Sadaf, 2026; Jamil &amp; Muschert, 2023; Raza &amp; Hennessy, 2025; Tu, 2026). The group is not a verified campus population (Gao &amp; Hua, 2021; Gong et al., 2020a). The article does not ask whether later hybrid practice has closed the gap. It asks whether the delivery problem is visible as learner-side conditions in this sample:</w:t>
+        <w:t xml:space="preserve">Thirty-seven of the 38 selected Pakistani nationality. That item is the only Pakistan link in the data. Residence, recruitment, university, program, and physical location were not checked. Writing on Pakistani educational mobility and university e-learning is used only as background for that reported nationality (Butt &amp; Sadaf, 2026; Jamil &amp; Muschert, 2023; Raza &amp; Hennessy, 2025; Tu, 2026). The group is not a verified campus population (Gao &amp; Hua, 2021; Gong et al., 2020a). The paper does not ask whether later hybrid practice has closed the gap. It asks what these 38 people reported:</w:t>
+      </w:r>
+    </w:p>
+    <w:p>
+      <w:pPr>
+        <w:pStyle w:val="BodyText"/>
+      </w:pPr>
+      <w:r>
+        <w:rPr>
+          <w:bCs/>
+          <w:b/>
+        </w:rPr>
+        <w:t xml:space="preserve">RQ1.</w:t>
+      </w:r>
+      <w:r>
+        <w:t xml:space="preserve"> </w:t>
+      </w:r>
+      <w:r>
+        <w:t xml:space="preserve">What household, connectivity, and platform-access conditions did they report?</w:t>
+      </w:r>
+    </w:p>
+    <w:p>
+      <w:pPr>
+        <w:pStyle w:val="BodyText"/>
+      </w:pPr>
+      <w:r>
+        <w:rPr>
+          <w:bCs/>
+          <w:b/>
+        </w:rPr>
+        <w:t xml:space="preserve">RQ2.</w:t>
+      </w:r>
+      <w:r>
+        <w:t xml:space="preserve"> </w:t>
+      </w:r>
+      <w:r>
+        <w:t xml:space="preserve">How did those conditions sit alongside</w:t>
+      </w:r>
+      <w:r>
+        <w:t xml:space="preserve"> </w:t>
+      </w:r>
+      <w:r>
+        <w:t xml:space="preserve">“</w:t>
+      </w:r>
+      <w:r>
+        <w:t xml:space="preserve">very high stress</w:t>
+      </w:r>
+      <w:r>
+        <w:t xml:space="preserve">”</w:t>
+      </w:r>
+      <w:r>
+        <w:t xml:space="preserve"> </w:t>
+      </w:r>
+      <w:r>
+        <w:t xml:space="preserve">and their appraisals of online learning?</w:t>
+      </w:r>
+    </w:p>
+    <w:p>
+      <w:pPr>
+        <w:pStyle w:val="BodyText"/>
+      </w:pPr>
+      <w:r>
+        <w:rPr>
+          <w:bCs/>
+          <w:b/>
+        </w:rPr>
+        <w:t xml:space="preserve">RQ3.</w:t>
+      </w:r>
+      <w:r>
+        <w:t xml:space="preserve"> </w:t>
+      </w:r>
+      <w:r>
+        <w:t xml:space="preserve">Did they judge that online Chinese courses could replace campus classes?</w:t>
+      </w:r>
+    </w:p>
+    <w:p>
+      <w:pPr>
+        <w:pStyle w:val="BodyText"/>
+      </w:pPr>
+      <w:r>
+        <w:t xml:space="preserve">The counts are descriptive. The associations are exploratory.</w:t>
+      </w:r>
+    </w:p>
+    <w:bookmarkEnd w:id="22"/>
+    <w:bookmarkStart w:id="28" w:name="Xa71efe292272ba0d775f88aaa92c3e49c1e1383"/>
+    <w:p>
+      <w:pPr>
+        <w:pStyle w:val="Heading2"/>
+      </w:pPr>
+      <w:r>
+        <w:t xml:space="preserve">2. Literature review and conceptual framework</w:t>
+      </w:r>
+    </w:p>
+    <w:bookmarkStart w:id="23" w:name="later-lenses-on-online-chinese-teaching"/>
+    <w:p>
+      <w:pPr>
+        <w:pStyle w:val="Heading3"/>
+      </w:pPr>
+      <w:r>
+        <w:t xml:space="preserve">2.1 Later lenses on online Chinese teaching</w:t>
+      </w:r>
+    </w:p>
+    <w:p>
+      <w:pPr>
+        <w:pStyle w:val="FirstParagraph"/>
+      </w:pPr>
+      <w:r>
+        <w:t xml:space="preserve">Hodges et al. (2020) distinguished emergency remote teaching from planned online provision. Gacs, Goertler, and Spasova (2020) brought that distinction into language education. Language-teacher surveys from the same period describe heavier workloads and uneven preparedness (Moser et al., 2021). Tao and Gao (2022) read the wider literature as a story of technical disruption and thinner engagement. In this journal, Russell (2020) treats language anxiety as a condition of the online learner, and Lomicka (2020) treats interaction as a problem of virtual community rather than of a copied campus hour. That work locates the moment in which the present questionnaire was completed. It is not a substitute for the stress reports in this sample.</w:t>
+      </w:r>
+    </w:p>
+    <w:p>
+      <w:pPr>
+        <w:pStyle w:val="BodyText"/>
+      </w:pPr>
+      <w:r>
+        <w:t xml:space="preserve">The later literature is the reading lens. After the return to campus, studies of technological normalization asked what should remain of emergency online practice (Moorhouse, 2023) and cautioned against treating a videoconference copy of the classroom as the lesson of the crisis (Stockwell &amp; Wang, 2023). For Chinese, contemporaneous policy writing recorded</w:t>
+      </w:r>
+      <w:r>
+        <w:t xml:space="preserve"> </w:t>
+      </w:r>
+      <w:r>
+        <w:t xml:space="preserve">“</w:t>
+      </w:r>
+      <w:r>
+        <w:t xml:space="preserve">suspending classes without stopping learning</w:t>
+      </w:r>
+      <w:r>
+        <w:t xml:space="preserve">”</w:t>
+      </w:r>
+      <w:r>
+        <w:t xml:space="preserve"> </w:t>
+      </w:r>
+      <w:r>
+        <w:t xml:space="preserve">(Zhang et al., 2020). Xu et al. (2022) show how character teaching was adapted on the sending side. Jin et al. (2023) report faculty perceptions of pandemic online teaching. Zhang and Liu (2023) examine online collaborative writing among Chinese-language learners in designed conditions. Later reviews still say more about tools than about household access, and they still flag digital equity as under-examined (Li &amp; Li, 2024; Xu, 2024; Zhang &amp; Osborne, 2026). Designed online Chinese-culture courses show a planned alternative to emergency copying (Guenier et al., 2026). Qi (2025) shows that an online Chinese class can itself become an anxiety-provoking setting. Those studies do not describe the present respondents. Much of that writing still assumes a relatively stable connection. The present questionnaire cannot test whether that assumption holds for current hybrid ICLE. It can show what 38 respondents reported when a travelling course asked them to join.</w:t>
+      </w:r>
+    </w:p>
+    <w:bookmarkEnd w:id="23"/>
+    <w:bookmarkStart w:id="24" w:name="X8fd0326383b50249221392c76a6b8ab8b037526"/>
+    <w:p>
+      <w:pPr>
+        <w:pStyle w:val="Heading3"/>
+      </w:pPr>
+      <w:r>
+        <w:t xml:space="preserve">2.2 Digital inequality and the home learning ecology</w:t>
+      </w:r>
+    </w:p>
+    <w:p>
+      <w:pPr>
+        <w:pStyle w:val="FirstParagraph"/>
+      </w:pPr>
+      <w:r>
+        <w:t xml:space="preserve">Later models of the digital divide distinguish material access from skills, usage, and outcomes (Helsper, 2021; van Dijk, 2020; Warschauer, 2003). Owning a device is not the same as being able to take part (Ali, 2020; Beaunoyer et al., 2020; Guo &amp; Wan, 2022; Vishnu et al., 2024). Work on Pakistani university e-learning reports uneven access, skills, electricity, and household device sharing (Butt &amp; Sadaf, 2026; Jamil &amp; Muschert, 2023; Raza &amp; Hennessy, 2025). The last of those sources is a grey-literature report. None of them is evidence about the 38 respondents here; they are background only for the nationality most of them reported.</w:t>
+      </w:r>
+    </w:p>
+    <w:p>
+      <w:pPr>
+        <w:pStyle w:val="BodyText"/>
+      </w:pPr>
+      <w:r>
+        <w:t xml:space="preserve">An ecological view of language education takes the setting of the class, not only the student and the application, as the unit of analysis (Guerrettaz et al., 2021; van Lier, 2004). Domestic space, paid or care work, power interruptions, and applications marked unusable are therefore read as elements of respondents’ immediate learning ecologies. They are material facts, not cultural traits.</w:t>
+      </w:r>
+    </w:p>
+    <w:bookmarkEnd w:id="24"/>
+    <w:bookmarkStart w:id="26" w:name="localization-of-delivery"/>
+    <w:p>
+      <w:pPr>
+        <w:pStyle w:val="Heading3"/>
+      </w:pPr>
+      <w:r>
+        <w:t xml:space="preserve">2.3 Localization of delivery</w:t>
+      </w:r>
+    </w:p>
+    <w:p>
+      <w:pPr>
+        <w:pStyle w:val="FirstParagraph"/>
+      </w:pPr>
+      <w:r>
+        <w:t xml:space="preserve">In materials work, localization has usually meant personalizing content so that it speaks to a particular group (McDonough &amp; Shaw, 2003; Tomlinson, 2011). Canagarajah (2005) and Kumaravadivelu (2001) locate pedagogy in a specific group and place. ICLE research has applied localization mainly to curriculum construction and textbook adaptation (Lu et al., 2024; Zhao, 2020; Zhao &amp; Huang, 2010). Guerrettaz et al. (2021) push materials off the page and into use. If that move is taken seriously, localization also has to ask whether learners can reach and take part in the class as it is delivered.</w:t>
+      </w:r>
+    </w:p>
+    <w:bookmarkStart w:id="25" w:name="four-layers-of-localization"/>
+    <w:p>
+      <w:pPr>
+        <w:pStyle w:val="Heading4"/>
+      </w:pPr>
+      <w:r>
+        <w:t xml:space="preserve">2.3.1 Four layers of localization</w:t>
+      </w:r>
+    </w:p>
+    <w:p>
+      <w:pPr>
+        <w:pStyle w:val="FirstParagraph"/>
+      </w:pPr>
+      <w:r>
+        <w:t xml:space="preserve">The following four layers are the proposed framework for reading the present data. They are a conceptual distinction, not a tested path:</w:t>
       </w:r>
     </w:p>
     <w:p>
@@ -340,17 +327,20 @@
         <w:pStyle w:val="Compact"/>
       </w:pPr>
       <w:r>
+        <w:t xml:space="preserve">Localization of</w:t>
+      </w:r>
+      <w:r>
+        <w:t xml:space="preserve"> </w:t>
+      </w:r>
+      <w:r>
         <w:rPr>
-          <w:bCs/>
-          <w:b/>
+          <w:iCs/>
+          <w:i/>
         </w:rPr>
-        <w:t xml:space="preserve">RQ1.</w:t>
-      </w:r>
-      <w:r>
-        <w:t xml:space="preserve"> </w:t>
-      </w:r>
-      <w:r>
-        <w:t xml:space="preserve">What household, connectivity, and platform-access conditions did respondents report?</w:t>
+        <w:t xml:space="preserve">content</w:t>
+      </w:r>
+      <w:r>
+        <w:t xml:space="preserve">: examples, festivals, and cultural comparison.</w:t>
       </w:r>
     </w:p>
     <w:p>
@@ -362,35 +352,20 @@
         <w:pStyle w:val="Compact"/>
       </w:pPr>
       <w:r>
+        <w:t xml:space="preserve">Localization of</w:t>
+      </w:r>
+      <w:r>
+        <w:t xml:space="preserve"> </w:t>
+      </w:r>
+      <w:r>
         <w:rPr>
-          <w:bCs/>
-          <w:b/>
+          <w:iCs/>
+          <w:i/>
         </w:rPr>
-        <w:t xml:space="preserve">RQ2.</w:t>
-      </w:r>
-      <w:r>
-        <w:t xml:space="preserve"> </w:t>
-      </w:r>
-      <w:r>
-        <w:t xml:space="preserve">In this sample, how were reported household and connectivity conditions associated with selecting</w:t>
-      </w:r>
-      <w:r>
-        <w:t xml:space="preserve"> </w:t>
-      </w:r>
-      <w:r>
-        <w:t xml:space="preserve">“</w:t>
-      </w:r>
-      <w:r>
-        <w:t xml:space="preserve">very high stress</w:t>
-      </w:r>
-      <w:r>
-        <w:t xml:space="preserve">”</w:t>
-      </w:r>
-      <w:r>
-        <w:t xml:space="preserve"> </w:t>
-      </w:r>
-      <w:r>
-        <w:t xml:space="preserve">and with respondents’ appraisals of online learning?</w:t>
+        <w:t xml:space="preserve">materials</w:t>
+      </w:r>
+      <w:r>
+        <w:t xml:space="preserve">: annotation, mediation language, and page redesign.</w:t>
       </w:r>
     </w:p>
     <w:p>
@@ -402,200 +377,6 @@
         <w:pStyle w:val="Compact"/>
       </w:pPr>
       <w:r>
-        <w:rPr>
-          <w:bCs/>
-          <w:b/>
-        </w:rPr>
-        <w:t xml:space="preserve">RQ3.</w:t>
-      </w:r>
-      <w:r>
-        <w:t xml:space="preserve"> </w:t>
-      </w:r>
-      <w:r>
-        <w:t xml:space="preserve">How did respondents judge whether online Chinese-language courses could replace campus-based classes?</w:t>
-      </w:r>
-    </w:p>
-    <w:p>
-      <w:pPr>
-        <w:pStyle w:val="FirstParagraph"/>
-      </w:pPr>
-      <w:r>
-        <w:t xml:space="preserve">Counts are used descriptively. Associations are exploratory and are not read as confirmatory tests of population-level relationships. Section 2 locates the study and sets out the four-layer reading of localization. Section 3 reports the methods. Section 4 addresses RQ1–RQ3 in turn. Sections 5–8 discuss the findings, set out pedagogical implications, and state the limits of the answer.</w:t>
-      </w:r>
-    </w:p>
-    <w:bookmarkEnd w:id="22"/>
-    <w:bookmarkStart w:id="28" w:name="Xa71efe292272ba0d775f88aaa92c3e49c1e1383"/>
-    <w:p>
-      <w:pPr>
-        <w:pStyle w:val="Heading2"/>
-      </w:pPr>
-      <w:r>
-        <w:t xml:space="preserve">2. Literature review and conceptual framework</w:t>
-      </w:r>
-    </w:p>
-    <w:bookmarkStart w:id="23" w:name="later-lenses-on-online-chinese-teaching"/>
-    <w:p>
-      <w:pPr>
-        <w:pStyle w:val="Heading3"/>
-      </w:pPr>
-      <w:r>
-        <w:t xml:space="preserve">2.1 Later lenses on online Chinese teaching</w:t>
-      </w:r>
-    </w:p>
-    <w:p>
-      <w:pPr>
-        <w:pStyle w:val="FirstParagraph"/>
-      </w:pPr>
-      <w:r>
-        <w:t xml:space="preserve">Hodges et al. (2020) distinguished emergency remote teaching from planned online provision. Gacs, Goertler, and Spasova (2020) brought that distinction into language education. Language-teacher surveys from the same period describe heavier workloads and uneven preparedness (Moser et al., 2021). Tao and Gao (2022) read the wider literature as a story of technical disruption and thinner engagement. In this journal, Russell (2020) treats language anxiety as a condition of the online learner, and Lomicka (2020) treats interaction as a problem of virtual community rather than of a copied campus hour. That work locates the moment in which the present questionnaire was completed. It is not a substitute for the stress reports in this sample.</w:t>
-      </w:r>
-    </w:p>
-    <w:p>
-      <w:pPr>
-        <w:pStyle w:val="BodyText"/>
-      </w:pPr>
-      <w:r>
-        <w:t xml:space="preserve">The later literature is the reading lens. After the return to campus, studies of technological normalization asked what should remain of emergency online practice (Moorhouse, 2023) and cautioned against treating a videoconference copy of the classroom as the lesson of the crisis (Stockwell &amp; Wang, 2023). For Chinese, contemporaneous policy writing recorded</w:t>
-      </w:r>
-      <w:r>
-        <w:t xml:space="preserve"> </w:t>
-      </w:r>
-      <w:r>
-        <w:t xml:space="preserve">“</w:t>
-      </w:r>
-      <w:r>
-        <w:t xml:space="preserve">suspending classes without stopping learning</w:t>
-      </w:r>
-      <w:r>
-        <w:t xml:space="preserve">”</w:t>
-      </w:r>
-      <w:r>
-        <w:t xml:space="preserve"> </w:t>
-      </w:r>
-      <w:r>
-        <w:t xml:space="preserve">(Zhang et al., 2020). Xu et al. (2022) show how character teaching was adapted on the sending side. Jin et al. (2023) report faculty perceptions of pandemic online teaching. Zhang and Liu (2023) examine online collaborative writing among Chinese-language learners in designed conditions. Later reviews still say more about tools than about household access, and they still flag digital equity as under-examined (Li &amp; Li, 2024; Xu, 2024; Zhang &amp; Osborne, 2026). Designed online Chinese-culture courses show a planned alternative to emergency copying (Guenier et al., 2026). Qi (2025) shows that an online Chinese class can itself become an anxiety-provoking setting. Those studies do not describe the present respondents. Much of that writing still assumes a relatively stable connection. The present questionnaire cannot test whether that assumption holds for current hybrid ICLE. It can show what 38 respondents reported when a travelling course asked them to join.</w:t>
-      </w:r>
-    </w:p>
-    <w:bookmarkEnd w:id="23"/>
-    <w:bookmarkStart w:id="24" w:name="X8fd0326383b50249221392c76a6b8ab8b037526"/>
-    <w:p>
-      <w:pPr>
-        <w:pStyle w:val="Heading3"/>
-      </w:pPr>
-      <w:r>
-        <w:t xml:space="preserve">2.2 Digital inequality and the home learning ecology</w:t>
-      </w:r>
-    </w:p>
-    <w:p>
-      <w:pPr>
-        <w:pStyle w:val="FirstParagraph"/>
-      </w:pPr>
-      <w:r>
-        <w:t xml:space="preserve">Later models of the digital divide distinguish material access from skills, usage, and outcomes (Helsper, 2021; van Dijk, 2020; Warschauer, 2003). Owning a device is not the same as being able to take part (Ali, 2020; Beaunoyer et al., 2020; Guo &amp; Wan, 2022; Vishnu et al., 2024). Work on Pakistani university e-learning reports uneven access, skills, electricity, and household device sharing (Butt &amp; Sadaf, 2026; Jamil &amp; Muschert, 2023; Raza &amp; Hennessy, 2025). The last of those sources is a grey-literature report. None of them is evidence about the 38 respondents here; they are background only for the nationality most of them reported.</w:t>
-      </w:r>
-    </w:p>
-    <w:p>
-      <w:pPr>
-        <w:pStyle w:val="BodyText"/>
-      </w:pPr>
-      <w:r>
-        <w:t xml:space="preserve">An ecological view of language education takes the setting of the class, not only the student and the application, as the unit of analysis (Guerrettaz et al., 2021; van Lier, 2004). Domestic space, paid or care work, power interruptions, and applications marked unusable are therefore read as elements of respondents’ immediate learning ecologies. They are material facts, not cultural traits.</w:t>
-      </w:r>
-    </w:p>
-    <w:bookmarkEnd w:id="24"/>
-    <w:bookmarkStart w:id="26" w:name="localization-of-delivery"/>
-    <w:p>
-      <w:pPr>
-        <w:pStyle w:val="Heading3"/>
-      </w:pPr>
-      <w:r>
-        <w:t xml:space="preserve">2.3 Localization of delivery</w:t>
-      </w:r>
-    </w:p>
-    <w:p>
-      <w:pPr>
-        <w:pStyle w:val="FirstParagraph"/>
-      </w:pPr>
-      <w:r>
-        <w:t xml:space="preserve">In materials work, localization has usually meant personalizing content so that it speaks to a particular group (McDonough &amp; Shaw, 2003; Tomlinson, 2011). Canagarajah (2005) and Kumaravadivelu (2001) locate pedagogy in a specific group and place. ICLE research has applied localization mainly to curriculum construction and textbook adaptation (Lu et al., 2024; Zhao, 2020; Zhao &amp; Huang, 2010). Guerrettaz et al. (2021) push materials off the page and into use. If that move is taken seriously, localization also has to ask whether learners can reach and take part in the class as it is delivered.</w:t>
-      </w:r>
-    </w:p>
-    <w:bookmarkStart w:id="25" w:name="four-layers-of-localization"/>
-    <w:p>
-      <w:pPr>
-        <w:pStyle w:val="Heading4"/>
-      </w:pPr>
-      <w:r>
-        <w:t xml:space="preserve">2.3.1 Four layers of localization</w:t>
-      </w:r>
-    </w:p>
-    <w:p>
-      <w:pPr>
-        <w:pStyle w:val="FirstParagraph"/>
-      </w:pPr>
-      <w:r>
-        <w:t xml:space="preserve">The following four layers are the proposed framework for reading the present data. They are a conceptual distinction, not a tested path:</w:t>
-      </w:r>
-    </w:p>
-    <w:p>
-      <w:pPr>
-        <w:numPr>
-          <w:ilvl w:val="0"/>
-          <w:numId w:val="1002"/>
-        </w:numPr>
-        <w:pStyle w:val="Compact"/>
-      </w:pPr>
-      <w:r>
-        <w:t xml:space="preserve">Localization of</w:t>
-      </w:r>
-      <w:r>
-        <w:t xml:space="preserve"> </w:t>
-      </w:r>
-      <w:r>
-        <w:rPr>
-          <w:iCs/>
-          <w:i/>
-        </w:rPr>
-        <w:t xml:space="preserve">content</w:t>
-      </w:r>
-      <w:r>
-        <w:t xml:space="preserve">: examples, festivals, and cultural comparison.</w:t>
-      </w:r>
-    </w:p>
-    <w:p>
-      <w:pPr>
-        <w:numPr>
-          <w:ilvl w:val="0"/>
-          <w:numId w:val="1002"/>
-        </w:numPr>
-        <w:pStyle w:val="Compact"/>
-      </w:pPr>
-      <w:r>
-        <w:t xml:space="preserve">Localization of</w:t>
-      </w:r>
-      <w:r>
-        <w:t xml:space="preserve"> </w:t>
-      </w:r>
-      <w:r>
-        <w:rPr>
-          <w:iCs/>
-          <w:i/>
-        </w:rPr>
-        <w:t xml:space="preserve">materials</w:t>
-      </w:r>
-      <w:r>
-        <w:t xml:space="preserve">: annotation, mediation language, and page redesign.</w:t>
-      </w:r>
-    </w:p>
-    <w:p>
-      <w:pPr>
-        <w:numPr>
-          <w:ilvl w:val="0"/>
-          <w:numId w:val="1002"/>
-        </w:numPr>
-        <w:pStyle w:val="Compact"/>
-      </w:pPr>
-      <w:r>
         <w:t xml:space="preserve">Localization of</w:t>
       </w:r>
       <w:r>
@@ -616,7 +397,7 @@
       <w:pPr>
         <w:numPr>
           <w:ilvl w:val="0"/>
-          <w:numId w:val="1002"/>
+          <w:numId w:val="1001"/>
         </w:numPr>
         <w:pStyle w:val="Compact"/>
       </w:pPr>
@@ -666,7 +447,7 @@
         <w:t xml:space="preserve"> </w:t>
       </w:r>
       <w:r>
-        <w:t xml:space="preserve">Chinese universities. Guenier, Xing, and Yan (2026) describe a designed online Chinese-culture course. The present respondents completed a Chinese-language questionnaire about online Chinese classes. They are not treated as a Confucius Institute classroom sample, and enrollment in a named Chinese university was not independently verified.</w:t>
+        <w:t xml:space="preserve">Chinese universities. Guenier, Xing, and Yan (2026) describe a designed online Chinese-culture course. The present respondents completed a questionnaire written in Chinese about online Chinese classes. They are not treated as a Confucius Institute classroom sample, and enrollment in a named Chinese university was not independently verified.</w:t>
       </w:r>
     </w:p>
     <w:bookmarkEnd w:id="25"/>
@@ -729,7 +510,7 @@
         <w:pStyle w:val="FirstParagraph"/>
       </w:pPr>
       <w:r>
-        <w:t xml:space="preserve">The instrument title on the Wenjuan export is 新冠肺炎期间留学生在线中文学习的影响因素 (Influencing factors in international students’ online Chinese learning during COVID-19). The items are those on that retained form. No separate validation study or recorded pilot of the instrument is available. This article is a secondary analysis of the completed file. Complete cases were submitted between 5 and 8 February 2022 (N = 38), during emergency remote teaching. That collection window is a methodological fact; the article does not treat the sample as a picture of current hybrid practice. The form did not record how the link was circulated, so the recruitment channel cannot be named. Respondents were adults who completed the Chinese-language questionnaire about online Chinese learning. Completing that questionnaire is not treated as proof of enrollment in a Chinese university. The instrument did not ask host university, city of residence that week, degree versus non-degree status, or scholarship type. Two items asked whether required courses and electives were being taken online: 27 respondents (71.1%) reported required courses online, and 23 (60.5%) reported electives online. Those answers do not identify a named program. The study therefore concerns a self-selected group of respondents reporting participation in online Chinese-language courses, not a verified enrollment record.</w:t>
+        <w:t xml:space="preserve">The instrument title on the Wenjuan export is Influencing factors in international students’ online Chinese learning during COVID-19. The items are those on that retained form. No separate validation study or recorded pilot of the instrument is available. This article is a secondary analysis of the completed responses. Complete cases were submitted between 5 and 8 February 2022 (N = 38), during emergency remote teaching. That collection window is a methodological fact; the article does not treat the sample as a picture of current hybrid practice. The form did not record how the link was circulated, so the recruitment channel cannot be named. Respondents were adults who completed a questionnaire written in Chinese about online Chinese learning. Completing that questionnaire is not treated as proof of enrollment in a Chinese university. The instrument did not ask host university, city of residence that week, degree versus non-degree status, or scholarship type. Two items asked whether required courses and electives were being taken online: 27 respondents (71.1%) reported required courses online, and 23 (60.5%) reported electives online. Those answers do not identify a named program. The study therefore concerns a self-selected group of respondents reporting participation in online Chinese-language courses, not a verified enrollment record.</w:t>
       </w:r>
     </w:p>
     <w:bookmarkEnd w:id="29"/>
@@ -773,7 +554,7 @@
         <w:pStyle w:val="FirstParagraph"/>
       </w:pPr>
       <w:r>
-        <w:t xml:space="preserve">The questionnaire comprised about 30 items: demographics, single-choice ordinals, and multiple-response lists. Stems are in Chinese, with some non-native wording (for example 您尝尝用什么平台). English glosses are used for reporting. Self-rated Chinese level was intermediate or advanced for 37 of 38 respondents. The instrument did not include a comprehension check, so completion of the Chinese-language questionnaire is treated only as evidence that respondents were willing to answer in Chinese. Item wording for the appraisal index is given in Appendix A.</w:t>
+        <w:t xml:space="preserve">The questionnaire comprised about 30 items: demographics, single-choice ordinals, and multiple-response lists. The items were written in Chinese. Some wording was non-native. Reporting uses English glosses. Self-rated Chinese level was intermediate or advanced for 37 of 38 respondents. The instrument did not include a comprehension check, so completion of a questionnaire written in Chinese is treated only as evidence that respondents were willing to answer in Chinese. Item wording for the appraisal index is given in Appendix A.</w:t>
       </w:r>
     </w:p>
     <w:p>
@@ -839,7 +620,7 @@
         <w:t xml:space="preserve"> </w:t>
       </w:r>
       <w:r>
-        <w:t xml:space="preserve">is that first category (非常高), not an analyst-created threshold or a cut on a multi-item scale. The focal stress analysis uses a dummy for this category and does not reverse the ordinal. Full coding directions are in Table A1.</w:t>
+        <w:t xml:space="preserve">is that first category on the form (glossed as very high), not an analyst-created threshold or a cut on a multi-item scale. The focal stress analysis uses a dummy for this category and does not reverse the ordinal. Full coding directions are in Table A1.</w:t>
       </w:r>
     </w:p>
     <w:p>
@@ -881,25 +662,7 @@
         <w:t xml:space="preserve"> </w:t>
       </w:r>
       <w:r>
-        <w:t xml:space="preserve">(export label: no electricity).</w:t>
-      </w:r>
-      <w:r>
-        <w:t xml:space="preserve"> </w:t>
-      </w:r>
-      <w:r>
-        <w:t xml:space="preserve">“</w:t>
-      </w:r>
-      <w:r>
-        <w:t xml:space="preserve">中国慕课</w:t>
-      </w:r>
-      <w:r>
-        <w:t xml:space="preserve">”</w:t>
-      </w:r>
-      <w:r>
-        <w:t xml:space="preserve"> </w:t>
-      </w:r>
-      <w:r>
-        <w:t xml:space="preserve">is reported as printed on the form; the option did not name a single provider such as 中国大学MOOC.</w:t>
+        <w:t xml:space="preserve">(export label: no electricity). Chinese MOOC is reported as printed on the form; the option did not name a single provider.</w:t>
       </w:r>
     </w:p>
     <w:bookmarkEnd w:id="31"/>
@@ -917,7 +680,7 @@
         <w:pStyle w:val="FirstParagraph"/>
       </w:pPr>
       <w:r>
-        <w:t xml:space="preserve">The analyses are mapped to the research questions. RQ1 is addressed with descriptive frequencies (Tables 1–3). RQ2 is addressed with two focal associations: home affects study very much × very high stress (two-sided Fisher’s exact</w:t>
+        <w:t xml:space="preserve">Household and platform reports are given as frequencies (Tables 1 to 3). Two associations are treated as focal: home affects study very much with very high stress (two-sided Fisher’s exact test), and internet speed with the appraisal index (Spearman’s ρ, with a percentile bootstrap 95% confidence interval from 5,000 resamples). Replacement judgments are reported as frequencies. Odds ratios and Wald confidence intervals are not reported: at N = 38 they are unstable. Other associations, including gender, are secondary and are placed in Appendix B. Frequencies are n/38 unless noted. Multiple-response items are the percentage who selected the option.</w:t>
       </w:r>
       <w:r>
         <w:t xml:space="preserve"> </w:t>
@@ -930,31 +693,6 @@
         <w:t xml:space="preserve">p</w:t>
       </w:r>
       <w:r>
-        <w:t xml:space="preserve">; SciPy</w:t>
-      </w:r>
-      <w:r>
-        <w:t xml:space="preserve"> </w:t>
-      </w:r>
-      <w:r>
-        <w:rPr>
-          <w:rStyle w:val="VerbatimChar"/>
-        </w:rPr>
-        <w:t xml:space="preserve">fisher_exact</w:t>
-      </w:r>
-      <w:r>
-        <w:t xml:space="preserve">) and internet speed × the appraisal index (Spearman’s ρ with a percentile bootstrap 95% confidence interval from 5,000 resamples). RQ3 is addressed with frequencies of the replacement judgment. Odds ratios and Wald confidence intervals are not reported: at N = 38 they are unstable. Other associations, including gender, are secondary and are placed in Appendix B. Frequencies are n/38 unless noted. Multiple-response items are the percentage who selected the option.</w:t>
-      </w:r>
-      <w:r>
-        <w:t xml:space="preserve"> </w:t>
-      </w:r>
-      <w:r>
-        <w:rPr>
-          <w:iCs/>
-          <w:i/>
-        </w:rPr>
-        <w:t xml:space="preserve">p</w:t>
-      </w:r>
-      <w:r>
         <w:t xml:space="preserve"> </w:t>
       </w:r>
       <w:r>
@@ -992,7 +730,7 @@
         <w:pStyle w:val="BodyText"/>
       </w:pPr>
       <w:r>
-        <w:t xml:space="preserve">No institutional ethics approval number is available for the original 2022 data collection. The first author was then an M.Phil. student, and numbered approval was not obtained. This article reports an anonymized secondary analysis of that file. No new data were collected. Names, IP addresses, exact timestamps, and device identifiers were removed before the public file was prepared.</w:t>
+        <w:t xml:space="preserve">No institutional ethics approval number is available for the original 2022 data collection. The first author was then a master’s student, and numbered approval was not obtained. This article reports an anonymized secondary analysis of those completed responses. No new data were collected. Names, IP addresses, exact timestamps, and device identifiers were removed before the public dataset was prepared.</w:t>
       </w:r>
     </w:p>
     <w:bookmarkEnd w:id="33"/>
@@ -1006,13 +744,13 @@
         <w:t xml:space="preserve">4. Results</w:t>
       </w:r>
     </w:p>
-    <w:bookmarkStart w:id="35" w:name="Xc19e6556867f37cf5943d55d08f36cc3acc822b"/>
+    <w:bookmarkStart w:id="35" w:name="respondents-and-household-conditions"/>
     <w:p>
       <w:pPr>
         <w:pStyle w:val="Heading3"/>
       </w:pPr>
       <w:r>
-        <w:t xml:space="preserve">4.1 Addressing RQ1: respondents and household conditions</w:t>
+        <w:t xml:space="preserve">4.1 Respondents and household conditions</w:t>
       </w:r>
     </w:p>
     <w:p>
@@ -1928,13 +1666,13 @@
       </w:tr>
     </w:tbl>
     <w:bookmarkEnd w:id="35"/>
-    <w:bookmarkStart w:id="36" w:name="addressing-rq1-platform-access"/>
+    <w:bookmarkStart w:id="36" w:name="platform-access"/>
     <w:p>
       <w:pPr>
         <w:pStyle w:val="Heading3"/>
       </w:pPr>
       <w:r>
-        <w:t xml:space="preserve">4.2 Addressing RQ1: platform access</w:t>
+        <w:t xml:space="preserve">4.2 Platform access</w:t>
       </w:r>
     </w:p>
     <w:p>
@@ -2394,7 +2132,7 @@
               <w:jc w:val="left"/>
             </w:pPr>
             <w:r>
-              <w:t xml:space="preserve">中国慕课 (Chinese MOOC, as printed)</w:t>
+              <w:t xml:space="preserve">Chinese MOOC (as printed)</w:t>
             </w:r>
           </w:p>
         </w:tc>
@@ -2469,7 +2207,7 @@
         <w:t xml:space="preserve"> </w:t>
       </w:r>
       <w:r>
-        <w:t xml:space="preserve">is the stem wording. QQ, Chaoxing, DingTalk, and 中国慕课 are platforms often used in Chinese-university teaching; they are not exclusively campus systems.</w:t>
+        <w:t xml:space="preserve">is the stem wording. QQ, Chaoxing, DingTalk, and Chinese MOOC are platforms often used in Chinese-university teaching; they are not exclusively campus systems.</w:t>
       </w:r>
       <w:r>
         <w:t xml:space="preserve"> </w:t>
@@ -2491,13 +2229,13 @@
       </w:r>
     </w:p>
     <w:bookmarkEnd w:id="36"/>
-    <w:bookmarkStart w:id="37" w:name="addressing-rq2-stress-and-appraisals"/>
+    <w:bookmarkStart w:id="37" w:name="stress-and-appraisals"/>
     <w:p>
       <w:pPr>
         <w:pStyle w:val="Heading3"/>
       </w:pPr>
       <w:r>
-        <w:t xml:space="preserve">4.3 Addressing RQ2: stress and appraisals</w:t>
+        <w:t xml:space="preserve">4.3 Stress and appraisals</w:t>
       </w:r>
     </w:p>
     <w:p>
@@ -2818,7 +2556,7 @@
         <w:pStyle w:val="BodyText"/>
       </w:pPr>
       <w:r>
-        <w:t xml:space="preserve">Among Pakistani-nationality respondents only (n = 37), the home–stress table remained 11/14 versus 3/23 (two-sided Fisher’s exact</w:t>
+        <w:t xml:space="preserve">Among Pakistani-nationality respondents only (n = 37), the home and stress table remained 11/14 versus 3/23 (two-sided Fisher’s exact</w:t>
       </w:r>
       <w:r>
         <w:t xml:space="preserve"> </w:t>
@@ -2838,13 +2576,13 @@
       </w:r>
     </w:p>
     <w:bookmarkEnd w:id="37"/>
-    <w:bookmarkStart w:id="38" w:name="addressing-rq3-replacement-judgment"/>
+    <w:bookmarkStart w:id="38" w:name="replacement-judgments"/>
     <w:p>
       <w:pPr>
         <w:pStyle w:val="Heading3"/>
       </w:pPr>
       <w:r>
-        <w:t xml:space="preserve">4.4 Addressing RQ3: replacement judgment</w:t>
+        <w:t xml:space="preserve">4.4 Replacement judgments</w:t>
       </w:r>
     </w:p>
     <w:p>
@@ -2879,7 +2617,7 @@
         <w:pStyle w:val="BodyText"/>
       </w:pPr>
       <w:r>
-        <w:t xml:space="preserve">The study set out to establish whether the difficulties the field has named—networks, platforms, interaction, and affect—were present as learner-side conditions in this sample. The answer is yes. Those who said the home affected study</w:t>
+        <w:t xml:space="preserve">The study set out to establish whether the difficulties the field has named, networks, platforms, interaction, and affect, were present as learner-side conditions in this sample. The answer is yes. Those who said the home affected study</w:t>
       </w:r>
       <w:r>
         <w:t xml:space="preserve"> </w:t>
@@ -2931,7 +2669,7 @@
         <w:pStyle w:val="BodyText"/>
       </w:pPr>
       <w:r>
-        <w:t xml:space="preserve">The platform pattern is best read as a possible geography of delivery. Applications often used in Chinese-university teaching (QQ, Chaoxing, DingTalk, 中国慕课) were frequently marked unusable, while Zoom and WhatsApp were more often marked available. The questionnaire cannot say whether that pattern reflects country restrictions, routing, account rules, skills, or virtual private networks. It can say that a travelling course which assumes a single institutional toolkit may ask learners to enter a class they cannot reliably open.</w:t>
+        <w:t xml:space="preserve">The platform pattern is best read as a possible geography of delivery. Applications often used in Chinese-university teaching (QQ, Chaoxing, DingTalk, Chinese MOOC) were frequently marked unusable, while Zoom and WhatsApp were more often marked available. The questionnaire cannot say whether that pattern reflects country restrictions, routing, account rules, skills, or virtual private networks. It can say that a travelling course which assumes a single institutional toolkit may ask learners to enter a class they cannot reliably open.</w:t>
       </w:r>
     </w:p>
     <w:p>
@@ -3155,7 +2893,7 @@
         <w:pStyle w:val="FirstParagraph"/>
       </w:pPr>
       <w:r>
-        <w:t xml:space="preserve">English glosses of the Chinese stems.</w:t>
+        <w:t xml:space="preserve">English glosses of the item stems.</w:t>
       </w:r>
     </w:p>
     <w:tbl>
@@ -3548,22 +3286,7 @@
         <w:pStyle w:val="FirstParagraph"/>
       </w:pPr>
       <w:r>
-        <w:t xml:space="preserve">See</w:t>
-      </w:r>
-      <w:r>
-        <w:t xml:space="preserve"> </w:t>
-      </w:r>
-      <w:r>
-        <w:rPr>
-          <w:rStyle w:val="VerbatimChar"/>
-        </w:rPr>
-        <w:t xml:space="preserve">analysis/supplementary_stats.md</w:t>
-      </w:r>
-      <w:r>
-        <w:t xml:space="preserve"> </w:t>
-      </w:r>
-      <w:r>
-        <w:t xml:space="preserve">for full tables. Summary: female × cannot-replace and learned-little × cannot-replace have identical cell counts (9/11 vs 10/27; Fisher’s exact</w:t>
+        <w:t xml:space="preserve">Female × cannot-replace and learned-little × cannot-replace have identical cell counts (9/11 vs 10/27; Fisher’s exact</w:t>
       </w:r>
       <w:r>
         <w:t xml:space="preserve"> </w:t>
@@ -4907,82 +4630,6 @@
     <w:lvl w:ilvl="8">
       <w:numFmt w:val="bullet"/>
       <w:lvlText w:val=" "/>
-      <w:lvlJc w:val="left"/>
-      <w:pPr>
-        <w:ind w:left="6480" w:hanging="480"/>
-      </w:pPr>
-    </w:lvl>
-  </w:abstractNum>
-  <w:abstractNum w:abstractNumId="991">
-    <w:nsid w:val="A991"/>
-    <w:multiLevelType w:val="multilevel"/>
-    <w:lvl w:ilvl="0">
-      <w:numFmt w:val="bullet"/>
-      <w:lvlText w:val="•"/>
-      <w:lvlJc w:val="left"/>
-      <w:pPr>
-        <w:ind w:left="720" w:hanging="480"/>
-      </w:pPr>
-    </w:lvl>
-    <w:lvl w:ilvl="1">
-      <w:numFmt w:val="bullet"/>
-      <w:lvlText w:val="–"/>
-      <w:lvlJc w:val="left"/>
-      <w:pPr>
-        <w:ind w:left="1440" w:hanging="480"/>
-      </w:pPr>
-    </w:lvl>
-    <w:lvl w:ilvl="2">
-      <w:numFmt w:val="bullet"/>
-      <w:lvlText w:val="•"/>
-      <w:lvlJc w:val="left"/>
-      <w:pPr>
-        <w:ind w:left="2160" w:hanging="480"/>
-      </w:pPr>
-    </w:lvl>
-    <w:lvl w:ilvl="3">
-      <w:numFmt w:val="bullet"/>
-      <w:lvlText w:val="–"/>
-      <w:lvlJc w:val="left"/>
-      <w:pPr>
-        <w:ind w:left="2880" w:hanging="480"/>
-      </w:pPr>
-    </w:lvl>
-    <w:lvl w:ilvl="4">
-      <w:numFmt w:val="bullet"/>
-      <w:lvlText w:val="•"/>
-      <w:lvlJc w:val="left"/>
-      <w:pPr>
-        <w:ind w:left="3600" w:hanging="480"/>
-      </w:pPr>
-    </w:lvl>
-    <w:lvl w:ilvl="5">
-      <w:numFmt w:val="bullet"/>
-      <w:lvlText w:val="–"/>
-      <w:lvlJc w:val="left"/>
-      <w:pPr>
-        <w:ind w:left="4320" w:hanging="480"/>
-      </w:pPr>
-    </w:lvl>
-    <w:lvl w:ilvl="6">
-      <w:numFmt w:val="bullet"/>
-      <w:lvlText w:val="•"/>
-      <w:lvlJc w:val="left"/>
-      <w:pPr>
-        <w:ind w:left="5040" w:hanging="480"/>
-      </w:pPr>
-    </w:lvl>
-    <w:lvl w:ilvl="7">
-      <w:numFmt w:val="bullet"/>
-      <w:lvlText w:val="–"/>
-      <w:lvlJc w:val="left"/>
-      <w:pPr>
-        <w:ind w:left="5760" w:hanging="480"/>
-      </w:pPr>
-    </w:lvl>
-    <w:lvl w:ilvl="8">
-      <w:numFmt w:val="bullet"/>
-      <w:lvlText w:val="•"/>
       <w:lvlJc w:val="left"/>
       <w:pPr>
         <w:ind w:left="6480" w:hanging="480"/>
@@ -5105,9 +4752,6 @@
     <w:abstractNumId w:val="990"/>
   </w:num>
   <w:num w:numId="1001">
-    <w:abstractNumId w:val="991"/>
-  </w:num>
-  <w:num w:numId="1002">
     <w:abstractNumId w:val="99411"/>
     <w:lvlOverride w:ilvl="0">
       <w:startOverride w:val="1"/>

</xml_diff>

<commit_message>
Cut the paper back to what the questionnaire can support
Remove the localization framework, Figure 1, and RQ3. Keep the delivery problem, the 38-person tables, and a smaller discussion.

Co-authored-by: kristinehina23-rgb <kristinehina23-rgb@users.noreply.github.com>
</commit_message>
<xml_diff>
--- a/papers/q1-masters-covid/word/manuscript.docx
+++ b/papers/q1-masters-covid/word/manuscript.docx
@@ -2,7 +2,7 @@
 <file path=word/document.xml><?xml version="1.0" encoding="utf-8"?>
 <w:document xmlns:w="http://schemas.openxmlformats.org/wordprocessingml/2006/main" xmlns:m="http://schemas.openxmlformats.org/officeDocument/2006/math" xmlns:r="http://schemas.openxmlformats.org/officeDocument/2006/relationships" xmlns:o="urn:schemas-microsoft-com:office:office" xmlns:v="urn:schemas-microsoft-com:vml" xmlns:w10="urn:schemas-microsoft-com:office:word" xmlns:a="http://schemas.openxmlformats.org/drawingml/2006/main" xmlns:pic="http://schemas.openxmlformats.org/drawingml/2006/picture" xmlns:wp="http://schemas.openxmlformats.org/drawingml/2006/wordprocessingDrawing">
   <w:body>
-    <w:bookmarkStart w:id="51" w:name="X93c39fec4510a5d3ad14aecff5d2131a9fc6cdc"/>
+    <w:bookmarkStart w:id="48" w:name="X93c39fec4510a5d3ad14aecff5d2131a9fc6cdc"/>
     <w:p>
       <w:pPr>
         <w:pStyle w:val="Heading1"/>
@@ -105,7 +105,7 @@
         <w:pStyle w:val="BodyText"/>
       </w:pPr>
       <w:r>
-        <w:t xml:space="preserve">Those difficulties are often named. They are less often measured from the learner’s side. Emergency papers used them as a backdrop for teacher workload, sending-side adaptation, or a video copy of the campus hour (MacIntyre et al., 2020; Moser et al., 2021; Xu et al., 2022). Later papers asked what should remain of that emergency practice (Moorhouse, 2023; Stockwell &amp; Wang, 2023). Reviews still list technical trouble and still say little about household access (Li &amp; Li, 2024; Xu, 2024; Zhang &amp; Osborne, 2026). Planned online courses and studies of learner emotion show what designed online Chinese teaching can look like (Guenier et al., 2026; Qi, 2025; Wen &amp; Liu, 2025). They do not show whether a travelling course could still be taken where learners sat. That term is used here, following Gacs et al. (2020), for a course designed in one institutional setting and taught in another. Work on international Chinese teaching has said more about what a course says than about whether learners can enter it (Gong et al., 2020b; Lu et al., 2024; Zhao, 2020).</w:t>
+        <w:t xml:space="preserve">Those difficulties are often named. They are less often measured from the learner’s side. Emergency papers used them as a backdrop for teacher workload, sending-side adaptation, or a video copy of the campus hour (MacIntyre et al., 2020; Moser et al., 2021; Xu et al., 2022). Later papers asked what should remain of that emergency practice (Moorhouse, 2023; Stockwell &amp; Wang, 2023). Reviews still list technical trouble and still say little about household access (Li &amp; Li, 2024; Xu, 2024; Zhang &amp; Osborne, 2026). Planned online courses and studies of learner emotion show what designed online Chinese teaching can look like (Guenier et al., 2026; Qi, 2025; Wen &amp; Liu, 2025). They do not show whether an online class could still be taken where learners sat. Work on international Chinese teaching has said more about what a course says than about whether learners can enter it (Gong et al., 2020b).</w:t>
       </w:r>
     </w:p>
     <w:p>
@@ -183,17 +183,7 @@
         <w:pStyle w:val="BodyText"/>
       </w:pPr>
       <w:r>
-        <w:rPr>
-          <w:bCs/>
-          <w:b/>
-        </w:rPr>
-        <w:t xml:space="preserve">RQ3.</w:t>
-      </w:r>
-      <w:r>
-        <w:t xml:space="preserve"> </w:t>
-      </w:r>
-      <w:r>
-        <w:t xml:space="preserve">Did they judge that online Chinese courses could replace campus classes?</w:t>
+        <w:t xml:space="preserve">The form also asked whether online study could replace campus classes. That item is reported as a count. It is not treated as a third research question.</w:t>
       </w:r>
     </w:p>
     <w:p>
@@ -205,13 +195,13 @@
       </w:r>
     </w:p>
     <w:bookmarkEnd w:id="22"/>
-    <w:bookmarkStart w:id="28" w:name="Xa71efe292272ba0d775f88aaa92c3e49c1e1383"/>
+    <w:bookmarkStart w:id="25" w:name="literature-review"/>
     <w:p>
       <w:pPr>
         <w:pStyle w:val="Heading2"/>
       </w:pPr>
       <w:r>
-        <w:t xml:space="preserve">2. Literature review and conceptual framework</w:t>
+        <w:t xml:space="preserve">2. Literature review</w:t>
       </w:r>
     </w:p>
     <w:bookmarkStart w:id="23" w:name="later-lenses-on-online-chinese-teaching"/>
@@ -236,7 +226,7 @@
         <w:pStyle w:val="BodyText"/>
       </w:pPr>
       <w:r>
-        <w:t xml:space="preserve">The later literature is the reading lens. After the return to campus, studies of technological normalization asked what should remain of emergency online practice (Moorhouse, 2023) and cautioned against treating a videoconference copy of the classroom as the lesson of the crisis (Stockwell &amp; Wang, 2023). For Chinese, contemporaneous policy writing recorded</w:t>
+        <w:t xml:space="preserve">After the return to campus, studies asked what should remain of emergency online practice (Moorhouse, 2023) and cautioned against treating a videoconference copy of the classroom as the lesson of the crisis (Stockwell &amp; Wang, 2023). For Chinese, contemporaneous policy writing recorded</w:t>
       </w:r>
       <w:r>
         <w:t xml:space="preserve"> </w:t>
@@ -254,7 +244,7 @@
         <w:t xml:space="preserve"> </w:t>
       </w:r>
       <w:r>
-        <w:t xml:space="preserve">(Zhang et al., 2020). Xu et al. (2022) show how character teaching was adapted on the sending side. Jin et al. (2023) report faculty perceptions of pandemic online teaching. Zhang and Liu (2023) examine online collaborative writing among Chinese-language learners in designed conditions. Later reviews still say more about tools than about household access, and they still flag digital equity as under-examined (Li &amp; Li, 2024; Xu, 2024; Zhang &amp; Osborne, 2026). Designed online Chinese-culture courses show a planned alternative to emergency copying (Guenier et al., 2026). Qi (2025) shows that an online Chinese class can itself become an anxiety-provoking setting. Those studies do not describe the present respondents. Much of that writing still assumes a relatively stable connection. The present questionnaire cannot test whether that assumption holds for current hybrid ICLE. It can show what 38 respondents reported when a travelling course asked them to join.</w:t>
+        <w:t xml:space="preserve">(Zhang et al., 2020). Xu et al. (2022) show how character teaching was adapted on the sending side. Jin et al. (2023) report faculty perceptions of pandemic online teaching. Zhang and Liu (2023) examine online collaborative writing among Chinese-language learners in designed conditions. Later reviews still say more about tools than about household access, and they still flag digital equity as under-examined (Li &amp; Li, 2024; Xu, 2024; Zhang &amp; Osborne, 2026). Designed online Chinese-culture courses show a planned alternative to emergency copying (Guenier et al., 2026). Qi (2025) shows that an online Chinese class can itself become an anxiety-provoking setting. Those studies do not describe the present respondents. Much of that writing still assumes a relatively stable connection. The present questionnaire cannot test whether that assumption holds for current hybrid teaching. It can show what 38 respondents reported.</w:t>
       </w:r>
     </w:p>
     <w:bookmarkEnd w:id="23"/>
@@ -283,14 +273,23 @@
         <w:t xml:space="preserve">An ecological view of language education takes the setting of the class, not only the student and the application, as the unit of analysis (Guerrettaz et al., 2021; van Lier, 2004). Domestic space, paid or care work, power interruptions, and applications marked unusable are therefore read as elements of respondents’ immediate learning ecologies. They are material facts, not cultural traits.</w:t>
       </w:r>
     </w:p>
+    <w:p>
+      <w:pPr>
+        <w:pStyle w:val="BodyText"/>
+      </w:pPr>
+      <w:r>
+        <w:t xml:space="preserve">This article does not test a theory of localization, nor does it observe how institutions adapted. It reports what 38 respondents said about home conditions and platform access.</w:t>
+      </w:r>
+    </w:p>
     <w:bookmarkEnd w:id="24"/>
-    <w:bookmarkStart w:id="26" w:name="localization-of-delivery"/>
+    <w:bookmarkEnd w:id="25"/>
+    <w:bookmarkStart w:id="31" w:name="methods"/>
     <w:p>
       <w:pPr>
-        <w:pStyle w:val="Heading3"/>
-      </w:pPr>
-      <w:r>
-        <w:t xml:space="preserve">2.3 Localization of delivery</w:t>
+        <w:pStyle w:val="Heading2"/>
+      </w:pPr>
+      <w:r>
+        <w:t xml:space="preserve">3. Methods</w:t>
       </w:r>
     </w:p>
     <w:p>
@@ -298,16 +297,16 @@
         <w:pStyle w:val="FirstParagraph"/>
       </w:pPr>
       <w:r>
-        <w:t xml:space="preserve">In materials work, localization has usually meant personalizing content so that it speaks to a particular group (McDonough &amp; Shaw, 2003; Tomlinson, 2011). Canagarajah (2005) and Kumaravadivelu (2001) locate pedagogy in a specific group and place. ICLE research has applied localization mainly to curriculum construction and textbook adaptation (Lu et al., 2024; Zhao, 2020; Zhao &amp; Huang, 2010). Guerrettaz et al. (2021) push materials off the page and into use. If that move is taken seriously, localization also has to ask whether learners can reach and take part in the class as it is delivered.</w:t>
+        <w:t xml:space="preserve">The study is an exploratory, cross-sectional questionnaire. It does not test a pre-registered confirmatory model. What follows describes the instrument, the self-selected group who completed it, and the limits of what the questionnaire can support.</w:t>
       </w:r>
     </w:p>
-    <w:bookmarkStart w:id="25" w:name="four-layers-of-localization"/>
+    <w:bookmarkStart w:id="26" w:name="design-and-context"/>
     <w:p>
       <w:pPr>
-        <w:pStyle w:val="Heading4"/>
-      </w:pPr>
-      <w:r>
-        <w:t xml:space="preserve">2.3.1 Four layers of localization</w:t>
+        <w:pStyle w:val="Heading3"/>
+      </w:pPr>
+      <w:r>
+        <w:t xml:space="preserve">3.1 Design and context</w:t>
       </w:r>
     </w:p>
     <w:p>
@@ -315,232 +314,37 @@
         <w:pStyle w:val="FirstParagraph"/>
       </w:pPr>
       <w:r>
-        <w:t xml:space="preserve">The following four layers are the proposed framework for reading the present data. They are a conceptual distinction, not a tested path:</w:t>
+        <w:t xml:space="preserve">The instrument title on the Wenjuan export is Influencing factors in international students’ online Chinese learning during COVID-19. The items are those on that retained form. No separate validation study or recorded pilot of the instrument is available. This article is a secondary analysis of the completed responses. Complete cases were submitted between 5 and 8 February 2022 (N = 38), during emergency remote teaching. That collection window is a methodological fact; the article does not treat the sample as a picture of current hybrid practice. The form did not record how the link was circulated, so the recruitment channel cannot be named. Respondents were adults who completed a questionnaire written in Chinese about online Chinese learning. Completing that questionnaire is not treated as proof of enrollment in a Chinese university. The instrument did not ask host university, city of residence that week, degree versus non-degree status, or scholarship type. Two items asked whether required courses and electives were being taken online: 27 respondents (71.1%) reported required courses online, and 23 (60.5%) reported electives online. Those answers do not identify a named program. The study therefore concerns a self-selected group of respondents reporting participation in online Chinese-language courses, not a verified enrollment record.</w:t>
+      </w:r>
+    </w:p>
+    <w:bookmarkEnd w:id="26"/>
+    <w:bookmarkStart w:id="27" w:name="participants"/>
+    <w:p>
+      <w:pPr>
+        <w:pStyle w:val="Heading3"/>
+      </w:pPr>
+      <w:r>
+        <w:t xml:space="preserve">3.2 Participants</w:t>
       </w:r>
     </w:p>
     <w:p>
       <w:pPr>
-        <w:numPr>
-          <w:ilvl w:val="0"/>
-          <w:numId w:val="1001"/>
-        </w:numPr>
-        <w:pStyle w:val="Compact"/>
-      </w:pPr>
-      <w:r>
-        <w:t xml:space="preserve">Localization of</w:t>
-      </w:r>
-      <w:r>
-        <w:t xml:space="preserve"> </w:t>
-      </w:r>
-      <w:r>
-        <w:rPr>
-          <w:iCs/>
-          <w:i/>
-        </w:rPr>
-        <w:t xml:space="preserve">content</w:t>
-      </w:r>
-      <w:r>
-        <w:t xml:space="preserve">: examples, festivals, and cultural comparison.</w:t>
+        <w:pStyle w:val="FirstParagraph"/>
+      </w:pPr>
+      <w:r>
+        <w:t xml:space="preserve">Of the 38 respondents, 27 were men (71.1%) and 11 were women (28.9%). Thirty-seven selected Pakistani nationality and one selected another nationality. That nationality item is the only Pakistan connection in the dataset. The group is not described as verified Chinese-university enrollment, as Pakistan-resident learners, as CSC students, or as a national sample. Self-rated Chinese level was mostly advanced (22, 57.9%) or intermediate (15, 39.5%), with one beginner; the label is the student’s own, not an HSK band. Years of learning Chinese clustered at three to four years (26, 68.4%). Wenjuan submission metadata classified the operating system as iPhone (24, 63.2%) or Android (14). That variable is the device used to submit the form, not an item about all devices used for class.</w:t>
       </w:r>
     </w:p>
     <w:p>
       <w:pPr>
-        <w:numPr>
-          <w:ilvl w:val="0"/>
-          <w:numId w:val="1001"/>
-        </w:numPr>
-        <w:pStyle w:val="Compact"/>
-      </w:pPr>
-      <w:r>
-        <w:t xml:space="preserve">Localization of</w:t>
-      </w:r>
-      <w:r>
-        <w:t xml:space="preserve"> </w:t>
-      </w:r>
-      <w:r>
-        <w:rPr>
-          <w:iCs/>
-          <w:i/>
-        </w:rPr>
-        <w:t xml:space="preserve">materials</w:t>
-      </w:r>
-      <w:r>
-        <w:t xml:space="preserve">: annotation, mediation language, and page redesign.</w:t>
-      </w:r>
-    </w:p>
-    <w:p>
-      <w:pPr>
-        <w:numPr>
-          <w:ilvl w:val="0"/>
-          <w:numId w:val="1001"/>
-        </w:numPr>
-        <w:pStyle w:val="Compact"/>
-      </w:pPr>
-      <w:r>
-        <w:t xml:space="preserve">Localization of</w:t>
-      </w:r>
-      <w:r>
-        <w:t xml:space="preserve"> </w:t>
-      </w:r>
-      <w:r>
-        <w:rPr>
-          <w:iCs/>
-          <w:i/>
-        </w:rPr>
-        <w:t xml:space="preserve">curriculum</w:t>
-      </w:r>
-      <w:r>
-        <w:t xml:space="preserve">: pathway, hours, and assessment of a named program (Shan &amp; Xu, 2024; Zhao, 2020).</w:t>
-      </w:r>
-    </w:p>
-    <w:p>
-      <w:pPr>
-        <w:numPr>
-          <w:ilvl w:val="0"/>
-          <w:numId w:val="1001"/>
-        </w:numPr>
-        <w:pStyle w:val="Compact"/>
-      </w:pPr>
-      <w:r>
-        <w:t xml:space="preserve">Localization of</w:t>
-      </w:r>
-      <w:r>
-        <w:t xml:space="preserve"> </w:t>
-      </w:r>
-      <w:r>
-        <w:rPr>
-          <w:iCs/>
-          <w:i/>
-        </w:rPr>
-        <w:t xml:space="preserve">delivery</w:t>
-      </w:r>
-      <w:r>
-        <w:t xml:space="preserve">: institutional adaptation of time, platform, task, participation mode, and assessment to the receiving context.</w:t>
-      </w:r>
-    </w:p>
-    <w:p>
-      <w:pPr>
-        <w:pStyle w:val="FirstParagraph"/>
-      </w:pPr>
-      <w:r>
-        <w:t xml:space="preserve">This analysis is concerned with the fourth. Localization of delivery does not replace accessibility or digital inclusion. It names the institutional decisions through which access is made possible or closed off when a course moves. The questionnaire did not observe those institutional decisions. It recorded the learner-side conditions against which such decisions would have to be judged. The claim is therefore conceptual rather than institutional: a course may be locally relevant in content but inaccessible in delivery. It is localized in delivery only when its required time, platform, participation mode, task design, and assessment are feasible where learners actually take part.</w:t>
-      </w:r>
-    </w:p>
-    <w:p>
-      <w:pPr>
         <w:pStyle w:val="BodyText"/>
       </w:pPr>
       <w:r>
-        <w:t xml:space="preserve">Gong et al. (2020b) map ICLE in mainland China for 2014–2018 and are used here as a pre-pandemic field sketch. Gao and Hua (2021) and Gong et al. (2020a) write about international students of Chinese</w:t>
-      </w:r>
-      <w:r>
-        <w:t xml:space="preserve"> </w:t>
-      </w:r>
-      <w:r>
-        <w:rPr>
-          <w:iCs/>
-          <w:i/>
-        </w:rPr>
-        <w:t xml:space="preserve">in</w:t>
-      </w:r>
-      <w:r>
-        <w:t xml:space="preserve"> </w:t>
-      </w:r>
-      <w:r>
-        <w:t xml:space="preserve">Chinese universities. Guenier, Xing, and Yan (2026) describe a designed online Chinese-culture course. The present respondents completed a questionnaire written in Chinese about online Chinese classes. They are not treated as a Confucius Institute classroom sample, and enrollment in a named Chinese university was not independently verified.</w:t>
-      </w:r>
-    </w:p>
-    <w:bookmarkEnd w:id="25"/>
-    <w:bookmarkEnd w:id="26"/>
-    <w:bookmarkStart w:id="27" w:name="conceptual-model"/>
-    <w:p>
-      <w:pPr>
-        <w:pStyle w:val="Heading3"/>
-      </w:pPr>
-      <w:r>
-        <w:t xml:space="preserve">2.4 Conceptual model</w:t>
-      </w:r>
-    </w:p>
-    <w:p>
-      <w:pPr>
-        <w:pStyle w:val="FirstParagraph"/>
-      </w:pPr>
-      <w:r>
-        <w:t xml:space="preserve">Figure 1 is offered as a reading model, not as a tested path. Household infrastructure and reported platform access are concurrent conditions of a travelling course and are interpreted as possible constraints on participation. Language investment is not part of the model.</w:t>
-      </w:r>
-    </w:p>
-    <w:p>
-      <w:pPr>
-        <w:pStyle w:val="BodyText"/>
-      </w:pPr>
-      <w:r>
-        <w:t xml:space="preserve">Figure 1. Localization of delivery as delivery-context fit (reading model). Household infrastructure (power interruptions, network stability, speed) and reported platform access are concurrent conditions. They are interpreted as possible constraints on participation and on self-reported stress, interaction, appraisal, and replacement judgments. The figure is not a causal path.</w:t>
+        <w:t xml:space="preserve">Wenjuan automatically recorded an IP-province field. A dummy was coded when that field was a mainland China province name (9 of 38). IP labels are technical metadata. They can be affected by virtual private networks and proxies, and they are not a reliable measure of physical location. They are not used as a participant-location variable and are not the basis of a sensitivity analysis. The dummy, submission dates, and device identifiers are not included in the public dataset.</w:t>
       </w:r>
     </w:p>
     <w:bookmarkEnd w:id="27"/>
-    <w:bookmarkEnd w:id="28"/>
-    <w:bookmarkStart w:id="34" w:name="methods"/>
-    <w:p>
-      <w:pPr>
-        <w:pStyle w:val="Heading2"/>
-      </w:pPr>
-      <w:r>
-        <w:t xml:space="preserve">3. Methods</w:t>
-      </w:r>
-    </w:p>
-    <w:p>
-      <w:pPr>
-        <w:pStyle w:val="FirstParagraph"/>
-      </w:pPr>
-      <w:r>
-        <w:t xml:space="preserve">The study is an exploratory, cross-sectional questionnaire. It does not test a pre-registered confirmatory model. What follows describes the instrument, the self-selected group who completed it, and the limits of what the questionnaire can support.</w:t>
-      </w:r>
-    </w:p>
-    <w:bookmarkStart w:id="29" w:name="design-and-context"/>
-    <w:p>
-      <w:pPr>
-        <w:pStyle w:val="Heading3"/>
-      </w:pPr>
-      <w:r>
-        <w:t xml:space="preserve">3.1 Design and context</w:t>
-      </w:r>
-    </w:p>
-    <w:p>
-      <w:pPr>
-        <w:pStyle w:val="FirstParagraph"/>
-      </w:pPr>
-      <w:r>
-        <w:t xml:space="preserve">The instrument title on the Wenjuan export is Influencing factors in international students’ online Chinese learning during COVID-19. The items are those on that retained form. No separate validation study or recorded pilot of the instrument is available. This article is a secondary analysis of the completed responses. Complete cases were submitted between 5 and 8 February 2022 (N = 38), during emergency remote teaching. That collection window is a methodological fact; the article does not treat the sample as a picture of current hybrid practice. The form did not record how the link was circulated, so the recruitment channel cannot be named. Respondents were adults who completed a questionnaire written in Chinese about online Chinese learning. Completing that questionnaire is not treated as proof of enrollment in a Chinese university. The instrument did not ask host university, city of residence that week, degree versus non-degree status, or scholarship type. Two items asked whether required courses and electives were being taken online: 27 respondents (71.1%) reported required courses online, and 23 (60.5%) reported electives online. Those answers do not identify a named program. The study therefore concerns a self-selected group of respondents reporting participation in online Chinese-language courses, not a verified enrollment record.</w:t>
-      </w:r>
-    </w:p>
-    <w:bookmarkEnd w:id="29"/>
-    <w:bookmarkStart w:id="30" w:name="participants"/>
-    <w:p>
-      <w:pPr>
-        <w:pStyle w:val="Heading3"/>
-      </w:pPr>
-      <w:r>
-        <w:t xml:space="preserve">3.2 Participants</w:t>
-      </w:r>
-    </w:p>
-    <w:p>
-      <w:pPr>
-        <w:pStyle w:val="FirstParagraph"/>
-      </w:pPr>
-      <w:r>
-        <w:t xml:space="preserve">Of the 38 respondents, 27 were men (71.1%) and 11 were women (28.9%). Thirty-seven selected Pakistani nationality and one selected another nationality. That nationality item is the only Pakistan connection in the dataset. The group is not described as verified Chinese-university enrollment, as Pakistan-resident learners, as CSC students, or as a national sample. Self-rated Chinese level was mostly advanced (22, 57.9%) or intermediate (15, 39.5%), with one beginner; the label is the student’s own, not an HSK band. Years of learning Chinese clustered at three to four years (26, 68.4%). Wenjuan submission metadata classified the operating system as iPhone (24, 63.2%) or Android (14). That variable is the device used to submit the form, not an item about all devices used for class.</w:t>
-      </w:r>
-    </w:p>
-    <w:p>
-      <w:pPr>
-        <w:pStyle w:val="BodyText"/>
-      </w:pPr>
-      <w:r>
-        <w:t xml:space="preserve">Wenjuan automatically recorded an IP-province field. A dummy was coded when that field was a mainland China province name (9 of 38). IP labels are technical metadata. They can be affected by virtual private networks and proxies, and they are not a reliable measure of physical location. They are not used as a participant-location variable and are not the basis of a sensitivity analysis. The dummy, submission dates, and device identifiers are not included in the public dataset.</w:t>
-      </w:r>
-    </w:p>
-    <w:bookmarkEnd w:id="30"/>
-    <w:bookmarkStart w:id="31" w:name="instrument-and-coding"/>
+    <w:bookmarkStart w:id="28" w:name="instrument-and-coding"/>
     <w:p>
       <w:pPr>
         <w:pStyle w:val="Heading3"/>
@@ -620,7 +424,7 @@
         <w:t xml:space="preserve"> </w:t>
       </w:r>
       <w:r>
-        <w:t xml:space="preserve">is that first category on the form (glossed as very high), not an analyst-created threshold or a cut on a multi-item scale. The focal stress analysis uses a dummy for this category and does not reverse the ordinal. Full coding directions are in Table A1.</w:t>
+        <w:t xml:space="preserve">is that first category on the form (glossed as very high), not an analyst-created threshold or a cut on a multi-item scale. The focal stress analysis uses a dummy for this category and does not reverse the ordinal. Coding directions are in Appendix A.</w:t>
       </w:r>
     </w:p>
     <w:p>
@@ -646,7 +450,7 @@
         <w:t xml:space="preserve"> </w:t>
       </w:r>
       <w:r>
-        <w:t xml:space="preserve">References to load-shedding elsewhere in the article are contextual. In the results the item is reported as</w:t>
+        <w:t xml:space="preserve">In the results the item is reported as</w:t>
       </w:r>
       <w:r>
         <w:t xml:space="preserve"> </w:t>
@@ -665,8 +469,8 @@
         <w:t xml:space="preserve">(export label: no electricity). Chinese MOOC is reported as printed on the form; the option did not name a single provider.</w:t>
       </w:r>
     </w:p>
-    <w:bookmarkEnd w:id="31"/>
-    <w:bookmarkStart w:id="32" w:name="analysis"/>
+    <w:bookmarkEnd w:id="28"/>
+    <w:bookmarkStart w:id="29" w:name="analysis"/>
     <w:p>
       <w:pPr>
         <w:pStyle w:val="Heading3"/>
@@ -707,8 +511,8 @@
         <w:t xml:space="preserve">A Pakistani-nationality check (n = 37) is reported only to show that dropping the one non-Pakistani case does not reverse the two focal associations. It is not a location analysis.</w:t>
       </w:r>
     </w:p>
-    <w:bookmarkEnd w:id="32"/>
-    <w:bookmarkStart w:id="33" w:name="ethics-and-data-protection"/>
+    <w:bookmarkEnd w:id="29"/>
+    <w:bookmarkStart w:id="30" w:name="ethics-and-data-protection"/>
     <w:p>
       <w:pPr>
         <w:pStyle w:val="Heading3"/>
@@ -733,9 +537,9 @@
         <w:t xml:space="preserve">No institutional ethics approval number is available for the original 2022 data collection. The first author was then a master’s student, and numbered approval was not obtained. This article reports an anonymized secondary analysis of those completed responses. No new data were collected. Names, IP addresses, exact timestamps, and device identifiers were removed before the public dataset was prepared.</w:t>
       </w:r>
     </w:p>
-    <w:bookmarkEnd w:id="33"/>
-    <w:bookmarkEnd w:id="34"/>
-    <w:bookmarkStart w:id="39" w:name="results"/>
+    <w:bookmarkEnd w:id="30"/>
+    <w:bookmarkEnd w:id="31"/>
+    <w:bookmarkStart w:id="36" w:name="results"/>
     <w:p>
       <w:pPr>
         <w:pStyle w:val="Heading2"/>
@@ -744,7 +548,7 @@
         <w:t xml:space="preserve">4. Results</w:t>
       </w:r>
     </w:p>
-    <w:bookmarkStart w:id="35" w:name="respondents-and-household-conditions"/>
+    <w:bookmarkStart w:id="32" w:name="respondents-and-household-conditions"/>
     <w:p>
       <w:pPr>
         <w:pStyle w:val="Heading3"/>
@@ -1665,8 +1469,8 @@
         </w:tc>
       </w:tr>
     </w:tbl>
-    <w:bookmarkEnd w:id="35"/>
-    <w:bookmarkStart w:id="36" w:name="platform-access"/>
+    <w:bookmarkEnd w:id="32"/>
+    <w:bookmarkStart w:id="33" w:name="platform-access"/>
     <w:p>
       <w:pPr>
         <w:pStyle w:val="Heading3"/>
@@ -2228,8 +2032,8 @@
         <w:t xml:space="preserve">follows the item wording and is not a technical claim that the platform was blocked.</w:t>
       </w:r>
     </w:p>
-    <w:bookmarkEnd w:id="36"/>
-    <w:bookmarkStart w:id="37" w:name="stress-and-appraisals"/>
+    <w:bookmarkEnd w:id="33"/>
+    <w:bookmarkStart w:id="34" w:name="stress-and-appraisals"/>
     <w:p>
       <w:pPr>
         <w:pStyle w:val="Heading3"/>
@@ -2575,8 +2379,8 @@
         <w:t xml:space="preserve">= .00011) and speed × appraisal was ρ = .67 (percentile bootstrap 95% CI [.39, .85]).</w:t>
       </w:r>
     </w:p>
-    <w:bookmarkEnd w:id="37"/>
-    <w:bookmarkStart w:id="38" w:name="replacement-judgments"/>
+    <w:bookmarkEnd w:id="34"/>
+    <w:bookmarkStart w:id="35" w:name="replacement-judgments"/>
     <w:p>
       <w:pPr>
         <w:pStyle w:val="Heading3"/>
@@ -2590,18 +2394,139 @@
         <w:pStyle w:val="FirstParagraph"/>
       </w:pPr>
       <w:r>
-        <w:t xml:space="preserve">Nineteen of 38 said online study could replace campus classes, and 19 said it could not. Among women, 9 of 11 said it could not; among men, 10 of 27 said so. With only 11 women, this is a cautious observation of perceived legitimacy in this sample. It is not a gender finding about Pakistani households and is not treated as a focal test (Appendix B).</w:t>
+        <w:t xml:space="preserve">Nineteen of 38 said online study could replace campus classes, and 19 said it could not. The form was split. That count is reported here because the item was on the questionnaire. It is not treated as a test of gender or of household type.</w:t>
+      </w:r>
+    </w:p>
+    <w:bookmarkEnd w:id="35"/>
+    <w:bookmarkEnd w:id="36"/>
+    <w:bookmarkStart w:id="37" w:name="discussion"/>
+    <w:p>
+      <w:pPr>
+        <w:pStyle w:val="Heading2"/>
+      </w:pPr>
+      <w:r>
+        <w:t xml:space="preserve">5. Discussion</w:t>
+      </w:r>
+    </w:p>
+    <w:p>
+      <w:pPr>
+        <w:pStyle w:val="FirstParagraph"/>
+      </w:pPr>
+      <w:r>
+        <w:t xml:space="preserve">In this sample, the difficulties the field has named, networks, platforms, interaction, and strain, were present as learner-side reports. Those who said the home affected study</w:t>
+      </w:r>
+      <w:r>
+        <w:t xml:space="preserve"> </w:t>
+      </w:r>
+      <w:r>
+        <w:t xml:space="preserve">“</w:t>
+      </w:r>
+      <w:r>
+        <w:t xml:space="preserve">very much</w:t>
+      </w:r>
+      <w:r>
+        <w:t xml:space="preserve">”</w:t>
+      </w:r>
+      <w:r>
+        <w:t xml:space="preserve"> </w:t>
+      </w:r>
+      <w:r>
+        <w:t xml:space="preserve">more often selected</w:t>
+      </w:r>
+      <w:r>
+        <w:t xml:space="preserve"> </w:t>
+      </w:r>
+      <w:r>
+        <w:t xml:space="preserve">“</w:t>
+      </w:r>
+      <w:r>
+        <w:t xml:space="preserve">very high stress,</w:t>
+      </w:r>
+      <w:r>
+        <w:t xml:space="preserve">”</w:t>
+      </w:r>
+      <w:r>
+        <w:t xml:space="preserve"> </w:t>
+      </w:r>
+      <w:r>
+        <w:t xml:space="preserve">and worse reported internet speed was associated with a more negative appraisal of online learning. Both associations come from one questionnaire. They are co-occurrences, not proof that the household caused stress or that speed caused a worse view of the class.</w:t>
+      </w:r>
+    </w:p>
+    <w:p>
+      <w:pPr>
+        <w:pStyle w:val="BodyText"/>
+      </w:pPr>
+      <w:r>
+        <w:t xml:space="preserve">Xu et al. (2022) show how character teaching was adapted on the sending side. Zhang and Liu (2023) show designed online Chinese work. The questionnaire shows something smaller: the home and platform conditions 38 respondents said they had to meet. A better textbook would not, by itself, have answered a live session on an unstable connection, or a required application that respondents marked unusable.</w:t>
+      </w:r>
+    </w:p>
+    <w:p>
+      <w:pPr>
+        <w:pStyle w:val="BodyText"/>
+      </w:pPr>
+      <w:r>
+        <w:t xml:space="preserve">Most respondents selected Pakistani nationality, and that is the only Pakistan connection the dataset can support. The home reports are material conditions, not a claim about Pakistani culture.</w:t>
+      </w:r>
+    </w:p>
+    <w:p>
+      <w:pPr>
+        <w:pStyle w:val="BodyText"/>
+      </w:pPr>
+      <w:r>
+        <w:t xml:space="preserve">QQ, Chaoxing, DingTalk, and Chinese MOOC were often marked unusable, while Zoom and WhatsApp were more often marked available. The questionnaire cannot say whether that pattern reflects country restrictions, routing, account rules, skills, or virtual private networks. It can say that requiring one institutional toolkit may ask some learners to enter a class they cannot reliably open.</w:t>
+      </w:r>
+    </w:p>
+    <w:p>
+      <w:pPr>
+        <w:pStyle w:val="BodyText"/>
+      </w:pPr>
+      <w:r>
+        <w:t xml:space="preserve">Participation here sat alongside reported platform trouble, power and connectivity problems, and a home that many described as not quiet. That is a description of domestic conditions in this sample.</w:t>
+      </w:r>
+    </w:p>
+    <w:bookmarkEnd w:id="37"/>
+    <w:bookmarkStart w:id="42" w:name="pedagogical-implications"/>
+    <w:p>
+      <w:pPr>
+        <w:pStyle w:val="Heading2"/>
+      </w:pPr>
+      <w:r>
+        <w:t xml:space="preserve">6. Pedagogical implications</w:t>
+      </w:r>
+    </w:p>
+    <w:p>
+      <w:pPr>
+        <w:pStyle w:val="FirstParagraph"/>
+      </w:pPr>
+      <w:r>
+        <w:t xml:space="preserve">In this sample, the questionnaire can support only a small set of classroom decisions.</w:t>
+      </w:r>
+    </w:p>
+    <w:bookmarkStart w:id="38" w:name="platform-selection"/>
+    <w:p>
+      <w:pPr>
+        <w:pStyle w:val="Heading3"/>
+      </w:pPr>
+      <w:r>
+        <w:t xml:space="preserve">Platform selection</w:t>
+      </w:r>
+    </w:p>
+    <w:p>
+      <w:pPr>
+        <w:pStyle w:val="FirstParagraph"/>
+      </w:pPr>
+      <w:r>
+        <w:t xml:space="preserve">Because QQ and Chaoxing were frequently marked unusable (Table 3), a program should not treat the sending-side toolkit as given. Before it requires a platform, it has to ask whether learners can open it where they sit, and it has to name a usable alternative. WhatsApp was marked available here, but it was not recorded as used for class, so the data do not recommend it as a replacement.</w:t>
       </w:r>
     </w:p>
     <w:bookmarkEnd w:id="38"/>
-    <w:bookmarkEnd w:id="39"/>
-    <w:bookmarkStart w:id="40" w:name="discussion"/>
+    <w:bookmarkStart w:id="39" w:name="assessment-modes"/>
     <w:p>
       <w:pPr>
-        <w:pStyle w:val="Heading2"/>
-      </w:pPr>
-      <w:r>
-        <w:t xml:space="preserve">5. Discussion</w:t>
+        <w:pStyle w:val="Heading3"/>
+      </w:pPr>
+      <w:r>
+        <w:t xml:space="preserve">Assessment modes</w:t>
       </w:r>
     </w:p>
     <w:p>
@@ -2609,15 +2534,25 @@
         <w:pStyle w:val="FirstParagraph"/>
       </w:pPr>
       <w:r>
-        <w:t xml:space="preserve">The contribution of this article is threefold. Empirically, it documents learner-side household and platform-access conditions for a travelling online Chinese course in a small emergency-period sample. Conceptually, it treats localization of delivery, or delivery-context fit, as a distinct layer of localization work. In relation to existing online ICLE research, it complements sending-side accounts of emergency adaptation (Xu et al., 2022) and designed online Chinese work (Zhang &amp; Liu, 2023) with the conditions against which those arrangements have to be judged.</w:t>
+        <w:t xml:space="preserve">Because only 28.9% described the home as quiet, 42.1% reported power interruptions, and 76.3% reported unstable networks (Table 2), institutions should not treat a live oral hour as the only assessable performance. Assessment that assumes a quiet, continuous campus hour will mark some of those conditions as learner failure.</w:t>
+      </w:r>
+    </w:p>
+    <w:bookmarkEnd w:id="39"/>
+    <w:bookmarkStart w:id="40" w:name="live-session-duration"/>
+    <w:p>
+      <w:pPr>
+        <w:pStyle w:val="Heading3"/>
+      </w:pPr>
+      <w:r>
+        <w:t xml:space="preserve">Live session duration</w:t>
       </w:r>
     </w:p>
     <w:p>
       <w:pPr>
-        <w:pStyle w:val="BodyText"/>
-      </w:pPr>
-      <w:r>
-        <w:t xml:space="preserve">The study set out to establish whether the difficulties the field has named, networks, platforms, interaction, and affect, were present as learner-side conditions in this sample. The answer is yes. Those who said the home affected study</w:t>
+        <w:pStyle w:val="FirstParagraph"/>
+      </w:pPr>
+      <w:r>
+        <w:t xml:space="preserve">Preferred live length here was 45 minutes for half of the respondents and 30 minutes for 28.9%. One open comment said that even one minute online was</w:t>
       </w:r>
       <w:r>
         <w:t xml:space="preserve"> </w:t>
@@ -2626,7 +2561,7 @@
         <w:t xml:space="preserve">“</w:t>
       </w:r>
       <w:r>
-        <w:t xml:space="preserve">very much</w:t>
+        <w:t xml:space="preserve">not suitable.</w:t>
       </w:r>
       <w:r>
         <w:t xml:space="preserve">”</w:t>
@@ -2635,33 +2570,25 @@
         <w:t xml:space="preserve"> </w:t>
       </w:r>
       <w:r>
-        <w:t xml:space="preserve">more often selected</w:t>
-      </w:r>
-      <w:r>
-        <w:t xml:space="preserve"> </w:t>
-      </w:r>
-      <w:r>
-        <w:t xml:space="preserve">“</w:t>
-      </w:r>
-      <w:r>
-        <w:t xml:space="preserve">very high stress,</w:t>
-      </w:r>
-      <w:r>
-        <w:t xml:space="preserve">”</w:t>
-      </w:r>
-      <w:r>
-        <w:t xml:space="preserve"> </w:t>
-      </w:r>
-      <w:r>
-        <w:t xml:space="preserve">and worse reported internet speed was associated with a more negative appraisal of online learning. The questionnaire does not show how institutions adapted. Localization of content and materials would still have been necessary (Lu et al., 2024; Zhao, 2020). It would not, by itself, have answered a synchronous session on an unstable connection, or a required application that respondents marked unusable in their country.</w:t>
+        <w:t xml:space="preserve">A shorter live slot or an asynchronous oral alternative is the suggestion the data can support.</w:t>
+      </w:r>
+    </w:p>
+    <w:bookmarkEnd w:id="40"/>
+    <w:bookmarkStart w:id="41" w:name="collecting-access-data"/>
+    <w:p>
+      <w:pPr>
+        <w:pStyle w:val="Heading3"/>
+      </w:pPr>
+      <w:r>
+        <w:t xml:space="preserve">Collecting access data</w:t>
       </w:r>
     </w:p>
     <w:p>
       <w:pPr>
-        <w:pStyle w:val="BodyText"/>
-      </w:pPr>
-      <w:r>
-        <w:t xml:space="preserve">Those conditions belong to the culture of the class in a narrow, ecological sense: the immediate setting in which language work was asked to happen (van Lier, 2004). They are not a claim about Pakistani culture, nor about a national educational system. Most respondents selected Pakistani nationality, and that is the only Pakistan connection the dataset can support.</w:t>
+        <w:pStyle w:val="FirstParagraph"/>
+      </w:pPr>
+      <w:r>
+        <w:t xml:space="preserve">The form shows household and access conditions. It does not show how institutions adapted. Those conditions should be collected as part of course design, not after complaints.</w:t>
       </w:r>
     </w:p>
     <w:p>
@@ -2669,37 +2596,36 @@
         <w:pStyle w:val="BodyText"/>
       </w:pPr>
       <w:r>
-        <w:t xml:space="preserve">The platform pattern is best read as a possible geography of delivery. Applications often used in Chinese-university teaching (QQ, Chaoxing, DingTalk, Chinese MOOC) were frequently marked unusable, while Zoom and WhatsApp were more often marked available. The questionnaire cannot say whether that pattern reflects country restrictions, routing, account rules, skills, or virtual private networks. It can say that a travelling course which assumes a single institutional toolkit may ask learners to enter a class they cannot reliably open.</w:t>
+        <w:t xml:space="preserve">These suggestions are bound to this sample. They are not a national policy, and they are not evidence that later hybrid teaching has repeated this pattern (Stockwell &amp; Wang, 2023).</w:t>
+      </w:r>
+    </w:p>
+    <w:bookmarkEnd w:id="41"/>
+    <w:bookmarkEnd w:id="42"/>
+    <w:bookmarkStart w:id="43" w:name="limitations"/>
+    <w:p>
+      <w:pPr>
+        <w:pStyle w:val="Heading2"/>
+      </w:pPr>
+      <w:r>
+        <w:t xml:space="preserve">7. Limitations</w:t>
       </w:r>
     </w:p>
     <w:p>
       <w:pPr>
-        <w:pStyle w:val="BodyText"/>
-      </w:pPr>
-      <w:r>
-        <w:t xml:space="preserve">Participation in this dataset co-occurred with reported platform access, power and connectivity problems, and a home that many described as not quiet. That is a description of domestic participation conditions, not a claim that inequality is</w:t>
-      </w:r>
-      <w:r>
-        <w:t xml:space="preserve"> </w:t>
-      </w:r>
-      <w:r>
-        <w:t xml:space="preserve">“</w:t>
-      </w:r>
-      <w:r>
-        <w:t xml:space="preserve">cultural.</w:t>
-      </w:r>
-      <w:r>
-        <w:t xml:space="preserve">”</w:t>
+        <w:pStyle w:val="FirstParagraph"/>
+      </w:pPr>
+      <w:r>
+        <w:t xml:space="preserve">The sample is small (N = 38), network-recruited, and majority male; recruitment channel, host university, program type, and place of residence were not recorded, so all outcomes are self-report from a convenience group whose enrollment was not independently verified. The data are from February 2022 and concern emergency remote teaching; they are not evidence about current hybrid education. The appraisal index is descriptive rather than a validated scale, the infrastructure-problem count is an unvalidated post hoc indicator, the form did not measure institutional adaptation, IP metadata are not a location measure, and no ethics-committee number is available for the 2022 collection (Section 3.5).</w:t>
       </w:r>
     </w:p>
-    <w:bookmarkEnd w:id="40"/>
-    <w:bookmarkStart w:id="45" w:name="pedagogical-implications"/>
+    <w:bookmarkEnd w:id="43"/>
+    <w:bookmarkStart w:id="44" w:name="conclusion"/>
     <w:p>
       <w:pPr>
         <w:pStyle w:val="Heading2"/>
       </w:pPr>
       <w:r>
-        <w:t xml:space="preserve">6. Pedagogical implications</w:t>
+        <w:t xml:space="preserve">8. Conclusion</w:t>
       </w:r>
     </w:p>
     <w:p>
@@ -2707,60 +2633,7 @@
         <w:pStyle w:val="FirstParagraph"/>
       </w:pPr>
       <w:r>
-        <w:t xml:space="preserve">In this sample, the questionnaire can support only a small set of classroom decisions.</w:t>
-      </w:r>
-    </w:p>
-    <w:bookmarkStart w:id="41" w:name="platform-selection"/>
-    <w:p>
-      <w:pPr>
-        <w:pStyle w:val="Heading3"/>
-      </w:pPr>
-      <w:r>
-        <w:t xml:space="preserve">Platform selection</w:t>
-      </w:r>
-    </w:p>
-    <w:p>
-      <w:pPr>
-        <w:pStyle w:val="FirstParagraph"/>
-      </w:pPr>
-      <w:r>
-        <w:t xml:space="preserve">Because QQ and Chaoxing were frequently marked unusable (Table 3), a program should not treat the sending-side toolkit as given. Before it requires a platform, it has to ask whether learners can open it where they sit, and it has to name a usable alternative. WhatsApp was marked available here, but it was not recorded as used for class, so the data do not recommend it as a replacement.</w:t>
-      </w:r>
-    </w:p>
-    <w:bookmarkEnd w:id="41"/>
-    <w:bookmarkStart w:id="42" w:name="assessment-modes"/>
-    <w:p>
-      <w:pPr>
-        <w:pStyle w:val="Heading3"/>
-      </w:pPr>
-      <w:r>
-        <w:t xml:space="preserve">Assessment modes</w:t>
-      </w:r>
-    </w:p>
-    <w:p>
-      <w:pPr>
-        <w:pStyle w:val="FirstParagraph"/>
-      </w:pPr>
-      <w:r>
-        <w:t xml:space="preserve">Because only 28.9% described the home as quiet, 42.1% reported power interruptions, and 76.3% reported unstable networks (Table 2), institutions should not treat a live oral hour as the only assessable performance. Assessment that assumes a quiet, continuous campus hour will mark some of those conditions as learner failure.</w:t>
-      </w:r>
-    </w:p>
-    <w:bookmarkEnd w:id="42"/>
-    <w:bookmarkStart w:id="43" w:name="live-session-duration"/>
-    <w:p>
-      <w:pPr>
-        <w:pStyle w:val="Heading3"/>
-      </w:pPr>
-      <w:r>
-        <w:t xml:space="preserve">Live session duration</w:t>
-      </w:r>
-    </w:p>
-    <w:p>
-      <w:pPr>
-        <w:pStyle w:val="FirstParagraph"/>
-      </w:pPr>
-      <w:r>
-        <w:t xml:space="preserve">Preferred live length here was 45 minutes for half of the respondents and 30 minutes for 28.9%. One open comment said that even one minute online was</w:t>
+        <w:t xml:space="preserve">In this sample, respondents reporting online Chinese-language courses also reported household infrastructure problems and uneven platform access. Those conditions co-occurred with selecting</w:t>
       </w:r>
       <w:r>
         <w:t xml:space="preserve"> </w:t>
@@ -2769,7 +2642,7 @@
         <w:t xml:space="preserve">“</w:t>
       </w:r>
       <w:r>
-        <w:t xml:space="preserve">not suitable.</w:t>
+        <w:t xml:space="preserve">very high stress</w:t>
       </w:r>
       <w:r>
         <w:t xml:space="preserve">”</w:t>
@@ -2778,108 +2651,11 @@
         <w:t xml:space="preserve"> </w:t>
       </w:r>
       <w:r>
-        <w:t xml:space="preserve">A shorter live slot or an asynchronous oral alternative is the suggestion the data can support.</w:t>
-      </w:r>
-    </w:p>
-    <w:bookmarkEnd w:id="43"/>
-    <w:bookmarkStart w:id="44" w:name="collecting-access-data"/>
-    <w:p>
-      <w:pPr>
-        <w:pStyle w:val="Heading3"/>
-      </w:pPr>
-      <w:r>
-        <w:t xml:space="preserve">Collecting access data</w:t>
-      </w:r>
-    </w:p>
-    <w:p>
-      <w:pPr>
-        <w:pStyle w:val="FirstParagraph"/>
-      </w:pPr>
-      <w:r>
-        <w:t xml:space="preserve">The form shows household and access conditions. It does not show how institutions adapted. Those conditions should be collected as part of course design, not after complaints.</w:t>
-      </w:r>
-    </w:p>
-    <w:p>
-      <w:pPr>
-        <w:pStyle w:val="BodyText"/>
-      </w:pPr>
-      <w:r>
-        <w:t xml:space="preserve">These suggestions are bound to this sample. They are not a national policy, and they are not evidence that later hybrid ICLE has repeated this pattern. They do suggest that hybrid models</w:t>
-      </w:r>
-      <w:r>
-        <w:t xml:space="preserve"> </w:t>
-      </w:r>
-      <w:r>
-        <w:rPr>
-          <w:iCs/>
-          <w:i/>
-        </w:rPr>
-        <w:t xml:space="preserve">may</w:t>
-      </w:r>
-      <w:r>
-        <w:t xml:space="preserve"> </w:t>
-      </w:r>
-      <w:r>
-        <w:t xml:space="preserve">reproduce a similar mismatch if the delivery assumptions of a travelling course are left unexamined (Stockwell &amp; Wang, 2023).</w:t>
+        <w:t xml:space="preserve">and with more negative appraisals of online learning. That answer is bounded by N = 38 and by emergency remote teaching (Section 3.1). Whether later hybrid arrangements have closed the gap is a question this study cannot answer. Online Chinese teaching is not only a content problem. It is also a delivery problem.</w:t>
       </w:r>
     </w:p>
     <w:bookmarkEnd w:id="44"/>
-    <w:bookmarkEnd w:id="45"/>
-    <w:bookmarkStart w:id="46" w:name="limitations"/>
-    <w:p>
-      <w:pPr>
-        <w:pStyle w:val="Heading2"/>
-      </w:pPr>
-      <w:r>
-        <w:t xml:space="preserve">7. Limitations</w:t>
-      </w:r>
-    </w:p>
-    <w:p>
-      <w:pPr>
-        <w:pStyle w:val="FirstParagraph"/>
-      </w:pPr>
-      <w:r>
-        <w:t xml:space="preserve">The sample is small (N = 38), network-recruited, and majority male; recruitment channel, host university, program type, and place of residence were not recorded, so all outcomes are self-report from a convenience group whose enrollment was not independently verified. The data are from February 2022 and concern emergency remote teaching; they are not evidence about current hybrid education. The appraisal index is descriptive rather than a validated scale, the infrastructure-problem count is an unvalidated post hoc indicator, the form did not measure institutional adaptation, IP metadata are not a location measure, and no ethics-committee number is available for the 2022 collection (Section 3.5).</w:t>
-      </w:r>
-    </w:p>
-    <w:bookmarkEnd w:id="46"/>
-    <w:bookmarkStart w:id="47" w:name="conclusion"/>
-    <w:p>
-      <w:pPr>
-        <w:pStyle w:val="Heading2"/>
-      </w:pPr>
-      <w:r>
-        <w:t xml:space="preserve">8. Conclusion</w:t>
-      </w:r>
-    </w:p>
-    <w:p>
-      <w:pPr>
-        <w:pStyle w:val="FirstParagraph"/>
-      </w:pPr>
-      <w:r>
-        <w:t xml:space="preserve">In this sample, respondents reporting online Chinese-language courses also reported household infrastructure problems and uneven platform access. Those conditions co-occurred with selecting</w:t>
-      </w:r>
-      <w:r>
-        <w:t xml:space="preserve"> </w:t>
-      </w:r>
-      <w:r>
-        <w:t xml:space="preserve">“</w:t>
-      </w:r>
-      <w:r>
-        <w:t xml:space="preserve">very high stress</w:t>
-      </w:r>
-      <w:r>
-        <w:t xml:space="preserve">”</w:t>
-      </w:r>
-      <w:r>
-        <w:t xml:space="preserve"> </w:t>
-      </w:r>
-      <w:r>
-        <w:t xml:space="preserve">and with more negative appraisals of online learning. That answer is bounded by N = 38 and by emergency remote teaching (Section 3.1). Whether later hybrid arrangements have closed the gap is a question this study cannot answer. Online Chinese teaching is not only a content problem. It is also a delivery problem.</w:t>
-      </w:r>
-    </w:p>
-    <w:bookmarkEnd w:id="47"/>
-    <w:bookmarkStart w:id="48" w:name="appendix-a.-appraisal-items-and-coding"/>
+    <w:bookmarkStart w:id="45" w:name="appendix-a.-appraisal-items-and-coding"/>
     <w:p>
       <w:pPr>
         <w:pStyle w:val="Heading2"/>
@@ -3271,8 +3047,8 @@
         <w:t xml:space="preserve">Index = mean of Q8, Q9, and Q10 (n = 38; no missing on these three).</w:t>
       </w:r>
     </w:p>
-    <w:bookmarkEnd w:id="48"/>
-    <w:bookmarkStart w:id="49" w:name="appendix-b.-secondary-statistics"/>
+    <w:bookmarkEnd w:id="45"/>
+    <w:bookmarkStart w:id="46" w:name="appendix-b.-secondary-statistics"/>
     <w:p>
       <w:pPr>
         <w:pStyle w:val="Heading2"/>
@@ -3337,8 +3113,8 @@
         <w:t xml:space="preserve">≥ .36.</w:t>
       </w:r>
     </w:p>
-    <w:bookmarkEnd w:id="49"/>
-    <w:bookmarkStart w:id="50" w:name="references"/>
+    <w:bookmarkEnd w:id="46"/>
+    <w:bookmarkStart w:id="47" w:name="references"/>
     <w:p>
       <w:pPr>
         <w:pStyle w:val="Heading2"/>
@@ -3415,27 +3191,6 @@
         <w:pStyle w:val="BodyText"/>
       </w:pPr>
       <w:r>
-        <w:t xml:space="preserve">Canagarajah, A. S. (Ed.). (2005).</w:t>
-      </w:r>
-      <w:r>
-        <w:t xml:space="preserve"> </w:t>
-      </w:r>
-      <w:r>
-        <w:rPr>
-          <w:iCs/>
-          <w:i/>
-        </w:rPr>
-        <w:t xml:space="preserve">Reclaiming the local in language policy and practice</w:t>
-      </w:r>
-      <w:r>
-        <w:t xml:space="preserve">. Lawrence Erlbaum.</w:t>
-      </w:r>
-    </w:p>
-    <w:p>
-      <w:pPr>
-        <w:pStyle w:val="BodyText"/>
-      </w:pPr>
-      <w:r>
         <w:t xml:space="preserve">Gacs, A., Goertler, S., &amp; Spasova, S. (2020). Planned online language education versus crisis-prompted online language teaching: Lessons for the future.</w:t>
       </w:r>
       <w:r>
@@ -3688,27 +3443,6 @@
         <w:pStyle w:val="BodyText"/>
       </w:pPr>
       <w:r>
-        <w:t xml:space="preserve">Kumaravadivelu, B. (2001). Toward a postmethod pedagogy.</w:t>
-      </w:r>
-      <w:r>
-        <w:t xml:space="preserve"> </w:t>
-      </w:r>
-      <w:r>
-        <w:rPr>
-          <w:iCs/>
-          <w:i/>
-        </w:rPr>
-        <w:t xml:space="preserve">TESOL Quarterly, 35</w:t>
-      </w:r>
-      <w:r>
-        <w:t xml:space="preserve">(4), 537-560. https://doi.org/10.2307/3588427</w:t>
-      </w:r>
-    </w:p>
-    <w:p>
-      <w:pPr>
-        <w:pStyle w:val="BodyText"/>
-      </w:pPr>
-      <w:r>
         <w:t xml:space="preserve">Li, J., &amp; Li, C. (2024). A scoping review of the research on the teaching models of online international Chinese language teaching.</w:t>
       </w:r>
       <w:r>
@@ -3751,27 +3485,6 @@
         <w:pStyle w:val="BodyText"/>
       </w:pPr>
       <w:r>
-        <w:t xml:space="preserve">Lu, X., Tan, A., Ma, Y., Feng, H., &amp; Hanif, B. (2024). Scenario analysis of localization and adaptation of Chinese language teaching.</w:t>
-      </w:r>
-      <w:r>
-        <w:t xml:space="preserve"> </w:t>
-      </w:r>
-      <w:r>
-        <w:rPr>
-          <w:iCs/>
-          <w:i/>
-        </w:rPr>
-        <w:t xml:space="preserve">Pakistan Journal of Humanities and Social Sciences, 12</w:t>
-      </w:r>
-      <w:r>
-        <w:t xml:space="preserve">(4), 3257-3281. https://doi.org/10.52131/pjhss.2024.v12i4.2553</w:t>
-      </w:r>
-    </w:p>
-    <w:p>
-      <w:pPr>
-        <w:pStyle w:val="BodyText"/>
-      </w:pPr>
-      <w:r>
         <w:t xml:space="preserve">MacIntyre, P. D., Gregersen, T., &amp; Mercer, S. (2020). Language teachers’ coping strategies during the Covid-19 conversion to online teaching: Correlations with stress, wellbeing and negative emotions.</w:t>
       </w:r>
       <w:r>
@@ -3793,30 +3506,6 @@
         <w:pStyle w:val="BodyText"/>
       </w:pPr>
       <w:r>
-        <w:t xml:space="preserve">McDonough, J., &amp; Shaw, C. (2003).</w:t>
-      </w:r>
-      <w:r>
-        <w:t xml:space="preserve"> </w:t>
-      </w:r>
-      <w:r>
-        <w:rPr>
-          <w:iCs/>
-          <w:i/>
-        </w:rPr>
-        <w:t xml:space="preserve">Materials and methods in ELT: A teacher’s guide</w:t>
-      </w:r>
-      <w:r>
-        <w:t xml:space="preserve"> </w:t>
-      </w:r>
-      <w:r>
-        <w:t xml:space="preserve">(2nd ed.). Blackwell.</w:t>
-      </w:r>
-    </w:p>
-    <w:p>
-      <w:pPr>
-        <w:pStyle w:val="BodyText"/>
-      </w:pPr>
-      <w:r>
         <w:t xml:space="preserve">Moorhouse, B. L. (2023). Teachers’ digital technology use after a period of online teaching.</w:t>
       </w:r>
       <w:r>
@@ -3958,27 +3647,6 @@
         <w:pStyle w:val="BodyText"/>
       </w:pPr>
       <w:r>
-        <w:t xml:space="preserve">Shan, Z., &amp; Xu, H. (2024). Students’ conceptions and experiences of institutionalised curriculum for multilingual learning: The case of a dual-foreign-languages programme.</w:t>
-      </w:r>
-      <w:r>
-        <w:t xml:space="preserve"> </w:t>
-      </w:r>
-      <w:r>
-        <w:rPr>
-          <w:iCs/>
-          <w:i/>
-        </w:rPr>
-        <w:t xml:space="preserve">Language, Culture and Curriculum, 37</w:t>
-      </w:r>
-      <w:r>
-        <w:t xml:space="preserve">(2), 230-246. https://doi.org/10.1080/07908318.2024.2313984</w:t>
-      </w:r>
-    </w:p>
-    <w:p>
-      <w:pPr>
-        <w:pStyle w:val="BodyText"/>
-      </w:pPr>
-      <w:r>
         <w:t xml:space="preserve">Stockwell, G., &amp; Wang, Y. (2023). Exploring the challenges of technology in language teaching in the aftermath of the pandemic.</w:t>
       </w:r>
       <w:r>
@@ -4021,30 +3689,6 @@
         <w:pStyle w:val="BodyText"/>
       </w:pPr>
       <w:r>
-        <w:t xml:space="preserve">Tomlinson, B. (Ed.). (2011).</w:t>
-      </w:r>
-      <w:r>
-        <w:t xml:space="preserve"> </w:t>
-      </w:r>
-      <w:r>
-        <w:rPr>
-          <w:iCs/>
-          <w:i/>
-        </w:rPr>
-        <w:t xml:space="preserve">Materials development in language teaching</w:t>
-      </w:r>
-      <w:r>
-        <w:t xml:space="preserve"> </w:t>
-      </w:r>
-      <w:r>
-        <w:t xml:space="preserve">(2nd ed.). Cambridge University Press.</w:t>
-      </w:r>
-    </w:p>
-    <w:p>
-      <w:pPr>
-        <w:pStyle w:val="BodyText"/>
-      </w:pPr>
-      <w:r>
         <w:t xml:space="preserve">Tu, M. (2026). Time and precarity in</w:t>
       </w:r>
       <w:r>
@@ -4310,50 +3954,8 @@
         <w:t xml:space="preserve">(3), 55. https://doi.org/10.3390/jrfm13030055</w:t>
       </w:r>
     </w:p>
-    <w:p>
-      <w:pPr>
-        <w:pStyle w:val="BodyText"/>
-      </w:pPr>
-      <w:r>
-        <w:t xml:space="preserve">Zhao, H., &amp; Huang, J. (2010). China’s policy of Chinese as a foreign language and the use of overseas Confucius Institutes.</w:t>
-      </w:r>
-      <w:r>
-        <w:t xml:space="preserve"> </w:t>
-      </w:r>
-      <w:r>
-        <w:rPr>
-          <w:iCs/>
-          <w:i/>
-        </w:rPr>
-        <w:t xml:space="preserve">Educational Research for Policy and Practice, 9</w:t>
-      </w:r>
-      <w:r>
-        <w:t xml:space="preserve">(2), 127-142. https://doi.org/10.1007/s10671-009-9078-1</w:t>
-      </w:r>
-    </w:p>
-    <w:p>
-      <w:pPr>
-        <w:pStyle w:val="BodyText"/>
-      </w:pPr>
-      <w:r>
-        <w:t xml:space="preserve">Zhao, K. (2020). Localising Chinese language curriculum construction: A case study in an Australian primary school.</w:t>
-      </w:r>
-      <w:r>
-        <w:t xml:space="preserve"> </w:t>
-      </w:r>
-      <w:r>
-        <w:rPr>
-          <w:iCs/>
-          <w:i/>
-        </w:rPr>
-        <w:t xml:space="preserve">Global Chinese, 6</w:t>
-      </w:r>
-      <w:r>
-        <w:t xml:space="preserve">(2), 263-288. https://doi.org/10.1515/glochi-2020-0014</w:t>
-      </w:r>
-    </w:p>
-    <w:bookmarkEnd w:id="50"/>
-    <w:bookmarkEnd w:id="51"/>
+    <w:bookmarkEnd w:id="47"/>
+    <w:bookmarkEnd w:id="48"/>
     <w:sectPr>
       <w:pgSz w:h="15840" w:w="12240"/>
       <w:pgMar w:bottom="1440" w:footer="720" w:gutter="0" w:header="720" w:left="1440" w:right="1440" w:top="1440"/>
@@ -4630,91 +4232,6 @@
     <w:lvl w:ilvl="8">
       <w:numFmt w:val="bullet"/>
       <w:lvlText w:val=" "/>
-      <w:lvlJc w:val="left"/>
-      <w:pPr>
-        <w:ind w:left="6480" w:hanging="480"/>
-      </w:pPr>
-    </w:lvl>
-  </w:abstractNum>
-  <w:abstractNum w:abstractNumId="99411">
-    <w:nsid w:val="A99411"/>
-    <w:multiLevelType w:val="multilevel"/>
-    <w:lvl w:ilvl="0">
-      <w:start w:val="1"/>
-      <w:numFmt w:val="decimal"/>
-      <w:lvlText w:val="%1."/>
-      <w:lvlJc w:val="left"/>
-      <w:pPr>
-        <w:ind w:left="720" w:hanging="480"/>
-      </w:pPr>
-    </w:lvl>
-    <w:lvl w:ilvl="1">
-      <w:start w:val="1"/>
-      <w:numFmt w:val="decimal"/>
-      <w:lvlText w:val="%2."/>
-      <w:lvlJc w:val="left"/>
-      <w:pPr>
-        <w:ind w:left="1440" w:hanging="480"/>
-      </w:pPr>
-    </w:lvl>
-    <w:lvl w:ilvl="2">
-      <w:start w:val="1"/>
-      <w:numFmt w:val="decimal"/>
-      <w:lvlText w:val="%3."/>
-      <w:lvlJc w:val="left"/>
-      <w:pPr>
-        <w:ind w:left="2160" w:hanging="480"/>
-      </w:pPr>
-    </w:lvl>
-    <w:lvl w:ilvl="3">
-      <w:start w:val="1"/>
-      <w:numFmt w:val="decimal"/>
-      <w:lvlText w:val="%4."/>
-      <w:lvlJc w:val="left"/>
-      <w:pPr>
-        <w:ind w:left="2880" w:hanging="480"/>
-      </w:pPr>
-    </w:lvl>
-    <w:lvl w:ilvl="4">
-      <w:start w:val="1"/>
-      <w:numFmt w:val="decimal"/>
-      <w:lvlText w:val="%5."/>
-      <w:lvlJc w:val="left"/>
-      <w:pPr>
-        <w:ind w:left="3600" w:hanging="480"/>
-      </w:pPr>
-    </w:lvl>
-    <w:lvl w:ilvl="5">
-      <w:start w:val="1"/>
-      <w:numFmt w:val="decimal"/>
-      <w:lvlText w:val="%6."/>
-      <w:lvlJc w:val="left"/>
-      <w:pPr>
-        <w:ind w:left="4320" w:hanging="480"/>
-      </w:pPr>
-    </w:lvl>
-    <w:lvl w:ilvl="6">
-      <w:start w:val="1"/>
-      <w:numFmt w:val="decimal"/>
-      <w:lvlText w:val="%7."/>
-      <w:lvlJc w:val="left"/>
-      <w:pPr>
-        <w:ind w:left="5040" w:hanging="480"/>
-      </w:pPr>
-    </w:lvl>
-    <w:lvl w:ilvl="7">
-      <w:start w:val="1"/>
-      <w:numFmt w:val="decimal"/>
-      <w:lvlText w:val="%8."/>
-      <w:lvlJc w:val="left"/>
-      <w:pPr>
-        <w:ind w:left="5760" w:hanging="480"/>
-      </w:pPr>
-    </w:lvl>
-    <w:lvl w:ilvl="8">
-      <w:start w:val="1"/>
-      <w:numFmt w:val="decimal"/>
-      <w:lvlText w:val="%9."/>
       <w:lvlJc w:val="left"/>
       <w:pPr>
         <w:ind w:left="6480" w:hanging="480"/>
@@ -4750,36 +4267,6 @@
   </w:num>
   <w:num w:numId="1000">
     <w:abstractNumId w:val="990"/>
-  </w:num>
-  <w:num w:numId="1001">
-    <w:abstractNumId w:val="99411"/>
-    <w:lvlOverride w:ilvl="0">
-      <w:startOverride w:val="1"/>
-    </w:lvlOverride>
-    <w:lvlOverride w:ilvl="1">
-      <w:startOverride w:val="1"/>
-    </w:lvlOverride>
-    <w:lvlOverride w:ilvl="2">
-      <w:startOverride w:val="1"/>
-    </w:lvlOverride>
-    <w:lvlOverride w:ilvl="3">
-      <w:startOverride w:val="1"/>
-    </w:lvlOverride>
-    <w:lvlOverride w:ilvl="4">
-      <w:startOverride w:val="1"/>
-    </w:lvlOverride>
-    <w:lvlOverride w:ilvl="5">
-      <w:startOverride w:val="1"/>
-    </w:lvlOverride>
-    <w:lvlOverride w:ilvl="6">
-      <w:startOverride w:val="1"/>
-    </w:lvlOverride>
-    <w:lvlOverride w:ilvl="7">
-      <w:startOverride w:val="1"/>
-    </w:lvlOverride>
-    <w:lvlOverride w:ilvl="8">
-      <w:startOverride w:val="1"/>
-    </w:lvlOverride>
   </w:num>
 </w:numbering>
 </file>

</xml_diff>

<commit_message>
Rewrite the manuscript as questionnaire reports, not a course study
Match the title, research question, and implications to the 38 Wenjuan rows. Drop the unverified-learner frame, Pakistan background citations, and program-level prescriptions.

Co-authored-by: kristinehina23-rgb <kristinehina23-rgb@users.noreply.github.com>
</commit_message>
<xml_diff>
--- a/papers/q1-masters-covid/word/manuscript.docx
+++ b/papers/q1-masters-covid/word/manuscript.docx
@@ -2,13 +2,13 @@
 <file path=word/document.xml><?xml version="1.0" encoding="utf-8"?>
 <w:document xmlns:w="http://schemas.openxmlformats.org/wordprocessingml/2006/main" xmlns:m="http://schemas.openxmlformats.org/officeDocument/2006/math" xmlns:r="http://schemas.openxmlformats.org/officeDocument/2006/relationships" xmlns:o="urn:schemas-microsoft-com:office:office" xmlns:v="urn:schemas-microsoft-com:vml" xmlns:w10="urn:schemas-microsoft-com:office:word" xmlns:a="http://schemas.openxmlformats.org/drawingml/2006/main" xmlns:pic="http://schemas.openxmlformats.org/drawingml/2006/picture" xmlns:wp="http://schemas.openxmlformats.org/drawingml/2006/wordprocessingDrawing">
   <w:body>
-    <w:bookmarkStart w:id="48" w:name="X93c39fec4510a5d3ad14aecff5d2131a9fc6cdc"/>
+    <w:bookmarkStart w:id="39" w:name="X6180d3d6f972a26b23eccbb78377f9f0be3dec6"/>
     <w:p>
       <w:pPr>
         <w:pStyle w:val="Heading1"/>
       </w:pPr>
       <w:r>
-        <w:t xml:space="preserve">Home conditions and platform access for online Chinese learners</w:t>
+        <w:t xml:space="preserve">Home and platform reports from an online Chinese questionnaire</w:t>
       </w:r>
     </w:p>
     <w:p>
@@ -26,7 +26,7 @@
         <w:t xml:space="preserve"> </w:t>
       </w:r>
       <w:r>
-        <w:t xml:space="preserve">Home and platform access</w:t>
+        <w:t xml:space="preserve">Home and platform reports</w:t>
       </w:r>
     </w:p>
     <w:bookmarkStart w:id="20" w:name="abstract"/>
@@ -43,7 +43,7 @@
         <w:pStyle w:val="FirstParagraph"/>
       </w:pPr>
       <w:r>
-        <w:t xml:space="preserve">An online Chinese course can keep its hours, platforms, oral tasks, and tests, and still be a course learners cannot take. If home power, network speed, or a required application does not support those arrangements, the content may still be sound while the class is closed. Thirty-eight people who said they were taking online Chinese courses completed a questionnaire written in Chinese. Thirty-seven selected Pakistani nationality. Unstable networks and power interruptions were common. Respondents who said home conditions affected study very much also more often selected very high stress. Worse reported internet speed went with a more negative view of online learning. QQ and Chaoxing were often marked unusable. Zoom and WhatsApp were more often marked available. The sample is small. The questionnaires were collected in February 2022, during emergency remote teaching, so the results do not describe current hybrid practice.</w:t>
+        <w:t xml:space="preserve">In February 2022, 38 people completed a questionnaire written in Chinese about online Chinese study. The form did not record how the link was shared, and it did not ask university, program, or place of residence. Completing it is not treated as proof of enrollment. Respondents reported unstable networks (29 of 38), power interruptions (16 of 38), and homes that were often not quiet (27 of 38). Fourteen said home conditions affected study very much, and 14 selected very high stress; those two answers often appeared together. Worse reported internet speed went with a more negative view of online learning. QQ and Chaoxing were often marked unusable. Zoom and WhatsApp were more often marked available. Several platform items were not asked in every column, so the table is incomplete. The sample is small and belongs to emergency remote teaching. It does not describe a named course or current hybrid practice.</w:t>
       </w:r>
     </w:p>
     <w:p>
@@ -79,7 +79,7 @@
         <w:pStyle w:val="FirstParagraph"/>
       </w:pPr>
       <w:r>
-        <w:t xml:space="preserve">If the hour, the application, the oral task, and the test all assume a quiet home and a stable connection, what should a program do when those conditions are not there?</w:t>
+        <w:t xml:space="preserve">If a short questionnaire from 2022 already shows unstable connections, power interruptions, and applications marked unusable, what should a teacher still check before treating a live online hour as something every student can join?</w:t>
       </w:r>
     </w:p>
     <w:bookmarkEnd w:id="21"/>
@@ -97,7 +97,7 @@
         <w:pStyle w:val="FirstParagraph"/>
       </w:pPr>
       <w:r>
-        <w:t xml:space="preserve">When Chinese teaching moved online, many programs kept the sending class’s timetable and classroom tasks. Task guides still assume that students can join a live session (Gacs et al., 2020; González-Lloret, 2020; Hodges et al., 2020; Payne, 2020; Stockwell &amp; Wang, 2023). That assumption often fails. Studies of online language teaching, including online Chinese, have already noted unstable networks, platforms that are hard to open, thinner talk, and strain (Li &amp; Li, 2024; Moser et al., 2021; Qi, 2025; Russell, 2020; Tao &amp; Gao, 2022). A device in the house is not enough if there is no power, little speed, or no usable application (Ali, 2020; Beaunoyer et al., 2020; Guo &amp; Wan, 2022; Vishnu et al., 2024; Warschauer, 2003). Distance language learning had already asked whether a remote class was even feasible (White, 2006). When those conditions do not hold, the content may still be sound, but the class is closed.</w:t>
+        <w:t xml:space="preserve">Online language teaching has long assumed that students can join a live session (Gacs et al., 2020; González-Lloret, 2020; Hodges et al., 2020; Payne, 2020). Work from the emergency-remote years, including work on Chinese, noted unstable networks, platforms that were hard to open, thinner talk, and strain (Moser et al., 2021; Russell, 2020; Tao &amp; Gao, 2022; Xu et al., 2022). A device is not the same as being able to take part (Beaunoyer et al., 2020; Warschauer, 2003). Distance language learning had already asked whether a remote class was even feasible (White, 2006).</w:t>
       </w:r>
     </w:p>
     <w:p>
@@ -105,7 +105,7 @@
         <w:pStyle w:val="BodyText"/>
       </w:pPr>
       <w:r>
-        <w:t xml:space="preserve">Those difficulties are often named. They are less often measured from the learner’s side. Emergency papers used them as a backdrop for teacher workload, sending-side adaptation, or a video copy of the campus hour (MacIntyre et al., 2020; Moser et al., 2021; Xu et al., 2022). Later papers asked what should remain of that emergency practice (Moorhouse, 2023; Stockwell &amp; Wang, 2023). Reviews still list technical trouble and still say little about household access (Li &amp; Li, 2024; Xu, 2024; Zhang &amp; Osborne, 2026). Planned online courses and studies of learner emotion show what designed online Chinese teaching can look like (Guenier et al., 2026; Qi, 2025; Wen &amp; Liu, 2025). They do not show whether an online class could still be taken where learners sat. Work on international Chinese teaching has said more about what a course says than about whether learners can enter it (Gong et al., 2020b).</w:t>
+        <w:t xml:space="preserve">Those difficulties are often named in reviews and teacher surveys. They are less often counted from a learner questionnaire. Xu, Jin, Deifell, and Angus (2022) show how character teaching was adapted on the sending side. Jin, Xu, and Deifell (2023) report what faculty thought about pandemic online teaching. The present paper does not repeat those designs. It reports one small form.</w:t>
       </w:r>
     </w:p>
     <w:p>
@@ -113,7 +113,7 @@
         <w:pStyle w:val="BodyText"/>
       </w:pPr>
       <w:r>
-        <w:t xml:space="preserve">Access, tasks, interaction, anxiety, and emergency adaptation are already familiar topics in this journal (Gacs et al., 2020; González-Lloret, 2020; Jin et al., 2023; Lomicka, 2020; Payne, 2020; Russell, 2020; Xu et al., 2022; Zhang &amp; Liu, 2023). This study asked a related question from the learner side. Thirty-eight people who reported taking online Chinese courses completed a questionnaire written in Chinese. They were asked about home conditions, connectivity, and platform access, and about stress and their view of online learning. The form cannot show how institutions adapted. It can show the conditions those arrangements had to meet. Time-zone difference and the lack of a Chinese-speaking environment were not measured. Respondents are not treated here as people who had gone home or who could not re-enter campus. Those were common situations in that period. The questionnaire does not record them.</w:t>
+        <w:t xml:space="preserve">Between 5 and 8 February 2022, 38 people submitted a Wenjuan questionnaire written in Chinese. The export title is Influencing factors in international students’ online Chinese learning during COVID-19. The items are those on that form. The form did not record how the link was circulated. It did not ask host university, city, degree status, or scholarship type. Completing a questionnaire written in Chinese is not treated here as proof that the respondent was enrolled in a Chinese course. Thirty-seven of the 38 selected Pakistani nationality. That box is reported as marked. Residence was not checked, and writing on education in Pakistan is not used as evidence about this group.</w:t>
       </w:r>
     </w:p>
     <w:p>
@@ -121,7 +121,7 @@
         <w:pStyle w:val="BodyText"/>
       </w:pPr>
       <w:r>
-        <w:t xml:space="preserve">Thirty-seven of the 38 selected Pakistani nationality. That item is the only Pakistan link in the data. Residence, recruitment, university, program, and physical location were not checked. Writing on Pakistani educational mobility and university e-learning is used only as background for that reported nationality (Butt &amp; Sadaf, 2026; Jamil &amp; Muschert, 2023; Raza &amp; Hennessy, 2025; Tu, 2026). The group is not a verified campus population (Gao &amp; Hua, 2021; Gong et al., 2020a). The paper does not ask whether later hybrid practice has closed the gap. It asks what these 38 people reported:</w:t>
+        <w:t xml:space="preserve">The paper asks one question:</w:t>
       </w:r>
     </w:p>
     <w:p>
@@ -139,7 +139,7 @@
         <w:t xml:space="preserve"> </w:t>
       </w:r>
       <w:r>
-        <w:t xml:space="preserve">What household, connectivity, and platform-access conditions did they report?</w:t>
+        <w:t xml:space="preserve">What household, connectivity, and platform-access conditions did these 38 respondents report?</w:t>
       </w:r>
     </w:p>
     <w:p>
@@ -147,43 +147,25 @@
         <w:pStyle w:val="BodyText"/>
       </w:pPr>
       <w:r>
-        <w:rPr>
-          <w:bCs/>
-          <w:b/>
-        </w:rPr>
-        <w:t xml:space="preserve">RQ2.</w:t>
-      </w:r>
-      <w:r>
-        <w:t xml:space="preserve"> </w:t>
-      </w:r>
-      <w:r>
-        <w:t xml:space="preserve">How did those conditions sit alongside</w:t>
-      </w:r>
-      <w:r>
-        <w:t xml:space="preserve"> </w:t>
-      </w:r>
-      <w:r>
-        <w:t xml:space="preserve">“</w:t>
-      </w:r>
-      <w:r>
-        <w:t xml:space="preserve">very high stress</w:t>
-      </w:r>
-      <w:r>
-        <w:t xml:space="preserve">”</w:t>
-      </w:r>
-      <w:r>
-        <w:t xml:space="preserve"> </w:t>
-      </w:r>
-      <w:r>
-        <w:t xml:space="preserve">and their appraisals of online learning?</w:t>
+        <w:t xml:space="preserve">Other answers on the form are also described: a four-category stress question, a short appraisal of online learning, and a yes/no item on whether online study could replace campus classes. Those answers are counts and same-form associations. They are not a second study.</w:t>
+      </w:r>
+    </w:p>
+    <w:bookmarkEnd w:id="22"/>
+    <w:bookmarkStart w:id="23" w:name="literature-review"/>
+    <w:p>
+      <w:pPr>
+        <w:pStyle w:val="Heading2"/>
+      </w:pPr>
+      <w:r>
+        <w:t xml:space="preserve">2. Literature review</w:t>
       </w:r>
     </w:p>
     <w:p>
       <w:pPr>
-        <w:pStyle w:val="BodyText"/>
-      </w:pPr>
-      <w:r>
-        <w:t xml:space="preserve">The form also asked whether online study could replace campus classes. That item is reported as a count. It is not treated as a third research question.</w:t>
+        <w:pStyle w:val="FirstParagraph"/>
+      </w:pPr>
+      <w:r>
+        <w:t xml:space="preserve">Hodges et al. (2020) distinguished emergency remote teaching from planned online provision. Gacs, Goertler, and Spasova (2020) brought that distinction into language education. In this journal, Russell (2020) treated anxiety as a condition of the online learner, and Xu et al. (2022) documented sending-side adaptation in Chinese character teaching. Later writing asked what should remain of emergency practice and warned against treating a videoconference copy of the classroom as the lesson of the crisis (Moorhouse, 2023; Stockwell &amp; Wang, 2023). Reviews of online Chinese teaching still say more about tools than about household access (Li &amp; Li, 2024; Xu, 2024).</w:t>
       </w:r>
     </w:p>
     <w:p>
@@ -191,26 +173,17 @@
         <w:pStyle w:val="BodyText"/>
       </w:pPr>
       <w:r>
-        <w:t xml:space="preserve">The counts are descriptive. The associations are exploratory.</w:t>
+        <w:t xml:space="preserve">Digital-divide work separates owning a device from being able to use it (van Dijk, 2020; Warschauer, 2003). The present questionnaire asked about power, network stability, speed, the quiet of the home, and whether named applications could be used. It did not measure skills, institutional rules, or whether a platform was blocked. Those later readings are background for the items. They are not tested here.</w:t>
       </w:r>
     </w:p>
-    <w:bookmarkEnd w:id="22"/>
-    <w:bookmarkStart w:id="25" w:name="literature-review"/>
+    <w:bookmarkEnd w:id="23"/>
+    <w:bookmarkStart w:id="28" w:name="methods"/>
     <w:p>
       <w:pPr>
         <w:pStyle w:val="Heading2"/>
       </w:pPr>
       <w:r>
-        <w:t xml:space="preserve">2. Literature review</w:t>
-      </w:r>
-    </w:p>
-    <w:bookmarkStart w:id="23" w:name="later-lenses-on-online-chinese-teaching"/>
-    <w:p>
-      <w:pPr>
-        <w:pStyle w:val="Heading3"/>
-      </w:pPr>
-      <w:r>
-        <w:t xml:space="preserve">2.1 Later lenses on online Chinese teaching</w:t>
+        <w:t xml:space="preserve">3. Methods</w:t>
       </w:r>
     </w:p>
     <w:p>
@@ -218,59 +191,50 @@
         <w:pStyle w:val="FirstParagraph"/>
       </w:pPr>
       <w:r>
-        <w:t xml:space="preserve">Hodges et al. (2020) distinguished emergency remote teaching from planned online provision. Gacs, Goertler, and Spasova (2020) brought that distinction into language education. Language-teacher surveys from the same period describe heavier workloads and uneven preparedness (Moser et al., 2021). Tao and Gao (2022) read the wider literature as a story of technical disruption and thinner engagement. In this journal, Russell (2020) treats language anxiety as a condition of the online learner, and Lomicka (2020) treats interaction as a problem of virtual community rather than of a copied campus hour. That work locates the moment in which the present questionnaire was completed. It is not a substitute for the stress reports in this sample.</w:t>
+        <w:t xml:space="preserve">The study is a secondary analysis of a one-shot questionnaire. There was no recorded pilot and no separate validation study.</w:t>
+      </w:r>
+    </w:p>
+    <w:bookmarkStart w:id="24" w:name="participants"/>
+    <w:p>
+      <w:pPr>
+        <w:pStyle w:val="Heading3"/>
+      </w:pPr>
+      <w:r>
+        <w:t xml:space="preserve">3.1 Participants</w:t>
       </w:r>
     </w:p>
     <w:p>
       <w:pPr>
-        <w:pStyle w:val="BodyText"/>
-      </w:pPr>
-      <w:r>
-        <w:t xml:space="preserve">After the return to campus, studies asked what should remain of emergency online practice (Moorhouse, 2023) and cautioned against treating a videoconference copy of the classroom as the lesson of the crisis (Stockwell &amp; Wang, 2023). For Chinese, contemporaneous policy writing recorded</w:t>
-      </w:r>
-      <w:r>
-        <w:t xml:space="preserve"> </w:t>
-      </w:r>
-      <w:r>
-        <w:t xml:space="preserve">“</w:t>
-      </w:r>
-      <w:r>
-        <w:t xml:space="preserve">suspending classes without stopping learning</w:t>
-      </w:r>
-      <w:r>
-        <w:t xml:space="preserve">”</w:t>
-      </w:r>
-      <w:r>
-        <w:t xml:space="preserve"> </w:t>
-      </w:r>
-      <w:r>
-        <w:t xml:space="preserve">(Zhang et al., 2020). Xu et al. (2022) show how character teaching was adapted on the sending side. Jin et al. (2023) report faculty perceptions of pandemic online teaching. Zhang and Liu (2023) examine online collaborative writing among Chinese-language learners in designed conditions. Later reviews still say more about tools than about household access, and they still flag digital equity as under-examined (Li &amp; Li, 2024; Xu, 2024; Zhang &amp; Osborne, 2026). Designed online Chinese-culture courses show a planned alternative to emergency copying (Guenier et al., 2026). Qi (2025) shows that an online Chinese class can itself become an anxiety-provoking setting. Those studies do not describe the present respondents. Much of that writing still assumes a relatively stable connection. The present questionnaire cannot test whether that assumption holds for current hybrid teaching. It can show what 38 respondents reported.</w:t>
-      </w:r>
-    </w:p>
-    <w:bookmarkEnd w:id="23"/>
-    <w:bookmarkStart w:id="24" w:name="X8fd0326383b50249221392c76a6b8ab8b037526"/>
-    <w:p>
-      <w:pPr>
-        <w:pStyle w:val="Heading3"/>
-      </w:pPr>
-      <w:r>
-        <w:t xml:space="preserve">2.2 Digital inequality and the home learning ecology</w:t>
+        <w:pStyle w:val="FirstParagraph"/>
+      </w:pPr>
+      <w:r>
+        <w:t xml:space="preserve">Thirty-eight complete rows remain. Twenty-seven respondents were men and 11 were women. Thirty-seven selected Pakistani nationality. Self-rated Chinese level was advanced for 22, intermediate for 15, and beginner for one. The label is the respondent’s own, not an official band. Years of learning Chinese clustered at three to four years (26 of 38). Twenty-seven said required courses were online, and 23 said electives were online. Thirty said all of their Chinese classes were online. Twenty-two said they were working while studying. Those answers describe what was marked. They do not identify a named program.</w:t>
       </w:r>
     </w:p>
     <w:p>
       <w:pPr>
-        <w:pStyle w:val="FirstParagraph"/>
-      </w:pPr>
-      <w:r>
-        <w:t xml:space="preserve">Later models of the digital divide distinguish material access from skills, usage, and outcomes (Helsper, 2021; van Dijk, 2020; Warschauer, 2003). Owning a device is not the same as being able to take part (Ali, 2020; Beaunoyer et al., 2020; Guo &amp; Wan, 2022; Vishnu et al., 2024). Work on Pakistani university e-learning reports uneven access, skills, electricity, and household device sharing (Butt &amp; Sadaf, 2026; Jamil &amp; Muschert, 2023; Raza &amp; Hennessy, 2025). The last of those sources is a grey-literature report. None of them is evidence about the 38 respondents here; they are background only for the nationality most of them reported.</w:t>
+        <w:pStyle w:val="BodyText"/>
+      </w:pPr>
+      <w:r>
+        <w:t xml:space="preserve">Wenjuan classified the submission operating system as iPhone (24) or Android (14). That is the device used to send the form, not a list of devices used for class. An IP-province field was also stored. Nine labels were mainland China province names. IP labels can be moved by a virtual private network or proxy. They are not used here as a location variable and are not in the public dataset.</w:t>
+      </w:r>
+    </w:p>
+    <w:bookmarkEnd w:id="24"/>
+    <w:bookmarkStart w:id="25" w:name="instrument-and-collection"/>
+    <w:p>
+      <w:pPr>
+        <w:pStyle w:val="Heading3"/>
+      </w:pPr>
+      <w:r>
+        <w:t xml:space="preserve">3.2 Instrument and collection</w:t>
       </w:r>
     </w:p>
     <w:p>
       <w:pPr>
-        <w:pStyle w:val="BodyText"/>
-      </w:pPr>
-      <w:r>
-        <w:t xml:space="preserve">An ecological view of language education takes the setting of the class, not only the student and the application, as the unit of analysis (Guerrettaz et al., 2021; van Lier, 2004). Domestic space, paid or care work, power interruptions, and applications marked unusable are therefore read as elements of respondents’ immediate learning ecologies. They are material facts, not cultural traits.</w:t>
+        <w:pStyle w:val="FirstParagraph"/>
+      </w:pPr>
+      <w:r>
+        <w:t xml:space="preserve">Complete cases were submitted between 5 and 8 February 2022. The questionnaire had about 30 items: demographics, single-choice ordinals, and multiple-response lists. The items were written in Chinese. Some wording was non-native. Reporting uses English glosses. There was no comprehension check.</w:t>
       </w:r>
     </w:p>
     <w:p>
@@ -278,137 +242,7 @@
         <w:pStyle w:val="BodyText"/>
       </w:pPr>
       <w:r>
-        <w:t xml:space="preserve">This article does not test a theory of localization, nor does it observe how institutions adapted. It reports what 38 respondents said about home conditions and platform access.</w:t>
-      </w:r>
-    </w:p>
-    <w:bookmarkEnd w:id="24"/>
-    <w:bookmarkEnd w:id="25"/>
-    <w:bookmarkStart w:id="31" w:name="methods"/>
-    <w:p>
-      <w:pPr>
-        <w:pStyle w:val="Heading2"/>
-      </w:pPr>
-      <w:r>
-        <w:t xml:space="preserve">3. Methods</w:t>
-      </w:r>
-    </w:p>
-    <w:p>
-      <w:pPr>
-        <w:pStyle w:val="FirstParagraph"/>
-      </w:pPr>
-      <w:r>
-        <w:t xml:space="preserve">The study is an exploratory, cross-sectional questionnaire. It does not test a pre-registered confirmatory model. What follows describes the instrument, the self-selected group who completed it, and the limits of what the questionnaire can support.</w:t>
-      </w:r>
-    </w:p>
-    <w:bookmarkStart w:id="26" w:name="design-and-context"/>
-    <w:p>
-      <w:pPr>
-        <w:pStyle w:val="Heading3"/>
-      </w:pPr>
-      <w:r>
-        <w:t xml:space="preserve">3.1 Design and context</w:t>
-      </w:r>
-    </w:p>
-    <w:p>
-      <w:pPr>
-        <w:pStyle w:val="FirstParagraph"/>
-      </w:pPr>
-      <w:r>
-        <w:t xml:space="preserve">The instrument title on the Wenjuan export is Influencing factors in international students’ online Chinese learning during COVID-19. The items are those on that retained form. No separate validation study or recorded pilot of the instrument is available. This article is a secondary analysis of the completed responses. Complete cases were submitted between 5 and 8 February 2022 (N = 38), during emergency remote teaching. That collection window is a methodological fact; the article does not treat the sample as a picture of current hybrid practice. The form did not record how the link was circulated, so the recruitment channel cannot be named. Respondents were adults who completed a questionnaire written in Chinese about online Chinese learning. Completing that questionnaire is not treated as proof of enrollment in a Chinese university. The instrument did not ask host university, city of residence that week, degree versus non-degree status, or scholarship type. Two items asked whether required courses and electives were being taken online: 27 respondents (71.1%) reported required courses online, and 23 (60.5%) reported electives online. Those answers do not identify a named program. The study therefore concerns a self-selected group of respondents reporting participation in online Chinese-language courses, not a verified enrollment record.</w:t>
-      </w:r>
-    </w:p>
-    <w:bookmarkEnd w:id="26"/>
-    <w:bookmarkStart w:id="27" w:name="participants"/>
-    <w:p>
-      <w:pPr>
-        <w:pStyle w:val="Heading3"/>
-      </w:pPr>
-      <w:r>
-        <w:t xml:space="preserve">3.2 Participants</w:t>
-      </w:r>
-    </w:p>
-    <w:p>
-      <w:pPr>
-        <w:pStyle w:val="FirstParagraph"/>
-      </w:pPr>
-      <w:r>
-        <w:t xml:space="preserve">Of the 38 respondents, 27 were men (71.1%) and 11 were women (28.9%). Thirty-seven selected Pakistani nationality and one selected another nationality. That nationality item is the only Pakistan connection in the dataset. The group is not described as verified Chinese-university enrollment, as Pakistan-resident learners, as CSC students, or as a national sample. Self-rated Chinese level was mostly advanced (22, 57.9%) or intermediate (15, 39.5%), with one beginner; the label is the student’s own, not an HSK band. Years of learning Chinese clustered at three to four years (26, 68.4%). Wenjuan submission metadata classified the operating system as iPhone (24, 63.2%) or Android (14). That variable is the device used to submit the form, not an item about all devices used for class.</w:t>
-      </w:r>
-    </w:p>
-    <w:p>
-      <w:pPr>
-        <w:pStyle w:val="BodyText"/>
-      </w:pPr>
-      <w:r>
-        <w:t xml:space="preserve">Wenjuan automatically recorded an IP-province field. A dummy was coded when that field was a mainland China province name (9 of 38). IP labels are technical metadata. They can be affected by virtual private networks and proxies, and they are not a reliable measure of physical location. They are not used as a participant-location variable and are not the basis of a sensitivity analysis. The dummy, submission dates, and device identifiers are not included in the public dataset.</w:t>
-      </w:r>
-    </w:p>
-    <w:bookmarkEnd w:id="27"/>
-    <w:bookmarkStart w:id="28" w:name="instrument-and-coding"/>
-    <w:p>
-      <w:pPr>
-        <w:pStyle w:val="Heading3"/>
-      </w:pPr>
-      <w:r>
-        <w:t xml:space="preserve">3.3 Instrument and coding</w:t>
-      </w:r>
-    </w:p>
-    <w:p>
-      <w:pPr>
-        <w:pStyle w:val="FirstParagraph"/>
-      </w:pPr>
-      <w:r>
-        <w:t xml:space="preserve">The questionnaire comprised about 30 items: demographics, single-choice ordinals, and multiple-response lists. The items were written in Chinese. Some wording was non-native. Reporting uses English glosses. Self-rated Chinese level was intermediate or advanced for 37 of 38 respondents. The instrument did not include a comprehension check, so completion of a questionnaire written in Chinese is treated only as evidence that respondents were willing to answer in Chinese. Item wording for the appraisal index is given in Appendix A.</w:t>
-      </w:r>
-    </w:p>
-    <w:p>
-      <w:pPr>
-        <w:pStyle w:val="BodyText"/>
-      </w:pPr>
-      <w:r>
-        <w:t xml:space="preserve">A three-item</w:t>
-      </w:r>
-      <w:r>
-        <w:t xml:space="preserve"> </w:t>
-      </w:r>
-      <w:r>
-        <w:rPr>
-          <w:iCs/>
-          <w:i/>
-        </w:rPr>
-        <w:t xml:space="preserve">perceived online-learning appraisal index</w:t>
-      </w:r>
-      <w:r>
-        <w:t xml:space="preserve"> </w:t>
-      </w:r>
-      <w:r>
-        <w:t xml:space="preserve">was formed from learned much (Q8), improves Chinese (Q9), and sparks interest (Q10). The items ask related but not identical questions and are treated as a descriptive index, not as a validated unidimensional scale. Internal consistency was acceptable in this sample (Cronbach’s α = .84); Spearman inter-item correlations ranged from .55 to .75 (Appendix B). Exploratory factor analysis was not used (N = 38). Individual items are also reported. One double-tick on</w:t>
-      </w:r>
-      <w:r>
-        <w:t xml:space="preserve"> </w:t>
-      </w:r>
-      <w:r>
-        <w:t xml:space="preserve">“</w:t>
-      </w:r>
-      <w:r>
-        <w:t xml:space="preserve">like online classes</w:t>
-      </w:r>
-      <w:r>
-        <w:t xml:space="preserve">”</w:t>
-      </w:r>
-      <w:r>
-        <w:t xml:space="preserve"> </w:t>
-      </w:r>
-      <w:r>
-        <w:t xml:space="preserve">was excluded for that item only (n = 37 valid).</w:t>
-      </w:r>
-    </w:p>
-    <w:p>
-      <w:pPr>
-        <w:pStyle w:val="BodyText"/>
-      </w:pPr>
-      <w:r>
-        <w:t xml:space="preserve">Coding follows the Wenjuan export. Higher values on speed, learned, improve, interest, and teacher interaction indicate a more negative report (worse speed; less learning, improvement, or interest; thinner interaction). Stress (Q24) is a four-category questionnaire item coded 1 = very high to 4 = none.</w:t>
+        <w:t xml:space="preserve">A three-item appraisal index was formed from learned much (Q8), improves Chinese (Q9), and sparks interest (Q10). Cronbach’s α was .84 in this sample. The index is a descriptive mean, not a validated scale. Coding follows the export: higher values on speed and on the three appraisal items indicate a worse report. Stress (Q24) is a four-category item.</w:t>
       </w:r>
       <w:r>
         <w:t xml:space="preserve"> </w:t>
@@ -424,15 +258,7 @@
         <w:t xml:space="preserve"> </w:t>
       </w:r>
       <w:r>
-        <w:t xml:space="preserve">is that first category on the form (glossed as very high), not an analyst-created threshold or a cut on a multi-item scale. The focal stress analysis uses a dummy for this category and does not reverse the ordinal. Coding directions are in Appendix A.</w:t>
-      </w:r>
-    </w:p>
-    <w:p>
-      <w:pPr>
-        <w:pStyle w:val="BodyText"/>
-      </w:pPr>
-      <w:r>
-        <w:t xml:space="preserve">The export labeled one multiple-response problem as</w:t>
+        <w:t xml:space="preserve">is the first category on the form, not a clinical cut. One multiple-response option was labeled</w:t>
       </w:r>
       <w:r>
         <w:t xml:space="preserve"> </w:t>
@@ -441,7 +267,7 @@
         <w:t xml:space="preserve">“</w:t>
       </w:r>
       <w:r>
-        <w:t xml:space="preserve">no electricity.</w:t>
+        <w:t xml:space="preserve">no electricity</w:t>
       </w:r>
       <w:r>
         <w:t xml:space="preserve">”</w:t>
@@ -450,7 +276,7 @@
         <w:t xml:space="preserve"> </w:t>
       </w:r>
       <w:r>
-        <w:t xml:space="preserve">In the results the item is reported as</w:t>
+        <w:t xml:space="preserve">on the export; results say</w:t>
       </w:r>
       <w:r>
         <w:t xml:space="preserve"> </w:t>
@@ -463,20 +289,17 @@
         <w:t xml:space="preserve">power interruptions</w:t>
       </w:r>
       <w:r>
-        <w:t xml:space="preserve"> </w:t>
-      </w:r>
-      <w:r>
-        <w:t xml:space="preserve">(export label: no electricity). Chinese MOOC is reported as printed on the form; the option did not name a single provider.</w:t>
+        <w:t xml:space="preserve">. Chinese MOOC is reported as printed on the form.</w:t>
       </w:r>
     </w:p>
-    <w:bookmarkEnd w:id="28"/>
-    <w:bookmarkStart w:id="29" w:name="analysis"/>
+    <w:bookmarkEnd w:id="25"/>
+    <w:bookmarkStart w:id="26" w:name="analysis"/>
     <w:p>
       <w:pPr>
         <w:pStyle w:val="Heading3"/>
       </w:pPr>
       <w:r>
-        <w:t xml:space="preserve">3.4 Analysis</w:t>
+        <w:t xml:space="preserve">3.3 Analysis</w:t>
       </w:r>
     </w:p>
     <w:p>
@@ -484,41 +307,45 @@
         <w:pStyle w:val="FirstParagraph"/>
       </w:pPr>
       <w:r>
-        <w:t xml:space="preserve">Household and platform reports are given as frequencies (Tables 1 to 3). Two associations are treated as focal: home affects study very much with very high stress (two-sided Fisher’s exact test), and internet speed with the appraisal index (Spearman’s ρ, with a percentile bootstrap 95% confidence interval from 5,000 resamples). Replacement judgments are reported as frequencies. Odds ratios and Wald confidence intervals are not reported: at N = 38 they are unstable. Other associations, including gender, are secondary and are placed in Appendix B. Frequencies are n/38 unless noted. Multiple-response items are the percentage who selected the option.</w:t>
-      </w:r>
-      <w:r>
-        <w:t xml:space="preserve"> </w:t>
-      </w:r>
-      <w:r>
-        <w:rPr>
-          <w:iCs/>
-          <w:i/>
-        </w:rPr>
-        <w:t xml:space="preserve">p</w:t>
-      </w:r>
-      <w:r>
-        <w:t xml:space="preserve"> </w:t>
-      </w:r>
-      <w:r>
-        <w:t xml:space="preserve">values are not adjusted for multiplicity and are not interpreted as confirmatory.</w:t>
+        <w:t xml:space="preserve">Household and platform answers are frequencies (Tables 1 to 3). Two same-form associations are also given: home affects study very much with very high stress (two-sided Fisher’s exact test), and internet speed with the appraisal index (Spearman’s ρ, percentile bootstrap 95% confidence interval, 5,000 resamples). The replacement item is a count. Odds ratios are not reported. Frequencies are n/38 unless noted. Multiple-response items are the share who selected the option.</w:t>
+      </w:r>
+    </w:p>
+    <w:bookmarkEnd w:id="26"/>
+    <w:bookmarkStart w:id="27" w:name="ethics"/>
+    <w:p>
+      <w:pPr>
+        <w:pStyle w:val="Heading3"/>
+      </w:pPr>
+      <w:r>
+        <w:t xml:space="preserve">3.4 Ethics</w:t>
       </w:r>
     </w:p>
     <w:p>
       <w:pPr>
-        <w:pStyle w:val="BodyText"/>
-      </w:pPr>
-      <w:r>
-        <w:t xml:space="preserve">A Pakistani-nationality check (n = 37) is reported only to show that dropping the one non-Pakistani case does not reverse the two focal associations. It is not a location analysis.</w:t>
+        <w:pStyle w:val="FirstParagraph"/>
+      </w:pPr>
+      <w:r>
+        <w:t xml:space="preserve">The form was presented as research on online Chinese learning and said that answers would be used for research. Completion and submission were treated as consent. No institutional ethics approval number is available for the 2022 collection. The first author was then a master’s student, and numbered approval was not obtained. Names, IP addresses, exact timestamps, and device identifiers were removed before the public dataset was prepared. No new data were collected.</w:t>
       </w:r>
     </w:p>
-    <w:bookmarkEnd w:id="29"/>
-    <w:bookmarkStart w:id="30" w:name="ethics-and-data-protection"/>
+    <w:bookmarkEnd w:id="27"/>
+    <w:bookmarkEnd w:id="28"/>
+    <w:bookmarkStart w:id="32" w:name="results"/>
     <w:p>
       <w:pPr>
+        <w:pStyle w:val="Heading2"/>
+      </w:pPr>
+      <w:r>
+        <w:t xml:space="preserve">4. Results</w:t>
+      </w:r>
+    </w:p>
+    <w:bookmarkStart w:id="29" w:name="Xde1493b68d584d3ae1d49aefd1652d63a9010bf"/>
+    <w:p>
+      <w:pPr>
         <w:pStyle w:val="Heading3"/>
       </w:pPr>
       <w:r>
-        <w:t xml:space="preserve">3.5 Ethics and data protection</w:t>
+        <w:t xml:space="preserve">4.1 Who answered, and what they reported at home</w:t>
       </w:r>
     </w:p>
     <w:p>
@@ -526,43 +353,7 @@
         <w:pStyle w:val="FirstParagraph"/>
       </w:pPr>
       <w:r>
-        <w:t xml:space="preserve">Adult respondents completed an online form presented as research on online Chinese learning. The form stated that answers would be used for research, and completion and submission were treated as consent.</w:t>
-      </w:r>
-    </w:p>
-    <w:p>
-      <w:pPr>
-        <w:pStyle w:val="BodyText"/>
-      </w:pPr>
-      <w:r>
-        <w:t xml:space="preserve">No institutional ethics approval number is available for the original 2022 data collection. The first author was then a master’s student, and numbered approval was not obtained. This article reports an anonymized secondary analysis of those completed responses. No new data were collected. Names, IP addresses, exact timestamps, and device identifiers were removed before the public dataset was prepared.</w:t>
-      </w:r>
-    </w:p>
-    <w:bookmarkEnd w:id="30"/>
-    <w:bookmarkEnd w:id="31"/>
-    <w:bookmarkStart w:id="36" w:name="results"/>
-    <w:p>
-      <w:pPr>
-        <w:pStyle w:val="Heading2"/>
-      </w:pPr>
-      <w:r>
-        <w:t xml:space="preserve">4. Results</w:t>
-      </w:r>
-    </w:p>
-    <w:bookmarkStart w:id="32" w:name="respondents-and-household-conditions"/>
-    <w:p>
-      <w:pPr>
-        <w:pStyle w:val="Heading3"/>
-      </w:pPr>
-      <w:r>
-        <w:t xml:space="preserve">4.1 Respondents and household conditions</w:t>
-      </w:r>
-    </w:p>
-    <w:p>
-      <w:pPr>
-        <w:pStyle w:val="FirstParagraph"/>
-      </w:pPr>
-      <w:r>
-        <w:t xml:space="preserve">Table 1 locates the sample. Most respondents said all of their Chinese classes were online, and more than half reported working alongside study.</w:t>
+        <w:t xml:space="preserve">Table 1 summarizes the marked background items.</w:t>
       </w:r>
     </w:p>
     <w:p>
@@ -1038,7 +829,7 @@
         <w:t xml:space="preserve"> </w:t>
       </w:r>
       <w:r>
-        <w:t xml:space="preserve">Convenience sample, Wenjuan, 5 to 8 February 2022. Device is the operating system recorded at submission, reported only as an aggregate.</w:t>
+        <w:t xml:space="preserve">Wenjuan, 5 to 8 February 2022. Device is the operating system recorded at submission.</w:t>
       </w:r>
     </w:p>
     <w:p>
@@ -1046,7 +837,7 @@
         <w:pStyle w:val="BodyText"/>
       </w:pPr>
       <w:r>
-        <w:t xml:space="preserve">Table 2 reports the household and connectivity conditions. The key figures are unstable networks (76.3%), power interruptions (42.1%), and very high stress (36.8%). Four respondents said their country did not have internet, yet all 38 submitted an online form. The item wording does not allow a firm reinterpretation, so the response is reported as given. Only 11 of 38 described the home as quiet.</w:t>
+        <w:t xml:space="preserve">Table 2 gives the household and connectivity reports. Twenty-nine of 38 marked an unstable network. Sixteen marked power interruptions. Twenty-seven said the home was not quiet. Fourteen said the home affected study very much, and 14 selected very high stress. Four people marked that their country did not have internet, yet all 38 submitted an online form. The wording does not allow a firm rereading, so that answer is left as marked.</w:t>
       </w:r>
     </w:p>
     <w:p>
@@ -1070,7 +861,7 @@
           <w:iCs/>
           <w:i/>
         </w:rPr>
-        <w:t xml:space="preserve">Reported conditions and selected outcomes (N = 38)</w:t>
+        <w:t xml:space="preserve">Reported conditions and selected other items (N = 38)</w:t>
       </w:r>
     </w:p>
     <w:tbl>
@@ -1469,14 +1260,14 @@
         </w:tc>
       </w:tr>
     </w:tbl>
-    <w:bookmarkEnd w:id="32"/>
-    <w:bookmarkStart w:id="33" w:name="platform-access"/>
+    <w:bookmarkEnd w:id="29"/>
+    <w:bookmarkStart w:id="30" w:name="platform-items"/>
     <w:p>
       <w:pPr>
         <w:pStyle w:val="Heading3"/>
       </w:pPr>
       <w:r>
-        <w:t xml:space="preserve">4.2 Platform access</w:t>
+        <w:t xml:space="preserve">4.2 Platform items</w:t>
       </w:r>
     </w:p>
     <w:p>
@@ -1484,7 +1275,61 @@
         <w:pStyle w:val="FirstParagraph"/>
       </w:pPr>
       <w:r>
-        <w:t xml:space="preserve">Table 3 shows uneven access to institutionally familiar and consumer-facing platforms. The questionnaire cannot isolate country restrictions, routing, account rules, skills, or virtual private networks. The pattern used for later discussion is that QQ and Chaoxing were frequently marked unusable, while Zoom and WhatsApp were more often marked available. WhatsApp appears only as available; the retained form did not code whether it was used for class. Tencent Meeting was the most used class tool but was marked available by fewer respondents, a discrepancy left as an item-level inconsistency.</w:t>
+        <w:t xml:space="preserve">Table 3 is incomplete by design. Some platforms were asked as</w:t>
+      </w:r>
+      <w:r>
+        <w:t xml:space="preserve"> </w:t>
+      </w:r>
+      <w:r>
+        <w:t xml:space="preserve">“</w:t>
+      </w:r>
+      <w:r>
+        <w:t xml:space="preserve">used for class,</w:t>
+      </w:r>
+      <w:r>
+        <w:t xml:space="preserve">”</w:t>
+      </w:r>
+      <w:r>
+        <w:t xml:space="preserve"> </w:t>
+      </w:r>
+      <w:r>
+        <w:t xml:space="preserve">some as</w:t>
+      </w:r>
+      <w:r>
+        <w:t xml:space="preserve"> </w:t>
+      </w:r>
+      <w:r>
+        <w:t xml:space="preserve">“</w:t>
+      </w:r>
+      <w:r>
+        <w:t xml:space="preserve">unusable in my country,</w:t>
+      </w:r>
+      <w:r>
+        <w:t xml:space="preserve">”</w:t>
+      </w:r>
+      <w:r>
+        <w:t xml:space="preserve"> </w:t>
+      </w:r>
+      <w:r>
+        <w:t xml:space="preserve">and some as</w:t>
+      </w:r>
+      <w:r>
+        <w:t xml:space="preserve"> </w:t>
+      </w:r>
+      <w:r>
+        <w:t xml:space="preserve">“</w:t>
+      </w:r>
+      <w:r>
+        <w:t xml:space="preserve">can use in my country.</w:t>
+      </w:r>
+      <w:r>
+        <w:t xml:space="preserve">”</w:t>
+      </w:r>
+      <w:r>
+        <w:t xml:space="preserve"> </w:t>
+      </w:r>
+      <w:r>
+        <w:t xml:space="preserve">WhatsApp has no used-for-class column. QQ, Chaoxing, DingTalk, and Chinese MOOC have no used-for-class column. Tencent Meeting was the most marked class tool (71.1%) and was marked available by fewer respondents (57.9%). That mismatch is left as an item problem. The table cannot separate country rules, routing, accounts, skills, or a virtual private network.</w:t>
       </w:r>
     </w:p>
     <w:p>
@@ -1508,7 +1353,7 @@
           <w:iCs/>
           <w:i/>
         </w:rPr>
-        <w:t xml:space="preserve">Reported use and perceived availability of platforms (multiple response, N = 38)</w:t>
+        <w:t xml:space="preserve">Platform items as asked (multiple response, N = 38)</w:t>
       </w:r>
     </w:p>
     <w:tbl>
@@ -2011,35 +1856,17 @@
         <w:t xml:space="preserve"> </w:t>
       </w:r>
       <w:r>
-        <w:t xml:space="preserve">is the stem wording. QQ, Chaoxing, DingTalk, and Chinese MOOC are platforms often used in Chinese-university teaching; they are not exclusively campus systems.</w:t>
-      </w:r>
-      <w:r>
-        <w:t xml:space="preserve"> </w:t>
-      </w:r>
-      <w:r>
-        <w:t xml:space="preserve">“</w:t>
-      </w:r>
-      <w:r>
-        <w:t xml:space="preserve">Marked unusable</w:t>
-      </w:r>
-      <w:r>
-        <w:t xml:space="preserve">”</w:t>
-      </w:r>
-      <w:r>
-        <w:t xml:space="preserve"> </w:t>
-      </w:r>
-      <w:r>
-        <w:t xml:space="preserve">follows the item wording and is not a technical claim that the platform was blocked.</w:t>
+        <w:t xml:space="preserve">is the stem wording.</w:t>
       </w:r>
     </w:p>
-    <w:bookmarkEnd w:id="33"/>
-    <w:bookmarkStart w:id="34" w:name="stress-and-appraisals"/>
+    <w:bookmarkEnd w:id="30"/>
+    <w:bookmarkStart w:id="31" w:name="stress-appraisals-and-replacement"/>
     <w:p>
       <w:pPr>
         <w:pStyle w:val="Heading3"/>
       </w:pPr>
       <w:r>
-        <w:t xml:space="preserve">4.3 Stress and appraisals</w:t>
+        <w:t xml:space="preserve">4.3 Stress, appraisals, and replacement</w:t>
       </w:r>
     </w:p>
     <w:p>
@@ -2047,25 +1874,7 @@
         <w:pStyle w:val="FirstParagraph"/>
       </w:pPr>
       <w:r>
-        <w:t xml:space="preserve">Among those who said the home affected study very much, 11 of 14 also selected</w:t>
-      </w:r>
-      <w:r>
-        <w:t xml:space="preserve"> </w:t>
-      </w:r>
-      <w:r>
-        <w:t xml:space="preserve">“</w:t>
-      </w:r>
-      <w:r>
-        <w:t xml:space="preserve">very high</w:t>
-      </w:r>
-      <w:r>
-        <w:t xml:space="preserve">”</w:t>
-      </w:r>
-      <w:r>
-        <w:t xml:space="preserve"> </w:t>
-      </w:r>
-      <w:r>
-        <w:t xml:space="preserve">psychological stress; among the others, 3 of 24 did (two-sided Fisher’s exact</w:t>
+        <w:t xml:space="preserve">Among those who said the home affected study very much, 11 of 14 also selected very high stress; among the others, 3 of 24 did (two-sided Fisher’s exact</w:t>
       </w:r>
       <w:r>
         <w:t xml:space="preserve"> </w:t>
@@ -2081,15 +1890,7 @@
         <w:t xml:space="preserve"> </w:t>
       </w:r>
       <w:r>
-        <w:t xml:space="preserve">= .00008). That is a co-occurrence in this dataset, not evidence that the household caused stress.</w:t>
-      </w:r>
-    </w:p>
-    <w:p>
-      <w:pPr>
-        <w:pStyle w:val="BodyText"/>
-      </w:pPr>
-      <w:r>
-        <w:t xml:space="preserve">Worse internet speed was associated with a worse appraisal index (ρ = .65,</w:t>
+        <w:t xml:space="preserve">= .00008). Worse internet speed went with a worse appraisal index (ρ = .65, percentile bootstrap 95% CI [.36, .84],</w:t>
       </w:r>
       <w:r>
         <w:t xml:space="preserve"> </w:t>
@@ -2105,7 +1906,7 @@
         <w:t xml:space="preserve"> </w:t>
       </w:r>
       <w:r>
-        <w:t xml:space="preserve">&lt; .001, percentile bootstrap 95% CI [.36, .84]; Table 4). An unvalidated post hoc count of selected infrastructure-problem options (unstable network, power interruptions, no signal) was not associated with the index (ρ = .02). That count is not interpreted as evidence against the role of infrastructure.</w:t>
+        <w:t xml:space="preserve">&lt; .001). Both pairs come from the same form. They are reported as co-occurrence, not as cause.</w:t>
       </w:r>
     </w:p>
     <w:p>
@@ -2131,7 +1932,7 @@
         <w:t xml:space="preserve"> </w:t>
       </w:r>
       <w:r>
-        <w:t xml:space="preserve">was uncommon (6 of 38). Preferred live length was 45 minutes for half of the respondents and 30 minutes for 28.9%. One open comment said that even one minute online was</w:t>
+        <w:t xml:space="preserve">was marked by 6 of 38. Preferred live length was 45 minutes for 19 respondents and 30 minutes for 11. One open comment said that even one minute online was</w:t>
       </w:r>
       <w:r>
         <w:t xml:space="preserve"> </w:t>
@@ -2151,208 +1952,26 @@
         <w:pStyle w:val="BodyText"/>
       </w:pPr>
       <w:r>
-        <w:rPr>
-          <w:bCs/>
-          <w:b/>
-        </w:rPr>
-        <w:t xml:space="preserve">Table 4</w:t>
+        <w:t xml:space="preserve">Nineteen said online study could replace campus classes, and 19 said it could not.</w:t>
+      </w:r>
+    </w:p>
+    <w:bookmarkEnd w:id="31"/>
+    <w:bookmarkEnd w:id="32"/>
+    <w:bookmarkStart w:id="33" w:name="discussion"/>
+    <w:p>
+      <w:pPr>
+        <w:pStyle w:val="Heading2"/>
+      </w:pPr>
+      <w:r>
+        <w:t xml:space="preserve">5. Discussion</w:t>
       </w:r>
     </w:p>
     <w:p>
       <w:pPr>
-        <w:pStyle w:val="BodyText"/>
-      </w:pPr>
-      <w:r>
-        <w:rPr>
-          <w:iCs/>
-          <w:i/>
-        </w:rPr>
-        <w:t xml:space="preserve">Focal associations (N = 38)</w:t>
-      </w:r>
-    </w:p>
-    <w:tbl>
-      <w:tblPr>
-        <w:tblStyle w:val="Table"/>
-        <w:tblW w:type="pct" w:w="5000"/>
-        <w:tblLook w:firstRow="1" w:lastRow="0" w:firstColumn="0" w:lastColumn="0" w:noHBand="0" w:noVBand="0" w:val="0020"/>
-        <w:jc w:val="start"/>
-      </w:tblPr>
-      <w:tblGrid>
-        <w:gridCol w:w="3960"/>
-        <w:gridCol w:w="3960"/>
-      </w:tblGrid>
-      <w:tr>
-        <w:trPr>
-          <w:tblHeader w:val="true"/>
-        </w:trPr>
-        <w:tc>
-          <w:tcPr/>
-          <w:p>
-            <w:pPr>
-              <w:pStyle w:val="Compact"/>
-              <w:jc w:val="left"/>
-            </w:pPr>
-            <w:r>
-              <w:t xml:space="preserve">Association</w:t>
-            </w:r>
-          </w:p>
-        </w:tc>
-        <w:tc>
-          <w:tcPr/>
-          <w:p>
-            <w:pPr>
-              <w:pStyle w:val="Compact"/>
-              <w:jc w:val="left"/>
-            </w:pPr>
-            <w:r>
-              <w:t xml:space="preserve">Result</w:t>
-            </w:r>
-          </w:p>
-        </w:tc>
-      </w:tr>
-      <w:tr>
-        <w:tc>
-          <w:tcPr/>
-          <w:p>
-            <w:pPr>
-              <w:pStyle w:val="Compact"/>
-              <w:jc w:val="left"/>
-            </w:pPr>
-            <w:r>
-              <w:t xml:space="preserve">Home affects study very much × very high stress</w:t>
-            </w:r>
-          </w:p>
-        </w:tc>
-        <w:tc>
-          <w:tcPr/>
-          <w:p>
-            <w:pPr>
-              <w:pStyle w:val="Compact"/>
-              <w:jc w:val="left"/>
-            </w:pPr>
-            <w:r>
-              <w:t xml:space="preserve">11/14 vs 3/24; two-sided Fisher’s exact</w:t>
-            </w:r>
-            <w:r>
-              <w:t xml:space="preserve"> </w:t>
-            </w:r>
-            <w:r>
-              <w:rPr>
-                <w:iCs/>
-                <w:i/>
-              </w:rPr>
-              <w:t xml:space="preserve">p</w:t>
-            </w:r>
-            <w:r>
-              <w:t xml:space="preserve"> </w:t>
-            </w:r>
-            <w:r>
-              <w:t xml:space="preserve">= .00008</w:t>
-            </w:r>
-          </w:p>
-        </w:tc>
-      </w:tr>
-      <w:tr>
-        <w:tc>
-          <w:tcPr/>
-          <w:p>
-            <w:pPr>
-              <w:pStyle w:val="Compact"/>
-              <w:jc w:val="left"/>
-            </w:pPr>
-            <w:r>
-              <w:t xml:space="preserve">Speed (worse) × appraisal index (worse)</w:t>
-            </w:r>
-          </w:p>
-        </w:tc>
-        <w:tc>
-          <w:tcPr/>
-          <w:p>
-            <w:pPr>
-              <w:pStyle w:val="Compact"/>
-              <w:jc w:val="left"/>
-            </w:pPr>
-            <w:r>
-              <w:t xml:space="preserve">ρ = .65, percentile bootstrap 95% CI [.36, .84],</w:t>
-            </w:r>
-            <w:r>
-              <w:t xml:space="preserve"> </w:t>
-            </w:r>
-            <w:r>
-              <w:rPr>
-                <w:iCs/>
-                <w:i/>
-              </w:rPr>
-              <w:t xml:space="preserve">p</w:t>
-            </w:r>
-            <w:r>
-              <w:t xml:space="preserve"> </w:t>
-            </w:r>
-            <w:r>
-              <w:t xml:space="preserve">&lt; .001</w:t>
-            </w:r>
-          </w:p>
-        </w:tc>
-      </w:tr>
-      <w:tr>
-        <w:tc>
-          <w:tcPr/>
-          <w:p>
-            <w:pPr>
-              <w:pStyle w:val="Compact"/>
-              <w:jc w:val="left"/>
-            </w:pPr>
-            <w:r>
-              <w:t xml:space="preserve">Infrastructure-problem count × appraisal index (exploratory post hoc)</w:t>
-            </w:r>
-          </w:p>
-        </w:tc>
-        <w:tc>
-          <w:tcPr/>
-          <w:p>
-            <w:pPr>
-              <w:pStyle w:val="Compact"/>
-              <w:jc w:val="left"/>
-            </w:pPr>
-            <w:r>
-              <w:t xml:space="preserve">ρ = .02, percentile bootstrap 95% CI [−.32, .37],</w:t>
-            </w:r>
-            <w:r>
-              <w:t xml:space="preserve"> </w:t>
-            </w:r>
-            <w:r>
-              <w:rPr>
-                <w:iCs/>
-                <w:i/>
-              </w:rPr>
-              <w:t xml:space="preserve">p</w:t>
-            </w:r>
-            <w:r>
-              <w:t xml:space="preserve"> </w:t>
-            </w:r>
-            <w:r>
-              <w:t xml:space="preserve">= .91</w:t>
-            </w:r>
-          </w:p>
-        </w:tc>
-      </w:tr>
-    </w:tbl>
-    <w:p>
-      <w:pPr>
-        <w:pStyle w:val="BodyText"/>
-      </w:pPr>
-      <w:r>
-        <w:rPr>
-          <w:iCs/>
-          <w:i/>
-        </w:rPr>
-        <w:t xml:space="preserve">Note.</w:t>
-      </w:r>
-      <w:r>
-        <w:t xml:space="preserve"> </w:t>
-      </w:r>
-      <w:r>
-        <w:t xml:space="preserve">Analyses are exploratory. Odds ratios are omitted. The infrastructure-problem count is an unvalidated post hoc indicator and is not treated as a parallel scale.</w:t>
+        <w:pStyle w:val="FirstParagraph"/>
+      </w:pPr>
+      <w:r>
+        <w:t xml:space="preserve">The 38 rows show a familiar list: unstable networks, power interruptions, homes that were often not quiet, and some applications marked unusable. That list matches trouble the field has already named (Tao &amp; Gao, 2022; Xu et al., 2022). It does not show how any institution taught, and it does not show that these respondents sat in one travelling course.</w:t>
       </w:r>
     </w:p>
     <w:p>
@@ -2360,33 +1979,43 @@
         <w:pStyle w:val="BodyText"/>
       </w:pPr>
       <w:r>
-        <w:t xml:space="preserve">Among Pakistani-nationality respondents only (n = 37), the home and stress table remained 11/14 versus 3/23 (two-sided Fisher’s exact</w:t>
-      </w:r>
-      <w:r>
-        <w:t xml:space="preserve"> </w:t>
-      </w:r>
-      <w:r>
-        <w:rPr>
-          <w:iCs/>
-          <w:i/>
-        </w:rPr>
-        <w:t xml:space="preserve">p</w:t>
-      </w:r>
-      <w:r>
-        <w:t xml:space="preserve"> </w:t>
-      </w:r>
-      <w:r>
-        <w:t xml:space="preserve">= .00011) and speed × appraisal was ρ = .67 (percentile bootstrap 95% CI [.39, .85]).</w:t>
+        <w:t xml:space="preserve">The stress and appraisal associations sit on the same questionnaire as the home and speed items. A person having a hard week could mark both. The 19/19 replacement split is a split, not a finding about online Chinese teaching.</w:t>
+      </w:r>
+    </w:p>
+    <w:p>
+      <w:pPr>
+        <w:pStyle w:val="BodyText"/>
+      </w:pPr>
+      <w:r>
+        <w:t xml:space="preserve">Table 3 can be read only as marked options. QQ and Chaoxing were often marked unusable. Zoom and WhatsApp were more often marked available. Because the columns were not asked for every platform, the table cannot support a map of which tools a Chinese program should drop.</w:t>
+      </w:r>
+    </w:p>
+    <w:bookmarkEnd w:id="33"/>
+    <w:bookmarkStart w:id="34" w:name="pedagogical-implications"/>
+    <w:p>
+      <w:pPr>
+        <w:pStyle w:val="Heading2"/>
+      </w:pPr>
+      <w:r>
+        <w:t xml:space="preserve">6. Pedagogical implications</w:t>
+      </w:r>
+    </w:p>
+    <w:p>
+      <w:pPr>
+        <w:pStyle w:val="FirstParagraph"/>
+      </w:pPr>
+      <w:r>
+        <w:t xml:space="preserve">These 38 answers cannot tell a program which platform to adopt or how long a live hour should last. They can remind a teacher to ask, before treating attendance as simple, whether the home is quiet enough for speech, whether the power and the connection hold, and whether the required application opens. WhatsApp was often marked available here, but the form did not ask whether it was used for class, so it is not recommended from these data. A live oral test that assumes a campus hour will treat some of the conditions in Table 2 as learner failure. That is a risk worth naming. It is not a policy derived from this sample.</w:t>
       </w:r>
     </w:p>
     <w:bookmarkEnd w:id="34"/>
-    <w:bookmarkStart w:id="35" w:name="replacement-judgments"/>
+    <w:bookmarkStart w:id="35" w:name="limitations"/>
     <w:p>
       <w:pPr>
-        <w:pStyle w:val="Heading3"/>
-      </w:pPr>
-      <w:r>
-        <w:t xml:space="preserve">4.4 Replacement judgments</w:t>
+        <w:pStyle w:val="Heading2"/>
+      </w:pPr>
+      <w:r>
+        <w:t xml:space="preserve">7. Limitations</w:t>
       </w:r>
     </w:p>
     <w:p>
@@ -2394,18 +2023,17 @@
         <w:pStyle w:val="FirstParagraph"/>
       </w:pPr>
       <w:r>
-        <w:t xml:space="preserve">Nineteen of 38 said online study could replace campus classes, and 19 said it could not. The form was split. That count is reported here because the item was on the questionnaire. It is not treated as a test of gender or of household type.</w:t>
+        <w:t xml:space="preserve">The sample is 38 self-selected rows from four days in February 2022. Recruitment is unknown. Enrollment was not verified. The instrument was not piloted. Several platform columns were never asked. The appraisal index is a local mean. There is no ethics-committee number for the original collection. The results are not a picture of current hybrid teaching.</w:t>
       </w:r>
     </w:p>
     <w:bookmarkEnd w:id="35"/>
-    <w:bookmarkEnd w:id="36"/>
-    <w:bookmarkStart w:id="37" w:name="discussion"/>
+    <w:bookmarkStart w:id="36" w:name="conclusion"/>
     <w:p>
       <w:pPr>
         <w:pStyle w:val="Heading2"/>
       </w:pPr>
       <w:r>
-        <w:t xml:space="preserve">5. Discussion</w:t>
+        <w:t xml:space="preserve">8. Conclusion</w:t>
       </w:r>
     </w:p>
     <w:p>
@@ -2413,263 +2041,17 @@
         <w:pStyle w:val="FirstParagraph"/>
       </w:pPr>
       <w:r>
-        <w:t xml:space="preserve">In this sample, the difficulties the field has named, networks, platforms, interaction, and strain, were present as learner-side reports. Those who said the home affected study</w:t>
-      </w:r>
-      <w:r>
-        <w:t xml:space="preserve"> </w:t>
-      </w:r>
-      <w:r>
-        <w:t xml:space="preserve">“</w:t>
-      </w:r>
-      <w:r>
-        <w:t xml:space="preserve">very much</w:t>
-      </w:r>
-      <w:r>
-        <w:t xml:space="preserve">”</w:t>
-      </w:r>
-      <w:r>
-        <w:t xml:space="preserve"> </w:t>
-      </w:r>
-      <w:r>
-        <w:t xml:space="preserve">more often selected</w:t>
-      </w:r>
-      <w:r>
-        <w:t xml:space="preserve"> </w:t>
-      </w:r>
-      <w:r>
-        <w:t xml:space="preserve">“</w:t>
-      </w:r>
-      <w:r>
-        <w:t xml:space="preserve">very high stress,</w:t>
-      </w:r>
-      <w:r>
-        <w:t xml:space="preserve">”</w:t>
-      </w:r>
-      <w:r>
-        <w:t xml:space="preserve"> </w:t>
-      </w:r>
-      <w:r>
-        <w:t xml:space="preserve">and worse reported internet speed was associated with a more negative appraisal of online learning. Both associations come from one questionnaire. They are co-occurrences, not proof that the household caused stress or that speed caused a worse view of the class.</w:t>
+        <w:t xml:space="preserve">Thirty-eight people who completed this 2022 questionnaire reported home and platform trouble alongside stress and mixed views of online study. That is all these rows can carry. Whether later teaching has closed that gap is a question they cannot answer.</w:t>
       </w:r>
     </w:p>
+    <w:bookmarkEnd w:id="36"/>
+    <w:bookmarkStart w:id="37" w:name="appendix.-item-glosses-and-coding"/>
     <w:p>
       <w:pPr>
-        <w:pStyle w:val="BodyText"/>
-      </w:pPr>
-      <w:r>
-        <w:t xml:space="preserve">Xu et al. (2022) show how character teaching was adapted on the sending side. Zhang and Liu (2023) show designed online Chinese work. The questionnaire shows something smaller: the home and platform conditions 38 respondents said they had to meet. A better textbook would not, by itself, have answered a live session on an unstable connection, or a required application that respondents marked unusable.</w:t>
-      </w:r>
-    </w:p>
-    <w:p>
-      <w:pPr>
-        <w:pStyle w:val="BodyText"/>
-      </w:pPr>
-      <w:r>
-        <w:t xml:space="preserve">Most respondents selected Pakistani nationality, and that is the only Pakistan connection the dataset can support. The home reports are material conditions, not a claim about Pakistani culture.</w:t>
-      </w:r>
-    </w:p>
-    <w:p>
-      <w:pPr>
-        <w:pStyle w:val="BodyText"/>
-      </w:pPr>
-      <w:r>
-        <w:t xml:space="preserve">QQ, Chaoxing, DingTalk, and Chinese MOOC were often marked unusable, while Zoom and WhatsApp were more often marked available. The questionnaire cannot say whether that pattern reflects country restrictions, routing, account rules, skills, or virtual private networks. It can say that requiring one institutional toolkit may ask some learners to enter a class they cannot reliably open.</w:t>
-      </w:r>
-    </w:p>
-    <w:p>
-      <w:pPr>
-        <w:pStyle w:val="BodyText"/>
-      </w:pPr>
-      <w:r>
-        <w:t xml:space="preserve">Participation here sat alongside reported platform trouble, power and connectivity problems, and a home that many described as not quiet. That is a description of domestic conditions in this sample.</w:t>
-      </w:r>
-    </w:p>
-    <w:bookmarkEnd w:id="37"/>
-    <w:bookmarkStart w:id="42" w:name="pedagogical-implications"/>
-    <w:p>
-      <w:pPr>
         <w:pStyle w:val="Heading2"/>
       </w:pPr>
       <w:r>
-        <w:t xml:space="preserve">6. Pedagogical implications</w:t>
-      </w:r>
-    </w:p>
-    <w:p>
-      <w:pPr>
-        <w:pStyle w:val="FirstParagraph"/>
-      </w:pPr>
-      <w:r>
-        <w:t xml:space="preserve">In this sample, the questionnaire can support only a small set of classroom decisions.</w:t>
-      </w:r>
-    </w:p>
-    <w:bookmarkStart w:id="38" w:name="platform-selection"/>
-    <w:p>
-      <w:pPr>
-        <w:pStyle w:val="Heading3"/>
-      </w:pPr>
-      <w:r>
-        <w:t xml:space="preserve">Platform selection</w:t>
-      </w:r>
-    </w:p>
-    <w:p>
-      <w:pPr>
-        <w:pStyle w:val="FirstParagraph"/>
-      </w:pPr>
-      <w:r>
-        <w:t xml:space="preserve">Because QQ and Chaoxing were frequently marked unusable (Table 3), a program should not treat the sending-side toolkit as given. Before it requires a platform, it has to ask whether learners can open it where they sit, and it has to name a usable alternative. WhatsApp was marked available here, but it was not recorded as used for class, so the data do not recommend it as a replacement.</w:t>
-      </w:r>
-    </w:p>
-    <w:bookmarkEnd w:id="38"/>
-    <w:bookmarkStart w:id="39" w:name="assessment-modes"/>
-    <w:p>
-      <w:pPr>
-        <w:pStyle w:val="Heading3"/>
-      </w:pPr>
-      <w:r>
-        <w:t xml:space="preserve">Assessment modes</w:t>
-      </w:r>
-    </w:p>
-    <w:p>
-      <w:pPr>
-        <w:pStyle w:val="FirstParagraph"/>
-      </w:pPr>
-      <w:r>
-        <w:t xml:space="preserve">Because only 28.9% described the home as quiet, 42.1% reported power interruptions, and 76.3% reported unstable networks (Table 2), institutions should not treat a live oral hour as the only assessable performance. Assessment that assumes a quiet, continuous campus hour will mark some of those conditions as learner failure.</w:t>
-      </w:r>
-    </w:p>
-    <w:bookmarkEnd w:id="39"/>
-    <w:bookmarkStart w:id="40" w:name="live-session-duration"/>
-    <w:p>
-      <w:pPr>
-        <w:pStyle w:val="Heading3"/>
-      </w:pPr>
-      <w:r>
-        <w:t xml:space="preserve">Live session duration</w:t>
-      </w:r>
-    </w:p>
-    <w:p>
-      <w:pPr>
-        <w:pStyle w:val="FirstParagraph"/>
-      </w:pPr>
-      <w:r>
-        <w:t xml:space="preserve">Preferred live length here was 45 minutes for half of the respondents and 30 minutes for 28.9%. One open comment said that even one minute online was</w:t>
-      </w:r>
-      <w:r>
-        <w:t xml:space="preserve"> </w:t>
-      </w:r>
-      <w:r>
-        <w:t xml:space="preserve">“</w:t>
-      </w:r>
-      <w:r>
-        <w:t xml:space="preserve">not suitable.</w:t>
-      </w:r>
-      <w:r>
-        <w:t xml:space="preserve">”</w:t>
-      </w:r>
-      <w:r>
-        <w:t xml:space="preserve"> </w:t>
-      </w:r>
-      <w:r>
-        <w:t xml:space="preserve">A shorter live slot or an asynchronous oral alternative is the suggestion the data can support.</w:t>
-      </w:r>
-    </w:p>
-    <w:bookmarkEnd w:id="40"/>
-    <w:bookmarkStart w:id="41" w:name="collecting-access-data"/>
-    <w:p>
-      <w:pPr>
-        <w:pStyle w:val="Heading3"/>
-      </w:pPr>
-      <w:r>
-        <w:t xml:space="preserve">Collecting access data</w:t>
-      </w:r>
-    </w:p>
-    <w:p>
-      <w:pPr>
-        <w:pStyle w:val="FirstParagraph"/>
-      </w:pPr>
-      <w:r>
-        <w:t xml:space="preserve">The form shows household and access conditions. It does not show how institutions adapted. Those conditions should be collected as part of course design, not after complaints.</w:t>
-      </w:r>
-    </w:p>
-    <w:p>
-      <w:pPr>
-        <w:pStyle w:val="BodyText"/>
-      </w:pPr>
-      <w:r>
-        <w:t xml:space="preserve">These suggestions are bound to this sample. They are not a national policy, and they are not evidence that later hybrid teaching has repeated this pattern (Stockwell &amp; Wang, 2023).</w:t>
-      </w:r>
-    </w:p>
-    <w:bookmarkEnd w:id="41"/>
-    <w:bookmarkEnd w:id="42"/>
-    <w:bookmarkStart w:id="43" w:name="limitations"/>
-    <w:p>
-      <w:pPr>
-        <w:pStyle w:val="Heading2"/>
-      </w:pPr>
-      <w:r>
-        <w:t xml:space="preserve">7. Limitations</w:t>
-      </w:r>
-    </w:p>
-    <w:p>
-      <w:pPr>
-        <w:pStyle w:val="FirstParagraph"/>
-      </w:pPr>
-      <w:r>
-        <w:t xml:space="preserve">The sample is small (N = 38), network-recruited, and majority male; recruitment channel, host university, program type, and place of residence were not recorded, so all outcomes are self-report from a convenience group whose enrollment was not independently verified. The data are from February 2022 and concern emergency remote teaching; they are not evidence about current hybrid education. The appraisal index is descriptive rather than a validated scale, the infrastructure-problem count is an unvalidated post hoc indicator, the form did not measure institutional adaptation, IP metadata are not a location measure, and no ethics-committee number is available for the 2022 collection (Section 3.5).</w:t>
-      </w:r>
-    </w:p>
-    <w:bookmarkEnd w:id="43"/>
-    <w:bookmarkStart w:id="44" w:name="conclusion"/>
-    <w:p>
-      <w:pPr>
-        <w:pStyle w:val="Heading2"/>
-      </w:pPr>
-      <w:r>
-        <w:t xml:space="preserve">8. Conclusion</w:t>
-      </w:r>
-    </w:p>
-    <w:p>
-      <w:pPr>
-        <w:pStyle w:val="FirstParagraph"/>
-      </w:pPr>
-      <w:r>
-        <w:t xml:space="preserve">In this sample, respondents reporting online Chinese-language courses also reported household infrastructure problems and uneven platform access. Those conditions co-occurred with selecting</w:t>
-      </w:r>
-      <w:r>
-        <w:t xml:space="preserve"> </w:t>
-      </w:r>
-      <w:r>
-        <w:t xml:space="preserve">“</w:t>
-      </w:r>
-      <w:r>
-        <w:t xml:space="preserve">very high stress</w:t>
-      </w:r>
-      <w:r>
-        <w:t xml:space="preserve">”</w:t>
-      </w:r>
-      <w:r>
-        <w:t xml:space="preserve"> </w:t>
-      </w:r>
-      <w:r>
-        <w:t xml:space="preserve">and with more negative appraisals of online learning. That answer is bounded by N = 38 and by emergency remote teaching (Section 3.1). Whether later hybrid arrangements have closed the gap is a question this study cannot answer. Online Chinese teaching is not only a content problem. It is also a delivery problem.</w:t>
-      </w:r>
-    </w:p>
-    <w:bookmarkEnd w:id="44"/>
-    <w:bookmarkStart w:id="45" w:name="appendix-a.-appraisal-items-and-coding"/>
-    <w:p>
-      <w:pPr>
-        <w:pStyle w:val="Heading2"/>
-      </w:pPr>
-      <w:r>
-        <w:t xml:space="preserve">Appendix A. Appraisal items and coding</w:t>
-      </w:r>
-    </w:p>
-    <w:p>
-      <w:pPr>
-        <w:pStyle w:val="FirstParagraph"/>
-      </w:pPr>
-      <w:r>
-        <w:t xml:space="preserve">English glosses of the item stems.</w:t>
+        <w:t xml:space="preserve">Appendix. Item glosses and coding</w:t>
       </w:r>
     </w:p>
     <w:tbl>
@@ -3044,109 +2426,22 @@
         <w:pStyle w:val="BodyText"/>
       </w:pPr>
       <w:r>
-        <w:t xml:space="preserve">Index = mean of Q8, Q9, and Q10 (n = 38; no missing on these three).</w:t>
+        <w:t xml:space="preserve">Index = mean of Q8, Q9, and Q10 (n = 38).</w:t>
       </w:r>
     </w:p>
-    <w:bookmarkEnd w:id="45"/>
-    <w:bookmarkStart w:id="46" w:name="appendix-b.-secondary-statistics"/>
+    <w:bookmarkEnd w:id="37"/>
+    <w:bookmarkStart w:id="38" w:name="references"/>
     <w:p>
       <w:pPr>
         <w:pStyle w:val="Heading2"/>
       </w:pPr>
       <w:r>
-        <w:t xml:space="preserve">Appendix B. Secondary statistics</w:t>
+        <w:t xml:space="preserve">References</w:t>
       </w:r>
     </w:p>
     <w:p>
       <w:pPr>
         <w:pStyle w:val="FirstParagraph"/>
-      </w:pPr>
-      <w:r>
-        <w:t xml:space="preserve">Female × cannot-replace and learned-little × cannot-replace have identical cell counts (9/11 vs 10/27; Fisher’s exact</w:t>
-      </w:r>
-      <w:r>
-        <w:t xml:space="preserve"> </w:t>
-      </w:r>
-      <w:r>
-        <w:rPr>
-          <w:iCs/>
-          <w:i/>
-        </w:rPr>
-        <w:t xml:space="preserve">p</w:t>
-      </w:r>
-      <w:r>
-        <w:t xml:space="preserve"> </w:t>
-      </w:r>
-      <w:r>
-        <w:t xml:space="preserve">= .029). Poor internet × cannot-replace: 8/10 vs 11/28, Fisher’s exact</w:t>
-      </w:r>
-      <w:r>
-        <w:t xml:space="preserve"> </w:t>
-      </w:r>
-      <w:r>
-        <w:rPr>
-          <w:iCs/>
-          <w:i/>
-        </w:rPr>
-        <w:t xml:space="preserve">p</w:t>
-      </w:r>
-      <w:r>
-        <w:t xml:space="preserve"> </w:t>
-      </w:r>
-      <w:r>
-        <w:t xml:space="preserve">= .062. Mann–Whitney tests by gender on ordinals all had</w:t>
-      </w:r>
-      <w:r>
-        <w:t xml:space="preserve"> </w:t>
-      </w:r>
-      <w:r>
-        <w:rPr>
-          <w:iCs/>
-          <w:i/>
-        </w:rPr>
-        <w:t xml:space="preserve">p</w:t>
-      </w:r>
-      <w:r>
-        <w:t xml:space="preserve"> </w:t>
-      </w:r>
-      <w:r>
-        <w:t xml:space="preserve">≥ .36.</w:t>
-      </w:r>
-    </w:p>
-    <w:bookmarkEnd w:id="46"/>
-    <w:bookmarkStart w:id="47" w:name="references"/>
-    <w:p>
-      <w:pPr>
-        <w:pStyle w:val="Heading2"/>
-      </w:pPr>
-      <w:r>
-        <w:t xml:space="preserve">References</w:t>
-      </w:r>
-    </w:p>
-    <w:p>
-      <w:pPr>
-        <w:pStyle w:val="FirstParagraph"/>
-      </w:pPr>
-      <w:r>
-        <w:t xml:space="preserve">Ali, W. (2020). Online and remote learning in higher education institutes: A necessity in light of COVID-19 pandemic.</w:t>
-      </w:r>
-      <w:r>
-        <w:t xml:space="preserve"> </w:t>
-      </w:r>
-      <w:r>
-        <w:rPr>
-          <w:iCs/>
-          <w:i/>
-        </w:rPr>
-        <w:t xml:space="preserve">Higher Education Studies, 10</w:t>
-      </w:r>
-      <w:r>
-        <w:t xml:space="preserve">(3), 16-25. https://doi.org/10.5539/hes.v10n3p16</w:t>
-      </w:r>
-    </w:p>
-    <w:p>
-      <w:pPr>
-        <w:pStyle w:val="BodyText"/>
       </w:pPr>
       <w:r>
         <w:t xml:space="preserve">Beaunoyer, E., Dupéré, S., &amp; Guitton, M. J. (2020). COVID-19 and digital inequalities: Reciprocal impacts and mitigation strategies.</w:t>
@@ -3170,27 +2465,6 @@
         <w:pStyle w:val="BodyText"/>
       </w:pPr>
       <w:r>
-        <w:t xml:space="preserve">Butt, A., &amp; Sadaf, M. (2026). Getting around the digital horizon: Recognizing multifaceted digital divide among university students in Pakistan.</w:t>
-      </w:r>
-      <w:r>
-        <w:t xml:space="preserve"> </w:t>
-      </w:r>
-      <w:r>
-        <w:rPr>
-          <w:iCs/>
-          <w:i/>
-        </w:rPr>
-        <w:t xml:space="preserve">Journal of the Knowledge Economy, 17</w:t>
-      </w:r>
-      <w:r>
-        <w:t xml:space="preserve">(4), 9567-9590. https://doi.org/10.1007/s13132-026-03164-7</w:t>
-      </w:r>
-    </w:p>
-    <w:p>
-      <w:pPr>
-        <w:pStyle w:val="BodyText"/>
-      </w:pPr>
-      <w:r>
         <w:t xml:space="preserve">Gacs, A., Goertler, S., &amp; Spasova, S. (2020). Planned online language education versus crisis-prompted online language teaching: Lessons for the future.</w:t>
       </w:r>
       <w:r>
@@ -3212,69 +2486,6 @@
         <w:pStyle w:val="BodyText"/>
       </w:pPr>
       <w:r>
-        <w:t xml:space="preserve">Gao, X., &amp; Hua, Z. (2021). Experiencing Chinese education: Learning of language and culture by international students in Chinese universities.</w:t>
-      </w:r>
-      <w:r>
-        <w:t xml:space="preserve"> </w:t>
-      </w:r>
-      <w:r>
-        <w:rPr>
-          <w:iCs/>
-          <w:i/>
-        </w:rPr>
-        <w:t xml:space="preserve">Language, Culture and Curriculum, 34</w:t>
-      </w:r>
-      <w:r>
-        <w:t xml:space="preserve">(4), 353-359. https://doi.org/10.1080/07908318.2020.1871002</w:t>
-      </w:r>
-    </w:p>
-    <w:p>
-      <w:pPr>
-        <w:pStyle w:val="BodyText"/>
-      </w:pPr>
-      <w:r>
-        <w:t xml:space="preserve">Gong, Y., Gao, X., Li, M., &amp; Lai, C. (2020a). Cultural adaptation challenges and strategies during study abroad: New Zealand students in China.</w:t>
-      </w:r>
-      <w:r>
-        <w:t xml:space="preserve"> </w:t>
-      </w:r>
-      <w:r>
-        <w:rPr>
-          <w:iCs/>
-          <w:i/>
-        </w:rPr>
-        <w:t xml:space="preserve">Language, Culture and Curriculum, 34</w:t>
-      </w:r>
-      <w:r>
-        <w:t xml:space="preserve">(4), 417-437. https://doi.org/10.1080/07908318.2020.1856129</w:t>
-      </w:r>
-    </w:p>
-    <w:p>
-      <w:pPr>
-        <w:pStyle w:val="BodyText"/>
-      </w:pPr>
-      <w:r>
-        <w:t xml:space="preserve">Gong, Y., Gao, X., &amp; Lyu, B. (2020b). Teaching Chinese as a second or foreign language to non-Chinese learners in mainland China (2014-2018).</w:t>
-      </w:r>
-      <w:r>
-        <w:t xml:space="preserve"> </w:t>
-      </w:r>
-      <w:r>
-        <w:rPr>
-          <w:iCs/>
-          <w:i/>
-        </w:rPr>
-        <w:t xml:space="preserve">Language Teaching, 53</w:t>
-      </w:r>
-      <w:r>
-        <w:t xml:space="preserve">(1), 44-62. https://doi.org/10.1017/S0261444819000387</w:t>
-      </w:r>
-    </w:p>
-    <w:p>
-      <w:pPr>
-        <w:pStyle w:val="BodyText"/>
-      </w:pPr>
-      <w:r>
         <w:t xml:space="preserve">González-Lloret, M. (2020). Collaborative tasks for online language teaching.</w:t>
       </w:r>
       <w:r>
@@ -3296,90 +2507,6 @@
         <w:pStyle w:val="BodyText"/>
       </w:pPr>
       <w:r>
-        <w:t xml:space="preserve">Guenier, A. W., Xing, M., &amp; Yan, J. (2026). From barriers to breakthroughs: Communicating Chinese culture to Irish learners with a multimodality online course.</w:t>
-      </w:r>
-      <w:r>
-        <w:t xml:space="preserve"> </w:t>
-      </w:r>
-      <w:r>
-        <w:rPr>
-          <w:iCs/>
-          <w:i/>
-        </w:rPr>
-        <w:t xml:space="preserve">Language, Culture and Curriculum</w:t>
-      </w:r>
-      <w:r>
-        <w:t xml:space="preserve">. Advance online publication. https://doi.org/10.1080/07908318.2026.2626775</w:t>
-      </w:r>
-    </w:p>
-    <w:p>
-      <w:pPr>
-        <w:pStyle w:val="BodyText"/>
-      </w:pPr>
-      <w:r>
-        <w:t xml:space="preserve">Guerrettaz, A. M., Engman, M. M., &amp; Matsumoto, Y. (2021). Empirically defining language learning and teaching materials in use through sociomaterial perspectives.</w:t>
-      </w:r>
-      <w:r>
-        <w:t xml:space="preserve"> </w:t>
-      </w:r>
-      <w:r>
-        <w:rPr>
-          <w:iCs/>
-          <w:i/>
-        </w:rPr>
-        <w:t xml:space="preserve">The Modern Language Journal, 105</w:t>
-      </w:r>
-      <w:r>
-        <w:t xml:space="preserve">(S1), 3-20. https://doi.org/10.1111/modl.12691</w:t>
-      </w:r>
-    </w:p>
-    <w:p>
-      <w:pPr>
-        <w:pStyle w:val="BodyText"/>
-      </w:pPr>
-      <w:r>
-        <w:t xml:space="preserve">Guo, C., &amp; Wan, B. (2022). The digital divide in online learning in China during the COVID-19 pandemic.</w:t>
-      </w:r>
-      <w:r>
-        <w:t xml:space="preserve"> </w:t>
-      </w:r>
-      <w:r>
-        <w:rPr>
-          <w:iCs/>
-          <w:i/>
-        </w:rPr>
-        <w:t xml:space="preserve">Technology in Society, 71</w:t>
-      </w:r>
-      <w:r>
-        <w:t xml:space="preserve">, Article 102122. https://doi.org/10.1016/j.techsoc.2022.102122</w:t>
-      </w:r>
-    </w:p>
-    <w:p>
-      <w:pPr>
-        <w:pStyle w:val="BodyText"/>
-      </w:pPr>
-      <w:r>
-        <w:t xml:space="preserve">Helsper, E. (2021).</w:t>
-      </w:r>
-      <w:r>
-        <w:t xml:space="preserve"> </w:t>
-      </w:r>
-      <w:r>
-        <w:rPr>
-          <w:iCs/>
-          <w:i/>
-        </w:rPr>
-        <w:t xml:space="preserve">The digital disconnect: The social causes and consequences of digital inequalities</w:t>
-      </w:r>
-      <w:r>
-        <w:t xml:space="preserve">. SAGE.</w:t>
-      </w:r>
-    </w:p>
-    <w:p>
-      <w:pPr>
-        <w:pStyle w:val="BodyText"/>
-      </w:pPr>
-      <w:r>
         <w:t xml:space="preserve">Hodges, C., Moore, S., Lockee, B., Trust, T., &amp; Bond, A. (2020). The difference between emergency remote teaching and online learning.</w:t>
       </w:r>
       <w:r>
@@ -3401,27 +2528,6 @@
         <w:pStyle w:val="BodyText"/>
       </w:pPr>
       <w:r>
-        <w:t xml:space="preserve">Jamil, S., &amp; Muschert, G. (2023). The COVID-19 pandemic and e-learning: The digital divide and educational crises in Pakistan’s universities.</w:t>
-      </w:r>
-      <w:r>
-        <w:t xml:space="preserve"> </w:t>
-      </w:r>
-      <w:r>
-        <w:rPr>
-          <w:iCs/>
-          <w:i/>
-        </w:rPr>
-        <w:t xml:space="preserve">American Behavioral Scientist, 68</w:t>
-      </w:r>
-      <w:r>
-        <w:t xml:space="preserve">(9), 1161-1179. https://doi.org/10.1177/00027642231156779</w:t>
-      </w:r>
-    </w:p>
-    <w:p>
-      <w:pPr>
-        <w:pStyle w:val="BodyText"/>
-      </w:pPr>
-      <w:r>
         <w:t xml:space="preserve">Jin, L., Xu, Y., &amp; Deifell, E. (2023). College-level world language faculty background characteristics and their perceptions of online language teaching during the pandemic.</w:t>
       </w:r>
       <w:r>
@@ -3464,7 +2570,49 @@
         <w:pStyle w:val="BodyText"/>
       </w:pPr>
       <w:r>
-        <w:t xml:space="preserve">Lomicka, L. (2020). Creating and sustaining virtual language communities.</w:t>
+        <w:t xml:space="preserve">Moorhouse, B. L. (2023). Teachers’ digital technology use after a period of online teaching.</w:t>
+      </w:r>
+      <w:r>
+        <w:t xml:space="preserve"> </w:t>
+      </w:r>
+      <w:r>
+        <w:rPr>
+          <w:iCs/>
+          <w:i/>
+        </w:rPr>
+        <w:t xml:space="preserve">ELT Journal, 77</w:t>
+      </w:r>
+      <w:r>
+        <w:t xml:space="preserve">(4), 445-457. https://doi.org/10.1093/elt/ccac050</w:t>
+      </w:r>
+    </w:p>
+    <w:p>
+      <w:pPr>
+        <w:pStyle w:val="BodyText"/>
+      </w:pPr>
+      <w:r>
+        <w:t xml:space="preserve">Moser, K. M., Wei, T., &amp; Brenner, D. (2021). Remote teaching during COVID-19: Implications from a national survey of language educators.</w:t>
+      </w:r>
+      <w:r>
+        <w:t xml:space="preserve"> </w:t>
+      </w:r>
+      <w:r>
+        <w:rPr>
+          <w:iCs/>
+          <w:i/>
+        </w:rPr>
+        <w:t xml:space="preserve">System, 97</w:t>
+      </w:r>
+      <w:r>
+        <w:t xml:space="preserve">, Article 102431. https://doi.org/10.1016/j.system.2020.102431</w:t>
+      </w:r>
+    </w:p>
+    <w:p>
+      <w:pPr>
+        <w:pStyle w:val="BodyText"/>
+      </w:pPr>
+      <w:r>
+        <w:t xml:space="preserve">Payne, J. S. (2020). Developing L2 productive language skills online and the strategic use of instructional tools.</w:t>
       </w:r>
       <w:r>
         <w:t xml:space="preserve"> </w:t>
@@ -3477,7 +2625,7 @@
         <w:t xml:space="preserve">Foreign Language Annals, 53</w:t>
       </w:r>
       <w:r>
-        <w:t xml:space="preserve">(2), 306-313. https://doi.org/10.1111/flan.12456</w:t>
+        <w:t xml:space="preserve">(2), 243-249. https://doi.org/10.1111/flan.12457</w:t>
       </w:r>
     </w:p>
     <w:p>
@@ -3485,70 +2633,7 @@
         <w:pStyle w:val="BodyText"/>
       </w:pPr>
       <w:r>
-        <w:t xml:space="preserve">MacIntyre, P. D., Gregersen, T., &amp; Mercer, S. (2020). Language teachers’ coping strategies during the Covid-19 conversion to online teaching: Correlations with stress, wellbeing and negative emotions.</w:t>
-      </w:r>
-      <w:r>
-        <w:t xml:space="preserve"> </w:t>
-      </w:r>
-      <w:r>
-        <w:rPr>
-          <w:iCs/>
-          <w:i/>
-        </w:rPr>
-        <w:t xml:space="preserve">System, 94</w:t>
-      </w:r>
-      <w:r>
-        <w:t xml:space="preserve">, Article 102352. https://doi.org/10.1016/j.system.2020.102352</w:t>
-      </w:r>
-    </w:p>
-    <w:p>
-      <w:pPr>
-        <w:pStyle w:val="BodyText"/>
-      </w:pPr>
-      <w:r>
-        <w:t xml:space="preserve">Moorhouse, B. L. (2023). Teachers’ digital technology use after a period of online teaching.</w:t>
-      </w:r>
-      <w:r>
-        <w:t xml:space="preserve"> </w:t>
-      </w:r>
-      <w:r>
-        <w:rPr>
-          <w:iCs/>
-          <w:i/>
-        </w:rPr>
-        <w:t xml:space="preserve">ELT Journal, 77</w:t>
-      </w:r>
-      <w:r>
-        <w:t xml:space="preserve">(4), 445-457. https://doi.org/10.1093/elt/ccac050</w:t>
-      </w:r>
-    </w:p>
-    <w:p>
-      <w:pPr>
-        <w:pStyle w:val="BodyText"/>
-      </w:pPr>
-      <w:r>
-        <w:t xml:space="preserve">Moser, K. M., Wei, T., &amp; Brenner, D. (2021). Remote teaching during COVID-19: Implications from a national survey of language educators.</w:t>
-      </w:r>
-      <w:r>
-        <w:t xml:space="preserve"> </w:t>
-      </w:r>
-      <w:r>
-        <w:rPr>
-          <w:iCs/>
-          <w:i/>
-        </w:rPr>
-        <w:t xml:space="preserve">System, 97</w:t>
-      </w:r>
-      <w:r>
-        <w:t xml:space="preserve">, Article 102431. https://doi.org/10.1016/j.system.2020.102431</w:t>
-      </w:r>
-    </w:p>
-    <w:p>
-      <w:pPr>
-        <w:pStyle w:val="BodyText"/>
-      </w:pPr>
-      <w:r>
-        <w:t xml:space="preserve">Payne, J. S. (2020). Developing L2 productive language skills online and the strategic use of instructional tools.</w:t>
+        <w:t xml:space="preserve">Russell, V. (2020). Language anxiety and the online learner.</w:t>
       </w:r>
       <w:r>
         <w:t xml:space="preserve"> </w:t>
@@ -3561,7 +2646,7 @@
         <w:t xml:space="preserve">Foreign Language Annals, 53</w:t>
       </w:r>
       <w:r>
-        <w:t xml:space="preserve">(2), 243-249. https://doi.org/10.1111/flan.12457</w:t>
+        <w:t xml:space="preserve">(2), 338-352. https://doi.org/10.1111/flan.12461</w:t>
       </w:r>
     </w:p>
     <w:p>
@@ -3569,22 +2654,112 @@
         <w:pStyle w:val="BodyText"/>
       </w:pPr>
       <w:r>
-        <w:t xml:space="preserve">Qi, X. (2025).</w:t>
+        <w:t xml:space="preserve">Stockwell, G., &amp; Wang, Y. (2023). Exploring the challenges of technology in language teaching in the aftermath of the pandemic.</w:t>
       </w:r>
       <w:r>
         <w:t xml:space="preserve"> </w:t>
       </w:r>
       <w:r>
-        <w:t xml:space="preserve">‘</w:t>
-      </w:r>
-      <w:r>
-        <w:t xml:space="preserve">My speech becomes just a voice, a picture</w:t>
-      </w:r>
-      <w:r>
-        <w:t xml:space="preserve">’</w:t>
-      </w:r>
-      <w:r>
-        <w:t xml:space="preserve">: Exploring language anxiety in Chinese as a second language learning in online environments.</w:t>
+        <w:rPr>
+          <w:iCs/>
+          <w:i/>
+        </w:rPr>
+        <w:t xml:space="preserve">RELC Journal, 54</w:t>
+      </w:r>
+      <w:r>
+        <w:t xml:space="preserve">(2), 474-482. https://doi.org/10.1177/00336882231168438</w:t>
+      </w:r>
+    </w:p>
+    <w:p>
+      <w:pPr>
+        <w:pStyle w:val="BodyText"/>
+      </w:pPr>
+      <w:r>
+        <w:t xml:space="preserve">Tao, J., &amp; Gao, X. (2022). Teaching and learning languages online: Challenges and responses.</w:t>
+      </w:r>
+      <w:r>
+        <w:t xml:space="preserve"> </w:t>
+      </w:r>
+      <w:r>
+        <w:rPr>
+          <w:iCs/>
+          <w:i/>
+        </w:rPr>
+        <w:t xml:space="preserve">System, 107</w:t>
+      </w:r>
+      <w:r>
+        <w:t xml:space="preserve">, Article 102819. https://doi.org/10.1016/j.system.2022.102819</w:t>
+      </w:r>
+    </w:p>
+    <w:p>
+      <w:pPr>
+        <w:pStyle w:val="BodyText"/>
+      </w:pPr>
+      <w:r>
+        <w:t xml:space="preserve">van Dijk, J. (2020).</w:t>
+      </w:r>
+      <w:r>
+        <w:t xml:space="preserve"> </w:t>
+      </w:r>
+      <w:r>
+        <w:rPr>
+          <w:iCs/>
+          <w:i/>
+        </w:rPr>
+        <w:t xml:space="preserve">The digital divide</w:t>
+      </w:r>
+      <w:r>
+        <w:t xml:space="preserve">. Polity.</w:t>
+      </w:r>
+    </w:p>
+    <w:p>
+      <w:pPr>
+        <w:pStyle w:val="BodyText"/>
+      </w:pPr>
+      <w:r>
+        <w:t xml:space="preserve">Warschauer, M. (2003).</w:t>
+      </w:r>
+      <w:r>
+        <w:t xml:space="preserve"> </w:t>
+      </w:r>
+      <w:r>
+        <w:rPr>
+          <w:iCs/>
+          <w:i/>
+        </w:rPr>
+        <w:t xml:space="preserve">Technology and social inclusion: Rethinking the digital divide</w:t>
+      </w:r>
+      <w:r>
+        <w:t xml:space="preserve">. MIT Press.</w:t>
+      </w:r>
+    </w:p>
+    <w:p>
+      <w:pPr>
+        <w:pStyle w:val="BodyText"/>
+      </w:pPr>
+      <w:r>
+        <w:t xml:space="preserve">White, C. (2006). Distance learning of foreign languages.</w:t>
+      </w:r>
+      <w:r>
+        <w:t xml:space="preserve"> </w:t>
+      </w:r>
+      <w:r>
+        <w:rPr>
+          <w:iCs/>
+          <w:i/>
+        </w:rPr>
+        <w:t xml:space="preserve">Language Teaching, 39</w:t>
+      </w:r>
+      <w:r>
+        <w:t xml:space="preserve">(4), 247-264. https://doi.org/10.1017/S0261444806003727</w:t>
+      </w:r>
+    </w:p>
+    <w:p>
+      <w:pPr>
+        <w:pStyle w:val="BodyText"/>
+      </w:pPr>
+      <w:r>
+        <w:t xml:space="preserve">Xu, B. (2024). Technology integration into Chinese as a foreign language learning in higher education: An integrated bibliometric analysis and systematic review (2000–2024).</w:t>
       </w:r>
       <w:r>
         <w:t xml:space="preserve"> </w:t>
@@ -3597,276 +2772,6 @@
         <w:t xml:space="preserve">Language Teaching Research</w:t>
       </w:r>
       <w:r>
-        <w:t xml:space="preserve">. Advance online publication. https://doi.org/10.1177/13621688251387320</w:t>
-      </w:r>
-    </w:p>
-    <w:p>
-      <w:pPr>
-        <w:pStyle w:val="BodyText"/>
-      </w:pPr>
-      <w:r>
-        <w:t xml:space="preserve">Raza, O., &amp; Hennessy, S. (2025).</w:t>
-      </w:r>
-      <w:r>
-        <w:t xml:space="preserve"> </w:t>
-      </w:r>
-      <w:r>
-        <w:rPr>
-          <w:iCs/>
-          <w:i/>
-        </w:rPr>
-        <w:t xml:space="preserve">Exploring the gender differences in technology use for educational purposes at home among students in Pakistan</w:t>
-      </w:r>
-      <w:r>
-        <w:t xml:space="preserve">. EdTech Hub. https://doi.org/10.53832/edtechhub.1099</w:t>
-      </w:r>
-    </w:p>
-    <w:p>
-      <w:pPr>
-        <w:pStyle w:val="BodyText"/>
-      </w:pPr>
-      <w:r>
-        <w:t xml:space="preserve">Russell, V. (2020). Language anxiety and the online learner.</w:t>
-      </w:r>
-      <w:r>
-        <w:t xml:space="preserve"> </w:t>
-      </w:r>
-      <w:r>
-        <w:rPr>
-          <w:iCs/>
-          <w:i/>
-        </w:rPr>
-        <w:t xml:space="preserve">Foreign Language Annals, 53</w:t>
-      </w:r>
-      <w:r>
-        <w:t xml:space="preserve">(2), 338-352. https://doi.org/10.1111/flan.12461</w:t>
-      </w:r>
-    </w:p>
-    <w:p>
-      <w:pPr>
-        <w:pStyle w:val="BodyText"/>
-      </w:pPr>
-      <w:r>
-        <w:t xml:space="preserve">Stockwell, G., &amp; Wang, Y. (2023). Exploring the challenges of technology in language teaching in the aftermath of the pandemic.</w:t>
-      </w:r>
-      <w:r>
-        <w:t xml:space="preserve"> </w:t>
-      </w:r>
-      <w:r>
-        <w:rPr>
-          <w:iCs/>
-          <w:i/>
-        </w:rPr>
-        <w:t xml:space="preserve">RELC Journal, 54</w:t>
-      </w:r>
-      <w:r>
-        <w:t xml:space="preserve">(2), 474-482. https://doi.org/10.1177/00336882231168438</w:t>
-      </w:r>
-    </w:p>
-    <w:p>
-      <w:pPr>
-        <w:pStyle w:val="BodyText"/>
-      </w:pPr>
-      <w:r>
-        <w:t xml:space="preserve">Tao, J., &amp; Gao, X. (2022). Teaching and learning languages online: Challenges and responses.</w:t>
-      </w:r>
-      <w:r>
-        <w:t xml:space="preserve"> </w:t>
-      </w:r>
-      <w:r>
-        <w:rPr>
-          <w:iCs/>
-          <w:i/>
-        </w:rPr>
-        <w:t xml:space="preserve">System, 107</w:t>
-      </w:r>
-      <w:r>
-        <w:t xml:space="preserve">, Article 102819. https://doi.org/10.1016/j.system.2022.102819</w:t>
-      </w:r>
-    </w:p>
-    <w:p>
-      <w:pPr>
-        <w:pStyle w:val="BodyText"/>
-      </w:pPr>
-      <w:r>
-        <w:t xml:space="preserve">Tu, M. (2026). Time and precarity in</w:t>
-      </w:r>
-      <w:r>
-        <w:t xml:space="preserve"> </w:t>
-      </w:r>
-      <w:r>
-        <w:t xml:space="preserve">‘</w:t>
-      </w:r>
-      <w:r>
-        <w:t xml:space="preserve">South–South</w:t>
-      </w:r>
-      <w:r>
-        <w:t xml:space="preserve">’</w:t>
-      </w:r>
-      <w:r>
-        <w:t xml:space="preserve"> </w:t>
-      </w:r>
-      <w:r>
-        <w:t xml:space="preserve">academic mobility: A 2019–2023 longitudinal study of Pakistani PhD students and recent graduates in China.</w:t>
-      </w:r>
-      <w:r>
-        <w:t xml:space="preserve"> </w:t>
-      </w:r>
-      <w:r>
-        <w:rPr>
-          <w:iCs/>
-          <w:i/>
-        </w:rPr>
-        <w:t xml:space="preserve">Population, Space and Place, 32</w:t>
-      </w:r>
-      <w:r>
-        <w:t xml:space="preserve">(2), Article e70227. https://doi.org/10.1002/psp.70227</w:t>
-      </w:r>
-    </w:p>
-    <w:p>
-      <w:pPr>
-        <w:pStyle w:val="BodyText"/>
-      </w:pPr>
-      <w:r>
-        <w:t xml:space="preserve">van Dijk, J. (2020).</w:t>
-      </w:r>
-      <w:r>
-        <w:t xml:space="preserve"> </w:t>
-      </w:r>
-      <w:r>
-        <w:rPr>
-          <w:iCs/>
-          <w:i/>
-        </w:rPr>
-        <w:t xml:space="preserve">The digital divide</w:t>
-      </w:r>
-      <w:r>
-        <w:t xml:space="preserve">. Polity.</w:t>
-      </w:r>
-    </w:p>
-    <w:p>
-      <w:pPr>
-        <w:pStyle w:val="BodyText"/>
-      </w:pPr>
-      <w:r>
-        <w:t xml:space="preserve">van Lier, L. (2004).</w:t>
-      </w:r>
-      <w:r>
-        <w:t xml:space="preserve"> </w:t>
-      </w:r>
-      <w:r>
-        <w:rPr>
-          <w:iCs/>
-          <w:i/>
-        </w:rPr>
-        <w:t xml:space="preserve">The ecology and semiotics of language learning: A sociocultural perspective</w:t>
-      </w:r>
-      <w:r>
-        <w:t xml:space="preserve">. Kluwer.</w:t>
-      </w:r>
-    </w:p>
-    <w:p>
-      <w:pPr>
-        <w:pStyle w:val="BodyText"/>
-      </w:pPr>
-      <w:r>
-        <w:t xml:space="preserve">Vishnu, S., Tengli, M. B., Ramadas, S., Sathyan, A. R., &amp; Bhatt, A. (2024). Bridging the divide: Assessing digital infrastructure for higher education online learning.</w:t>
-      </w:r>
-      <w:r>
-        <w:t xml:space="preserve"> </w:t>
-      </w:r>
-      <w:r>
-        <w:rPr>
-          <w:iCs/>
-          <w:i/>
-        </w:rPr>
-        <w:t xml:space="preserve">TechTrends, 68</w:t>
-      </w:r>
-      <w:r>
-        <w:t xml:space="preserve">(6), 1107-1116. https://doi.org/10.1007/s11528-024-00997-4</w:t>
-      </w:r>
-    </w:p>
-    <w:p>
-      <w:pPr>
-        <w:pStyle w:val="BodyText"/>
-      </w:pPr>
-      <w:r>
-        <w:t xml:space="preserve">Warschauer, M. (2003).</w:t>
-      </w:r>
-      <w:r>
-        <w:t xml:space="preserve"> </w:t>
-      </w:r>
-      <w:r>
-        <w:rPr>
-          <w:iCs/>
-          <w:i/>
-        </w:rPr>
-        <w:t xml:space="preserve">Technology and social inclusion: Rethinking the digital divide</w:t>
-      </w:r>
-      <w:r>
-        <w:t xml:space="preserve">. MIT Press.</w:t>
-      </w:r>
-    </w:p>
-    <w:p>
-      <w:pPr>
-        <w:pStyle w:val="BodyText"/>
-      </w:pPr>
-      <w:r>
-        <w:t xml:space="preserve">Wen, X., &amp; Liu, F. (2025). Emotional dynamics of advanced Chinese as a second language learners: A Q methodology study.</w:t>
-      </w:r>
-      <w:r>
-        <w:t xml:space="preserve"> </w:t>
-      </w:r>
-      <w:r>
-        <w:rPr>
-          <w:iCs/>
-          <w:i/>
-        </w:rPr>
-        <w:t xml:space="preserve">Language, Culture and Curriculum, 38</w:t>
-      </w:r>
-      <w:r>
-        <w:t xml:space="preserve">(3), 380-400. https://doi.org/10.1080/07908318.2025.2486449</w:t>
-      </w:r>
-    </w:p>
-    <w:p>
-      <w:pPr>
-        <w:pStyle w:val="BodyText"/>
-      </w:pPr>
-      <w:r>
-        <w:t xml:space="preserve">White, C. (2006). Distance learning of foreign languages.</w:t>
-      </w:r>
-      <w:r>
-        <w:t xml:space="preserve"> </w:t>
-      </w:r>
-      <w:r>
-        <w:rPr>
-          <w:iCs/>
-          <w:i/>
-        </w:rPr>
-        <w:t xml:space="preserve">Language Teaching, 39</w:t>
-      </w:r>
-      <w:r>
-        <w:t xml:space="preserve">(4), 247-264. https://doi.org/10.1017/S0261444806003727</w:t>
-      </w:r>
-    </w:p>
-    <w:p>
-      <w:pPr>
-        <w:pStyle w:val="BodyText"/>
-      </w:pPr>
-      <w:r>
-        <w:t xml:space="preserve">Xu, B. (2024). Technology integration into Chinese as a foreign language learning in higher education: An integrated bibliometric analysis and systematic review (2000–2024).</w:t>
-      </w:r>
-      <w:r>
-        <w:t xml:space="preserve"> </w:t>
-      </w:r>
-      <w:r>
-        <w:rPr>
-          <w:iCs/>
-          <w:i/>
-        </w:rPr>
-        <w:t xml:space="preserve">Language Teaching Research</w:t>
-      </w:r>
-      <w:r>
         <w:t xml:space="preserve">. Advance online publication. https://doi.org/10.1177/13621688241277911</w:t>
       </w:r>
     </w:p>
@@ -3891,71 +2796,8 @@
         <w:t xml:space="preserve">(1), 72-97. https://doi.org/10.1111/flan.12541</w:t>
       </w:r>
     </w:p>
-    <w:p>
-      <w:pPr>
-        <w:pStyle w:val="BodyText"/>
-      </w:pPr>
-      <w:r>
-        <w:t xml:space="preserve">Zhang, M., &amp; Liu, Q. (2023). Synchronous and asynchronous online collaborative writing: A study on Chinese language learners.</w:t>
-      </w:r>
-      <w:r>
-        <w:t xml:space="preserve"> </w:t>
-      </w:r>
-      <w:r>
-        <w:rPr>
-          <w:iCs/>
-          <w:i/>
-        </w:rPr>
-        <w:t xml:space="preserve">Foreign Language Annals, 56</w:t>
-      </w:r>
-      <w:r>
-        <w:t xml:space="preserve">(3), 740-763. https://doi.org/10.1111/flan.12704</w:t>
-      </w:r>
-    </w:p>
-    <w:p>
-      <w:pPr>
-        <w:pStyle w:val="BodyText"/>
-      </w:pPr>
-      <w:r>
-        <w:t xml:space="preserve">Zhang, Q., &amp; Osborne, C. (2026). Readiness for digital transformation in Chinese as a foreign language education: A semi-systematic review.</w:t>
-      </w:r>
-      <w:r>
-        <w:t xml:space="preserve"> </w:t>
-      </w:r>
-      <w:r>
-        <w:rPr>
-          <w:iCs/>
-          <w:i/>
-        </w:rPr>
-        <w:t xml:space="preserve">Chinese as a Second Language Research, 15</w:t>
-      </w:r>
-      <w:r>
-        <w:t xml:space="preserve">(1), 11-43. https://doi.org/10.1515/caslar-2026-2002</w:t>
-      </w:r>
-    </w:p>
-    <w:p>
-      <w:pPr>
-        <w:pStyle w:val="BodyText"/>
-      </w:pPr>
-      <w:r>
-        <w:t xml:space="preserve">Zhang, W., Wang, Y., Yang, L., &amp; Wang, C. (2020). Suspending classes without stopping learning: China’s education emergency management policy in the COVID-19 outbreak.</w:t>
-      </w:r>
-      <w:r>
-        <w:t xml:space="preserve"> </w:t>
-      </w:r>
-      <w:r>
-        <w:rPr>
-          <w:iCs/>
-          <w:i/>
-        </w:rPr>
-        <w:t xml:space="preserve">Journal of Risk and Financial Management, 13</w:t>
-      </w:r>
-      <w:r>
-        <w:t xml:space="preserve">(3), 55. https://doi.org/10.3390/jrfm13030055</w:t>
-      </w:r>
-    </w:p>
-    <w:bookmarkEnd w:id="47"/>
-    <w:bookmarkEnd w:id="48"/>
+    <w:bookmarkEnd w:id="38"/>
+    <w:bookmarkEnd w:id="39"/>
     <w:sectPr>
       <w:pgSz w:h="15840" w:w="12240"/>
       <w:pgMar w:bottom="1440" w:footer="720" w:gutter="0" w:header="720" w:left="1440" w:right="1440" w:top="1440"/>

</xml_diff>

<commit_message>
Recast the manuscript as a short contribution, not an FLA article
Keep the 38-row tables and name the real task: documenting home conditions and named platforms. Drop the FLA Challenge and the full-article frame.

Co-authored-by: kristinehina23-rgb <kristinehina23-rgb@users.noreply.github.com>
</commit_message>
<xml_diff>
--- a/papers/q1-masters-covid/word/manuscript.docx
+++ b/papers/q1-masters-covid/word/manuscript.docx
@@ -2,13 +2,13 @@
 <file path=word/document.xml><?xml version="1.0" encoding="utf-8"?>
 <w:document xmlns:w="http://schemas.openxmlformats.org/wordprocessingml/2006/main" xmlns:m="http://schemas.openxmlformats.org/officeDocument/2006/math" xmlns:r="http://schemas.openxmlformats.org/officeDocument/2006/relationships" xmlns:o="urn:schemas-microsoft-com:office:office" xmlns:v="urn:schemas-microsoft-com:vml" xmlns:w10="urn:schemas-microsoft-com:office:word" xmlns:a="http://schemas.openxmlformats.org/drawingml/2006/main" xmlns:pic="http://schemas.openxmlformats.org/drawingml/2006/picture" xmlns:wp="http://schemas.openxmlformats.org/drawingml/2006/wordprocessingDrawing">
   <w:body>
-    <w:bookmarkStart w:id="39" w:name="X6180d3d6f972a26b23eccbb78377f9f0be3dec6"/>
+    <w:bookmarkStart w:id="27" w:name="X05acd6df0d7cf866a4a8047e473c33139c0e345"/>
     <w:p>
       <w:pPr>
         <w:pStyle w:val="Heading1"/>
       </w:pPr>
       <w:r>
-        <w:t xml:space="preserve">Home and platform reports from an online Chinese questionnaire</w:t>
+        <w:t xml:space="preserve">Home conditions and named platforms in a 2022 online Chinese questionnaire</w:t>
       </w:r>
     </w:p>
     <w:p>
@@ -26,7 +26,25 @@
         <w:t xml:space="preserve"> </w:t>
       </w:r>
       <w:r>
-        <w:t xml:space="preserve">Home and platform reports</w:t>
+        <w:t xml:space="preserve">Home conditions and named platforms</w:t>
+      </w:r>
+    </w:p>
+    <w:p>
+      <w:pPr>
+        <w:pStyle w:val="BodyText"/>
+      </w:pPr>
+      <w:r>
+        <w:rPr>
+          <w:bCs/>
+          <w:b/>
+        </w:rPr>
+        <w:t xml:space="preserve">Piece type:</w:t>
+      </w:r>
+      <w:r>
+        <w:t xml:space="preserve"> </w:t>
+      </w:r>
+      <w:r>
+        <w:t xml:space="preserve">short contribution (not a full research article)</w:t>
       </w:r>
     </w:p>
     <w:bookmarkStart w:id="20" w:name="abstract"/>
@@ -43,7 +61,7 @@
         <w:pStyle w:val="FirstParagraph"/>
       </w:pPr>
       <w:r>
-        <w:t xml:space="preserve">In February 2022, 38 people completed a questionnaire written in Chinese about online Chinese study. The form did not record how the link was shared, and it did not ask university, program, or place of residence. Completing it is not treated as proof of enrollment. Respondents reported unstable networks (29 of 38), power interruptions (16 of 38), and homes that were often not quiet (27 of 38). Fourteen said home conditions affected study very much, and 14 selected very high stress; those two answers often appeared together. Worse reported internet speed went with a more negative view of online learning. QQ and Chaoxing were often marked unusable. Zoom and WhatsApp were more often marked available. Several platform items were not asked in every column, so the table is incomplete. The sample is small and belongs to emergency remote teaching. It does not describe a named course or current hybrid practice.</w:t>
+        <w:t xml:space="preserve">Sending-side studies of emergency online Chinese teaching have described how instructors adapted hours and tasks. They have said less about what respondents marked for home power, network speed, and named applications. This short contribution reports 38 completed replies to a Wenjuan questionnaire written in Chinese and submitted between 5 and 8 February 2022. The form did not record recruitment, university, or place. Completing it is not treated as proof of enrollment. Twenty-nine of 38 marked an unstable network, 16 marked power interruptions, and 27 said the home was not quiet. QQ and Chaoxing were often marked unusable. Zoom and WhatsApp were more often marked available. Several platform columns were never asked, so the table is incomplete. The counts document learner-side ticks the field has named but rarely tabulated. They do not describe a named course or current hybrid practice.</w:t>
       </w:r>
     </w:p>
     <w:p>
@@ -61,17 +79,17 @@
         <w:t xml:space="preserve"> </w:t>
       </w:r>
       <w:r>
-        <w:t xml:space="preserve">Chinese; online language teaching; household infrastructure; platform access; emergency remote teaching</w:t>
+        <w:t xml:space="preserve">online Chinese teaching; household conditions; platform access; questionnaire; emergency remote teaching</w:t>
       </w:r>
     </w:p>
     <w:bookmarkEnd w:id="20"/>
-    <w:bookmarkStart w:id="21" w:name="the-challenge"/>
+    <w:bookmarkStart w:id="21" w:name="why-these-38-rows-are-worth-a-short-note"/>
     <w:p>
       <w:pPr>
         <w:pStyle w:val="Heading2"/>
       </w:pPr>
       <w:r>
-        <w:t xml:space="preserve">The Challenge</w:t>
+        <w:t xml:space="preserve">1. Why these 38 rows are worth a short note</w:t>
       </w:r>
     </w:p>
     <w:p>
@@ -79,17 +97,25 @@
         <w:pStyle w:val="FirstParagraph"/>
       </w:pPr>
       <w:r>
-        <w:t xml:space="preserve">If a short questionnaire from 2022 already shows unstable connections, power interruptions, and applications marked unusable, what should a teacher still check before treating a live online hour as something every student can join?</w:t>
+        <w:t xml:space="preserve">Emergency writing on online language teaching already said that a live hour assumes a connection and a usable application (Gacs et al., 2020; González-Lloret, 2020; Hodges et al., 2020). For Chinese, Xu, Jin, Deifell, and Angus (2022) showed how character teaching was adapted on the sending side. Jin, Xu, and Deifell (2023) reported faculty views. Reviews still list technical trouble and still give few learner-side frequencies for named tools (Li &amp; Li, 2024; Tao &amp; Gao, 2022).</w:t>
+      </w:r>
+    </w:p>
+    <w:p>
+      <w:pPr>
+        <w:pStyle w:val="BodyText"/>
+      </w:pPr>
+      <w:r>
+        <w:t xml:space="preserve">This note does not repeat those designs. It puts one small table set on the page: home conditions and named platforms, as marked on a 2022 form. That is a documentation task. It is not a test of teaching, and it is not a study of a verified class.</w:t>
       </w:r>
     </w:p>
     <w:bookmarkEnd w:id="21"/>
-    <w:bookmarkStart w:id="22" w:name="introduction"/>
+    <w:bookmarkStart w:id="22" w:name="the-form"/>
     <w:p>
       <w:pPr>
         <w:pStyle w:val="Heading2"/>
       </w:pPr>
       <w:r>
-        <w:t xml:space="preserve">1. Introduction</w:t>
+        <w:t xml:space="preserve">2. The form</w:t>
       </w:r>
     </w:p>
     <w:p>
@@ -97,7 +123,7 @@
         <w:pStyle w:val="FirstParagraph"/>
       </w:pPr>
       <w:r>
-        <w:t xml:space="preserve">Online language teaching has long assumed that students can join a live session (Gacs et al., 2020; González-Lloret, 2020; Hodges et al., 2020; Payne, 2020). Work from the emergency-remote years, including work on Chinese, noted unstable networks, platforms that were hard to open, thinner talk, and strain (Moser et al., 2021; Russell, 2020; Tao &amp; Gao, 2022; Xu et al., 2022). A device is not the same as being able to take part (Beaunoyer et al., 2020; Warschauer, 2003). Distance language learning had already asked whether a remote class was even feasible (White, 2006).</w:t>
+        <w:t xml:space="preserve">The export title is Influencing factors in international students’ online Chinese learning during COVID-19. Thirty-eight complete rows remain. There was no recorded pilot. The link circulation was not stored. Host university, city, degree status, and scholarship type were not asked. Thirty-seven respondents selected Pakistani nationality. That box is reported as marked. Residence was not checked.</w:t>
       </w:r>
     </w:p>
     <w:p>
@@ -105,7 +131,7 @@
         <w:pStyle w:val="BodyText"/>
       </w:pPr>
       <w:r>
-        <w:t xml:space="preserve">Those difficulties are often named in reviews and teacher surveys. They are less often counted from a learner questionnaire. Xu, Jin, Deifell, and Angus (2022) show how character teaching was adapted on the sending side. Jin, Xu, and Deifell (2023) report what faculty thought about pandemic online teaching. The present paper does not repeat those designs. It reports one small form.</w:t>
+        <w:t xml:space="preserve">Twenty-seven respondents were men and 11 were women. Self-rated Chinese was advanced for 22, intermediate for 15, and beginner for one. Twenty-seven said required courses were online; 23 said electives were. Thirty said all of their Chinese classes were online. Twenty-two said they were working while studying. Submission operating system was iPhone (24) or Android (14). That is the device used to send the form.</w:t>
       </w:r>
     </w:p>
     <w:p>
@@ -113,136 +139,7 @@
         <w:pStyle w:val="BodyText"/>
       </w:pPr>
       <w:r>
-        <w:t xml:space="preserve">Between 5 and 8 February 2022, 38 people submitted a Wenjuan questionnaire written in Chinese. The export title is Influencing factors in international students’ online Chinese learning during COVID-19. The items are those on that form. The form did not record how the link was circulated. It did not ask host university, city, degree status, or scholarship type. Completing a questionnaire written in Chinese is not treated here as proof that the respondent was enrolled in a Chinese course. Thirty-seven of the 38 selected Pakistani nationality. That box is reported as marked. Residence was not checked, and writing on education in Pakistan is not used as evidence about this group.</w:t>
-      </w:r>
-    </w:p>
-    <w:p>
-      <w:pPr>
-        <w:pStyle w:val="BodyText"/>
-      </w:pPr>
-      <w:r>
-        <w:t xml:space="preserve">The paper asks one question:</w:t>
-      </w:r>
-    </w:p>
-    <w:p>
-      <w:pPr>
-        <w:pStyle w:val="BodyText"/>
-      </w:pPr>
-      <w:r>
-        <w:rPr>
-          <w:bCs/>
-          <w:b/>
-        </w:rPr>
-        <w:t xml:space="preserve">RQ1.</w:t>
-      </w:r>
-      <w:r>
-        <w:t xml:space="preserve"> </w:t>
-      </w:r>
-      <w:r>
-        <w:t xml:space="preserve">What household, connectivity, and platform-access conditions did these 38 respondents report?</w:t>
-      </w:r>
-    </w:p>
-    <w:p>
-      <w:pPr>
-        <w:pStyle w:val="BodyText"/>
-      </w:pPr>
-      <w:r>
-        <w:t xml:space="preserve">Other answers on the form are also described: a four-category stress question, a short appraisal of online learning, and a yes/no item on whether online study could replace campus classes. Those answers are counts and same-form associations. They are not a second study.</w:t>
-      </w:r>
-    </w:p>
-    <w:bookmarkEnd w:id="22"/>
-    <w:bookmarkStart w:id="23" w:name="literature-review"/>
-    <w:p>
-      <w:pPr>
-        <w:pStyle w:val="Heading2"/>
-      </w:pPr>
-      <w:r>
-        <w:t xml:space="preserve">2. Literature review</w:t>
-      </w:r>
-    </w:p>
-    <w:p>
-      <w:pPr>
-        <w:pStyle w:val="FirstParagraph"/>
-      </w:pPr>
-      <w:r>
-        <w:t xml:space="preserve">Hodges et al. (2020) distinguished emergency remote teaching from planned online provision. Gacs, Goertler, and Spasova (2020) brought that distinction into language education. In this journal, Russell (2020) treated anxiety as a condition of the online learner, and Xu et al. (2022) documented sending-side adaptation in Chinese character teaching. Later writing asked what should remain of emergency practice and warned against treating a videoconference copy of the classroom as the lesson of the crisis (Moorhouse, 2023; Stockwell &amp; Wang, 2023). Reviews of online Chinese teaching still say more about tools than about household access (Li &amp; Li, 2024; Xu, 2024).</w:t>
-      </w:r>
-    </w:p>
-    <w:p>
-      <w:pPr>
-        <w:pStyle w:val="BodyText"/>
-      </w:pPr>
-      <w:r>
-        <w:t xml:space="preserve">Digital-divide work separates owning a device from being able to use it (van Dijk, 2020; Warschauer, 2003). The present questionnaire asked about power, network stability, speed, the quiet of the home, and whether named applications could be used. It did not measure skills, institutional rules, or whether a platform was blocked. Those later readings are background for the items. They are not tested here.</w:t>
-      </w:r>
-    </w:p>
-    <w:bookmarkEnd w:id="23"/>
-    <w:bookmarkStart w:id="28" w:name="methods"/>
-    <w:p>
-      <w:pPr>
-        <w:pStyle w:val="Heading2"/>
-      </w:pPr>
-      <w:r>
-        <w:t xml:space="preserve">3. Methods</w:t>
-      </w:r>
-    </w:p>
-    <w:p>
-      <w:pPr>
-        <w:pStyle w:val="FirstParagraph"/>
-      </w:pPr>
-      <w:r>
-        <w:t xml:space="preserve">The study is a secondary analysis of a one-shot questionnaire. There was no recorded pilot and no separate validation study.</w:t>
-      </w:r>
-    </w:p>
-    <w:bookmarkStart w:id="24" w:name="participants"/>
-    <w:p>
-      <w:pPr>
-        <w:pStyle w:val="Heading3"/>
-      </w:pPr>
-      <w:r>
-        <w:t xml:space="preserve">3.1 Participants</w:t>
-      </w:r>
-    </w:p>
-    <w:p>
-      <w:pPr>
-        <w:pStyle w:val="FirstParagraph"/>
-      </w:pPr>
-      <w:r>
-        <w:t xml:space="preserve">Thirty-eight complete rows remain. Twenty-seven respondents were men and 11 were women. Thirty-seven selected Pakistani nationality. Self-rated Chinese level was advanced for 22, intermediate for 15, and beginner for one. The label is the respondent’s own, not an official band. Years of learning Chinese clustered at three to four years (26 of 38). Twenty-seven said required courses were online, and 23 said electives were online. Thirty said all of their Chinese classes were online. Twenty-two said they were working while studying. Those answers describe what was marked. They do not identify a named program.</w:t>
-      </w:r>
-    </w:p>
-    <w:p>
-      <w:pPr>
-        <w:pStyle w:val="BodyText"/>
-      </w:pPr>
-      <w:r>
-        <w:t xml:space="preserve">Wenjuan classified the submission operating system as iPhone (24) or Android (14). That is the device used to send the form, not a list of devices used for class. An IP-province field was also stored. Nine labels were mainland China province names. IP labels can be moved by a virtual private network or proxy. They are not used here as a location variable and are not in the public dataset.</w:t>
-      </w:r>
-    </w:p>
-    <w:bookmarkEnd w:id="24"/>
-    <w:bookmarkStart w:id="25" w:name="instrument-and-collection"/>
-    <w:p>
-      <w:pPr>
-        <w:pStyle w:val="Heading3"/>
-      </w:pPr>
-      <w:r>
-        <w:t xml:space="preserve">3.2 Instrument and collection</w:t>
-      </w:r>
-    </w:p>
-    <w:p>
-      <w:pPr>
-        <w:pStyle w:val="FirstParagraph"/>
-      </w:pPr>
-      <w:r>
-        <w:t xml:space="preserve">Complete cases were submitted between 5 and 8 February 2022. The questionnaire had about 30 items: demographics, single-choice ordinals, and multiple-response lists. The items were written in Chinese. Some wording was non-native. Reporting uses English glosses. There was no comprehension check.</w:t>
-      </w:r>
-    </w:p>
-    <w:p>
-      <w:pPr>
-        <w:pStyle w:val="BodyText"/>
-      </w:pPr>
-      <w:r>
-        <w:t xml:space="preserve">A three-item appraisal index was formed from learned much (Q8), improves Chinese (Q9), and sparks interest (Q10). Cronbach’s α was .84 in this sample. The index is a descriptive mean, not a validated scale. Coding follows the export: higher values on speed and on the three appraisal items indicate a worse report. Stress (Q24) is a four-category item.</w:t>
+        <w:t xml:space="preserve">The items were written in Chinese. Reporting uses English glosses. A three-item mean (learned much, improves Chinese, sparks interest) had Cronbach’s α = .84 here; it is a local mean, not a validated scale. Stress is the first category on a four-category item, glossed as very high.</w:t>
       </w:r>
       <w:r>
         <w:t xml:space="preserve"> </w:t>
@@ -252,13 +149,13 @@
           <w:iCs/>
           <w:i/>
         </w:rPr>
-        <w:t xml:space="preserve">Very high stress</w:t>
+        <w:t xml:space="preserve">Power interruptions</w:t>
       </w:r>
       <w:r>
         <w:t xml:space="preserve"> </w:t>
       </w:r>
       <w:r>
-        <w:t xml:space="preserve">is the first category on the form, not a clinical cut. One multiple-response option was labeled</w:t>
+        <w:t xml:space="preserve">is the export option</w:t>
       </w:r>
       <w:r>
         <w:t xml:space="preserve"> </w:t>
@@ -267,39 +164,36 @@
         <w:t xml:space="preserve">“</w:t>
       </w:r>
       <w:r>
-        <w:t xml:space="preserve">no electricity</w:t>
+        <w:t xml:space="preserve">no electricity.</w:t>
       </w:r>
       <w:r>
         <w:t xml:space="preserve">”</w:t>
       </w:r>
+    </w:p>
+    <w:p>
+      <w:pPr>
+        <w:pStyle w:val="BodyText"/>
+      </w:pPr>
       <w:r>
-        <w:t xml:space="preserve"> </w:t>
-      </w:r>
-      <w:r>
-        <w:t xml:space="preserve">on the export; results say</w:t>
-      </w:r>
-      <w:r>
-        <w:t xml:space="preserve"> </w:t>
-      </w:r>
-      <w:r>
-        <w:rPr>
-          <w:iCs/>
-          <w:i/>
-        </w:rPr>
-        <w:t xml:space="preserve">power interruptions</w:t>
-      </w:r>
-      <w:r>
-        <w:t xml:space="preserve">. Chinese MOOC is reported as printed on the form.</w:t>
+        <w:t xml:space="preserve">The form said answers would be used for research. Completion was treated as consent. No ethics-committee number exists for the 2022 collection. Identifiers were removed before the public dataset was prepared.</w:t>
       </w:r>
     </w:p>
-    <w:bookmarkEnd w:id="25"/>
-    <w:bookmarkStart w:id="26" w:name="analysis"/>
     <w:p>
       <w:pPr>
-        <w:pStyle w:val="Heading3"/>
+        <w:pStyle w:val="BodyText"/>
       </w:pPr>
       <w:r>
-        <w:t xml:space="preserve">3.3 Analysis</w:t>
+        <w:t xml:space="preserve">Frequencies are n/38. Two same-form pairs are given as co-occurrence only: home affects study very much with very high stress (Fisher’s exact test), and speed with the appraisal mean (Spearman’s ρ).</w:t>
+      </w:r>
+    </w:p>
+    <w:bookmarkEnd w:id="22"/>
+    <w:bookmarkStart w:id="23" w:name="what-was-marked"/>
+    <w:p>
+      <w:pPr>
+        <w:pStyle w:val="Heading2"/>
+      </w:pPr>
+      <w:r>
+        <w:t xml:space="preserve">3. What was marked</w:t>
       </w:r>
     </w:p>
     <w:p>
@@ -307,53 +201,7 @@
         <w:pStyle w:val="FirstParagraph"/>
       </w:pPr>
       <w:r>
-        <w:t xml:space="preserve">Household and platform answers are frequencies (Tables 1 to 3). Two same-form associations are also given: home affects study very much with very high stress (two-sided Fisher’s exact test), and internet speed with the appraisal index (Spearman’s ρ, percentile bootstrap 95% confidence interval, 5,000 resamples). The replacement item is a count. Odds ratios are not reported. Frequencies are n/38 unless noted. Multiple-response items are the share who selected the option.</w:t>
-      </w:r>
-    </w:p>
-    <w:bookmarkEnd w:id="26"/>
-    <w:bookmarkStart w:id="27" w:name="ethics"/>
-    <w:p>
-      <w:pPr>
-        <w:pStyle w:val="Heading3"/>
-      </w:pPr>
-      <w:r>
-        <w:t xml:space="preserve">3.4 Ethics</w:t>
-      </w:r>
-    </w:p>
-    <w:p>
-      <w:pPr>
-        <w:pStyle w:val="FirstParagraph"/>
-      </w:pPr>
-      <w:r>
-        <w:t xml:space="preserve">The form was presented as research on online Chinese learning and said that answers would be used for research. Completion and submission were treated as consent. No institutional ethics approval number is available for the 2022 collection. The first author was then a master’s student, and numbered approval was not obtained. Names, IP addresses, exact timestamps, and device identifiers were removed before the public dataset was prepared. No new data were collected.</w:t>
-      </w:r>
-    </w:p>
-    <w:bookmarkEnd w:id="27"/>
-    <w:bookmarkEnd w:id="28"/>
-    <w:bookmarkStart w:id="32" w:name="results"/>
-    <w:p>
-      <w:pPr>
-        <w:pStyle w:val="Heading2"/>
-      </w:pPr>
-      <w:r>
-        <w:t xml:space="preserve">4. Results</w:t>
-      </w:r>
-    </w:p>
-    <w:bookmarkStart w:id="29" w:name="Xde1493b68d584d3ae1d49aefd1652d63a9010bf"/>
-    <w:p>
-      <w:pPr>
-        <w:pStyle w:val="Heading3"/>
-      </w:pPr>
-      <w:r>
-        <w:t xml:space="preserve">4.1 Who answered, and what they reported at home</w:t>
-      </w:r>
-    </w:p>
-    <w:p>
-      <w:pPr>
-        <w:pStyle w:val="FirstParagraph"/>
-      </w:pPr>
-      <w:r>
-        <w:t xml:space="preserve">Table 1 summarizes the marked background items.</w:t>
+        <w:t xml:space="preserve">Table 1 is the background ticks.</w:t>
       </w:r>
     </w:p>
     <w:p>
@@ -775,44 +623,6 @@
           </w:p>
         </w:tc>
       </w:tr>
-      <w:tr>
-        <w:tc>
-          <w:tcPr/>
-          <w:p>
-            <w:pPr>
-              <w:pStyle w:val="Compact"/>
-              <w:jc w:val="left"/>
-            </w:pPr>
-            <w:r>
-              <w:t xml:space="preserve">Total</w:t>
-            </w:r>
-          </w:p>
-        </w:tc>
-        <w:tc>
-          <w:tcPr/>
-          <w:p>
-            <w:pPr>
-              <w:pStyle w:val="Compact"/>
-              <w:jc w:val="right"/>
-            </w:pPr>
-            <w:r>
-              <w:t xml:space="preserve">38</w:t>
-            </w:r>
-          </w:p>
-        </w:tc>
-        <w:tc>
-          <w:tcPr/>
-          <w:p>
-            <w:pPr>
-              <w:pStyle w:val="Compact"/>
-              <w:jc w:val="right"/>
-            </w:pPr>
-            <w:r>
-              <w:t xml:space="preserve">100</w:t>
-            </w:r>
-          </w:p>
-        </w:tc>
-      </w:tr>
     </w:tbl>
     <w:p>
       <w:pPr>
@@ -829,7 +639,7 @@
         <w:t xml:space="preserve"> </w:t>
       </w:r>
       <w:r>
-        <w:t xml:space="preserve">Wenjuan, 5 to 8 February 2022. Device is the operating system recorded at submission.</w:t>
+        <w:t xml:space="preserve">Wenjuan, 5 to 8 February 2022.</w:t>
       </w:r>
     </w:p>
     <w:p>
@@ -837,7 +647,7 @@
         <w:pStyle w:val="BodyText"/>
       </w:pPr>
       <w:r>
-        <w:t xml:space="preserve">Table 2 gives the household and connectivity reports. Twenty-nine of 38 marked an unstable network. Sixteen marked power interruptions. Twenty-seven said the home was not quiet. Fourteen said the home affected study very much, and 14 selected very high stress. Four people marked that their country did not have internet, yet all 38 submitted an online form. The wording does not allow a firm rereading, so that answer is left as marked.</w:t>
+        <w:t xml:space="preserve">Table 2 is the home and connection ticks. Four people marked that their country did not have internet, yet all 38 submitted online. That answer is left as marked.</w:t>
       </w:r>
     </w:p>
     <w:p>
@@ -861,7 +671,7 @@
           <w:iCs/>
           <w:i/>
         </w:rPr>
-        <w:t xml:space="preserve">Reported conditions and selected other items (N = 38)</w:t>
+        <w:t xml:space="preserve">Home and connection items (N = 38)</w:t>
       </w:r>
     </w:p>
     <w:tbl>
@@ -1260,76 +1070,12 @@
         </w:tc>
       </w:tr>
     </w:tbl>
-    <w:bookmarkEnd w:id="29"/>
-    <w:bookmarkStart w:id="30" w:name="platform-items"/>
     <w:p>
       <w:pPr>
-        <w:pStyle w:val="Heading3"/>
+        <w:pStyle w:val="BodyText"/>
       </w:pPr>
       <w:r>
-        <w:t xml:space="preserve">4.2 Platform items</w:t>
-      </w:r>
-    </w:p>
-    <w:p>
-      <w:pPr>
-        <w:pStyle w:val="FirstParagraph"/>
-      </w:pPr>
-      <w:r>
-        <w:t xml:space="preserve">Table 3 is incomplete by design. Some platforms were asked as</w:t>
-      </w:r>
-      <w:r>
-        <w:t xml:space="preserve"> </w:t>
-      </w:r>
-      <w:r>
-        <w:t xml:space="preserve">“</w:t>
-      </w:r>
-      <w:r>
-        <w:t xml:space="preserve">used for class,</w:t>
-      </w:r>
-      <w:r>
-        <w:t xml:space="preserve">”</w:t>
-      </w:r>
-      <w:r>
-        <w:t xml:space="preserve"> </w:t>
-      </w:r>
-      <w:r>
-        <w:t xml:space="preserve">some as</w:t>
-      </w:r>
-      <w:r>
-        <w:t xml:space="preserve"> </w:t>
-      </w:r>
-      <w:r>
-        <w:t xml:space="preserve">“</w:t>
-      </w:r>
-      <w:r>
-        <w:t xml:space="preserve">unusable in my country,</w:t>
-      </w:r>
-      <w:r>
-        <w:t xml:space="preserve">”</w:t>
-      </w:r>
-      <w:r>
-        <w:t xml:space="preserve"> </w:t>
-      </w:r>
-      <w:r>
-        <w:t xml:space="preserve">and some as</w:t>
-      </w:r>
-      <w:r>
-        <w:t xml:space="preserve"> </w:t>
-      </w:r>
-      <w:r>
-        <w:t xml:space="preserve">“</w:t>
-      </w:r>
-      <w:r>
-        <w:t xml:space="preserve">can use in my country.</w:t>
-      </w:r>
-      <w:r>
-        <w:t xml:space="preserve">”</w:t>
-      </w:r>
-      <w:r>
-        <w:t xml:space="preserve"> </w:t>
-      </w:r>
-      <w:r>
-        <w:t xml:space="preserve">WhatsApp has no used-for-class column. QQ, Chaoxing, DingTalk, and Chinese MOOC have no used-for-class column. Tencent Meeting was the most marked class tool (71.1%) and was marked available by fewer respondents (57.9%). That mismatch is left as an item problem. The table cannot separate country rules, routing, accounts, skills, or a virtual private network.</w:t>
+        <w:t xml:space="preserve">Table 3 is incomplete. Some tools were asked as used for class, some as unusable in my country, some as can use in my country. Tencent Meeting was marked as used by 71.1% and as available by 57.9%. The table cannot separate blocking, accounts, skill, or a virtual private network.</w:t>
       </w:r>
     </w:p>
     <w:p>
@@ -1353,7 +1099,7 @@
           <w:iCs/>
           <w:i/>
         </w:rPr>
-        <w:t xml:space="preserve">Platform items as asked (multiple response, N = 38)</w:t>
+        <w:t xml:space="preserve">Named platforms as asked (multiple response, N = 38)</w:t>
       </w:r>
     </w:p>
     <w:tbl>
@@ -1838,40 +1584,12 @@
         <w:t xml:space="preserve"> </w:t>
       </w:r>
       <w:r>
-        <w:t xml:space="preserve">n.a. = the item was not asked in that column.</w:t>
-      </w:r>
-      <w:r>
-        <w:t xml:space="preserve"> </w:t>
-      </w:r>
-      <w:r>
-        <w:t xml:space="preserve">“</w:t>
-      </w:r>
-      <w:r>
-        <w:t xml:space="preserve">My country</w:t>
-      </w:r>
-      <w:r>
-        <w:t xml:space="preserve">”</w:t>
-      </w:r>
-      <w:r>
-        <w:t xml:space="preserve"> </w:t>
-      </w:r>
-      <w:r>
-        <w:t xml:space="preserve">is the stem wording.</w:t>
-      </w:r>
-    </w:p>
-    <w:bookmarkEnd w:id="30"/>
-    <w:bookmarkStart w:id="31" w:name="stress-appraisals-and-replacement"/>
-    <w:p>
-      <w:pPr>
-        <w:pStyle w:val="Heading3"/>
-      </w:pPr>
-      <w:r>
-        <w:t xml:space="preserve">4.3 Stress, appraisals, and replacement</w:t>
+        <w:t xml:space="preserve">n.a. = not asked in that column.</w:t>
       </w:r>
     </w:p>
     <w:p>
       <w:pPr>
-        <w:pStyle w:val="FirstParagraph"/>
+        <w:pStyle w:val="BodyText"/>
       </w:pPr>
       <w:r>
         <w:t xml:space="preserve">Among those who said the home affected study very much, 11 of 14 also selected very high stress; among the others, 3 of 24 did (two-sided Fisher’s exact</w:t>
@@ -1890,23 +1608,25 @@
         <w:t xml:space="preserve"> </w:t>
       </w:r>
       <w:r>
-        <w:t xml:space="preserve">= .00008). Worse internet speed went with a worse appraisal index (ρ = .65, percentile bootstrap 95% CI [.36, .84],</w:t>
+        <w:t xml:space="preserve">= .00008). Worse speed went with a worse appraisal mean (ρ = .65, percentile bootstrap 95% CI [.36, .84]). Nineteen said online study could replace campus classes; 19 said it could not. Preferred live length was 45 minutes for 19 people and 30 minutes for 11.</w:t>
       </w:r>
+    </w:p>
+    <w:bookmarkEnd w:id="23"/>
+    <w:bookmarkStart w:id="24" w:name="X3f9a06f98ef0a4a81e5ec1f167f6257c9aa4cdb"/>
+    <w:p>
+      <w:pPr>
+        <w:pStyle w:val="Heading2"/>
+      </w:pPr>
       <w:r>
-        <w:t xml:space="preserve"> </w:t>
+        <w:t xml:space="preserve">4. What a Chinese teacher can take from this</w:t>
       </w:r>
+    </w:p>
+    <w:p>
+      <w:pPr>
+        <w:pStyle w:val="FirstParagraph"/>
+      </w:pPr>
       <w:r>
-        <w:rPr>
-          <w:iCs/>
-          <w:i/>
-        </w:rPr>
-        <w:t xml:space="preserve">p</w:t>
-      </w:r>
-      <w:r>
-        <w:t xml:space="preserve"> </w:t>
-      </w:r>
-      <w:r>
-        <w:t xml:space="preserve">&lt; .001). Both pairs come from the same form. They are reported as co-occurrence, not as cause.</w:t>
+        <w:t xml:space="preserve">The useful part of the note is Table 2 plus the named tools in Table 3. Xu et al. (2022) could show how teachers adapted characters. These rows show that QQ and Chaoxing were often marked unusable on this form, while Zoom and WhatsApp were more often marked available. A teacher who still requires one campus application can at least ask whether that application opens where the learner sits. The data do not recommend WhatsApp as a class tool: the form never asked whether it was used for class.</w:t>
       </w:r>
     </w:p>
     <w:p>
@@ -1914,37 +1634,7 @@
         <w:pStyle w:val="BodyText"/>
       </w:pPr>
       <w:r>
-        <w:t xml:space="preserve">Active interaction with the teacher</w:t>
-      </w:r>
-      <w:r>
-        <w:t xml:space="preserve"> </w:t>
-      </w:r>
-      <w:r>
-        <w:t xml:space="preserve">“</w:t>
-      </w:r>
-      <w:r>
-        <w:t xml:space="preserve">very much</w:t>
-      </w:r>
-      <w:r>
-        <w:t xml:space="preserve">”</w:t>
-      </w:r>
-      <w:r>
-        <w:t xml:space="preserve"> </w:t>
-      </w:r>
-      <w:r>
-        <w:t xml:space="preserve">was marked by 6 of 38. Preferred live length was 45 minutes for 19 respondents and 30 minutes for 11. One open comment said that even one minute online was</w:t>
-      </w:r>
-      <w:r>
-        <w:t xml:space="preserve"> </w:t>
-      </w:r>
-      <w:r>
-        <w:t xml:space="preserve">“</w:t>
-      </w:r>
-      <w:r>
-        <w:t xml:space="preserve">not suitable.</w:t>
-      </w:r>
-      <w:r>
-        <w:t xml:space="preserve">”</w:t>
+        <w:t xml:space="preserve">A live oral hour that needs a quiet room and a steady line will treat many of the ticks in Table 2 as absence or weak performance. That is worth checking before the first session. It is not a rule for a national program.</w:t>
       </w:r>
     </w:p>
     <w:p>
@@ -1952,18 +1642,17 @@
         <w:pStyle w:val="BodyText"/>
       </w:pPr>
       <w:r>
-        <w:t xml:space="preserve">Nineteen said online study could replace campus classes, and 19 said it could not.</w:t>
+        <w:t xml:space="preserve">The stress and replacement numbers sit on the same form as the home items. They are not a second finding.</w:t>
       </w:r>
     </w:p>
-    <w:bookmarkEnd w:id="31"/>
-    <w:bookmarkEnd w:id="32"/>
-    <w:bookmarkStart w:id="33" w:name="discussion"/>
+    <w:bookmarkEnd w:id="24"/>
+    <w:bookmarkStart w:id="25" w:name="limits"/>
     <w:p>
       <w:pPr>
         <w:pStyle w:val="Heading2"/>
       </w:pPr>
       <w:r>
-        <w:t xml:space="preserve">5. Discussion</w:t>
+        <w:t xml:space="preserve">5. Limits</w:t>
       </w:r>
     </w:p>
     <w:p>
@@ -1971,466 +1660,11 @@
         <w:pStyle w:val="FirstParagraph"/>
       </w:pPr>
       <w:r>
-        <w:t xml:space="preserve">The 38 rows show a familiar list: unstable networks, power interruptions, homes that were often not quiet, and some applications marked unusable. That list matches trouble the field has already named (Tao &amp; Gao, 2022; Xu et al., 2022). It does not show how any institution taught, and it does not show that these respondents sat in one travelling course.</w:t>
+        <w:t xml:space="preserve">Thirty-eight self-selected rows, four days, unknown recruitment, enrollment not verified, no pilot, incomplete platform columns, no ethics number, February 2022. Later hybrid teaching is outside the file.</w:t>
       </w:r>
     </w:p>
-    <w:p>
-      <w:pPr>
-        <w:pStyle w:val="BodyText"/>
-      </w:pPr>
-      <w:r>
-        <w:t xml:space="preserve">The stress and appraisal associations sit on the same questionnaire as the home and speed items. A person having a hard week could mark both. The 19/19 replacement split is a split, not a finding about online Chinese teaching.</w:t>
-      </w:r>
-    </w:p>
-    <w:p>
-      <w:pPr>
-        <w:pStyle w:val="BodyText"/>
-      </w:pPr>
-      <w:r>
-        <w:t xml:space="preserve">Table 3 can be read only as marked options. QQ and Chaoxing were often marked unusable. Zoom and WhatsApp were more often marked available. Because the columns were not asked for every platform, the table cannot support a map of which tools a Chinese program should drop.</w:t>
-      </w:r>
-    </w:p>
-    <w:bookmarkEnd w:id="33"/>
-    <w:bookmarkStart w:id="34" w:name="pedagogical-implications"/>
-    <w:p>
-      <w:pPr>
-        <w:pStyle w:val="Heading2"/>
-      </w:pPr>
-      <w:r>
-        <w:t xml:space="preserve">6. Pedagogical implications</w:t>
-      </w:r>
-    </w:p>
-    <w:p>
-      <w:pPr>
-        <w:pStyle w:val="FirstParagraph"/>
-      </w:pPr>
-      <w:r>
-        <w:t xml:space="preserve">These 38 answers cannot tell a program which platform to adopt or how long a live hour should last. They can remind a teacher to ask, before treating attendance as simple, whether the home is quiet enough for speech, whether the power and the connection hold, and whether the required application opens. WhatsApp was often marked available here, but the form did not ask whether it was used for class, so it is not recommended from these data. A live oral test that assumes a campus hour will treat some of the conditions in Table 2 as learner failure. That is a risk worth naming. It is not a policy derived from this sample.</w:t>
-      </w:r>
-    </w:p>
-    <w:bookmarkEnd w:id="34"/>
-    <w:bookmarkStart w:id="35" w:name="limitations"/>
-    <w:p>
-      <w:pPr>
-        <w:pStyle w:val="Heading2"/>
-      </w:pPr>
-      <w:r>
-        <w:t xml:space="preserve">7. Limitations</w:t>
-      </w:r>
-    </w:p>
-    <w:p>
-      <w:pPr>
-        <w:pStyle w:val="FirstParagraph"/>
-      </w:pPr>
-      <w:r>
-        <w:t xml:space="preserve">The sample is 38 self-selected rows from four days in February 2022. Recruitment is unknown. Enrollment was not verified. The instrument was not piloted. Several platform columns were never asked. The appraisal index is a local mean. There is no ethics-committee number for the original collection. The results are not a picture of current hybrid teaching.</w:t>
-      </w:r>
-    </w:p>
-    <w:bookmarkEnd w:id="35"/>
-    <w:bookmarkStart w:id="36" w:name="conclusion"/>
-    <w:p>
-      <w:pPr>
-        <w:pStyle w:val="Heading2"/>
-      </w:pPr>
-      <w:r>
-        <w:t xml:space="preserve">8. Conclusion</w:t>
-      </w:r>
-    </w:p>
-    <w:p>
-      <w:pPr>
-        <w:pStyle w:val="FirstParagraph"/>
-      </w:pPr>
-      <w:r>
-        <w:t xml:space="preserve">Thirty-eight people who completed this 2022 questionnaire reported home and platform trouble alongside stress and mixed views of online study. That is all these rows can carry. Whether later teaching has closed that gap is a question they cannot answer.</w:t>
-      </w:r>
-    </w:p>
-    <w:bookmarkEnd w:id="36"/>
-    <w:bookmarkStart w:id="37" w:name="appendix.-item-glosses-and-coding"/>
-    <w:p>
-      <w:pPr>
-        <w:pStyle w:val="Heading2"/>
-      </w:pPr>
-      <w:r>
-        <w:t xml:space="preserve">Appendix. Item glosses and coding</w:t>
-      </w:r>
-    </w:p>
-    <w:tbl>
-      <w:tblPr>
-        <w:tblStyle w:val="Table"/>
-        <w:tblW w:type="pct" w:w="5000"/>
-        <w:tblLook w:firstRow="1" w:lastRow="0" w:firstColumn="0" w:lastColumn="0" w:noHBand="0" w:noVBand="0" w:val="0020"/>
-        <w:jc w:val="start"/>
-      </w:tblPr>
-      <w:tblGrid>
-        <w:gridCol w:w="1980"/>
-        <w:gridCol w:w="1980"/>
-        <w:gridCol w:w="1980"/>
-        <w:gridCol w:w="1980"/>
-      </w:tblGrid>
-      <w:tr>
-        <w:trPr>
-          <w:tblHeader w:val="true"/>
-        </w:trPr>
-        <w:tc>
-          <w:tcPr/>
-          <w:p>
-            <w:pPr>
-              <w:pStyle w:val="Compact"/>
-              <w:jc w:val="left"/>
-            </w:pPr>
-            <w:r>
-              <w:t xml:space="preserve">Item</w:t>
-            </w:r>
-          </w:p>
-        </w:tc>
-        <w:tc>
-          <w:tcPr/>
-          <w:p>
-            <w:pPr>
-              <w:pStyle w:val="Compact"/>
-              <w:jc w:val="left"/>
-            </w:pPr>
-            <w:r>
-              <w:t xml:space="preserve">Stem (gloss)</w:t>
-            </w:r>
-          </w:p>
-        </w:tc>
-        <w:tc>
-          <w:tcPr/>
-          <w:p>
-            <w:pPr>
-              <w:pStyle w:val="Compact"/>
-              <w:jc w:val="left"/>
-            </w:pPr>
-            <w:r>
-              <w:t xml:space="preserve">1</w:t>
-            </w:r>
-          </w:p>
-        </w:tc>
-        <w:tc>
-          <w:tcPr/>
-          <w:p>
-            <w:pPr>
-              <w:pStyle w:val="Compact"/>
-              <w:jc w:val="left"/>
-            </w:pPr>
-            <w:r>
-              <w:t xml:space="preserve">Higher</w:t>
-            </w:r>
-          </w:p>
-        </w:tc>
-      </w:tr>
-      <w:tr>
-        <w:tc>
-          <w:tcPr/>
-          <w:p>
-            <w:pPr>
-              <w:pStyle w:val="Compact"/>
-              <w:jc w:val="left"/>
-            </w:pPr>
-            <w:r>
-              <w:t xml:space="preserve">Learned (Q8)</w:t>
-            </w:r>
-          </w:p>
-        </w:tc>
-        <w:tc>
-          <w:tcPr/>
-          <w:p>
-            <w:pPr>
-              <w:pStyle w:val="Compact"/>
-              <w:jc w:val="left"/>
-            </w:pPr>
-            <w:r>
-              <w:t xml:space="preserve">Can you learn a lot in online class?</w:t>
-            </w:r>
-          </w:p>
-        </w:tc>
-        <w:tc>
-          <w:tcPr/>
-          <w:p>
-            <w:pPr>
-              <w:pStyle w:val="Compact"/>
-              <w:jc w:val="left"/>
-            </w:pPr>
-            <w:r>
-              <w:t xml:space="preserve">a lot</w:t>
-            </w:r>
-          </w:p>
-        </w:tc>
-        <w:tc>
-          <w:tcPr/>
-          <w:p>
-            <w:pPr>
-              <w:pStyle w:val="Compact"/>
-              <w:jc w:val="left"/>
-            </w:pPr>
-            <w:r>
-              <w:t xml:space="preserve">worse appraisal</w:t>
-            </w:r>
-          </w:p>
-        </w:tc>
-      </w:tr>
-      <w:tr>
-        <w:tc>
-          <w:tcPr/>
-          <w:p>
-            <w:pPr>
-              <w:pStyle w:val="Compact"/>
-              <w:jc w:val="left"/>
-            </w:pPr>
-            <w:r>
-              <w:t xml:space="preserve">Improve (Q9)</w:t>
-            </w:r>
-          </w:p>
-        </w:tc>
-        <w:tc>
-          <w:tcPr/>
-          <w:p>
-            <w:pPr>
-              <w:pStyle w:val="Compact"/>
-              <w:jc w:val="left"/>
-            </w:pPr>
-            <w:r>
-              <w:t xml:space="preserve">Can online study improve Chinese?</w:t>
-            </w:r>
-          </w:p>
-        </w:tc>
-        <w:tc>
-          <w:tcPr/>
-          <w:p>
-            <w:pPr>
-              <w:pStyle w:val="Compact"/>
-              <w:jc w:val="left"/>
-            </w:pPr>
-            <w:r>
-              <w:t xml:space="preserve">very much</w:t>
-            </w:r>
-          </w:p>
-        </w:tc>
-        <w:tc>
-          <w:tcPr/>
-          <w:p>
-            <w:pPr>
-              <w:pStyle w:val="Compact"/>
-              <w:jc w:val="left"/>
-            </w:pPr>
-            <w:r>
-              <w:t xml:space="preserve">worse appraisal</w:t>
-            </w:r>
-          </w:p>
-        </w:tc>
-      </w:tr>
-      <w:tr>
-        <w:tc>
-          <w:tcPr/>
-          <w:p>
-            <w:pPr>
-              <w:pStyle w:val="Compact"/>
-              <w:jc w:val="left"/>
-            </w:pPr>
-            <w:r>
-              <w:t xml:space="preserve">Interest (Q10)</w:t>
-            </w:r>
-          </w:p>
-        </w:tc>
-        <w:tc>
-          <w:tcPr/>
-          <w:p>
-            <w:pPr>
-              <w:pStyle w:val="Compact"/>
-              <w:jc w:val="left"/>
-            </w:pPr>
-            <w:r>
-              <w:t xml:space="preserve">Does it spark learning interest?</w:t>
-            </w:r>
-          </w:p>
-        </w:tc>
-        <w:tc>
-          <w:tcPr/>
-          <w:p>
-            <w:pPr>
-              <w:pStyle w:val="Compact"/>
-              <w:jc w:val="left"/>
-            </w:pPr>
-            <w:r>
-              <w:t xml:space="preserve">very much</w:t>
-            </w:r>
-          </w:p>
-        </w:tc>
-        <w:tc>
-          <w:tcPr/>
-          <w:p>
-            <w:pPr>
-              <w:pStyle w:val="Compact"/>
-              <w:jc w:val="left"/>
-            </w:pPr>
-            <w:r>
-              <w:t xml:space="preserve">worse appraisal</w:t>
-            </w:r>
-          </w:p>
-        </w:tc>
-      </w:tr>
-      <w:tr>
-        <w:tc>
-          <w:tcPr/>
-          <w:p>
-            <w:pPr>
-              <w:pStyle w:val="Compact"/>
-              <w:jc w:val="left"/>
-            </w:pPr>
-            <w:r>
-              <w:t xml:space="preserve">Speed (Q14)</w:t>
-            </w:r>
-          </w:p>
-        </w:tc>
-        <w:tc>
-          <w:tcPr/>
-          <w:p>
-            <w:pPr>
-              <w:pStyle w:val="Compact"/>
-              <w:jc w:val="left"/>
-            </w:pPr>
-            <w:r>
-              <w:t xml:space="preserve">Internet speed</w:t>
-            </w:r>
-          </w:p>
-        </w:tc>
-        <w:tc>
-          <w:tcPr/>
-          <w:p>
-            <w:pPr>
-              <w:pStyle w:val="Compact"/>
-              <w:jc w:val="left"/>
-            </w:pPr>
-            <w:r>
-              <w:t xml:space="preserve">very good</w:t>
-            </w:r>
-          </w:p>
-        </w:tc>
-        <w:tc>
-          <w:tcPr/>
-          <w:p>
-            <w:pPr>
-              <w:pStyle w:val="Compact"/>
-              <w:jc w:val="left"/>
-            </w:pPr>
-            <w:r>
-              <w:t xml:space="preserve">worse speed</w:t>
-            </w:r>
-          </w:p>
-        </w:tc>
-      </w:tr>
-      <w:tr>
-        <w:tc>
-          <w:tcPr/>
-          <w:p>
-            <w:pPr>
-              <w:pStyle w:val="Compact"/>
-              <w:jc w:val="left"/>
-            </w:pPr>
-            <w:r>
-              <w:t xml:space="preserve">Stress (Q24)</w:t>
-            </w:r>
-          </w:p>
-        </w:tc>
-        <w:tc>
-          <w:tcPr/>
-          <w:p>
-            <w:pPr>
-              <w:pStyle w:val="Compact"/>
-              <w:jc w:val="left"/>
-            </w:pPr>
-            <w:r>
-              <w:t xml:space="preserve">Psychological stress</w:t>
-            </w:r>
-          </w:p>
-        </w:tc>
-        <w:tc>
-          <w:tcPr/>
-          <w:p>
-            <w:pPr>
-              <w:pStyle w:val="Compact"/>
-              <w:jc w:val="left"/>
-            </w:pPr>
-            <w:r>
-              <w:t xml:space="preserve">very high</w:t>
-            </w:r>
-          </w:p>
-        </w:tc>
-        <w:tc>
-          <w:tcPr/>
-          <w:p>
-            <w:pPr>
-              <w:pStyle w:val="Compact"/>
-              <w:jc w:val="left"/>
-            </w:pPr>
-            <w:r>
-              <w:t xml:space="preserve">less stress</w:t>
-            </w:r>
-          </w:p>
-        </w:tc>
-      </w:tr>
-      <w:tr>
-        <w:tc>
-          <w:tcPr/>
-          <w:p>
-            <w:pPr>
-              <w:pStyle w:val="Compact"/>
-              <w:jc w:val="left"/>
-            </w:pPr>
-            <w:r>
-              <w:t xml:space="preserve">Interaction (Q25)</w:t>
-            </w:r>
-          </w:p>
-        </w:tc>
-        <w:tc>
-          <w:tcPr/>
-          <w:p>
-            <w:pPr>
-              <w:pStyle w:val="Compact"/>
-              <w:jc w:val="left"/>
-            </w:pPr>
-            <w:r>
-              <w:t xml:space="preserve">Active interaction with teacher</w:t>
-            </w:r>
-          </w:p>
-        </w:tc>
-        <w:tc>
-          <w:tcPr/>
-          <w:p>
-            <w:pPr>
-              <w:pStyle w:val="Compact"/>
-              <w:jc w:val="left"/>
-            </w:pPr>
-            <w:r>
-              <w:t xml:space="preserve">very much</w:t>
-            </w:r>
-          </w:p>
-        </w:tc>
-        <w:tc>
-          <w:tcPr/>
-          <w:p>
-            <w:pPr>
-              <w:pStyle w:val="Compact"/>
-              <w:jc w:val="left"/>
-            </w:pPr>
-            <w:r>
-              <w:t xml:space="preserve">thinner interaction</w:t>
-            </w:r>
-          </w:p>
-        </w:tc>
-      </w:tr>
-    </w:tbl>
-    <w:p>
-      <w:pPr>
-        <w:pStyle w:val="BodyText"/>
-      </w:pPr>
-      <w:r>
-        <w:t xml:space="preserve">Index = mean of Q8, Q9, and Q10 (n = 38).</w:t>
-      </w:r>
-    </w:p>
-    <w:bookmarkEnd w:id="37"/>
-    <w:bookmarkStart w:id="38" w:name="references"/>
+    <w:bookmarkEnd w:id="25"/>
+    <w:bookmarkStart w:id="26" w:name="references"/>
     <w:p>
       <w:pPr>
         <w:pStyle w:val="Heading2"/>
@@ -2442,27 +1676,6 @@
     <w:p>
       <w:pPr>
         <w:pStyle w:val="FirstParagraph"/>
-      </w:pPr>
-      <w:r>
-        <w:t xml:space="preserve">Beaunoyer, E., Dupéré, S., &amp; Guitton, M. J. (2020). COVID-19 and digital inequalities: Reciprocal impacts and mitigation strategies.</w:t>
-      </w:r>
-      <w:r>
-        <w:t xml:space="preserve"> </w:t>
-      </w:r>
-      <w:r>
-        <w:rPr>
-          <w:iCs/>
-          <w:i/>
-        </w:rPr>
-        <w:t xml:space="preserve">Computers in Human Behavior, 111</w:t>
-      </w:r>
-      <w:r>
-        <w:t xml:space="preserve">, Article 106424. https://doi.org/10.1016/j.chb.2020.106424</w:t>
-      </w:r>
-    </w:p>
-    <w:p>
-      <w:pPr>
-        <w:pStyle w:val="BodyText"/>
       </w:pPr>
       <w:r>
         <w:t xml:space="preserve">Gacs, A., Goertler, S., &amp; Spasova, S. (2020). Planned online language education versus crisis-prompted online language teaching: Lessons for the future.</w:t>
@@ -2570,111 +1783,6 @@
         <w:pStyle w:val="BodyText"/>
       </w:pPr>
       <w:r>
-        <w:t xml:space="preserve">Moorhouse, B. L. (2023). Teachers’ digital technology use after a period of online teaching.</w:t>
-      </w:r>
-      <w:r>
-        <w:t xml:space="preserve"> </w:t>
-      </w:r>
-      <w:r>
-        <w:rPr>
-          <w:iCs/>
-          <w:i/>
-        </w:rPr>
-        <w:t xml:space="preserve">ELT Journal, 77</w:t>
-      </w:r>
-      <w:r>
-        <w:t xml:space="preserve">(4), 445-457. https://doi.org/10.1093/elt/ccac050</w:t>
-      </w:r>
-    </w:p>
-    <w:p>
-      <w:pPr>
-        <w:pStyle w:val="BodyText"/>
-      </w:pPr>
-      <w:r>
-        <w:t xml:space="preserve">Moser, K. M., Wei, T., &amp; Brenner, D. (2021). Remote teaching during COVID-19: Implications from a national survey of language educators.</w:t>
-      </w:r>
-      <w:r>
-        <w:t xml:space="preserve"> </w:t>
-      </w:r>
-      <w:r>
-        <w:rPr>
-          <w:iCs/>
-          <w:i/>
-        </w:rPr>
-        <w:t xml:space="preserve">System, 97</w:t>
-      </w:r>
-      <w:r>
-        <w:t xml:space="preserve">, Article 102431. https://doi.org/10.1016/j.system.2020.102431</w:t>
-      </w:r>
-    </w:p>
-    <w:p>
-      <w:pPr>
-        <w:pStyle w:val="BodyText"/>
-      </w:pPr>
-      <w:r>
-        <w:t xml:space="preserve">Payne, J. S. (2020). Developing L2 productive language skills online and the strategic use of instructional tools.</w:t>
-      </w:r>
-      <w:r>
-        <w:t xml:space="preserve"> </w:t>
-      </w:r>
-      <w:r>
-        <w:rPr>
-          <w:iCs/>
-          <w:i/>
-        </w:rPr>
-        <w:t xml:space="preserve">Foreign Language Annals, 53</w:t>
-      </w:r>
-      <w:r>
-        <w:t xml:space="preserve">(2), 243-249. https://doi.org/10.1111/flan.12457</w:t>
-      </w:r>
-    </w:p>
-    <w:p>
-      <w:pPr>
-        <w:pStyle w:val="BodyText"/>
-      </w:pPr>
-      <w:r>
-        <w:t xml:space="preserve">Russell, V. (2020). Language anxiety and the online learner.</w:t>
-      </w:r>
-      <w:r>
-        <w:t xml:space="preserve"> </w:t>
-      </w:r>
-      <w:r>
-        <w:rPr>
-          <w:iCs/>
-          <w:i/>
-        </w:rPr>
-        <w:t xml:space="preserve">Foreign Language Annals, 53</w:t>
-      </w:r>
-      <w:r>
-        <w:t xml:space="preserve">(2), 338-352. https://doi.org/10.1111/flan.12461</w:t>
-      </w:r>
-    </w:p>
-    <w:p>
-      <w:pPr>
-        <w:pStyle w:val="BodyText"/>
-      </w:pPr>
-      <w:r>
-        <w:t xml:space="preserve">Stockwell, G., &amp; Wang, Y. (2023). Exploring the challenges of technology in language teaching in the aftermath of the pandemic.</w:t>
-      </w:r>
-      <w:r>
-        <w:t xml:space="preserve"> </w:t>
-      </w:r>
-      <w:r>
-        <w:rPr>
-          <w:iCs/>
-          <w:i/>
-        </w:rPr>
-        <w:t xml:space="preserve">RELC Journal, 54</w:t>
-      </w:r>
-      <w:r>
-        <w:t xml:space="preserve">(2), 474-482. https://doi.org/10.1177/00336882231168438</w:t>
-      </w:r>
-    </w:p>
-    <w:p>
-      <w:pPr>
-        <w:pStyle w:val="BodyText"/>
-      </w:pPr>
-      <w:r>
         <w:t xml:space="preserve">Tao, J., &amp; Gao, X. (2022). Teaching and learning languages online: Challenges and responses.</w:t>
       </w:r>
       <w:r>
@@ -2689,90 +1797,6 @@
       </w:r>
       <w:r>
         <w:t xml:space="preserve">, Article 102819. https://doi.org/10.1016/j.system.2022.102819</w:t>
-      </w:r>
-    </w:p>
-    <w:p>
-      <w:pPr>
-        <w:pStyle w:val="BodyText"/>
-      </w:pPr>
-      <w:r>
-        <w:t xml:space="preserve">van Dijk, J. (2020).</w:t>
-      </w:r>
-      <w:r>
-        <w:t xml:space="preserve"> </w:t>
-      </w:r>
-      <w:r>
-        <w:rPr>
-          <w:iCs/>
-          <w:i/>
-        </w:rPr>
-        <w:t xml:space="preserve">The digital divide</w:t>
-      </w:r>
-      <w:r>
-        <w:t xml:space="preserve">. Polity.</w:t>
-      </w:r>
-    </w:p>
-    <w:p>
-      <w:pPr>
-        <w:pStyle w:val="BodyText"/>
-      </w:pPr>
-      <w:r>
-        <w:t xml:space="preserve">Warschauer, M. (2003).</w:t>
-      </w:r>
-      <w:r>
-        <w:t xml:space="preserve"> </w:t>
-      </w:r>
-      <w:r>
-        <w:rPr>
-          <w:iCs/>
-          <w:i/>
-        </w:rPr>
-        <w:t xml:space="preserve">Technology and social inclusion: Rethinking the digital divide</w:t>
-      </w:r>
-      <w:r>
-        <w:t xml:space="preserve">. MIT Press.</w:t>
-      </w:r>
-    </w:p>
-    <w:p>
-      <w:pPr>
-        <w:pStyle w:val="BodyText"/>
-      </w:pPr>
-      <w:r>
-        <w:t xml:space="preserve">White, C. (2006). Distance learning of foreign languages.</w:t>
-      </w:r>
-      <w:r>
-        <w:t xml:space="preserve"> </w:t>
-      </w:r>
-      <w:r>
-        <w:rPr>
-          <w:iCs/>
-          <w:i/>
-        </w:rPr>
-        <w:t xml:space="preserve">Language Teaching, 39</w:t>
-      </w:r>
-      <w:r>
-        <w:t xml:space="preserve">(4), 247-264. https://doi.org/10.1017/S0261444806003727</w:t>
-      </w:r>
-    </w:p>
-    <w:p>
-      <w:pPr>
-        <w:pStyle w:val="BodyText"/>
-      </w:pPr>
-      <w:r>
-        <w:t xml:space="preserve">Xu, B. (2024). Technology integration into Chinese as a foreign language learning in higher education: An integrated bibliometric analysis and systematic review (2000–2024).</w:t>
-      </w:r>
-      <w:r>
-        <w:t xml:space="preserve"> </w:t>
-      </w:r>
-      <w:r>
-        <w:rPr>
-          <w:iCs/>
-          <w:i/>
-        </w:rPr>
-        <w:t xml:space="preserve">Language Teaching Research</w:t>
-      </w:r>
-      <w:r>
-        <w:t xml:space="preserve">. Advance online publication. https://doi.org/10.1177/13621688241277911</w:t>
       </w:r>
     </w:p>
     <w:p>
@@ -2796,8 +1820,8 @@
         <w:t xml:space="preserve">(1), 72-97. https://doi.org/10.1111/flan.12541</w:t>
       </w:r>
     </w:p>
-    <w:bookmarkEnd w:id="38"/>
-    <w:bookmarkEnd w:id="39"/>
+    <w:bookmarkEnd w:id="26"/>
+    <w:bookmarkEnd w:id="27"/>
     <w:sectPr>
       <w:pgSz w:h="15840" w:w="12240"/>
       <w:pgMar w:bottom="1440" w:footer="720" w:gutter="0" w:header="720" w:left="1440" w:right="1440" w:top="1440"/>

</xml_diff>

<commit_message>
Restore the full research article around the N=38 data
Treat the questionnaire as a study with two research questions, tables, and tests. Stop framing it as a short contribution.

Co-authored-by: kristinehina23-rgb <kristinehina23-rgb@users.noreply.github.com>
</commit_message>
<xml_diff>
--- a/papers/q1-masters-covid/word/manuscript.docx
+++ b/papers/q1-masters-covid/word/manuscript.docx
@@ -2,13 +2,13 @@
 <file path=word/document.xml><?xml version="1.0" encoding="utf-8"?>
 <w:document xmlns:w="http://schemas.openxmlformats.org/wordprocessingml/2006/main" xmlns:m="http://schemas.openxmlformats.org/officeDocument/2006/math" xmlns:r="http://schemas.openxmlformats.org/officeDocument/2006/relationships" xmlns:o="urn:schemas-microsoft-com:office:office" xmlns:v="urn:schemas-microsoft-com:vml" xmlns:w10="urn:schemas-microsoft-com:office:word" xmlns:a="http://schemas.openxmlformats.org/drawingml/2006/main" xmlns:pic="http://schemas.openxmlformats.org/drawingml/2006/picture" xmlns:wp="http://schemas.openxmlformats.org/drawingml/2006/wordprocessingDrawing">
   <w:body>
-    <w:bookmarkStart w:id="27" w:name="X05acd6df0d7cf866a4a8047e473c33139c0e345"/>
+    <w:bookmarkStart w:id="48" w:name="X93c39fec4510a5d3ad14aecff5d2131a9fc6cdc"/>
     <w:p>
       <w:pPr>
         <w:pStyle w:val="Heading1"/>
       </w:pPr>
       <w:r>
-        <w:t xml:space="preserve">Home conditions and named platforms in a 2022 online Chinese questionnaire</w:t>
+        <w:t xml:space="preserve">Home conditions and platform access for online Chinese learners</w:t>
       </w:r>
     </w:p>
     <w:p>
@@ -26,25 +26,7 @@
         <w:t xml:space="preserve"> </w:t>
       </w:r>
       <w:r>
-        <w:t xml:space="preserve">Home conditions and named platforms</w:t>
-      </w:r>
-    </w:p>
-    <w:p>
-      <w:pPr>
-        <w:pStyle w:val="BodyText"/>
-      </w:pPr>
-      <w:r>
-        <w:rPr>
-          <w:bCs/>
-          <w:b/>
-        </w:rPr>
-        <w:t xml:space="preserve">Piece type:</w:t>
-      </w:r>
-      <w:r>
-        <w:t xml:space="preserve"> </w:t>
-      </w:r>
-      <w:r>
-        <w:t xml:space="preserve">short contribution (not a full research article)</w:t>
+        <w:t xml:space="preserve">Home and platform access</w:t>
       </w:r>
     </w:p>
     <w:bookmarkStart w:id="20" w:name="abstract"/>
@@ -61,7 +43,7 @@
         <w:pStyle w:val="FirstParagraph"/>
       </w:pPr>
       <w:r>
-        <w:t xml:space="preserve">Sending-side studies of emergency online Chinese teaching have described how instructors adapted hours and tasks. They have said less about what respondents marked for home power, network speed, and named applications. This short contribution reports 38 completed replies to a Wenjuan questionnaire written in Chinese and submitted between 5 and 8 February 2022. The form did not record recruitment, university, or place. Completing it is not treated as proof of enrollment. Twenty-nine of 38 marked an unstable network, 16 marked power interruptions, and 27 said the home was not quiet. QQ and Chaoxing were often marked unusable. Zoom and WhatsApp were more often marked available. Several platform columns were never asked, so the table is incomplete. The counts document learner-side ticks the field has named but rarely tabulated. They do not describe a named course or current hybrid practice.</w:t>
+        <w:t xml:space="preserve">This study analysed 38 completed questionnaires, written in Chinese, from people who said they were taking online Chinese courses. Thirty-seven selected Pakistani nationality. Unstable networks and power interruptions were common. Respondents who said home conditions affected study very much also more often selected very high stress. Worse reported internet speed went with a more negative view of online learning. QQ and Chaoxing were often marked unusable. Zoom and WhatsApp were more often marked available. The sample is small. The questionnaires were collected in February 2022, during emergency remote teaching, so the results do not describe current hybrid practice.</w:t>
       </w:r>
     </w:p>
     <w:p>
@@ -79,17 +61,17 @@
         <w:t xml:space="preserve"> </w:t>
       </w:r>
       <w:r>
-        <w:t xml:space="preserve">online Chinese teaching; household conditions; platform access; questionnaire; emergency remote teaching</w:t>
+        <w:t xml:space="preserve">Chinese; online language teaching; household infrastructure; platform access; emergency remote teaching</w:t>
       </w:r>
     </w:p>
     <w:bookmarkEnd w:id="20"/>
-    <w:bookmarkStart w:id="21" w:name="why-these-38-rows-are-worth-a-short-note"/>
+    <w:bookmarkStart w:id="21" w:name="the-challenge"/>
     <w:p>
       <w:pPr>
         <w:pStyle w:val="Heading2"/>
       </w:pPr>
       <w:r>
-        <w:t xml:space="preserve">1. Why these 38 rows are worth a short note</w:t>
+        <w:t xml:space="preserve">The Challenge</w:t>
       </w:r>
     </w:p>
     <w:p>
@@ -97,33 +79,33 @@
         <w:pStyle w:val="FirstParagraph"/>
       </w:pPr>
       <w:r>
-        <w:t xml:space="preserve">Emergency writing on online language teaching already said that a live hour assumes a connection and a usable application (Gacs et al., 2020; González-Lloret, 2020; Hodges et al., 2020). For Chinese, Xu, Jin, Deifell, and Angus (2022) showed how character teaching was adapted on the sending side. Jin, Xu, and Deifell (2023) reported faculty views. Reviews still list technical trouble and still give few learner-side frequencies for named tools (Li &amp; Li, 2024; Tao &amp; Gao, 2022).</w:t>
+        <w:t xml:space="preserve">If the hour, the application, the oral task, and the test all assume a quiet home and a stable connection, what should a program do when those conditions are not there?</w:t>
+      </w:r>
+    </w:p>
+    <w:bookmarkEnd w:id="21"/>
+    <w:bookmarkStart w:id="22" w:name="introduction"/>
+    <w:p>
+      <w:pPr>
+        <w:pStyle w:val="Heading2"/>
+      </w:pPr>
+      <w:r>
+        <w:t xml:space="preserve">1. Introduction</w:t>
       </w:r>
     </w:p>
     <w:p>
       <w:pPr>
-        <w:pStyle w:val="BodyText"/>
-      </w:pPr>
-      <w:r>
-        <w:t xml:space="preserve">This note does not repeat those designs. It puts one small table set on the page: home conditions and named platforms, as marked on a 2022 form. That is a documentation task. It is not a test of teaching, and it is not a study of a verified class.</w:t>
-      </w:r>
-    </w:p>
-    <w:bookmarkEnd w:id="21"/>
-    <w:bookmarkStart w:id="22" w:name="the-form"/>
-    <w:p>
-      <w:pPr>
-        <w:pStyle w:val="Heading2"/>
-      </w:pPr>
-      <w:r>
-        <w:t xml:space="preserve">2. The form</w:t>
+        <w:pStyle w:val="FirstParagraph"/>
+      </w:pPr>
+      <w:r>
+        <w:t xml:space="preserve">When Chinese teaching moved online, many programs kept the sending class’s timetable and classroom tasks. Task guides still assume that students can join a live session (Gacs et al., 2020; González-Lloret, 2020; Hodges et al., 2020; Payne, 2020; Stockwell &amp; Wang, 2023). That assumption often fails. Studies of online language teaching, including online Chinese, have already noted unstable networks, platforms that are hard to open, thinner talk, and strain (Li &amp; Li, 2024; Moser et al., 2021; Qi, 2025; Russell, 2020; Tao &amp; Gao, 2022). A device in the house is not enough if there is no power, little speed, or no usable application (Ali, 2020; Beaunoyer et al., 2020; Guo &amp; Wan, 2022; Vishnu et al., 2024; Warschauer, 2003). Distance language learning had already asked whether a remote class was even feasible (White, 2006). When those conditions do not hold, the content may still be sound, but the class is closed.</w:t>
       </w:r>
     </w:p>
     <w:p>
       <w:pPr>
-        <w:pStyle w:val="FirstParagraph"/>
-      </w:pPr>
-      <w:r>
-        <w:t xml:space="preserve">The export title is Influencing factors in international students’ online Chinese learning during COVID-19. Thirty-eight complete rows remain. There was no recorded pilot. The link circulation was not stored. Host university, city, degree status, and scholarship type were not asked. Thirty-seven respondents selected Pakistani nationality. That box is reported as marked. Residence was not checked.</w:t>
+        <w:pStyle w:val="BodyText"/>
+      </w:pPr>
+      <w:r>
+        <w:t xml:space="preserve">Those difficulties are often named. They are less often measured from the learner’s side. Emergency papers used them as a backdrop for teacher workload, sending-side adaptation, or a video copy of the campus hour (MacIntyre et al., 2020; Moser et al., 2021; Xu et al., 2022). Later papers asked what should remain of that emergency practice (Moorhouse, 2023; Stockwell &amp; Wang, 2023). Reviews still list technical trouble and still say little about household access (Li &amp; Li, 2024; Xu, 2024; Zhang &amp; Osborne, 2026). Planned online courses and studies of learner emotion show what designed online Chinese teaching can look like (Guenier et al., 2026; Qi, 2025; Wen &amp; Liu, 2025). They do not show whether an online class could still be taken where learners sat. Work on international Chinese teaching has said more about what a course says than about whether learners can enter it (Gong et al., 2020b).</w:t>
       </w:r>
     </w:p>
     <w:p>
@@ -131,7 +113,7 @@
         <w:pStyle w:val="BodyText"/>
       </w:pPr>
       <w:r>
-        <w:t xml:space="preserve">Twenty-seven respondents were men and 11 were women. Self-rated Chinese was advanced for 22, intermediate for 15, and beginner for one. Twenty-seven said required courses were online; 23 said electives were. Thirty said all of their Chinese classes were online. Twenty-two said they were working while studying. Submission operating system was iPhone (24) or Android (14). That is the device used to send the form.</w:t>
+        <w:t xml:space="preserve">This study reports questionnaire data from the learner side. Thirty-eight respondents who said they were taking online Chinese courses completed a form written in Chinese in February 2022. The form asked about home conditions, connectivity, and platform access, and about stress and their view of online learning. Thirty-seven selected Pakistani nationality. Residence, university, and program were not asked, so those boxes are not inferred. The study asks:</w:t>
       </w:r>
     </w:p>
     <w:p>
@@ -139,7 +121,228 @@
         <w:pStyle w:val="BodyText"/>
       </w:pPr>
       <w:r>
-        <w:t xml:space="preserve">The items were written in Chinese. Reporting uses English glosses. A three-item mean (learned much, improves Chinese, sparks interest) had Cronbach’s α = .84 here; it is a local mean, not a validated scale. Stress is the first category on a four-category item, glossed as very high.</w:t>
+        <w:rPr>
+          <w:bCs/>
+          <w:b/>
+        </w:rPr>
+        <w:t xml:space="preserve">RQ1.</w:t>
+      </w:r>
+      <w:r>
+        <w:t xml:space="preserve"> </w:t>
+      </w:r>
+      <w:r>
+        <w:t xml:space="preserve">What household, connectivity, and platform-access conditions did the 38 respondents report?</w:t>
+      </w:r>
+    </w:p>
+    <w:p>
+      <w:pPr>
+        <w:pStyle w:val="BodyText"/>
+      </w:pPr>
+      <w:r>
+        <w:rPr>
+          <w:bCs/>
+          <w:b/>
+        </w:rPr>
+        <w:t xml:space="preserve">RQ2.</w:t>
+      </w:r>
+      <w:r>
+        <w:t xml:space="preserve"> </w:t>
+      </w:r>
+      <w:r>
+        <w:t xml:space="preserve">How did those conditions sit alongside</w:t>
+      </w:r>
+      <w:r>
+        <w:t xml:space="preserve"> </w:t>
+      </w:r>
+      <w:r>
+        <w:t xml:space="preserve">“</w:t>
+      </w:r>
+      <w:r>
+        <w:t xml:space="preserve">very high stress</w:t>
+      </w:r>
+      <w:r>
+        <w:t xml:space="preserve">”</w:t>
+      </w:r>
+      <w:r>
+        <w:t xml:space="preserve"> </w:t>
+      </w:r>
+      <w:r>
+        <w:t xml:space="preserve">and their appraisals of online learning?</w:t>
+      </w:r>
+    </w:p>
+    <w:p>
+      <w:pPr>
+        <w:pStyle w:val="BodyText"/>
+      </w:pPr>
+      <w:r>
+        <w:t xml:space="preserve">The form also asked whether online study could replace campus classes. That item is reported as a count.</w:t>
+      </w:r>
+    </w:p>
+    <w:p>
+      <w:pPr>
+        <w:pStyle w:val="BodyText"/>
+      </w:pPr>
+      <w:r>
+        <w:t xml:space="preserve">The frequencies describe the sample. The two associations in RQ2 are exploratory tests on these data.</w:t>
+      </w:r>
+    </w:p>
+    <w:bookmarkEnd w:id="22"/>
+    <w:bookmarkStart w:id="25" w:name="literature-review"/>
+    <w:p>
+      <w:pPr>
+        <w:pStyle w:val="Heading2"/>
+      </w:pPr>
+      <w:r>
+        <w:t xml:space="preserve">2. Literature review</w:t>
+      </w:r>
+    </w:p>
+    <w:bookmarkStart w:id="23" w:name="later-lenses-on-online-chinese-teaching"/>
+    <w:p>
+      <w:pPr>
+        <w:pStyle w:val="Heading3"/>
+      </w:pPr>
+      <w:r>
+        <w:t xml:space="preserve">2.1 Later lenses on online Chinese teaching</w:t>
+      </w:r>
+    </w:p>
+    <w:p>
+      <w:pPr>
+        <w:pStyle w:val="FirstParagraph"/>
+      </w:pPr>
+      <w:r>
+        <w:t xml:space="preserve">Hodges et al. (2020) distinguished emergency remote teaching from planned online provision. Gacs, Goertler, and Spasova (2020) brought that distinction into language education. Language-teacher surveys from the same period describe heavier workloads and uneven preparedness (Moser et al., 2021). Tao and Gao (2022) read the wider literature as a story of technical disruption and thinner engagement. In this journal, Russell (2020) treats language anxiety as a condition of the online learner, and Lomicka (2020) treats interaction as a problem of virtual community rather than of a copied campus hour. That work locates the moment in which the present questionnaire was completed. It is not a substitute for the stress reports in this sample.</w:t>
+      </w:r>
+    </w:p>
+    <w:p>
+      <w:pPr>
+        <w:pStyle w:val="BodyText"/>
+      </w:pPr>
+      <w:r>
+        <w:t xml:space="preserve">After the return to campus, studies asked what should remain of emergency online practice (Moorhouse, 2023) and cautioned against treating a videoconference copy of the classroom as the lesson of the crisis (Stockwell &amp; Wang, 2023). For Chinese, contemporaneous policy writing recorded</w:t>
+      </w:r>
+      <w:r>
+        <w:t xml:space="preserve"> </w:t>
+      </w:r>
+      <w:r>
+        <w:t xml:space="preserve">“</w:t>
+      </w:r>
+      <w:r>
+        <w:t xml:space="preserve">suspending classes without stopping learning</w:t>
+      </w:r>
+      <w:r>
+        <w:t xml:space="preserve">”</w:t>
+      </w:r>
+      <w:r>
+        <w:t xml:space="preserve"> </w:t>
+      </w:r>
+      <w:r>
+        <w:t xml:space="preserve">(Zhang et al., 2020). Xu et al. (2022) show how character teaching was adapted on the sending side. Jin et al. (2023) report faculty perceptions of pandemic online teaching. Zhang and Liu (2023) examine online collaborative writing among Chinese-language learners in designed conditions. Later reviews still say more about tools than about household access, and they still flag digital equity as under-examined (Li &amp; Li, 2024; Xu, 2024; Zhang &amp; Osborne, 2026). Designed online Chinese-culture courses show a planned alternative to emergency copying (Guenier et al., 2026). Qi (2025) shows that an online Chinese class can itself become an anxiety-provoking setting. Those studies do not describe the present respondents. Much of that writing still assumes a relatively stable connection. The present questionnaire cannot test whether that assumption holds for current hybrid teaching. It can show what 38 respondents reported.</w:t>
+      </w:r>
+    </w:p>
+    <w:bookmarkEnd w:id="23"/>
+    <w:bookmarkStart w:id="24" w:name="X8fd0326383b50249221392c76a6b8ab8b037526"/>
+    <w:p>
+      <w:pPr>
+        <w:pStyle w:val="Heading3"/>
+      </w:pPr>
+      <w:r>
+        <w:t xml:space="preserve">2.2 Digital inequality and the home learning ecology</w:t>
+      </w:r>
+    </w:p>
+    <w:p>
+      <w:pPr>
+        <w:pStyle w:val="FirstParagraph"/>
+      </w:pPr>
+      <w:r>
+        <w:t xml:space="preserve">Later models of the digital divide distinguish material access from skills, usage, and outcomes (Helsper, 2021; van Dijk, 2020; Warschauer, 2003). Owning a device is not the same as being able to take part (Ali, 2020; Beaunoyer et al., 2020; Guo &amp; Wan, 2022; Vishnu et al., 2024). An ecological view of language education takes the setting of the class, not only the student and the application, as the unit of analysis (Guerrettaz et al., 2021; van Lier, 2004). Domestic space, paid or care work, power interruptions, and applications marked unusable are read here as part of the immediate setting in which the 38 respondents said they were studying.</w:t>
+      </w:r>
+    </w:p>
+    <w:bookmarkEnd w:id="24"/>
+    <w:bookmarkEnd w:id="25"/>
+    <w:bookmarkStart w:id="31" w:name="methods"/>
+    <w:p>
+      <w:pPr>
+        <w:pStyle w:val="Heading2"/>
+      </w:pPr>
+      <w:r>
+        <w:t xml:space="preserve">3. Methods</w:t>
+      </w:r>
+    </w:p>
+    <w:p>
+      <w:pPr>
+        <w:pStyle w:val="FirstParagraph"/>
+      </w:pPr>
+      <w:r>
+        <w:t xml:space="preserve">The study is an exploratory, cross-sectional questionnaire. It does not test a pre-registered confirmatory model. What follows describes the instrument, the self-selected group who completed it, and the limits of what the questionnaire can support.</w:t>
+      </w:r>
+    </w:p>
+    <w:bookmarkStart w:id="26" w:name="design-and-context"/>
+    <w:p>
+      <w:pPr>
+        <w:pStyle w:val="Heading3"/>
+      </w:pPr>
+      <w:r>
+        <w:t xml:space="preserve">3.1 Design and context</w:t>
+      </w:r>
+    </w:p>
+    <w:p>
+      <w:pPr>
+        <w:pStyle w:val="FirstParagraph"/>
+      </w:pPr>
+      <w:r>
+        <w:t xml:space="preserve">The instrument title on the Wenjuan export is Influencing factors in international students’ online Chinese learning during COVID-19. The items are those on that retained form. No separate validation study or recorded pilot of the instrument is available. This article is a secondary analysis of the completed responses. Complete cases were submitted between 5 and 8 February 2022 (N = 38), during emergency remote teaching. That collection window is a methodological fact; the article does not treat the sample as a picture of current hybrid practice. The form did not record how the link was circulated, so the recruitment channel cannot be named. Respondents were adults who completed a questionnaire written in Chinese about online Chinese learning. Completing that questionnaire is not treated as proof of enrollment in a Chinese university. The instrument did not ask host university, city of residence that week, degree versus non-degree status, or scholarship type. Two items asked whether required courses and electives were being taken online: 27 respondents (71.1%) reported required courses online, and 23 (60.5%) reported electives online. Those answers do not identify a named program. The study therefore concerns a self-selected group of respondents reporting participation in online Chinese-language courses, not a verified enrollment record.</w:t>
+      </w:r>
+    </w:p>
+    <w:bookmarkEnd w:id="26"/>
+    <w:bookmarkStart w:id="27" w:name="participants"/>
+    <w:p>
+      <w:pPr>
+        <w:pStyle w:val="Heading3"/>
+      </w:pPr>
+      <w:r>
+        <w:t xml:space="preserve">3.2 Participants</w:t>
+      </w:r>
+    </w:p>
+    <w:p>
+      <w:pPr>
+        <w:pStyle w:val="FirstParagraph"/>
+      </w:pPr>
+      <w:r>
+        <w:t xml:space="preserve">Of the 38 respondents, 27 were men (71.1%) and 11 were women (28.9%). Thirty-seven selected Pakistani nationality and one selected another nationality. That nationality item is the only Pakistan connection in the dataset. The group is not described as verified Chinese-university enrollment, as Pakistan-resident learners, as CSC students, or as a national sample. Self-rated Chinese level was mostly advanced (22, 57.9%) or intermediate (15, 39.5%), with one beginner; the label is the student’s own, not an HSK band. Years of learning Chinese clustered at three to four years (26, 68.4%). Wenjuan submission metadata classified the operating system as iPhone (24, 63.2%) or Android (14). That variable is the device used to submit the form, not an item about all devices used for class.</w:t>
+      </w:r>
+    </w:p>
+    <w:p>
+      <w:pPr>
+        <w:pStyle w:val="BodyText"/>
+      </w:pPr>
+      <w:r>
+        <w:t xml:space="preserve">Wenjuan automatically recorded an IP-province field. A dummy was coded when that field was a mainland China province name (9 of 38). IP labels are technical metadata. They can be affected by virtual private networks and proxies, and they are not a reliable measure of physical location. They are not used as a participant-location variable and are not the basis of a sensitivity analysis. The dummy, submission dates, and device identifiers are not included in the public dataset.</w:t>
+      </w:r>
+    </w:p>
+    <w:bookmarkEnd w:id="27"/>
+    <w:bookmarkStart w:id="28" w:name="instrument-and-coding"/>
+    <w:p>
+      <w:pPr>
+        <w:pStyle w:val="Heading3"/>
+      </w:pPr>
+      <w:r>
+        <w:t xml:space="preserve">3.3 Instrument and coding</w:t>
+      </w:r>
+    </w:p>
+    <w:p>
+      <w:pPr>
+        <w:pStyle w:val="FirstParagraph"/>
+      </w:pPr>
+      <w:r>
+        <w:t xml:space="preserve">The questionnaire comprised about 30 items: demographics, single-choice ordinals, and multiple-response lists. The items were written in Chinese. Some wording was non-native. Reporting uses English glosses. Self-rated Chinese level was intermediate or advanced for 37 of 38 respondents. The instrument did not include a comprehension check, so completion of a questionnaire written in Chinese is treated only as evidence that respondents were willing to answer in Chinese. Item wording for the appraisal index is given in Appendix A.</w:t>
+      </w:r>
+    </w:p>
+    <w:p>
+      <w:pPr>
+        <w:pStyle w:val="BodyText"/>
+      </w:pPr>
+      <w:r>
+        <w:t xml:space="preserve">A three-item</w:t>
       </w:r>
       <w:r>
         <w:t xml:space="preserve"> </w:t>
@@ -149,13 +352,13 @@
           <w:iCs/>
           <w:i/>
         </w:rPr>
-        <w:t xml:space="preserve">Power interruptions</w:t>
+        <w:t xml:space="preserve">perceived online-learning appraisal index</w:t>
       </w:r>
       <w:r>
         <w:t xml:space="preserve"> </w:t>
       </w:r>
       <w:r>
-        <w:t xml:space="preserve">is the export option</w:t>
+        <w:t xml:space="preserve">was formed from learned much (Q8), improves Chinese (Q9), and sparks interest (Q10). The items ask related but not identical questions and are treated as a descriptive index, not as a validated unidimensional scale. Internal consistency was acceptable in this sample (Cronbach’s α = .84); Spearman inter-item correlations ranged from .55 to .75 (Appendix B). Exploratory factor analysis was not used (N = 38). Individual items are also reported. One double-tick on</w:t>
       </w:r>
       <w:r>
         <w:t xml:space="preserve"> </w:t>
@@ -164,10 +367,16 @@
         <w:t xml:space="preserve">“</w:t>
       </w:r>
       <w:r>
-        <w:t xml:space="preserve">no electricity.</w:t>
+        <w:t xml:space="preserve">like online classes</w:t>
       </w:r>
       <w:r>
         <w:t xml:space="preserve">”</w:t>
+      </w:r>
+      <w:r>
+        <w:t xml:space="preserve"> </w:t>
+      </w:r>
+      <w:r>
+        <w:t xml:space="preserve">was excluded for that item only (n = 37 valid).</w:t>
       </w:r>
     </w:p>
     <w:p>
@@ -175,7 +384,23 @@
         <w:pStyle w:val="BodyText"/>
       </w:pPr>
       <w:r>
-        <w:t xml:space="preserve">The form said answers would be used for research. Completion was treated as consent. No ethics-committee number exists for the 2022 collection. Identifiers were removed before the public dataset was prepared.</w:t>
+        <w:t xml:space="preserve">Coding follows the Wenjuan export. Higher values on speed, learned, improve, interest, and teacher interaction indicate a more negative report (worse speed; less learning, improvement, or interest; thinner interaction). Stress (Q24) is a four-category questionnaire item coded 1 = very high to 4 = none.</w:t>
+      </w:r>
+      <w:r>
+        <w:t xml:space="preserve"> </w:t>
+      </w:r>
+      <w:r>
+        <w:rPr>
+          <w:iCs/>
+          <w:i/>
+        </w:rPr>
+        <w:t xml:space="preserve">Very high stress</w:t>
+      </w:r>
+      <w:r>
+        <w:t xml:space="preserve"> </w:t>
+      </w:r>
+      <w:r>
+        <w:t xml:space="preserve">is that first category on the form (glossed as very high), not an analyst-created threshold or a cut on a multi-item scale. The focal stress analysis uses a dummy for this category and does not reverse the ordinal. Coding directions are in Appendix A.</w:t>
       </w:r>
     </w:p>
     <w:p>
@@ -183,17 +408,51 @@
         <w:pStyle w:val="BodyText"/>
       </w:pPr>
       <w:r>
-        <w:t xml:space="preserve">Frequencies are n/38. Two same-form pairs are given as co-occurrence only: home affects study very much with very high stress (Fisher’s exact test), and speed with the appraisal mean (Spearman’s ρ).</w:t>
+        <w:t xml:space="preserve">The export labeled one multiple-response problem as</w:t>
+      </w:r>
+      <w:r>
+        <w:t xml:space="preserve"> </w:t>
+      </w:r>
+      <w:r>
+        <w:t xml:space="preserve">“</w:t>
+      </w:r>
+      <w:r>
+        <w:t xml:space="preserve">no electricity.</w:t>
+      </w:r>
+      <w:r>
+        <w:t xml:space="preserve">”</w:t>
+      </w:r>
+      <w:r>
+        <w:t xml:space="preserve"> </w:t>
+      </w:r>
+      <w:r>
+        <w:t xml:space="preserve">In the results the item is reported as</w:t>
+      </w:r>
+      <w:r>
+        <w:t xml:space="preserve"> </w:t>
+      </w:r>
+      <w:r>
+        <w:rPr>
+          <w:iCs/>
+          <w:i/>
+        </w:rPr>
+        <w:t xml:space="preserve">power interruptions</w:t>
+      </w:r>
+      <w:r>
+        <w:t xml:space="preserve"> </w:t>
+      </w:r>
+      <w:r>
+        <w:t xml:space="preserve">(export label: no electricity). Chinese MOOC is reported as printed on the form; the option did not name a single provider.</w:t>
       </w:r>
     </w:p>
-    <w:bookmarkEnd w:id="22"/>
-    <w:bookmarkStart w:id="23" w:name="what-was-marked"/>
+    <w:bookmarkEnd w:id="28"/>
+    <w:bookmarkStart w:id="29" w:name="analysis"/>
     <w:p>
       <w:pPr>
-        <w:pStyle w:val="Heading2"/>
-      </w:pPr>
-      <w:r>
-        <w:t xml:space="preserve">3. What was marked</w:t>
+        <w:pStyle w:val="Heading3"/>
+      </w:pPr>
+      <w:r>
+        <w:t xml:space="preserve">3.4 Analysis</w:t>
       </w:r>
     </w:p>
     <w:p>
@@ -201,7 +460,85 @@
         <w:pStyle w:val="FirstParagraph"/>
       </w:pPr>
       <w:r>
-        <w:t xml:space="preserve">Table 1 is the background ticks.</w:t>
+        <w:t xml:space="preserve">Household and platform reports are given as frequencies (Tables 1 to 3). Two associations are treated as focal: home affects study very much with very high stress (two-sided Fisher’s exact test), and internet speed with the appraisal index (Spearman’s ρ, with a percentile bootstrap 95% confidence interval from 5,000 resamples). Replacement judgments are reported as frequencies. Odds ratios and Wald confidence intervals are not reported: at N = 38 they are unstable. Other associations, including gender, are secondary and are placed in Appendix B. Frequencies are n/38 unless noted. Multiple-response items are the percentage who selected the option.</w:t>
+      </w:r>
+      <w:r>
+        <w:t xml:space="preserve"> </w:t>
+      </w:r>
+      <w:r>
+        <w:rPr>
+          <w:iCs/>
+          <w:i/>
+        </w:rPr>
+        <w:t xml:space="preserve">p</w:t>
+      </w:r>
+      <w:r>
+        <w:t xml:space="preserve"> </w:t>
+      </w:r>
+      <w:r>
+        <w:t xml:space="preserve">values are not adjusted for multiplicity and are not interpreted as confirmatory.</w:t>
+      </w:r>
+    </w:p>
+    <w:p>
+      <w:pPr>
+        <w:pStyle w:val="BodyText"/>
+      </w:pPr>
+      <w:r>
+        <w:t xml:space="preserve">A Pakistani-nationality check (n = 37) is reported only to show that dropping the one non-Pakistani case does not reverse the two focal associations. It is not a location analysis.</w:t>
+      </w:r>
+    </w:p>
+    <w:bookmarkEnd w:id="29"/>
+    <w:bookmarkStart w:id="30" w:name="ethics-and-data-protection"/>
+    <w:p>
+      <w:pPr>
+        <w:pStyle w:val="Heading3"/>
+      </w:pPr>
+      <w:r>
+        <w:t xml:space="preserve">3.5 Ethics and data protection</w:t>
+      </w:r>
+    </w:p>
+    <w:p>
+      <w:pPr>
+        <w:pStyle w:val="FirstParagraph"/>
+      </w:pPr>
+      <w:r>
+        <w:t xml:space="preserve">Adult respondents completed an online form presented as research on online Chinese learning. The form stated that answers would be used for research, and completion and submission were treated as consent.</w:t>
+      </w:r>
+    </w:p>
+    <w:p>
+      <w:pPr>
+        <w:pStyle w:val="BodyText"/>
+      </w:pPr>
+      <w:r>
+        <w:t xml:space="preserve">No institutional ethics approval number is available for the original 2022 data collection. The first author was then a master’s student, and numbered approval was not obtained. This article reports an anonymized secondary analysis of those completed responses. No new data were collected. Names, IP addresses, exact timestamps, and device identifiers were removed before the public dataset was prepared.</w:t>
+      </w:r>
+    </w:p>
+    <w:bookmarkEnd w:id="30"/>
+    <w:bookmarkEnd w:id="31"/>
+    <w:bookmarkStart w:id="36" w:name="results"/>
+    <w:p>
+      <w:pPr>
+        <w:pStyle w:val="Heading2"/>
+      </w:pPr>
+      <w:r>
+        <w:t xml:space="preserve">4. Results</w:t>
+      </w:r>
+    </w:p>
+    <w:bookmarkStart w:id="32" w:name="respondents-and-household-conditions"/>
+    <w:p>
+      <w:pPr>
+        <w:pStyle w:val="Heading3"/>
+      </w:pPr>
+      <w:r>
+        <w:t xml:space="preserve">4.1 Respondents and household conditions</w:t>
+      </w:r>
+    </w:p>
+    <w:p>
+      <w:pPr>
+        <w:pStyle w:val="FirstParagraph"/>
+      </w:pPr>
+      <w:r>
+        <w:t xml:space="preserve">Table 1 locates the sample. Most respondents said all of their Chinese classes were online, and more than half reported working alongside study.</w:t>
       </w:r>
     </w:p>
     <w:p>
@@ -623,6 +960,44 @@
           </w:p>
         </w:tc>
       </w:tr>
+      <w:tr>
+        <w:tc>
+          <w:tcPr/>
+          <w:p>
+            <w:pPr>
+              <w:pStyle w:val="Compact"/>
+              <w:jc w:val="left"/>
+            </w:pPr>
+            <w:r>
+              <w:t xml:space="preserve">Total</w:t>
+            </w:r>
+          </w:p>
+        </w:tc>
+        <w:tc>
+          <w:tcPr/>
+          <w:p>
+            <w:pPr>
+              <w:pStyle w:val="Compact"/>
+              <w:jc w:val="right"/>
+            </w:pPr>
+            <w:r>
+              <w:t xml:space="preserve">38</w:t>
+            </w:r>
+          </w:p>
+        </w:tc>
+        <w:tc>
+          <w:tcPr/>
+          <w:p>
+            <w:pPr>
+              <w:pStyle w:val="Compact"/>
+              <w:jc w:val="right"/>
+            </w:pPr>
+            <w:r>
+              <w:t xml:space="preserve">100</w:t>
+            </w:r>
+          </w:p>
+        </w:tc>
+      </w:tr>
     </w:tbl>
     <w:p>
       <w:pPr>
@@ -639,7 +1014,7 @@
         <w:t xml:space="preserve"> </w:t>
       </w:r>
       <w:r>
-        <w:t xml:space="preserve">Wenjuan, 5 to 8 February 2022.</w:t>
+        <w:t xml:space="preserve">Convenience sample, Wenjuan, 5 to 8 February 2022. Device is the operating system recorded at submission, reported only as an aggregate.</w:t>
       </w:r>
     </w:p>
     <w:p>
@@ -647,7 +1022,7 @@
         <w:pStyle w:val="BodyText"/>
       </w:pPr>
       <w:r>
-        <w:t xml:space="preserve">Table 2 is the home and connection ticks. Four people marked that their country did not have internet, yet all 38 submitted online. That answer is left as marked.</w:t>
+        <w:t xml:space="preserve">Table 2 reports the household and connectivity conditions. The key figures are unstable networks (76.3%), power interruptions (42.1%), and very high stress (36.8%). Four respondents said their country did not have internet, yet all 38 submitted an online form. The item wording does not allow a firm reinterpretation, so the response is reported as given. Only 11 of 38 described the home as quiet.</w:t>
       </w:r>
     </w:p>
     <w:p>
@@ -671,7 +1046,7 @@
           <w:iCs/>
           <w:i/>
         </w:rPr>
-        <w:t xml:space="preserve">Home and connection items (N = 38)</w:t>
+        <w:t xml:space="preserve">Reported conditions and selected outcomes (N = 38)</w:t>
       </w:r>
     </w:p>
     <w:tbl>
@@ -1070,12 +1445,22 @@
         </w:tc>
       </w:tr>
     </w:tbl>
+    <w:bookmarkEnd w:id="32"/>
+    <w:bookmarkStart w:id="33" w:name="platform-access"/>
     <w:p>
       <w:pPr>
-        <w:pStyle w:val="BodyText"/>
-      </w:pPr>
-      <w:r>
-        <w:t xml:space="preserve">Table 3 is incomplete. Some tools were asked as used for class, some as unusable in my country, some as can use in my country. Tencent Meeting was marked as used by 71.1% and as available by 57.9%. The table cannot separate blocking, accounts, skill, or a virtual private network.</w:t>
+        <w:pStyle w:val="Heading3"/>
+      </w:pPr>
+      <w:r>
+        <w:t xml:space="preserve">4.2 Platform access</w:t>
+      </w:r>
+    </w:p>
+    <w:p>
+      <w:pPr>
+        <w:pStyle w:val="FirstParagraph"/>
+      </w:pPr>
+      <w:r>
+        <w:t xml:space="preserve">Table 3 shows uneven access to institutionally familiar and consumer-facing platforms. The questionnaire cannot isolate country restrictions, routing, account rules, skills, or virtual private networks. The pattern used for later discussion is that QQ and Chaoxing were frequently marked unusable, while Zoom and WhatsApp were more often marked available. WhatsApp appears only as available; the retained form did not code whether it was used for class. Tencent Meeting was the most used class tool but was marked available by fewer respondents, a discrepancy left as an item-level inconsistency.</w:t>
       </w:r>
     </w:p>
     <w:p>
@@ -1099,7 +1484,7 @@
           <w:iCs/>
           <w:i/>
         </w:rPr>
-        <w:t xml:space="preserve">Named platforms as asked (multiple response, N = 38)</w:t>
+        <w:t xml:space="preserve">Reported use and perceived availability of platforms (multiple response, N = 38)</w:t>
       </w:r>
     </w:p>
     <w:tbl>
@@ -1584,15 +1969,79 @@
         <w:t xml:space="preserve"> </w:t>
       </w:r>
       <w:r>
-        <w:t xml:space="preserve">n.a. = not asked in that column.</w:t>
+        <w:t xml:space="preserve">n.a. = the item was not asked in that column.</w:t>
+      </w:r>
+      <w:r>
+        <w:t xml:space="preserve"> </w:t>
+      </w:r>
+      <w:r>
+        <w:t xml:space="preserve">“</w:t>
+      </w:r>
+      <w:r>
+        <w:t xml:space="preserve">My country</w:t>
+      </w:r>
+      <w:r>
+        <w:t xml:space="preserve">”</w:t>
+      </w:r>
+      <w:r>
+        <w:t xml:space="preserve"> </w:t>
+      </w:r>
+      <w:r>
+        <w:t xml:space="preserve">is the stem wording. QQ, Chaoxing, DingTalk, and Chinese MOOC are platforms often used in Chinese-university teaching; they are not exclusively campus systems.</w:t>
+      </w:r>
+      <w:r>
+        <w:t xml:space="preserve"> </w:t>
+      </w:r>
+      <w:r>
+        <w:t xml:space="preserve">“</w:t>
+      </w:r>
+      <w:r>
+        <w:t xml:space="preserve">Marked unusable</w:t>
+      </w:r>
+      <w:r>
+        <w:t xml:space="preserve">”</w:t>
+      </w:r>
+      <w:r>
+        <w:t xml:space="preserve"> </w:t>
+      </w:r>
+      <w:r>
+        <w:t xml:space="preserve">follows the item wording and is not a technical claim that the platform was blocked.</w:t>
+      </w:r>
+    </w:p>
+    <w:bookmarkEnd w:id="33"/>
+    <w:bookmarkStart w:id="34" w:name="stress-and-appraisals"/>
+    <w:p>
+      <w:pPr>
+        <w:pStyle w:val="Heading3"/>
+      </w:pPr>
+      <w:r>
+        <w:t xml:space="preserve">4.3 Stress and appraisals</w:t>
       </w:r>
     </w:p>
     <w:p>
       <w:pPr>
-        <w:pStyle w:val="BodyText"/>
-      </w:pPr>
-      <w:r>
-        <w:t xml:space="preserve">Among those who said the home affected study very much, 11 of 14 also selected very high stress; among the others, 3 of 24 did (two-sided Fisher’s exact</w:t>
+        <w:pStyle w:val="FirstParagraph"/>
+      </w:pPr>
+      <w:r>
+        <w:t xml:space="preserve">Among those who said the home affected study very much, 11 of 14 also selected</w:t>
+      </w:r>
+      <w:r>
+        <w:t xml:space="preserve"> </w:t>
+      </w:r>
+      <w:r>
+        <w:t xml:space="preserve">“</w:t>
+      </w:r>
+      <w:r>
+        <w:t xml:space="preserve">very high</w:t>
+      </w:r>
+      <w:r>
+        <w:t xml:space="preserve">”</w:t>
+      </w:r>
+      <w:r>
+        <w:t xml:space="preserve"> </w:t>
+      </w:r>
+      <w:r>
+        <w:t xml:space="preserve">psychological stress; among the others, 3 of 24 did (two-sided Fisher’s exact</w:t>
       </w:r>
       <w:r>
         <w:t xml:space="preserve"> </w:t>
@@ -1608,25 +2057,31 @@
         <w:t xml:space="preserve"> </w:t>
       </w:r>
       <w:r>
-        <w:t xml:space="preserve">= .00008). Worse speed went with a worse appraisal mean (ρ = .65, percentile bootstrap 95% CI [.36, .84]). Nineteen said online study could replace campus classes; 19 said it could not. Preferred live length was 45 minutes for 19 people and 30 minutes for 11.</w:t>
-      </w:r>
-    </w:p>
-    <w:bookmarkEnd w:id="23"/>
-    <w:bookmarkStart w:id="24" w:name="X3f9a06f98ef0a4a81e5ec1f167f6257c9aa4cdb"/>
-    <w:p>
-      <w:pPr>
-        <w:pStyle w:val="Heading2"/>
-      </w:pPr>
-      <w:r>
-        <w:t xml:space="preserve">4. What a Chinese teacher can take from this</w:t>
+        <w:t xml:space="preserve">= .00008). That is a co-occurrence in this dataset, not evidence that the household caused stress.</w:t>
       </w:r>
     </w:p>
     <w:p>
       <w:pPr>
-        <w:pStyle w:val="FirstParagraph"/>
-      </w:pPr>
-      <w:r>
-        <w:t xml:space="preserve">The useful part of the note is Table 2 plus the named tools in Table 3. Xu et al. (2022) could show how teachers adapted characters. These rows show that QQ and Chaoxing were often marked unusable on this form, while Zoom and WhatsApp were more often marked available. A teacher who still requires one campus application can at least ask whether that application opens where the learner sits. The data do not recommend WhatsApp as a class tool: the form never asked whether it was used for class.</w:t>
+        <w:pStyle w:val="BodyText"/>
+      </w:pPr>
+      <w:r>
+        <w:t xml:space="preserve">Worse internet speed was associated with a worse appraisal index (ρ = .65,</w:t>
+      </w:r>
+      <w:r>
+        <w:t xml:space="preserve"> </w:t>
+      </w:r>
+      <w:r>
+        <w:rPr>
+          <w:iCs/>
+          <w:i/>
+        </w:rPr>
+        <w:t xml:space="preserve">p</w:t>
+      </w:r>
+      <w:r>
+        <w:t xml:space="preserve"> </w:t>
+      </w:r>
+      <w:r>
+        <w:t xml:space="preserve">&lt; .001, percentile bootstrap 95% CI [.36, .84]; Table 4). An unvalidated post hoc count of selected infrastructure-problem options (unstable network, power interruptions, no signal) was not associated with the index (ρ = .02). That count is not interpreted as evidence against the role of infrastructure.</w:t>
       </w:r>
     </w:p>
     <w:p>
@@ -1634,7 +2089,37 @@
         <w:pStyle w:val="BodyText"/>
       </w:pPr>
       <w:r>
-        <w:t xml:space="preserve">A live oral hour that needs a quiet room and a steady line will treat many of the ticks in Table 2 as absence or weak performance. That is worth checking before the first session. It is not a rule for a national program.</w:t>
+        <w:t xml:space="preserve">Active interaction with the teacher</w:t>
+      </w:r>
+      <w:r>
+        <w:t xml:space="preserve"> </w:t>
+      </w:r>
+      <w:r>
+        <w:t xml:space="preserve">“</w:t>
+      </w:r>
+      <w:r>
+        <w:t xml:space="preserve">very much</w:t>
+      </w:r>
+      <w:r>
+        <w:t xml:space="preserve">”</w:t>
+      </w:r>
+      <w:r>
+        <w:t xml:space="preserve"> </w:t>
+      </w:r>
+      <w:r>
+        <w:t xml:space="preserve">was uncommon (6 of 38). Preferred live length was 45 minutes for half of the respondents and 30 minutes for 28.9%. One open comment said that even one minute online was</w:t>
+      </w:r>
+      <w:r>
+        <w:t xml:space="preserve"> </w:t>
+      </w:r>
+      <w:r>
+        <w:t xml:space="preserve">“</w:t>
+      </w:r>
+      <w:r>
+        <w:t xml:space="preserve">not suitable.</w:t>
+      </w:r>
+      <w:r>
+        <w:t xml:space="preserve">”</w:t>
       </w:r>
     </w:p>
     <w:p>
@@ -1642,40 +2127,1025 @@
         <w:pStyle w:val="BodyText"/>
       </w:pPr>
       <w:r>
-        <w:t xml:space="preserve">The stress and replacement numbers sit on the same form as the home items. They are not a second finding.</w:t>
-      </w:r>
-    </w:p>
-    <w:bookmarkEnd w:id="24"/>
-    <w:bookmarkStart w:id="25" w:name="limits"/>
-    <w:p>
-      <w:pPr>
-        <w:pStyle w:val="Heading2"/>
-      </w:pPr>
-      <w:r>
-        <w:t xml:space="preserve">5. Limits</w:t>
+        <w:rPr>
+          <w:bCs/>
+          <w:b/>
+        </w:rPr>
+        <w:t xml:space="preserve">Table 4</w:t>
       </w:r>
     </w:p>
     <w:p>
       <w:pPr>
-        <w:pStyle w:val="FirstParagraph"/>
-      </w:pPr>
-      <w:r>
-        <w:t xml:space="preserve">Thirty-eight self-selected rows, four days, unknown recruitment, enrollment not verified, no pilot, incomplete platform columns, no ethics number, February 2022. Later hybrid teaching is outside the file.</w:t>
+        <w:pStyle w:val="BodyText"/>
+      </w:pPr>
+      <w:r>
+        <w:rPr>
+          <w:iCs/>
+          <w:i/>
+        </w:rPr>
+        <w:t xml:space="preserve">Focal associations (N = 38)</w:t>
       </w:r>
     </w:p>
-    <w:bookmarkEnd w:id="25"/>
-    <w:bookmarkStart w:id="26" w:name="references"/>
+    <w:tbl>
+      <w:tblPr>
+        <w:tblStyle w:val="Table"/>
+        <w:tblW w:type="pct" w:w="5000"/>
+        <w:tblLook w:firstRow="1" w:lastRow="0" w:firstColumn="0" w:lastColumn="0" w:noHBand="0" w:noVBand="0" w:val="0020"/>
+        <w:jc w:val="start"/>
+      </w:tblPr>
+      <w:tblGrid>
+        <w:gridCol w:w="3960"/>
+        <w:gridCol w:w="3960"/>
+      </w:tblGrid>
+      <w:tr>
+        <w:trPr>
+          <w:tblHeader w:val="true"/>
+        </w:trPr>
+        <w:tc>
+          <w:tcPr/>
+          <w:p>
+            <w:pPr>
+              <w:pStyle w:val="Compact"/>
+              <w:jc w:val="left"/>
+            </w:pPr>
+            <w:r>
+              <w:t xml:space="preserve">Association</w:t>
+            </w:r>
+          </w:p>
+        </w:tc>
+        <w:tc>
+          <w:tcPr/>
+          <w:p>
+            <w:pPr>
+              <w:pStyle w:val="Compact"/>
+              <w:jc w:val="left"/>
+            </w:pPr>
+            <w:r>
+              <w:t xml:space="preserve">Result</w:t>
+            </w:r>
+          </w:p>
+        </w:tc>
+      </w:tr>
+      <w:tr>
+        <w:tc>
+          <w:tcPr/>
+          <w:p>
+            <w:pPr>
+              <w:pStyle w:val="Compact"/>
+              <w:jc w:val="left"/>
+            </w:pPr>
+            <w:r>
+              <w:t xml:space="preserve">Home affects study very much × very high stress</w:t>
+            </w:r>
+          </w:p>
+        </w:tc>
+        <w:tc>
+          <w:tcPr/>
+          <w:p>
+            <w:pPr>
+              <w:pStyle w:val="Compact"/>
+              <w:jc w:val="left"/>
+            </w:pPr>
+            <w:r>
+              <w:t xml:space="preserve">11/14 vs 3/24; two-sided Fisher’s exact</w:t>
+            </w:r>
+            <w:r>
+              <w:t xml:space="preserve"> </w:t>
+            </w:r>
+            <w:r>
+              <w:rPr>
+                <w:iCs/>
+                <w:i/>
+              </w:rPr>
+              <w:t xml:space="preserve">p</w:t>
+            </w:r>
+            <w:r>
+              <w:t xml:space="preserve"> </w:t>
+            </w:r>
+            <w:r>
+              <w:t xml:space="preserve">= .00008</w:t>
+            </w:r>
+          </w:p>
+        </w:tc>
+      </w:tr>
+      <w:tr>
+        <w:tc>
+          <w:tcPr/>
+          <w:p>
+            <w:pPr>
+              <w:pStyle w:val="Compact"/>
+              <w:jc w:val="left"/>
+            </w:pPr>
+            <w:r>
+              <w:t xml:space="preserve">Speed (worse) × appraisal index (worse)</w:t>
+            </w:r>
+          </w:p>
+        </w:tc>
+        <w:tc>
+          <w:tcPr/>
+          <w:p>
+            <w:pPr>
+              <w:pStyle w:val="Compact"/>
+              <w:jc w:val="left"/>
+            </w:pPr>
+            <w:r>
+              <w:t xml:space="preserve">ρ = .65, percentile bootstrap 95% CI [.36, .84],</w:t>
+            </w:r>
+            <w:r>
+              <w:t xml:space="preserve"> </w:t>
+            </w:r>
+            <w:r>
+              <w:rPr>
+                <w:iCs/>
+                <w:i/>
+              </w:rPr>
+              <w:t xml:space="preserve">p</w:t>
+            </w:r>
+            <w:r>
+              <w:t xml:space="preserve"> </w:t>
+            </w:r>
+            <w:r>
+              <w:t xml:space="preserve">&lt; .001</w:t>
+            </w:r>
+          </w:p>
+        </w:tc>
+      </w:tr>
+      <w:tr>
+        <w:tc>
+          <w:tcPr/>
+          <w:p>
+            <w:pPr>
+              <w:pStyle w:val="Compact"/>
+              <w:jc w:val="left"/>
+            </w:pPr>
+            <w:r>
+              <w:t xml:space="preserve">Infrastructure-problem count × appraisal index (exploratory post hoc)</w:t>
+            </w:r>
+          </w:p>
+        </w:tc>
+        <w:tc>
+          <w:tcPr/>
+          <w:p>
+            <w:pPr>
+              <w:pStyle w:val="Compact"/>
+              <w:jc w:val="left"/>
+            </w:pPr>
+            <w:r>
+              <w:t xml:space="preserve">ρ = .02, percentile bootstrap 95% CI [−.32, .37],</w:t>
+            </w:r>
+            <w:r>
+              <w:t xml:space="preserve"> </w:t>
+            </w:r>
+            <w:r>
+              <w:rPr>
+                <w:iCs/>
+                <w:i/>
+              </w:rPr>
+              <w:t xml:space="preserve">p</w:t>
+            </w:r>
+            <w:r>
+              <w:t xml:space="preserve"> </w:t>
+            </w:r>
+            <w:r>
+              <w:t xml:space="preserve">= .91</w:t>
+            </w:r>
+          </w:p>
+        </w:tc>
+      </w:tr>
+    </w:tbl>
     <w:p>
       <w:pPr>
-        <w:pStyle w:val="Heading2"/>
-      </w:pPr>
-      <w:r>
-        <w:t xml:space="preserve">References</w:t>
+        <w:pStyle w:val="BodyText"/>
+      </w:pPr>
+      <w:r>
+        <w:rPr>
+          <w:iCs/>
+          <w:i/>
+        </w:rPr>
+        <w:t xml:space="preserve">Note.</w:t>
+      </w:r>
+      <w:r>
+        <w:t xml:space="preserve"> </w:t>
+      </w:r>
+      <w:r>
+        <w:t xml:space="preserve">Analyses are exploratory. Odds ratios are omitted. The infrastructure-problem count is an unvalidated post hoc indicator and is not treated as a parallel scale.</w:t>
       </w:r>
     </w:p>
     <w:p>
       <w:pPr>
+        <w:pStyle w:val="BodyText"/>
+      </w:pPr>
+      <w:r>
+        <w:t xml:space="preserve">Among Pakistani-nationality respondents only (n = 37), the home and stress table remained 11/14 versus 3/23 (two-sided Fisher’s exact</w:t>
+      </w:r>
+      <w:r>
+        <w:t xml:space="preserve"> </w:t>
+      </w:r>
+      <w:r>
+        <w:rPr>
+          <w:iCs/>
+          <w:i/>
+        </w:rPr>
+        <w:t xml:space="preserve">p</w:t>
+      </w:r>
+      <w:r>
+        <w:t xml:space="preserve"> </w:t>
+      </w:r>
+      <w:r>
+        <w:t xml:space="preserve">= .00011) and speed × appraisal was ρ = .67 (percentile bootstrap 95% CI [.39, .85]).</w:t>
+      </w:r>
+    </w:p>
+    <w:bookmarkEnd w:id="34"/>
+    <w:bookmarkStart w:id="35" w:name="replacement-judgments"/>
+    <w:p>
+      <w:pPr>
+        <w:pStyle w:val="Heading3"/>
+      </w:pPr>
+      <w:r>
+        <w:t xml:space="preserve">4.4 Replacement judgments</w:t>
+      </w:r>
+    </w:p>
+    <w:p>
+      <w:pPr>
         <w:pStyle w:val="FirstParagraph"/>
+      </w:pPr>
+      <w:r>
+        <w:t xml:space="preserve">Nineteen of 38 said online study could replace campus classes, and 19 said it could not. The form was split. That count is reported here because the item was on the questionnaire. It is not treated as a test of gender or of household type.</w:t>
+      </w:r>
+    </w:p>
+    <w:bookmarkEnd w:id="35"/>
+    <w:bookmarkEnd w:id="36"/>
+    <w:bookmarkStart w:id="37" w:name="discussion"/>
+    <w:p>
+      <w:pPr>
+        <w:pStyle w:val="Heading2"/>
+      </w:pPr>
+      <w:r>
+        <w:t xml:space="preserve">5. Discussion</w:t>
+      </w:r>
+    </w:p>
+    <w:p>
+      <w:pPr>
+        <w:pStyle w:val="FirstParagraph"/>
+      </w:pPr>
+      <w:r>
+        <w:t xml:space="preserve">The data show the difficulties the field has named, networks, platforms, interaction, and strain, as learner-side reports in this sample. Those who said the home affected study</w:t>
+      </w:r>
+      <w:r>
+        <w:t xml:space="preserve"> </w:t>
+      </w:r>
+      <w:r>
+        <w:t xml:space="preserve">“</w:t>
+      </w:r>
+      <w:r>
+        <w:t xml:space="preserve">very much</w:t>
+      </w:r>
+      <w:r>
+        <w:t xml:space="preserve">”</w:t>
+      </w:r>
+      <w:r>
+        <w:t xml:space="preserve"> </w:t>
+      </w:r>
+      <w:r>
+        <w:t xml:space="preserve">more often selected</w:t>
+      </w:r>
+      <w:r>
+        <w:t xml:space="preserve"> </w:t>
+      </w:r>
+      <w:r>
+        <w:t xml:space="preserve">“</w:t>
+      </w:r>
+      <w:r>
+        <w:t xml:space="preserve">very high stress,</w:t>
+      </w:r>
+      <w:r>
+        <w:t xml:space="preserve">”</w:t>
+      </w:r>
+      <w:r>
+        <w:t xml:space="preserve"> </w:t>
+      </w:r>
+      <w:r>
+        <w:t xml:space="preserve">and worse reported internet speed was associated with a more negative appraisal of online learning. Both tests are exploratory. They do not prove that the household caused stress or that speed caused a worse view of the class. They do show that those answers travelled together in these 38 rows.</w:t>
+      </w:r>
+    </w:p>
+    <w:p>
+      <w:pPr>
+        <w:pStyle w:val="BodyText"/>
+      </w:pPr>
+      <w:r>
+        <w:t xml:space="preserve">Xu et al. (2022) show how character teaching was adapted on the sending side. Zhang and Liu (2023) show designed online Chinese work. The present data add the home and platform conditions the 38 respondents marked. A better textbook would not, by itself, have answered a live session on an unstable connection, or a required application that they marked unusable.</w:t>
+      </w:r>
+    </w:p>
+    <w:p>
+      <w:pPr>
+        <w:pStyle w:val="BodyText"/>
+      </w:pPr>
+      <w:r>
+        <w:t xml:space="preserve">QQ, Chaoxing, DingTalk, and Chinese MOOC were often marked unusable, while Zoom and WhatsApp were more often marked available. The items cannot separate country restrictions, routing, account rules, skills, or virtual private networks. They can show that a single required toolkit was not equally marked as usable in this sample.</w:t>
+      </w:r>
+    </w:p>
+    <w:bookmarkEnd w:id="37"/>
+    <w:bookmarkStart w:id="42" w:name="pedagogical-implications"/>
+    <w:p>
+      <w:pPr>
+        <w:pStyle w:val="Heading2"/>
+      </w:pPr>
+      <w:r>
+        <w:t xml:space="preserve">6. Pedagogical implications</w:t>
+      </w:r>
+    </w:p>
+    <w:p>
+      <w:pPr>
+        <w:pStyle w:val="FirstParagraph"/>
+      </w:pPr>
+      <w:r>
+        <w:t xml:space="preserve">In this sample, the questionnaire can support only a small set of classroom decisions.</w:t>
+      </w:r>
+    </w:p>
+    <w:bookmarkStart w:id="38" w:name="platform-selection"/>
+    <w:p>
+      <w:pPr>
+        <w:pStyle w:val="Heading3"/>
+      </w:pPr>
+      <w:r>
+        <w:t xml:space="preserve">Platform selection</w:t>
+      </w:r>
+    </w:p>
+    <w:p>
+      <w:pPr>
+        <w:pStyle w:val="FirstParagraph"/>
+      </w:pPr>
+      <w:r>
+        <w:t xml:space="preserve">Because QQ and Chaoxing were frequently marked unusable (Table 3), a program should not treat the sending-side toolkit as given. Before it requires a platform, it has to ask whether learners can open it where they sit, and it has to name a usable alternative. WhatsApp was marked available here, but it was not recorded as used for class, so the data do not recommend it as a replacement.</w:t>
+      </w:r>
+    </w:p>
+    <w:bookmarkEnd w:id="38"/>
+    <w:bookmarkStart w:id="39" w:name="assessment-modes"/>
+    <w:p>
+      <w:pPr>
+        <w:pStyle w:val="Heading3"/>
+      </w:pPr>
+      <w:r>
+        <w:t xml:space="preserve">Assessment modes</w:t>
+      </w:r>
+    </w:p>
+    <w:p>
+      <w:pPr>
+        <w:pStyle w:val="FirstParagraph"/>
+      </w:pPr>
+      <w:r>
+        <w:t xml:space="preserve">Because only 28.9% described the home as quiet, 42.1% reported power interruptions, and 76.3% reported unstable networks (Table 2), institutions should not treat a live oral hour as the only assessable performance. Assessment that assumes a quiet, continuous campus hour will mark some of those conditions as learner failure.</w:t>
+      </w:r>
+    </w:p>
+    <w:bookmarkEnd w:id="39"/>
+    <w:bookmarkStart w:id="40" w:name="live-session-duration"/>
+    <w:p>
+      <w:pPr>
+        <w:pStyle w:val="Heading3"/>
+      </w:pPr>
+      <w:r>
+        <w:t xml:space="preserve">Live session duration</w:t>
+      </w:r>
+    </w:p>
+    <w:p>
+      <w:pPr>
+        <w:pStyle w:val="FirstParagraph"/>
+      </w:pPr>
+      <w:r>
+        <w:t xml:space="preserve">Preferred live length here was 45 minutes for half of the respondents and 30 minutes for 28.9%. One open comment said that even one minute online was</w:t>
+      </w:r>
+      <w:r>
+        <w:t xml:space="preserve"> </w:t>
+      </w:r>
+      <w:r>
+        <w:t xml:space="preserve">“</w:t>
+      </w:r>
+      <w:r>
+        <w:t xml:space="preserve">not suitable.</w:t>
+      </w:r>
+      <w:r>
+        <w:t xml:space="preserve">”</w:t>
+      </w:r>
+      <w:r>
+        <w:t xml:space="preserve"> </w:t>
+      </w:r>
+      <w:r>
+        <w:t xml:space="preserve">A shorter live slot or an asynchronous oral alternative is the suggestion the data can support.</w:t>
+      </w:r>
+    </w:p>
+    <w:bookmarkEnd w:id="40"/>
+    <w:bookmarkStart w:id="41" w:name="collecting-access-data"/>
+    <w:p>
+      <w:pPr>
+        <w:pStyle w:val="Heading3"/>
+      </w:pPr>
+      <w:r>
+        <w:t xml:space="preserve">Collecting access data</w:t>
+      </w:r>
+    </w:p>
+    <w:p>
+      <w:pPr>
+        <w:pStyle w:val="FirstParagraph"/>
+      </w:pPr>
+      <w:r>
+        <w:t xml:space="preserve">The form shows household and access conditions. It does not show how institutions adapted. Those conditions should be collected as part of course design, not after complaints.</w:t>
+      </w:r>
+    </w:p>
+    <w:p>
+      <w:pPr>
+        <w:pStyle w:val="BodyText"/>
+      </w:pPr>
+      <w:r>
+        <w:t xml:space="preserve">These suggestions are bound to this sample. They are not a national policy, and they are not evidence that later hybrid teaching has repeated this pattern (Stockwell &amp; Wang, 2023).</w:t>
+      </w:r>
+    </w:p>
+    <w:bookmarkEnd w:id="41"/>
+    <w:bookmarkEnd w:id="42"/>
+    <w:bookmarkStart w:id="43" w:name="limitations"/>
+    <w:p>
+      <w:pPr>
+        <w:pStyle w:val="Heading2"/>
+      </w:pPr>
+      <w:r>
+        <w:t xml:space="preserve">7. Limitations</w:t>
+      </w:r>
+    </w:p>
+    <w:p>
+      <w:pPr>
+        <w:pStyle w:val="FirstParagraph"/>
+      </w:pPr>
+      <w:r>
+        <w:t xml:space="preserve">The sample is small (N = 38), network-recruited, and majority male; recruitment channel, host university, program type, and place of residence were not recorded, so all outcomes are self-report from a convenience group whose enrollment was not independently verified. The data are from February 2022 and concern emergency remote teaching; they are not evidence about current hybrid education. The appraisal index is descriptive rather than a validated scale, the infrastructure-problem count is an unvalidated post hoc indicator, the form did not measure institutional adaptation, IP metadata are not a location measure, and no ethics-committee number is available for the 2022 collection (Section 3.5).</w:t>
+      </w:r>
+    </w:p>
+    <w:bookmarkEnd w:id="43"/>
+    <w:bookmarkStart w:id="44" w:name="conclusion"/>
+    <w:p>
+      <w:pPr>
+        <w:pStyle w:val="Heading2"/>
+      </w:pPr>
+      <w:r>
+        <w:t xml:space="preserve">8. Conclusion</w:t>
+      </w:r>
+    </w:p>
+    <w:p>
+      <w:pPr>
+        <w:pStyle w:val="FirstParagraph"/>
+      </w:pPr>
+      <w:r>
+        <w:t xml:space="preserve">This study used questionnaire data from 38 respondents who reported online Chinese study. Unstable networks, power interruptions, and uneven platform access were common in the sample. Home conditions that</w:t>
+      </w:r>
+      <w:r>
+        <w:t xml:space="preserve"> </w:t>
+      </w:r>
+      <w:r>
+        <w:t xml:space="preserve">“</w:t>
+      </w:r>
+      <w:r>
+        <w:t xml:space="preserve">affected study very much</w:t>
+      </w:r>
+      <w:r>
+        <w:t xml:space="preserve">”</w:t>
+      </w:r>
+      <w:r>
+        <w:t xml:space="preserve"> </w:t>
+      </w:r>
+      <w:r>
+        <w:t xml:space="preserve">co-occurred with</w:t>
+      </w:r>
+      <w:r>
+        <w:t xml:space="preserve"> </w:t>
+      </w:r>
+      <w:r>
+        <w:t xml:space="preserve">“</w:t>
+      </w:r>
+      <w:r>
+        <w:t xml:space="preserve">very high stress,</w:t>
+      </w:r>
+      <w:r>
+        <w:t xml:space="preserve">”</w:t>
+      </w:r>
+      <w:r>
+        <w:t xml:space="preserve"> </w:t>
+      </w:r>
+      <w:r>
+        <w:t xml:space="preserve">and worse reported speed went with a more negative appraisal of online learning. Online Chinese teaching is not only a content problem. In these data it is also a delivery problem.</w:t>
+      </w:r>
+    </w:p>
+    <w:bookmarkEnd w:id="44"/>
+    <w:bookmarkStart w:id="45" w:name="appendix-a.-appraisal-items-and-coding"/>
+    <w:p>
+      <w:pPr>
+        <w:pStyle w:val="Heading2"/>
+      </w:pPr>
+      <w:r>
+        <w:t xml:space="preserve">Appendix A. Appraisal items and coding</w:t>
+      </w:r>
+    </w:p>
+    <w:p>
+      <w:pPr>
+        <w:pStyle w:val="FirstParagraph"/>
+      </w:pPr>
+      <w:r>
+        <w:t xml:space="preserve">English glosses of the item stems.</w:t>
+      </w:r>
+    </w:p>
+    <w:tbl>
+      <w:tblPr>
+        <w:tblStyle w:val="Table"/>
+        <w:tblW w:type="pct" w:w="5000"/>
+        <w:tblLook w:firstRow="1" w:lastRow="0" w:firstColumn="0" w:lastColumn="0" w:noHBand="0" w:noVBand="0" w:val="0020"/>
+        <w:jc w:val="start"/>
+      </w:tblPr>
+      <w:tblGrid>
+        <w:gridCol w:w="1980"/>
+        <w:gridCol w:w="1980"/>
+        <w:gridCol w:w="1980"/>
+        <w:gridCol w:w="1980"/>
+      </w:tblGrid>
+      <w:tr>
+        <w:trPr>
+          <w:tblHeader w:val="true"/>
+        </w:trPr>
+        <w:tc>
+          <w:tcPr/>
+          <w:p>
+            <w:pPr>
+              <w:pStyle w:val="Compact"/>
+              <w:jc w:val="left"/>
+            </w:pPr>
+            <w:r>
+              <w:t xml:space="preserve">Item</w:t>
+            </w:r>
+          </w:p>
+        </w:tc>
+        <w:tc>
+          <w:tcPr/>
+          <w:p>
+            <w:pPr>
+              <w:pStyle w:val="Compact"/>
+              <w:jc w:val="left"/>
+            </w:pPr>
+            <w:r>
+              <w:t xml:space="preserve">Stem (gloss)</w:t>
+            </w:r>
+          </w:p>
+        </w:tc>
+        <w:tc>
+          <w:tcPr/>
+          <w:p>
+            <w:pPr>
+              <w:pStyle w:val="Compact"/>
+              <w:jc w:val="left"/>
+            </w:pPr>
+            <w:r>
+              <w:t xml:space="preserve">1</w:t>
+            </w:r>
+          </w:p>
+        </w:tc>
+        <w:tc>
+          <w:tcPr/>
+          <w:p>
+            <w:pPr>
+              <w:pStyle w:val="Compact"/>
+              <w:jc w:val="left"/>
+            </w:pPr>
+            <w:r>
+              <w:t xml:space="preserve">Higher</w:t>
+            </w:r>
+          </w:p>
+        </w:tc>
+      </w:tr>
+      <w:tr>
+        <w:tc>
+          <w:tcPr/>
+          <w:p>
+            <w:pPr>
+              <w:pStyle w:val="Compact"/>
+              <w:jc w:val="left"/>
+            </w:pPr>
+            <w:r>
+              <w:t xml:space="preserve">Learned (Q8)</w:t>
+            </w:r>
+          </w:p>
+        </w:tc>
+        <w:tc>
+          <w:tcPr/>
+          <w:p>
+            <w:pPr>
+              <w:pStyle w:val="Compact"/>
+              <w:jc w:val="left"/>
+            </w:pPr>
+            <w:r>
+              <w:t xml:space="preserve">Can you learn a lot in online class?</w:t>
+            </w:r>
+          </w:p>
+        </w:tc>
+        <w:tc>
+          <w:tcPr/>
+          <w:p>
+            <w:pPr>
+              <w:pStyle w:val="Compact"/>
+              <w:jc w:val="left"/>
+            </w:pPr>
+            <w:r>
+              <w:t xml:space="preserve">a lot</w:t>
+            </w:r>
+          </w:p>
+        </w:tc>
+        <w:tc>
+          <w:tcPr/>
+          <w:p>
+            <w:pPr>
+              <w:pStyle w:val="Compact"/>
+              <w:jc w:val="left"/>
+            </w:pPr>
+            <w:r>
+              <w:t xml:space="preserve">worse appraisal</w:t>
+            </w:r>
+          </w:p>
+        </w:tc>
+      </w:tr>
+      <w:tr>
+        <w:tc>
+          <w:tcPr/>
+          <w:p>
+            <w:pPr>
+              <w:pStyle w:val="Compact"/>
+              <w:jc w:val="left"/>
+            </w:pPr>
+            <w:r>
+              <w:t xml:space="preserve">Improve (Q9)</w:t>
+            </w:r>
+          </w:p>
+        </w:tc>
+        <w:tc>
+          <w:tcPr/>
+          <w:p>
+            <w:pPr>
+              <w:pStyle w:val="Compact"/>
+              <w:jc w:val="left"/>
+            </w:pPr>
+            <w:r>
+              <w:t xml:space="preserve">Can online study improve Chinese?</w:t>
+            </w:r>
+          </w:p>
+        </w:tc>
+        <w:tc>
+          <w:tcPr/>
+          <w:p>
+            <w:pPr>
+              <w:pStyle w:val="Compact"/>
+              <w:jc w:val="left"/>
+            </w:pPr>
+            <w:r>
+              <w:t xml:space="preserve">very much</w:t>
+            </w:r>
+          </w:p>
+        </w:tc>
+        <w:tc>
+          <w:tcPr/>
+          <w:p>
+            <w:pPr>
+              <w:pStyle w:val="Compact"/>
+              <w:jc w:val="left"/>
+            </w:pPr>
+            <w:r>
+              <w:t xml:space="preserve">worse appraisal</w:t>
+            </w:r>
+          </w:p>
+        </w:tc>
+      </w:tr>
+      <w:tr>
+        <w:tc>
+          <w:tcPr/>
+          <w:p>
+            <w:pPr>
+              <w:pStyle w:val="Compact"/>
+              <w:jc w:val="left"/>
+            </w:pPr>
+            <w:r>
+              <w:t xml:space="preserve">Interest (Q10)</w:t>
+            </w:r>
+          </w:p>
+        </w:tc>
+        <w:tc>
+          <w:tcPr/>
+          <w:p>
+            <w:pPr>
+              <w:pStyle w:val="Compact"/>
+              <w:jc w:val="left"/>
+            </w:pPr>
+            <w:r>
+              <w:t xml:space="preserve">Does it spark learning interest?</w:t>
+            </w:r>
+          </w:p>
+        </w:tc>
+        <w:tc>
+          <w:tcPr/>
+          <w:p>
+            <w:pPr>
+              <w:pStyle w:val="Compact"/>
+              <w:jc w:val="left"/>
+            </w:pPr>
+            <w:r>
+              <w:t xml:space="preserve">very much</w:t>
+            </w:r>
+          </w:p>
+        </w:tc>
+        <w:tc>
+          <w:tcPr/>
+          <w:p>
+            <w:pPr>
+              <w:pStyle w:val="Compact"/>
+              <w:jc w:val="left"/>
+            </w:pPr>
+            <w:r>
+              <w:t xml:space="preserve">worse appraisal</w:t>
+            </w:r>
+          </w:p>
+        </w:tc>
+      </w:tr>
+      <w:tr>
+        <w:tc>
+          <w:tcPr/>
+          <w:p>
+            <w:pPr>
+              <w:pStyle w:val="Compact"/>
+              <w:jc w:val="left"/>
+            </w:pPr>
+            <w:r>
+              <w:t xml:space="preserve">Speed (Q14)</w:t>
+            </w:r>
+          </w:p>
+        </w:tc>
+        <w:tc>
+          <w:tcPr/>
+          <w:p>
+            <w:pPr>
+              <w:pStyle w:val="Compact"/>
+              <w:jc w:val="left"/>
+            </w:pPr>
+            <w:r>
+              <w:t xml:space="preserve">Internet speed</w:t>
+            </w:r>
+          </w:p>
+        </w:tc>
+        <w:tc>
+          <w:tcPr/>
+          <w:p>
+            <w:pPr>
+              <w:pStyle w:val="Compact"/>
+              <w:jc w:val="left"/>
+            </w:pPr>
+            <w:r>
+              <w:t xml:space="preserve">very good</w:t>
+            </w:r>
+          </w:p>
+        </w:tc>
+        <w:tc>
+          <w:tcPr/>
+          <w:p>
+            <w:pPr>
+              <w:pStyle w:val="Compact"/>
+              <w:jc w:val="left"/>
+            </w:pPr>
+            <w:r>
+              <w:t xml:space="preserve">worse speed</w:t>
+            </w:r>
+          </w:p>
+        </w:tc>
+      </w:tr>
+      <w:tr>
+        <w:tc>
+          <w:tcPr/>
+          <w:p>
+            <w:pPr>
+              <w:pStyle w:val="Compact"/>
+              <w:jc w:val="left"/>
+            </w:pPr>
+            <w:r>
+              <w:t xml:space="preserve">Stress (Q24)</w:t>
+            </w:r>
+          </w:p>
+        </w:tc>
+        <w:tc>
+          <w:tcPr/>
+          <w:p>
+            <w:pPr>
+              <w:pStyle w:val="Compact"/>
+              <w:jc w:val="left"/>
+            </w:pPr>
+            <w:r>
+              <w:t xml:space="preserve">Psychological stress</w:t>
+            </w:r>
+          </w:p>
+        </w:tc>
+        <w:tc>
+          <w:tcPr/>
+          <w:p>
+            <w:pPr>
+              <w:pStyle w:val="Compact"/>
+              <w:jc w:val="left"/>
+            </w:pPr>
+            <w:r>
+              <w:t xml:space="preserve">very high</w:t>
+            </w:r>
+          </w:p>
+        </w:tc>
+        <w:tc>
+          <w:tcPr/>
+          <w:p>
+            <w:pPr>
+              <w:pStyle w:val="Compact"/>
+              <w:jc w:val="left"/>
+            </w:pPr>
+            <w:r>
+              <w:t xml:space="preserve">less stress</w:t>
+            </w:r>
+          </w:p>
+        </w:tc>
+      </w:tr>
+      <w:tr>
+        <w:tc>
+          <w:tcPr/>
+          <w:p>
+            <w:pPr>
+              <w:pStyle w:val="Compact"/>
+              <w:jc w:val="left"/>
+            </w:pPr>
+            <w:r>
+              <w:t xml:space="preserve">Interaction (Q25)</w:t>
+            </w:r>
+          </w:p>
+        </w:tc>
+        <w:tc>
+          <w:tcPr/>
+          <w:p>
+            <w:pPr>
+              <w:pStyle w:val="Compact"/>
+              <w:jc w:val="left"/>
+            </w:pPr>
+            <w:r>
+              <w:t xml:space="preserve">Active interaction with teacher</w:t>
+            </w:r>
+          </w:p>
+        </w:tc>
+        <w:tc>
+          <w:tcPr/>
+          <w:p>
+            <w:pPr>
+              <w:pStyle w:val="Compact"/>
+              <w:jc w:val="left"/>
+            </w:pPr>
+            <w:r>
+              <w:t xml:space="preserve">very much</w:t>
+            </w:r>
+          </w:p>
+        </w:tc>
+        <w:tc>
+          <w:tcPr/>
+          <w:p>
+            <w:pPr>
+              <w:pStyle w:val="Compact"/>
+              <w:jc w:val="left"/>
+            </w:pPr>
+            <w:r>
+              <w:t xml:space="preserve">thinner interaction</w:t>
+            </w:r>
+          </w:p>
+        </w:tc>
+      </w:tr>
+    </w:tbl>
+    <w:p>
+      <w:pPr>
+        <w:pStyle w:val="BodyText"/>
+      </w:pPr>
+      <w:r>
+        <w:t xml:space="preserve">Index = mean of Q8, Q9, and Q10 (n = 38; no missing on these three).</w:t>
+      </w:r>
+    </w:p>
+    <w:bookmarkEnd w:id="45"/>
+    <w:bookmarkStart w:id="46" w:name="appendix-b.-secondary-statistics"/>
+    <w:p>
+      <w:pPr>
+        <w:pStyle w:val="Heading2"/>
+      </w:pPr>
+      <w:r>
+        <w:t xml:space="preserve">Appendix B. Secondary statistics</w:t>
+      </w:r>
+    </w:p>
+    <w:p>
+      <w:pPr>
+        <w:pStyle w:val="FirstParagraph"/>
+      </w:pPr>
+      <w:r>
+        <w:t xml:space="preserve">Female × cannot-replace and learned-little × cannot-replace have identical cell counts (9/11 vs 10/27; Fisher’s exact</w:t>
+      </w:r>
+      <w:r>
+        <w:t xml:space="preserve"> </w:t>
+      </w:r>
+      <w:r>
+        <w:rPr>
+          <w:iCs/>
+          <w:i/>
+        </w:rPr>
+        <w:t xml:space="preserve">p</w:t>
+      </w:r>
+      <w:r>
+        <w:t xml:space="preserve"> </w:t>
+      </w:r>
+      <w:r>
+        <w:t xml:space="preserve">= .029). Poor internet × cannot-replace: 8/10 vs 11/28, Fisher’s exact</w:t>
+      </w:r>
+      <w:r>
+        <w:t xml:space="preserve"> </w:t>
+      </w:r>
+      <w:r>
+        <w:rPr>
+          <w:iCs/>
+          <w:i/>
+        </w:rPr>
+        <w:t xml:space="preserve">p</w:t>
+      </w:r>
+      <w:r>
+        <w:t xml:space="preserve"> </w:t>
+      </w:r>
+      <w:r>
+        <w:t xml:space="preserve">= .062. Mann–Whitney tests by gender on ordinals all had</w:t>
+      </w:r>
+      <w:r>
+        <w:t xml:space="preserve"> </w:t>
+      </w:r>
+      <w:r>
+        <w:rPr>
+          <w:iCs/>
+          <w:i/>
+        </w:rPr>
+        <w:t xml:space="preserve">p</w:t>
+      </w:r>
+      <w:r>
+        <w:t xml:space="preserve"> </w:t>
+      </w:r>
+      <w:r>
+        <w:t xml:space="preserve">≥ .36.</w:t>
+      </w:r>
+    </w:p>
+    <w:bookmarkEnd w:id="46"/>
+    <w:bookmarkStart w:id="47" w:name="references"/>
+    <w:p>
+      <w:pPr>
+        <w:pStyle w:val="Heading2"/>
+      </w:pPr>
+      <w:r>
+        <w:t xml:space="preserve">References</w:t>
+      </w:r>
+    </w:p>
+    <w:p>
+      <w:pPr>
+        <w:pStyle w:val="FirstParagraph"/>
+      </w:pPr>
+      <w:r>
+        <w:t xml:space="preserve">Ali, W. (2020). Online and remote learning in higher education institutes: A necessity in light of COVID-19 pandemic.</w:t>
+      </w:r>
+      <w:r>
+        <w:t xml:space="preserve"> </w:t>
+      </w:r>
+      <w:r>
+        <w:rPr>
+          <w:iCs/>
+          <w:i/>
+        </w:rPr>
+        <w:t xml:space="preserve">Higher Education Studies, 10</w:t>
+      </w:r>
+      <w:r>
+        <w:t xml:space="preserve">(3), 16-25. https://doi.org/10.5539/hes.v10n3p16</w:t>
+      </w:r>
+    </w:p>
+    <w:p>
+      <w:pPr>
+        <w:pStyle w:val="BodyText"/>
+      </w:pPr>
+      <w:r>
+        <w:t xml:space="preserve">Beaunoyer, E., Dupéré, S., &amp; Guitton, M. J. (2020). COVID-19 and digital inequalities: Reciprocal impacts and mitigation strategies.</w:t>
+      </w:r>
+      <w:r>
+        <w:t xml:space="preserve"> </w:t>
+      </w:r>
+      <w:r>
+        <w:rPr>
+          <w:iCs/>
+          <w:i/>
+        </w:rPr>
+        <w:t xml:space="preserve">Computers in Human Behavior, 111</w:t>
+      </w:r>
+      <w:r>
+        <w:t xml:space="preserve">, Article 106424. https://doi.org/10.1016/j.chb.2020.106424</w:t>
+      </w:r>
+    </w:p>
+    <w:p>
+      <w:pPr>
+        <w:pStyle w:val="BodyText"/>
       </w:pPr>
       <w:r>
         <w:t xml:space="preserve">Gacs, A., Goertler, S., &amp; Spasova, S. (2020). Planned online language education versus crisis-prompted online language teaching: Lessons for the future.</w:t>
@@ -1699,6 +3169,27 @@
         <w:pStyle w:val="BodyText"/>
       </w:pPr>
       <w:r>
+        <w:t xml:space="preserve">Gong, Y., Gao, X., &amp; Lyu, B. (2020b). Teaching Chinese as a second or foreign language to non-Chinese learners in mainland China (2014-2018).</w:t>
+      </w:r>
+      <w:r>
+        <w:t xml:space="preserve"> </w:t>
+      </w:r>
+      <w:r>
+        <w:rPr>
+          <w:iCs/>
+          <w:i/>
+        </w:rPr>
+        <w:t xml:space="preserve">Language Teaching, 53</w:t>
+      </w:r>
+      <w:r>
+        <w:t xml:space="preserve">(1), 44-62. https://doi.org/10.1017/S0261444819000387</w:t>
+      </w:r>
+    </w:p>
+    <w:p>
+      <w:pPr>
+        <w:pStyle w:val="BodyText"/>
+      </w:pPr>
+      <w:r>
         <w:t xml:space="preserve">González-Lloret, M. (2020). Collaborative tasks for online language teaching.</w:t>
       </w:r>
       <w:r>
@@ -1720,6 +3211,90 @@
         <w:pStyle w:val="BodyText"/>
       </w:pPr>
       <w:r>
+        <w:t xml:space="preserve">Guenier, A. W., Xing, M., &amp; Yan, J. (2026). From barriers to breakthroughs: Communicating Chinese culture to Irish learners with a multimodality online course.</w:t>
+      </w:r>
+      <w:r>
+        <w:t xml:space="preserve"> </w:t>
+      </w:r>
+      <w:r>
+        <w:rPr>
+          <w:iCs/>
+          <w:i/>
+        </w:rPr>
+        <w:t xml:space="preserve">Language, Culture and Curriculum</w:t>
+      </w:r>
+      <w:r>
+        <w:t xml:space="preserve">. Advance online publication. https://doi.org/10.1080/07908318.2026.2626775</w:t>
+      </w:r>
+    </w:p>
+    <w:p>
+      <w:pPr>
+        <w:pStyle w:val="BodyText"/>
+      </w:pPr>
+      <w:r>
+        <w:t xml:space="preserve">Guerrettaz, A. M., Engman, M. M., &amp; Matsumoto, Y. (2021). Empirically defining language learning and teaching materials in use through sociomaterial perspectives.</w:t>
+      </w:r>
+      <w:r>
+        <w:t xml:space="preserve"> </w:t>
+      </w:r>
+      <w:r>
+        <w:rPr>
+          <w:iCs/>
+          <w:i/>
+        </w:rPr>
+        <w:t xml:space="preserve">The Modern Language Journal, 105</w:t>
+      </w:r>
+      <w:r>
+        <w:t xml:space="preserve">(S1), 3-20. https://doi.org/10.1111/modl.12691</w:t>
+      </w:r>
+    </w:p>
+    <w:p>
+      <w:pPr>
+        <w:pStyle w:val="BodyText"/>
+      </w:pPr>
+      <w:r>
+        <w:t xml:space="preserve">Guo, C., &amp; Wan, B. (2022). The digital divide in online learning in China during the COVID-19 pandemic.</w:t>
+      </w:r>
+      <w:r>
+        <w:t xml:space="preserve"> </w:t>
+      </w:r>
+      <w:r>
+        <w:rPr>
+          <w:iCs/>
+          <w:i/>
+        </w:rPr>
+        <w:t xml:space="preserve">Technology in Society, 71</w:t>
+      </w:r>
+      <w:r>
+        <w:t xml:space="preserve">, Article 102122. https://doi.org/10.1016/j.techsoc.2022.102122</w:t>
+      </w:r>
+    </w:p>
+    <w:p>
+      <w:pPr>
+        <w:pStyle w:val="BodyText"/>
+      </w:pPr>
+      <w:r>
+        <w:t xml:space="preserve">Helsper, E. (2021).</w:t>
+      </w:r>
+      <w:r>
+        <w:t xml:space="preserve"> </w:t>
+      </w:r>
+      <w:r>
+        <w:rPr>
+          <w:iCs/>
+          <w:i/>
+        </w:rPr>
+        <w:t xml:space="preserve">The digital disconnect: The social causes and consequences of digital inequalities</w:t>
+      </w:r>
+      <w:r>
+        <w:t xml:space="preserve">. SAGE.</w:t>
+      </w:r>
+    </w:p>
+    <w:p>
+      <w:pPr>
+        <w:pStyle w:val="BodyText"/>
+      </w:pPr>
+      <w:r>
         <w:t xml:space="preserve">Hodges, C., Moore, S., Lockee, B., Trust, T., &amp; Bond, A. (2020). The difference between emergency remote teaching and online learning.</w:t>
       </w:r>
       <w:r>
@@ -1783,6 +3358,189 @@
         <w:pStyle w:val="BodyText"/>
       </w:pPr>
       <w:r>
+        <w:t xml:space="preserve">Lomicka, L. (2020). Creating and sustaining virtual language communities.</w:t>
+      </w:r>
+      <w:r>
+        <w:t xml:space="preserve"> </w:t>
+      </w:r>
+      <w:r>
+        <w:rPr>
+          <w:iCs/>
+          <w:i/>
+        </w:rPr>
+        <w:t xml:space="preserve">Foreign Language Annals, 53</w:t>
+      </w:r>
+      <w:r>
+        <w:t xml:space="preserve">(2), 306-313. https://doi.org/10.1111/flan.12456</w:t>
+      </w:r>
+    </w:p>
+    <w:p>
+      <w:pPr>
+        <w:pStyle w:val="BodyText"/>
+      </w:pPr>
+      <w:r>
+        <w:t xml:space="preserve">MacIntyre, P. D., Gregersen, T., &amp; Mercer, S. (2020). Language teachers’ coping strategies during the Covid-19 conversion to online teaching: Correlations with stress, wellbeing and negative emotions.</w:t>
+      </w:r>
+      <w:r>
+        <w:t xml:space="preserve"> </w:t>
+      </w:r>
+      <w:r>
+        <w:rPr>
+          <w:iCs/>
+          <w:i/>
+        </w:rPr>
+        <w:t xml:space="preserve">System, 94</w:t>
+      </w:r>
+      <w:r>
+        <w:t xml:space="preserve">, Article 102352. https://doi.org/10.1016/j.system.2020.102352</w:t>
+      </w:r>
+    </w:p>
+    <w:p>
+      <w:pPr>
+        <w:pStyle w:val="BodyText"/>
+      </w:pPr>
+      <w:r>
+        <w:t xml:space="preserve">Moorhouse, B. L. (2023). Teachers’ digital technology use after a period of online teaching.</w:t>
+      </w:r>
+      <w:r>
+        <w:t xml:space="preserve"> </w:t>
+      </w:r>
+      <w:r>
+        <w:rPr>
+          <w:iCs/>
+          <w:i/>
+        </w:rPr>
+        <w:t xml:space="preserve">ELT Journal, 77</w:t>
+      </w:r>
+      <w:r>
+        <w:t xml:space="preserve">(4), 445-457. https://doi.org/10.1093/elt/ccac050</w:t>
+      </w:r>
+    </w:p>
+    <w:p>
+      <w:pPr>
+        <w:pStyle w:val="BodyText"/>
+      </w:pPr>
+      <w:r>
+        <w:t xml:space="preserve">Moser, K. M., Wei, T., &amp; Brenner, D. (2021). Remote teaching during COVID-19: Implications from a national survey of language educators.</w:t>
+      </w:r>
+      <w:r>
+        <w:t xml:space="preserve"> </w:t>
+      </w:r>
+      <w:r>
+        <w:rPr>
+          <w:iCs/>
+          <w:i/>
+        </w:rPr>
+        <w:t xml:space="preserve">System, 97</w:t>
+      </w:r>
+      <w:r>
+        <w:t xml:space="preserve">, Article 102431. https://doi.org/10.1016/j.system.2020.102431</w:t>
+      </w:r>
+    </w:p>
+    <w:p>
+      <w:pPr>
+        <w:pStyle w:val="BodyText"/>
+      </w:pPr>
+      <w:r>
+        <w:t xml:space="preserve">Payne, J. S. (2020). Developing L2 productive language skills online and the strategic use of instructional tools.</w:t>
+      </w:r>
+      <w:r>
+        <w:t xml:space="preserve"> </w:t>
+      </w:r>
+      <w:r>
+        <w:rPr>
+          <w:iCs/>
+          <w:i/>
+        </w:rPr>
+        <w:t xml:space="preserve">Foreign Language Annals, 53</w:t>
+      </w:r>
+      <w:r>
+        <w:t xml:space="preserve">(2), 243-249. https://doi.org/10.1111/flan.12457</w:t>
+      </w:r>
+    </w:p>
+    <w:p>
+      <w:pPr>
+        <w:pStyle w:val="BodyText"/>
+      </w:pPr>
+      <w:r>
+        <w:t xml:space="preserve">Qi, X. (2025).</w:t>
+      </w:r>
+      <w:r>
+        <w:t xml:space="preserve"> </w:t>
+      </w:r>
+      <w:r>
+        <w:t xml:space="preserve">‘</w:t>
+      </w:r>
+      <w:r>
+        <w:t xml:space="preserve">My speech becomes just a voice, a picture</w:t>
+      </w:r>
+      <w:r>
+        <w:t xml:space="preserve">’</w:t>
+      </w:r>
+      <w:r>
+        <w:t xml:space="preserve">: Exploring language anxiety in Chinese as a second language learning in online environments.</w:t>
+      </w:r>
+      <w:r>
+        <w:t xml:space="preserve"> </w:t>
+      </w:r>
+      <w:r>
+        <w:rPr>
+          <w:iCs/>
+          <w:i/>
+        </w:rPr>
+        <w:t xml:space="preserve">Language Teaching Research</w:t>
+      </w:r>
+      <w:r>
+        <w:t xml:space="preserve">. Advance online publication. https://doi.org/10.1177/13621688251387320</w:t>
+      </w:r>
+    </w:p>
+    <w:p>
+      <w:pPr>
+        <w:pStyle w:val="BodyText"/>
+      </w:pPr>
+      <w:r>
+        <w:t xml:space="preserve">Russell, V. (2020). Language anxiety and the online learner.</w:t>
+      </w:r>
+      <w:r>
+        <w:t xml:space="preserve"> </w:t>
+      </w:r>
+      <w:r>
+        <w:rPr>
+          <w:iCs/>
+          <w:i/>
+        </w:rPr>
+        <w:t xml:space="preserve">Foreign Language Annals, 53</w:t>
+      </w:r>
+      <w:r>
+        <w:t xml:space="preserve">(2), 338-352. https://doi.org/10.1111/flan.12461</w:t>
+      </w:r>
+    </w:p>
+    <w:p>
+      <w:pPr>
+        <w:pStyle w:val="BodyText"/>
+      </w:pPr>
+      <w:r>
+        <w:t xml:space="preserve">Stockwell, G., &amp; Wang, Y. (2023). Exploring the challenges of technology in language teaching in the aftermath of the pandemic.</w:t>
+      </w:r>
+      <w:r>
+        <w:t xml:space="preserve"> </w:t>
+      </w:r>
+      <w:r>
+        <w:rPr>
+          <w:iCs/>
+          <w:i/>
+        </w:rPr>
+        <w:t xml:space="preserve">RELC Journal, 54</w:t>
+      </w:r>
+      <w:r>
+        <w:t xml:space="preserve">(2), 474-482. https://doi.org/10.1177/00336882231168438</w:t>
+      </w:r>
+    </w:p>
+    <w:p>
+      <w:pPr>
+        <w:pStyle w:val="BodyText"/>
+      </w:pPr>
+      <w:r>
         <w:t xml:space="preserve">Tao, J., &amp; Gao, X. (2022). Teaching and learning languages online: Challenges and responses.</w:t>
       </w:r>
       <w:r>
@@ -1804,6 +3562,153 @@
         <w:pStyle w:val="BodyText"/>
       </w:pPr>
       <w:r>
+        <w:t xml:space="preserve">van Dijk, J. (2020).</w:t>
+      </w:r>
+      <w:r>
+        <w:t xml:space="preserve"> </w:t>
+      </w:r>
+      <w:r>
+        <w:rPr>
+          <w:iCs/>
+          <w:i/>
+        </w:rPr>
+        <w:t xml:space="preserve">The digital divide</w:t>
+      </w:r>
+      <w:r>
+        <w:t xml:space="preserve">. Polity.</w:t>
+      </w:r>
+    </w:p>
+    <w:p>
+      <w:pPr>
+        <w:pStyle w:val="BodyText"/>
+      </w:pPr>
+      <w:r>
+        <w:t xml:space="preserve">van Lier, L. (2004).</w:t>
+      </w:r>
+      <w:r>
+        <w:t xml:space="preserve"> </w:t>
+      </w:r>
+      <w:r>
+        <w:rPr>
+          <w:iCs/>
+          <w:i/>
+        </w:rPr>
+        <w:t xml:space="preserve">The ecology and semiotics of language learning: A sociocultural perspective</w:t>
+      </w:r>
+      <w:r>
+        <w:t xml:space="preserve">. Kluwer.</w:t>
+      </w:r>
+    </w:p>
+    <w:p>
+      <w:pPr>
+        <w:pStyle w:val="BodyText"/>
+      </w:pPr>
+      <w:r>
+        <w:t xml:space="preserve">Vishnu, S., Tengli, M. B., Ramadas, S., Sathyan, A. R., &amp; Bhatt, A. (2024). Bridging the divide: Assessing digital infrastructure for higher education online learning.</w:t>
+      </w:r>
+      <w:r>
+        <w:t xml:space="preserve"> </w:t>
+      </w:r>
+      <w:r>
+        <w:rPr>
+          <w:iCs/>
+          <w:i/>
+        </w:rPr>
+        <w:t xml:space="preserve">TechTrends, 68</w:t>
+      </w:r>
+      <w:r>
+        <w:t xml:space="preserve">(6), 1107-1116. https://doi.org/10.1007/s11528-024-00997-4</w:t>
+      </w:r>
+    </w:p>
+    <w:p>
+      <w:pPr>
+        <w:pStyle w:val="BodyText"/>
+      </w:pPr>
+      <w:r>
+        <w:t xml:space="preserve">Warschauer, M. (2003).</w:t>
+      </w:r>
+      <w:r>
+        <w:t xml:space="preserve"> </w:t>
+      </w:r>
+      <w:r>
+        <w:rPr>
+          <w:iCs/>
+          <w:i/>
+        </w:rPr>
+        <w:t xml:space="preserve">Technology and social inclusion: Rethinking the digital divide</w:t>
+      </w:r>
+      <w:r>
+        <w:t xml:space="preserve">. MIT Press.</w:t>
+      </w:r>
+    </w:p>
+    <w:p>
+      <w:pPr>
+        <w:pStyle w:val="BodyText"/>
+      </w:pPr>
+      <w:r>
+        <w:t xml:space="preserve">Wen, X., &amp; Liu, F. (2025). Emotional dynamics of advanced Chinese as a second language learners: A Q methodology study.</w:t>
+      </w:r>
+      <w:r>
+        <w:t xml:space="preserve"> </w:t>
+      </w:r>
+      <w:r>
+        <w:rPr>
+          <w:iCs/>
+          <w:i/>
+        </w:rPr>
+        <w:t xml:space="preserve">Language, Culture and Curriculum, 38</w:t>
+      </w:r>
+      <w:r>
+        <w:t xml:space="preserve">(3), 380-400. https://doi.org/10.1080/07908318.2025.2486449</w:t>
+      </w:r>
+    </w:p>
+    <w:p>
+      <w:pPr>
+        <w:pStyle w:val="BodyText"/>
+      </w:pPr>
+      <w:r>
+        <w:t xml:space="preserve">White, C. (2006). Distance learning of foreign languages.</w:t>
+      </w:r>
+      <w:r>
+        <w:t xml:space="preserve"> </w:t>
+      </w:r>
+      <w:r>
+        <w:rPr>
+          <w:iCs/>
+          <w:i/>
+        </w:rPr>
+        <w:t xml:space="preserve">Language Teaching, 39</w:t>
+      </w:r>
+      <w:r>
+        <w:t xml:space="preserve">(4), 247-264. https://doi.org/10.1017/S0261444806003727</w:t>
+      </w:r>
+    </w:p>
+    <w:p>
+      <w:pPr>
+        <w:pStyle w:val="BodyText"/>
+      </w:pPr>
+      <w:r>
+        <w:t xml:space="preserve">Xu, B. (2024). Technology integration into Chinese as a foreign language learning in higher education: An integrated bibliometric analysis and systematic review (2000–2024).</w:t>
+      </w:r>
+      <w:r>
+        <w:t xml:space="preserve"> </w:t>
+      </w:r>
+      <w:r>
+        <w:rPr>
+          <w:iCs/>
+          <w:i/>
+        </w:rPr>
+        <w:t xml:space="preserve">Language Teaching Research</w:t>
+      </w:r>
+      <w:r>
+        <w:t xml:space="preserve">. Advance online publication. https://doi.org/10.1177/13621688241277911</w:t>
+      </w:r>
+    </w:p>
+    <w:p>
+      <w:pPr>
+        <w:pStyle w:val="BodyText"/>
+      </w:pPr>
+      <w:r>
         <w:t xml:space="preserve">Xu, Y., Jin, L., Deifell, E., &amp; Angus, K. (2022). Facilitating technology-based character learning in emergency remote teaching.</w:t>
       </w:r>
       <w:r>
@@ -1820,8 +3725,71 @@
         <w:t xml:space="preserve">(1), 72-97. https://doi.org/10.1111/flan.12541</w:t>
       </w:r>
     </w:p>
-    <w:bookmarkEnd w:id="26"/>
-    <w:bookmarkEnd w:id="27"/>
+    <w:p>
+      <w:pPr>
+        <w:pStyle w:val="BodyText"/>
+      </w:pPr>
+      <w:r>
+        <w:t xml:space="preserve">Zhang, M., &amp; Liu, Q. (2023). Synchronous and asynchronous online collaborative writing: A study on Chinese language learners.</w:t>
+      </w:r>
+      <w:r>
+        <w:t xml:space="preserve"> </w:t>
+      </w:r>
+      <w:r>
+        <w:rPr>
+          <w:iCs/>
+          <w:i/>
+        </w:rPr>
+        <w:t xml:space="preserve">Foreign Language Annals, 56</w:t>
+      </w:r>
+      <w:r>
+        <w:t xml:space="preserve">(3), 740-763. https://doi.org/10.1111/flan.12704</w:t>
+      </w:r>
+    </w:p>
+    <w:p>
+      <w:pPr>
+        <w:pStyle w:val="BodyText"/>
+      </w:pPr>
+      <w:r>
+        <w:t xml:space="preserve">Zhang, Q., &amp; Osborne, C. (2026). Readiness for digital transformation in Chinese as a foreign language education: A semi-systematic review.</w:t>
+      </w:r>
+      <w:r>
+        <w:t xml:space="preserve"> </w:t>
+      </w:r>
+      <w:r>
+        <w:rPr>
+          <w:iCs/>
+          <w:i/>
+        </w:rPr>
+        <w:t xml:space="preserve">Chinese as a Second Language Research, 15</w:t>
+      </w:r>
+      <w:r>
+        <w:t xml:space="preserve">(1), 11-43. https://doi.org/10.1515/caslar-2026-2002</w:t>
+      </w:r>
+    </w:p>
+    <w:p>
+      <w:pPr>
+        <w:pStyle w:val="BodyText"/>
+      </w:pPr>
+      <w:r>
+        <w:t xml:space="preserve">Zhang, W., Wang, Y., Yang, L., &amp; Wang, C. (2020). Suspending classes without stopping learning: China’s education emergency management policy in the COVID-19 outbreak.</w:t>
+      </w:r>
+      <w:r>
+        <w:t xml:space="preserve"> </w:t>
+      </w:r>
+      <w:r>
+        <w:rPr>
+          <w:iCs/>
+          <w:i/>
+        </w:rPr>
+        <w:t xml:space="preserve">Journal of Risk and Financial Management, 13</w:t>
+      </w:r>
+      <w:r>
+        <w:t xml:space="preserve">(3), 55. https://doi.org/10.3390/jrfm13030055</w:t>
+      </w:r>
+    </w:p>
+    <w:bookmarkEnd w:id="47"/>
+    <w:bookmarkEnd w:id="48"/>
     <w:sectPr>
       <w:pgSz w:h="15840" w:w="12240"/>
       <w:pgMar w:bottom="1440" w:footer="720" w:gutter="0" w:header="720" w:left="1440" w:right="1440" w:top="1440"/>

</xml_diff>

<commit_message>
Add Yu and Xu (2022) in English from the screenshot source
Cite the Journal of International Students learner-side South Asian online-learning study. Keep the manuscript in English only.

Co-authored-by: kristinehina23-rgb <kristinehina23-rgb@users.noreply.github.com>
</commit_message>
<xml_diff>
--- a/papers/q1-masters-covid/word/manuscript.docx
+++ b/papers/q1-masters-covid/word/manuscript.docx
@@ -105,7 +105,7 @@
         <w:pStyle w:val="BodyText"/>
       </w:pPr>
       <w:r>
-        <w:t xml:space="preserve">Those difficulties are often named. They are less often measured from the learner’s side. Emergency papers used them as a backdrop for teacher workload, sending-side adaptation, or a video copy of the campus hour (MacIntyre et al., 2020; Moser et al., 2021; Xu et al., 2022). Later papers asked what should remain of that emergency practice (Moorhouse, 2023; Stockwell &amp; Wang, 2023). Reviews still list technical trouble and still say little about household access (Li &amp; Li, 2024; Xu, 2024; Zhang &amp; Osborne, 2026). Planned online courses and studies of learner emotion show what designed online Chinese teaching can look like (Guenier et al., 2026; Qi, 2025; Wen &amp; Liu, 2025). They do not show whether an online class could still be taken where learners sat. Work on international Chinese teaching has said more about what a course says than about whether learners can enter it (Gong et al., 2020b).</w:t>
+        <w:t xml:space="preserve">Those difficulties are often named. They are less often measured from the learner’s side. Emergency papers used them as a backdrop for teacher workload, sending-side adaptation, or a video copy of the campus hour (MacIntyre et al., 2020; Moser et al., 2021; Xu et al., 2022). Yu and Xu (2022) surveyed South Asian students in China on online learning during the pandemic and reported generally positive learning status. Their questionnaire asked about autonomy, online learning state, and how students judged the effect. It did not count household power, network speed, or whether named applications were marked unusable. Later papers asked what should remain of that emergency practice (Moorhouse, 2023; Stockwell &amp; Wang, 2023). Reviews still list technical trouble and still say little about household access (Li &amp; Li, 2024; Xu, 2024; Zhang &amp; Osborne, 2026). Planned online courses and studies of learner emotion show what designed online Chinese teaching can look like (Guenier et al., 2026; Qi, 2025; Wen &amp; Liu, 2025). They do not show whether an online class could still be taken where learners sat. Work on international Chinese teaching has said more about what a course says than about whether learners can enter it (Gong et al., 2020b).</w:t>
       </w:r>
     </w:p>
     <w:p>
@@ -236,7 +236,7 @@
         <w:t xml:space="preserve"> </w:t>
       </w:r>
       <w:r>
-        <w:t xml:space="preserve">(Zhang et al., 2020). Xu et al. (2022) show how character teaching was adapted on the sending side. Jin et al. (2023) report faculty perceptions of pandemic online teaching. Zhang and Liu (2023) examine online collaborative writing among Chinese-language learners in designed conditions. Later reviews still say more about tools than about household access, and they still flag digital equity as under-examined (Li &amp; Li, 2024; Xu, 2024; Zhang &amp; Osborne, 2026). Designed online Chinese-culture courses show a planned alternative to emergency copying (Guenier et al., 2026). Qi (2025) shows that an online Chinese class can itself become an anxiety-provoking setting. Those studies do not describe the present respondents. Much of that writing still assumes a relatively stable connection. The present questionnaire cannot test whether that assumption holds for current hybrid teaching. It can show what 38 respondents reported.</w:t>
+        <w:t xml:space="preserve">(Zhang et al., 2020). Xu et al. (2022) show how character teaching was adapted on the sending side. Yu and Xu (2022) give a learner-side questionnaire from 153 South Asian students taking Chinese courses online. In that sample, overall online learning status was reported as positive, and autonomous learning was linked to how students evaluated the effect. Jin et al. (2023) report faculty perceptions of pandemic online teaching. Zhang and Liu (2023) examine online collaborative writing among Chinese-language learners in designed conditions. Later reviews still say more about tools than about household access, and they still flag digital equity as under-examined (Li &amp; Li, 2024; Xu, 2024; Zhang &amp; Osborne, 2026). Designed online Chinese-culture courses show a planned alternative to emergency copying (Guenier et al., 2026). Qi (2025) shows that an online Chinese class can itself become an anxiety-provoking setting. Those studies do not describe the present respondents. Much of that writing still assumes a relatively stable connection. The present questionnaire cannot test whether that assumption holds for current hybrid teaching. It can show what 38 respondents reported.</w:t>
       </w:r>
     </w:p>
     <w:bookmarkEnd w:id="23"/>
@@ -2433,7 +2433,7 @@
         <w:pStyle w:val="BodyText"/>
       </w:pPr>
       <w:r>
-        <w:t xml:space="preserve">Xu et al. (2022) show how character teaching was adapted on the sending side. Zhang and Liu (2023) show designed online Chinese work. The present data add the home and platform conditions the 38 respondents marked. A better textbook would not, by itself, have answered a live session on an unstable connection, or a required application that they marked unusable.</w:t>
+        <w:t xml:space="preserve">Xu et al. (2022) show how character teaching was adapted on the sending side. Yu and Xu (2022) show learner-side ratings of online learning status among South Asian students in China, with overall positive reports in that larger sample. Zhang and Liu (2023) show designed online Chinese work. The present data add the home and platform conditions the 38 respondents marked in February 2022. A better textbook would not, by itself, have answered a live session on an unstable connection, or a required application that they marked unusable. The Yu and Xu questionnaire and this form are not the same sample and are not read here as a single test.</w:t>
       </w:r>
     </w:p>
     <w:p>
@@ -3730,6 +3730,27 @@
         <w:pStyle w:val="BodyText"/>
       </w:pPr>
       <w:r>
+        <w:t xml:space="preserve">Yu, L., &amp; Xu, L. (2022). Research on the online learning experience of South Asian students during COVID-19: The mediating effect of online learning status on autonomous learning and learning effect evaluation.</w:t>
+      </w:r>
+      <w:r>
+        <w:t xml:space="preserve"> </w:t>
+      </w:r>
+      <w:r>
+        <w:rPr>
+          <w:iCs/>
+          <w:i/>
+        </w:rPr>
+        <w:t xml:space="preserve">Journal of International Students, 12</w:t>
+      </w:r>
+      <w:r>
+        <w:t xml:space="preserve">(S1), 45-60. https://doi.org/10.32674/jis.v12iS1.4607</w:t>
+      </w:r>
+    </w:p>
+    <w:p>
+      <w:pPr>
+        <w:pStyle w:val="BodyText"/>
+      </w:pPr>
+      <w:r>
         <w:t xml:space="preserve">Zhang, M., &amp; Liu, Q. (2023). Synchronous and asynchronous online collaborative writing: A study on Chinese language learners.</w:t>
       </w:r>
       <w:r>

</xml_diff>

<commit_message>
Restructure the article into introduction, methods, themes, discussion, and references
Keep the N=38 tables and tests. Group results as home, platforms, and stress rather than a separate literature or results chapter.

Co-authored-by: kristinehina23-rgb <kristinehina23-rgb@users.noreply.github.com>
</commit_message>
<xml_diff>
--- a/papers/q1-masters-covid/word/manuscript.docx
+++ b/papers/q1-masters-covid/word/manuscript.docx
@@ -2,7 +2,7 @@
 <file path=word/document.xml><?xml version="1.0" encoding="utf-8"?>
 <w:document xmlns:w="http://schemas.openxmlformats.org/wordprocessingml/2006/main" xmlns:m="http://schemas.openxmlformats.org/officeDocument/2006/math" xmlns:r="http://schemas.openxmlformats.org/officeDocument/2006/relationships" xmlns:o="urn:schemas-microsoft-com:office:office" xmlns:v="urn:schemas-microsoft-com:vml" xmlns:w10="urn:schemas-microsoft-com:office:word" xmlns:a="http://schemas.openxmlformats.org/drawingml/2006/main" xmlns:pic="http://schemas.openxmlformats.org/drawingml/2006/picture" xmlns:wp="http://schemas.openxmlformats.org/drawingml/2006/wordprocessingDrawing">
   <w:body>
-    <w:bookmarkStart w:id="48" w:name="X93c39fec4510a5d3ad14aecff5d2131a9fc6cdc"/>
+    <w:bookmarkStart w:id="29" w:name="X93c39fec4510a5d3ad14aecff5d2131a9fc6cdc"/>
     <w:p>
       <w:pPr>
         <w:pStyle w:val="Heading1"/>
@@ -65,13 +65,13 @@
       </w:r>
     </w:p>
     <w:bookmarkEnd w:id="20"/>
-    <w:bookmarkStart w:id="21" w:name="the-challenge"/>
+    <w:bookmarkStart w:id="21" w:name="introduction"/>
     <w:p>
       <w:pPr>
         <w:pStyle w:val="Heading2"/>
       </w:pPr>
       <w:r>
-        <w:t xml:space="preserve">The Challenge</w:t>
+        <w:t xml:space="preserve">1. Introduction</w:t>
       </w:r>
     </w:p>
     <w:p>
@@ -79,25 +79,15 @@
         <w:pStyle w:val="FirstParagraph"/>
       </w:pPr>
       <w:r>
-        <w:t xml:space="preserve">If the hour, the application, the oral task, and the test all assume a quiet home and a stable connection, what should a program do when those conditions are not there?</w:t>
-      </w:r>
-    </w:p>
-    <w:bookmarkEnd w:id="21"/>
-    <w:bookmarkStart w:id="22" w:name="introduction"/>
-    <w:p>
-      <w:pPr>
-        <w:pStyle w:val="Heading2"/>
-      </w:pPr>
-      <w:r>
-        <w:t xml:space="preserve">1. Introduction</w:t>
+        <w:t xml:space="preserve">When Chinese teaching moved online, many programs kept the sending class’s timetable and classroom tasks. Task guides still assume that students can join a live session (Gacs et al., 2020; González-Lloret, 2020; Hodges et al., 2020; Payne, 2020). That assumption often fails. Studies of online language teaching, including online Chinese, have already noted unstable networks, platforms that are hard to open, thinner talk, and strain (Li &amp; Li, 2024; Moser et al., 2021; Qi, 2025; Russell, 2020; Tao &amp; Gao, 2022). A device in the house is not enough if there is no power, little speed, or no usable application (Ali, 2020; Beaunoyer et al., 2020; Guo &amp; Wan, 2022; Warschauer, 2003). Distance language learning had already asked whether a remote class was even feasible (White, 2006). When those conditions do not hold, the content may still be sound, but the class is closed.</w:t>
       </w:r>
     </w:p>
     <w:p>
       <w:pPr>
-        <w:pStyle w:val="FirstParagraph"/>
-      </w:pPr>
-      <w:r>
-        <w:t xml:space="preserve">When Chinese teaching moved online, many programs kept the sending class’s timetable and classroom tasks. Task guides still assume that students can join a live session (Gacs et al., 2020; González-Lloret, 2020; Hodges et al., 2020; Payne, 2020; Stockwell &amp; Wang, 2023). That assumption often fails. Studies of online language teaching, including online Chinese, have already noted unstable networks, platforms that are hard to open, thinner talk, and strain (Li &amp; Li, 2024; Moser et al., 2021; Qi, 2025; Russell, 2020; Tao &amp; Gao, 2022). A device in the house is not enough if there is no power, little speed, or no usable application (Ali, 2020; Beaunoyer et al., 2020; Guo &amp; Wan, 2022; Vishnu et al., 2024; Warschauer, 2003). Distance language learning had already asked whether a remote class was even feasible (White, 2006). When those conditions do not hold, the content may still be sound, but the class is closed.</w:t>
+        <w:pStyle w:val="BodyText"/>
+      </w:pPr>
+      <w:r>
+        <w:t xml:space="preserve">Those difficulties are often named. They are less often counted from the learner’s side. Emergency papers used them as a backdrop for teacher workload or sending-side adaptation (MacIntyre et al., 2020; Xu et al., 2022). Yu and Xu (2022) surveyed 153 South Asian students in China on online learning during the pandemic. They reported generally positive learning status, and they linked autonomous learning to how students judged the effect. Their form did not count household power, network speed, or whether named applications were marked unusable. Xu et al. (2022) show how character teaching was adapted on the sending side. Jin et al. (2023) report faculty views of pandemic online teaching. Later reviews still say more about tools than about household access (Li &amp; Li, 2024; Xu, 2024). Owning a device is not the same as being able to take part (Helsper, 2021; van Dijk, 2020). The home, the power supply, and the application are part of the setting in which language work was asked to happen (Guerrettaz et al., 2021; van Lier, 2004).</w:t>
       </w:r>
     </w:p>
     <w:p>
@@ -105,7 +95,7 @@
         <w:pStyle w:val="BodyText"/>
       </w:pPr>
       <w:r>
-        <w:t xml:space="preserve">Those difficulties are often named. They are less often measured from the learner’s side. Emergency papers used them as a backdrop for teacher workload, sending-side adaptation, or a video copy of the campus hour (MacIntyre et al., 2020; Moser et al., 2021; Xu et al., 2022). Yu and Xu (2022) surveyed South Asian students in China on online learning during the pandemic and reported generally positive learning status. Their questionnaire asked about autonomy, online learning state, and how students judged the effect. It did not count household power, network speed, or whether named applications were marked unusable. Later papers asked what should remain of that emergency practice (Moorhouse, 2023; Stockwell &amp; Wang, 2023). Reviews still list technical trouble and still say little about household access (Li &amp; Li, 2024; Xu, 2024; Zhang &amp; Osborne, 2026). Planned online courses and studies of learner emotion show what designed online Chinese teaching can look like (Guenier et al., 2026; Qi, 2025; Wen &amp; Liu, 2025). They do not show whether an online class could still be taken where learners sat. Work on international Chinese teaching has said more about what a course says than about whether learners can enter it (Gong et al., 2020b).</w:t>
+        <w:t xml:space="preserve">This study reports questionnaire data from the learner side. Thirty-eight respondents who said they were taking online Chinese courses completed a form written in Chinese in February 2022. The form asked about home conditions, connectivity, and platform access, and about stress and their view of online learning. Thirty-seven selected Pakistani nationality. Residence, university, and program were not asked, so those boxes are not inferred.</w:t>
       </w:r>
     </w:p>
     <w:p>
@@ -113,7 +103,7 @@
         <w:pStyle w:val="BodyText"/>
       </w:pPr>
       <w:r>
-        <w:t xml:space="preserve">This study reports questionnaire data from the learner side. Thirty-eight respondents who said they were taking online Chinese courses completed a form written in Chinese in February 2022. The form asked about home conditions, connectivity, and platform access, and about stress and their view of online learning. Thirty-seven selected Pakistani nationality. Residence, university, and program were not asked, so those boxes are not inferred. The study asks:</w:t>
+        <w:t xml:space="preserve">The study asks:</w:t>
       </w:r>
     </w:p>
     <w:p>
@@ -175,42 +165,33 @@
         <w:pStyle w:val="BodyText"/>
       </w:pPr>
       <w:r>
-        <w:t xml:space="preserve">The form also asked whether online study could replace campus classes. That item is reported as a count.</w:t>
+        <w:t xml:space="preserve">The answers are presented as three themes that follow the items on the form: home and connection, named platforms, and stress with appraisal.</w:t>
+      </w:r>
+    </w:p>
+    <w:bookmarkEnd w:id="21"/>
+    <w:bookmarkStart w:id="22" w:name="methods"/>
+    <w:p>
+      <w:pPr>
+        <w:pStyle w:val="Heading2"/>
+      </w:pPr>
+      <w:r>
+        <w:t xml:space="preserve">2. Methods</w:t>
       </w:r>
     </w:p>
     <w:p>
       <w:pPr>
-        <w:pStyle w:val="BodyText"/>
-      </w:pPr>
-      <w:r>
-        <w:t xml:space="preserve">The frequencies describe the sample. The two associations in RQ2 are exploratory tests on these data.</w:t>
-      </w:r>
-    </w:p>
-    <w:bookmarkEnd w:id="22"/>
-    <w:bookmarkStart w:id="25" w:name="literature-review"/>
-    <w:p>
-      <w:pPr>
-        <w:pStyle w:val="Heading2"/>
-      </w:pPr>
-      <w:r>
-        <w:t xml:space="preserve">2. Literature review</w:t>
-      </w:r>
-    </w:p>
-    <w:bookmarkStart w:id="23" w:name="later-lenses-on-online-chinese-teaching"/>
-    <w:p>
-      <w:pPr>
-        <w:pStyle w:val="Heading3"/>
-      </w:pPr>
-      <w:r>
-        <w:t xml:space="preserve">2.1 Later lenses on online Chinese teaching</w:t>
+        <w:pStyle w:val="FirstParagraph"/>
+      </w:pPr>
+      <w:r>
+        <w:t xml:space="preserve">The study is an exploratory, cross-sectional questionnaire. Complete cases were submitted on Wenjuan between 5 and 8 February 2022 (N = 38). The export title is Influencing factors in international students’ online Chinese learning during COVID-19. The items are those on that form. There was no recorded pilot. The link circulation was not stored. Completing a questionnaire written in Chinese is not treated as proof of enrollment in a named university.</w:t>
       </w:r>
     </w:p>
     <w:p>
       <w:pPr>
-        <w:pStyle w:val="FirstParagraph"/>
-      </w:pPr>
-      <w:r>
-        <w:t xml:space="preserve">Hodges et al. (2020) distinguished emergency remote teaching from planned online provision. Gacs, Goertler, and Spasova (2020) brought that distinction into language education. Language-teacher surveys from the same period describe heavier workloads and uneven preparedness (Moser et al., 2021). Tao and Gao (2022) read the wider literature as a story of technical disruption and thinner engagement. In this journal, Russell (2020) treats language anxiety as a condition of the online learner, and Lomicka (2020) treats interaction as a problem of virtual community rather than of a copied campus hour. That work locates the moment in which the present questionnaire was completed. It is not a substitute for the stress reports in this sample.</w:t>
+        <w:pStyle w:val="BodyText"/>
+      </w:pPr>
+      <w:r>
+        <w:t xml:space="preserve">Of the 38 respondents, 27 were men and 11 were women. Thirty-seven selected Pakistani nationality. Self-rated Chinese was advanced for 22, intermediate for 15, and beginner for one. Years of learning Chinese clustered at three to four years (26 of 38). Twenty-seven said required courses were online, and 23 said electives were. Thirty said all of their Chinese classes were online. Twenty-two said they were working while studying. Submission operating system was iPhone (24) or Android (14). That is the device used to send the form. An IP-province field was stored; nine labels were mainland China province names. IP is not used as a location variable.</w:t>
       </w:r>
     </w:p>
     <w:p>
@@ -218,173 +199,7 @@
         <w:pStyle w:val="BodyText"/>
       </w:pPr>
       <w:r>
-        <w:t xml:space="preserve">After the return to campus, studies asked what should remain of emergency online practice (Moorhouse, 2023) and cautioned against treating a videoconference copy of the classroom as the lesson of the crisis (Stockwell &amp; Wang, 2023). For Chinese, contemporaneous policy writing recorded</w:t>
-      </w:r>
-      <w:r>
-        <w:t xml:space="preserve"> </w:t>
-      </w:r>
-      <w:r>
-        <w:t xml:space="preserve">“</w:t>
-      </w:r>
-      <w:r>
-        <w:t xml:space="preserve">suspending classes without stopping learning</w:t>
-      </w:r>
-      <w:r>
-        <w:t xml:space="preserve">”</w:t>
-      </w:r>
-      <w:r>
-        <w:t xml:space="preserve"> </w:t>
-      </w:r>
-      <w:r>
-        <w:t xml:space="preserve">(Zhang et al., 2020). Xu et al. (2022) show how character teaching was adapted on the sending side. Yu and Xu (2022) give a learner-side questionnaire from 153 South Asian students taking Chinese courses online. In that sample, overall online learning status was reported as positive, and autonomous learning was linked to how students evaluated the effect. Jin et al. (2023) report faculty perceptions of pandemic online teaching. Zhang and Liu (2023) examine online collaborative writing among Chinese-language learners in designed conditions. Later reviews still say more about tools than about household access, and they still flag digital equity as under-examined (Li &amp; Li, 2024; Xu, 2024; Zhang &amp; Osborne, 2026). Designed online Chinese-culture courses show a planned alternative to emergency copying (Guenier et al., 2026). Qi (2025) shows that an online Chinese class can itself become an anxiety-provoking setting. Those studies do not describe the present respondents. Much of that writing still assumes a relatively stable connection. The present questionnaire cannot test whether that assumption holds for current hybrid teaching. It can show what 38 respondents reported.</w:t>
-      </w:r>
-    </w:p>
-    <w:bookmarkEnd w:id="23"/>
-    <w:bookmarkStart w:id="24" w:name="X8fd0326383b50249221392c76a6b8ab8b037526"/>
-    <w:p>
-      <w:pPr>
-        <w:pStyle w:val="Heading3"/>
-      </w:pPr>
-      <w:r>
-        <w:t xml:space="preserve">2.2 Digital inequality and the home learning ecology</w:t>
-      </w:r>
-    </w:p>
-    <w:p>
-      <w:pPr>
-        <w:pStyle w:val="FirstParagraph"/>
-      </w:pPr>
-      <w:r>
-        <w:t xml:space="preserve">Later models of the digital divide distinguish material access from skills, usage, and outcomes (Helsper, 2021; van Dijk, 2020; Warschauer, 2003). Owning a device is not the same as being able to take part (Ali, 2020; Beaunoyer et al., 2020; Guo &amp; Wan, 2022; Vishnu et al., 2024). An ecological view of language education takes the setting of the class, not only the student and the application, as the unit of analysis (Guerrettaz et al., 2021; van Lier, 2004). Domestic space, paid or care work, power interruptions, and applications marked unusable are read here as part of the immediate setting in which the 38 respondents said they were studying.</w:t>
-      </w:r>
-    </w:p>
-    <w:bookmarkEnd w:id="24"/>
-    <w:bookmarkEnd w:id="25"/>
-    <w:bookmarkStart w:id="31" w:name="methods"/>
-    <w:p>
-      <w:pPr>
-        <w:pStyle w:val="Heading2"/>
-      </w:pPr>
-      <w:r>
-        <w:t xml:space="preserve">3. Methods</w:t>
-      </w:r>
-    </w:p>
-    <w:p>
-      <w:pPr>
-        <w:pStyle w:val="FirstParagraph"/>
-      </w:pPr>
-      <w:r>
-        <w:t xml:space="preserve">The study is an exploratory, cross-sectional questionnaire. It does not test a pre-registered confirmatory model. What follows describes the instrument, the self-selected group who completed it, and the limits of what the questionnaire can support.</w:t>
-      </w:r>
-    </w:p>
-    <w:bookmarkStart w:id="26" w:name="design-and-context"/>
-    <w:p>
-      <w:pPr>
-        <w:pStyle w:val="Heading3"/>
-      </w:pPr>
-      <w:r>
-        <w:t xml:space="preserve">3.1 Design and context</w:t>
-      </w:r>
-    </w:p>
-    <w:p>
-      <w:pPr>
-        <w:pStyle w:val="FirstParagraph"/>
-      </w:pPr>
-      <w:r>
-        <w:t xml:space="preserve">The instrument title on the Wenjuan export is Influencing factors in international students’ online Chinese learning during COVID-19. The items are those on that retained form. No separate validation study or recorded pilot of the instrument is available. This article is a secondary analysis of the completed responses. Complete cases were submitted between 5 and 8 February 2022 (N = 38), during emergency remote teaching. That collection window is a methodological fact; the article does not treat the sample as a picture of current hybrid practice. The form did not record how the link was circulated, so the recruitment channel cannot be named. Respondents were adults who completed a questionnaire written in Chinese about online Chinese learning. Completing that questionnaire is not treated as proof of enrollment in a Chinese university. The instrument did not ask host university, city of residence that week, degree versus non-degree status, or scholarship type. Two items asked whether required courses and electives were being taken online: 27 respondents (71.1%) reported required courses online, and 23 (60.5%) reported electives online. Those answers do not identify a named program. The study therefore concerns a self-selected group of respondents reporting participation in online Chinese-language courses, not a verified enrollment record.</w:t>
-      </w:r>
-    </w:p>
-    <w:bookmarkEnd w:id="26"/>
-    <w:bookmarkStart w:id="27" w:name="participants"/>
-    <w:p>
-      <w:pPr>
-        <w:pStyle w:val="Heading3"/>
-      </w:pPr>
-      <w:r>
-        <w:t xml:space="preserve">3.2 Participants</w:t>
-      </w:r>
-    </w:p>
-    <w:p>
-      <w:pPr>
-        <w:pStyle w:val="FirstParagraph"/>
-      </w:pPr>
-      <w:r>
-        <w:t xml:space="preserve">Of the 38 respondents, 27 were men (71.1%) and 11 were women (28.9%). Thirty-seven selected Pakistani nationality and one selected another nationality. That nationality item is the only Pakistan connection in the dataset. The group is not described as verified Chinese-university enrollment, as Pakistan-resident learners, as CSC students, or as a national sample. Self-rated Chinese level was mostly advanced (22, 57.9%) or intermediate (15, 39.5%), with one beginner; the label is the student’s own, not an HSK band. Years of learning Chinese clustered at three to four years (26, 68.4%). Wenjuan submission metadata classified the operating system as iPhone (24, 63.2%) or Android (14). That variable is the device used to submit the form, not an item about all devices used for class.</w:t>
-      </w:r>
-    </w:p>
-    <w:p>
-      <w:pPr>
-        <w:pStyle w:val="BodyText"/>
-      </w:pPr>
-      <w:r>
-        <w:t xml:space="preserve">Wenjuan automatically recorded an IP-province field. A dummy was coded when that field was a mainland China province name (9 of 38). IP labels are technical metadata. They can be affected by virtual private networks and proxies, and they are not a reliable measure of physical location. They are not used as a participant-location variable and are not the basis of a sensitivity analysis. The dummy, submission dates, and device identifiers are not included in the public dataset.</w:t>
-      </w:r>
-    </w:p>
-    <w:bookmarkEnd w:id="27"/>
-    <w:bookmarkStart w:id="28" w:name="instrument-and-coding"/>
-    <w:p>
-      <w:pPr>
-        <w:pStyle w:val="Heading3"/>
-      </w:pPr>
-      <w:r>
-        <w:t xml:space="preserve">3.3 Instrument and coding</w:t>
-      </w:r>
-    </w:p>
-    <w:p>
-      <w:pPr>
-        <w:pStyle w:val="FirstParagraph"/>
-      </w:pPr>
-      <w:r>
-        <w:t xml:space="preserve">The questionnaire comprised about 30 items: demographics, single-choice ordinals, and multiple-response lists. The items were written in Chinese. Some wording was non-native. Reporting uses English glosses. Self-rated Chinese level was intermediate or advanced for 37 of 38 respondents. The instrument did not include a comprehension check, so completion of a questionnaire written in Chinese is treated only as evidence that respondents were willing to answer in Chinese. Item wording for the appraisal index is given in Appendix A.</w:t>
-      </w:r>
-    </w:p>
-    <w:p>
-      <w:pPr>
-        <w:pStyle w:val="BodyText"/>
-      </w:pPr>
-      <w:r>
-        <w:t xml:space="preserve">A three-item</w:t>
-      </w:r>
-      <w:r>
-        <w:t xml:space="preserve"> </w:t>
-      </w:r>
-      <w:r>
-        <w:rPr>
-          <w:iCs/>
-          <w:i/>
-        </w:rPr>
-        <w:t xml:space="preserve">perceived online-learning appraisal index</w:t>
-      </w:r>
-      <w:r>
-        <w:t xml:space="preserve"> </w:t>
-      </w:r>
-      <w:r>
-        <w:t xml:space="preserve">was formed from learned much (Q8), improves Chinese (Q9), and sparks interest (Q10). The items ask related but not identical questions and are treated as a descriptive index, not as a validated unidimensional scale. Internal consistency was acceptable in this sample (Cronbach’s α = .84); Spearman inter-item correlations ranged from .55 to .75 (Appendix B). Exploratory factor analysis was not used (N = 38). Individual items are also reported. One double-tick on</w:t>
-      </w:r>
-      <w:r>
-        <w:t xml:space="preserve"> </w:t>
-      </w:r>
-      <w:r>
-        <w:t xml:space="preserve">“</w:t>
-      </w:r>
-      <w:r>
-        <w:t xml:space="preserve">like online classes</w:t>
-      </w:r>
-      <w:r>
-        <w:t xml:space="preserve">”</w:t>
-      </w:r>
-      <w:r>
-        <w:t xml:space="preserve"> </w:t>
-      </w:r>
-      <w:r>
-        <w:t xml:space="preserve">was excluded for that item only (n = 37 valid).</w:t>
-      </w:r>
-    </w:p>
-    <w:p>
-      <w:pPr>
-        <w:pStyle w:val="BodyText"/>
-      </w:pPr>
-      <w:r>
-        <w:t xml:space="preserve">Coding follows the Wenjuan export. Higher values on speed, learned, improve, interest, and teacher interaction indicate a more negative report (worse speed; less learning, improvement, or interest; thinner interaction). Stress (Q24) is a four-category questionnaire item coded 1 = very high to 4 = none.</w:t>
+        <w:t xml:space="preserve">The questionnaire had about 30 items. Reporting uses English glosses. A three-item appraisal mean was formed from learned much (Q8), improves Chinese (Q9), and sparks interest (Q10). Cronbach’s α was .84 in this sample. The mean is descriptive, not a validated scale. Higher values on speed and on the three appraisal items indicate a worse report.</w:t>
       </w:r>
       <w:r>
         <w:t xml:space="preserve"> </w:t>
@@ -400,33 +215,7 @@
         <w:t xml:space="preserve"> </w:t>
       </w:r>
       <w:r>
-        <w:t xml:space="preserve">is that first category on the form (glossed as very high), not an analyst-created threshold or a cut on a multi-item scale. The focal stress analysis uses a dummy for this category and does not reverse the ordinal. Coding directions are in Appendix A.</w:t>
-      </w:r>
-    </w:p>
-    <w:p>
-      <w:pPr>
-        <w:pStyle w:val="BodyText"/>
-      </w:pPr>
-      <w:r>
-        <w:t xml:space="preserve">The export labeled one multiple-response problem as</w:t>
-      </w:r>
-      <w:r>
-        <w:t xml:space="preserve"> </w:t>
-      </w:r>
-      <w:r>
-        <w:t xml:space="preserve">“</w:t>
-      </w:r>
-      <w:r>
-        <w:t xml:space="preserve">no electricity.</w:t>
-      </w:r>
-      <w:r>
-        <w:t xml:space="preserve">”</w:t>
-      </w:r>
-      <w:r>
-        <w:t xml:space="preserve"> </w:t>
-      </w:r>
-      <w:r>
-        <w:t xml:space="preserve">In the results the item is reported as</w:t>
+        <w:t xml:space="preserve">is the first category on a four-category item.</w:t>
       </w:r>
       <w:r>
         <w:t xml:space="preserve"> </w:t>
@@ -436,47 +225,39 @@
           <w:iCs/>
           <w:i/>
         </w:rPr>
-        <w:t xml:space="preserve">power interruptions</w:t>
+        <w:t xml:space="preserve">Power interruptions</w:t>
       </w:r>
       <w:r>
         <w:t xml:space="preserve"> </w:t>
       </w:r>
       <w:r>
-        <w:t xml:space="preserve">(export label: no electricity). Chinese MOOC is reported as printed on the form; the option did not name a single provider.</w:t>
-      </w:r>
-    </w:p>
-    <w:bookmarkEnd w:id="28"/>
-    <w:bookmarkStart w:id="29" w:name="analysis"/>
-    <w:p>
-      <w:pPr>
-        <w:pStyle w:val="Heading3"/>
-      </w:pPr>
-      <w:r>
-        <w:t xml:space="preserve">3.4 Analysis</w:t>
+        <w:t xml:space="preserve">is the export option</w:t>
+      </w:r>
+      <w:r>
+        <w:t xml:space="preserve"> </w:t>
+      </w:r>
+      <w:r>
+        <w:t xml:space="preserve">“</w:t>
+      </w:r>
+      <w:r>
+        <w:t xml:space="preserve">no electricity.</w:t>
+      </w:r>
+      <w:r>
+        <w:t xml:space="preserve">”</w:t>
+      </w:r>
+      <w:r>
+        <w:t xml:space="preserve"> </w:t>
+      </w:r>
+      <w:r>
+        <w:t xml:space="preserve">Chinese MOOC is reported as printed on the form.</w:t>
       </w:r>
     </w:p>
     <w:p>
       <w:pPr>
-        <w:pStyle w:val="FirstParagraph"/>
-      </w:pPr>
-      <w:r>
-        <w:t xml:space="preserve">Household and platform reports are given as frequencies (Tables 1 to 3). Two associations are treated as focal: home affects study very much with very high stress (two-sided Fisher’s exact test), and internet speed with the appraisal index (Spearman’s ρ, with a percentile bootstrap 95% confidence interval from 5,000 resamples). Replacement judgments are reported as frequencies. Odds ratios and Wald confidence intervals are not reported: at N = 38 they are unstable. Other associations, including gender, are secondary and are placed in Appendix B. Frequencies are n/38 unless noted. Multiple-response items are the percentage who selected the option.</w:t>
-      </w:r>
-      <w:r>
-        <w:t xml:space="preserve"> </w:t>
-      </w:r>
-      <w:r>
-        <w:rPr>
-          <w:iCs/>
-          <w:i/>
-        </w:rPr>
-        <w:t xml:space="preserve">p</w:t>
-      </w:r>
-      <w:r>
-        <w:t xml:space="preserve"> </w:t>
-      </w:r>
-      <w:r>
-        <w:t xml:space="preserve">values are not adjusted for multiplicity and are not interpreted as confirmatory.</w:t>
+        <w:pStyle w:val="BodyText"/>
+      </w:pPr>
+      <w:r>
+        <w:t xml:space="preserve">Household and platform answers are frequencies. Two associations are reported: home affects study very much with very high stress (two-sided Fisher’s exact test), and internet speed with the appraisal mean (Spearman’s ρ, percentile bootstrap 95% CI, 5,000 resamples). The replacement item is a count. Odds ratios are not reported. Frequencies are n/38 unless noted.</w:t>
       </w:r>
     </w:p>
     <w:p>
@@ -484,17 +265,17 @@
         <w:pStyle w:val="BodyText"/>
       </w:pPr>
       <w:r>
-        <w:t xml:space="preserve">A Pakistani-nationality check (n = 37) is reported only to show that dropping the one non-Pakistani case does not reverse the two focal associations. It is not a location analysis.</w:t>
+        <w:t xml:space="preserve">The form said answers would be used for research. Completion was treated as consent. No ethics-committee number is available for the 2022 collection. Names, IP addresses, exact timestamps, and device identifiers were removed before the public dataset was prepared.</w:t>
       </w:r>
     </w:p>
-    <w:bookmarkEnd w:id="29"/>
-    <w:bookmarkStart w:id="30" w:name="ethics-and-data-protection"/>
+    <w:bookmarkEnd w:id="22"/>
+    <w:bookmarkStart w:id="26" w:name="themes"/>
     <w:p>
       <w:pPr>
-        <w:pStyle w:val="Heading3"/>
-      </w:pPr>
-      <w:r>
-        <w:t xml:space="preserve">3.5 Ethics and data protection</w:t>
+        <w:pStyle w:val="Heading2"/>
+      </w:pPr>
+      <w:r>
+        <w:t xml:space="preserve">3. Themes</w:t>
       </w:r>
     </w:p>
     <w:p>
@@ -502,43 +283,24 @@
         <w:pStyle w:val="FirstParagraph"/>
       </w:pPr>
       <w:r>
-        <w:t xml:space="preserve">Adult respondents completed an online form presented as research on online Chinese learning. The form stated that answers would be used for research, and completion and submission were treated as consent.</w:t>
+        <w:t xml:space="preserve">The three themes below group the questionnaire items. They are not interview codes.</w:t>
+      </w:r>
+    </w:p>
+    <w:bookmarkStart w:id="23" w:name="theme-1.-home-and-connection"/>
+    <w:p>
+      <w:pPr>
+        <w:pStyle w:val="Heading3"/>
+      </w:pPr>
+      <w:r>
+        <w:t xml:space="preserve">Theme 1. Home and connection</w:t>
       </w:r>
     </w:p>
     <w:p>
       <w:pPr>
-        <w:pStyle w:val="BodyText"/>
-      </w:pPr>
-      <w:r>
-        <w:t xml:space="preserve">No institutional ethics approval number is available for the original 2022 data collection. The first author was then a master’s student, and numbered approval was not obtained. This article reports an anonymized secondary analysis of those completed responses. No new data were collected. Names, IP addresses, exact timestamps, and device identifiers were removed before the public dataset was prepared.</w:t>
-      </w:r>
-    </w:p>
-    <w:bookmarkEnd w:id="30"/>
-    <w:bookmarkEnd w:id="31"/>
-    <w:bookmarkStart w:id="36" w:name="results"/>
-    <w:p>
-      <w:pPr>
-        <w:pStyle w:val="Heading2"/>
-      </w:pPr>
-      <w:r>
-        <w:t xml:space="preserve">4. Results</w:t>
-      </w:r>
-    </w:p>
-    <w:bookmarkStart w:id="32" w:name="respondents-and-household-conditions"/>
-    <w:p>
-      <w:pPr>
-        <w:pStyle w:val="Heading3"/>
-      </w:pPr>
-      <w:r>
-        <w:t xml:space="preserve">4.1 Respondents and household conditions</w:t>
-      </w:r>
-    </w:p>
-    <w:p>
-      <w:pPr>
         <w:pStyle w:val="FirstParagraph"/>
       </w:pPr>
       <w:r>
-        <w:t xml:space="preserve">Table 1 locates the sample. Most respondents said all of their Chinese classes were online, and more than half reported working alongside study.</w:t>
+        <w:t xml:space="preserve">Most respondents said all of their Chinese classes were online, and more than half said they were working alongside study (Table 1).</w:t>
       </w:r>
     </w:p>
     <w:p>
@@ -1014,7 +776,7 @@
         <w:t xml:space="preserve"> </w:t>
       </w:r>
       <w:r>
-        <w:t xml:space="preserve">Convenience sample, Wenjuan, 5 to 8 February 2022. Device is the operating system recorded at submission, reported only as an aggregate.</w:t>
+        <w:t xml:space="preserve">Wenjuan, 5 to 8 February 2022. Device is the operating system recorded at submission.</w:t>
       </w:r>
     </w:p>
     <w:p>
@@ -1022,7 +784,7 @@
         <w:pStyle w:val="BodyText"/>
       </w:pPr>
       <w:r>
-        <w:t xml:space="preserve">Table 2 reports the household and connectivity conditions. The key figures are unstable networks (76.3%), power interruptions (42.1%), and very high stress (36.8%). Four respondents said their country did not have internet, yet all 38 submitted an online form. The item wording does not allow a firm reinterpretation, so the response is reported as given. Only 11 of 38 described the home as quiet.</w:t>
+        <w:t xml:space="preserve">Twenty-nine of 38 marked an unstable network. Sixteen marked power interruptions. Twenty-seven said the home was not quiet. Fourteen said the home affected study very much. Four people marked that their country did not have internet, yet all 38 submitted an online form. That answer is left as marked.</w:t>
       </w:r>
     </w:p>
     <w:p>
@@ -1046,7 +808,7 @@
           <w:iCs/>
           <w:i/>
         </w:rPr>
-        <w:t xml:space="preserve">Reported conditions and selected outcomes (N = 38)</w:t>
+        <w:t xml:space="preserve">Home and connection items (N = 38)</w:t>
       </w:r>
     </w:p>
     <w:tbl>
@@ -1445,14 +1207,14 @@
         </w:tc>
       </w:tr>
     </w:tbl>
-    <w:bookmarkEnd w:id="32"/>
-    <w:bookmarkStart w:id="33" w:name="platform-access"/>
+    <w:bookmarkEnd w:id="23"/>
+    <w:bookmarkStart w:id="24" w:name="theme-2.-named-platforms"/>
     <w:p>
       <w:pPr>
         <w:pStyle w:val="Heading3"/>
       </w:pPr>
       <w:r>
-        <w:t xml:space="preserve">4.2 Platform access</w:t>
+        <w:t xml:space="preserve">Theme 2. Named platforms</w:t>
       </w:r>
     </w:p>
     <w:p>
@@ -1460,7 +1222,7 @@
         <w:pStyle w:val="FirstParagraph"/>
       </w:pPr>
       <w:r>
-        <w:t xml:space="preserve">Table 3 shows uneven access to institutionally familiar and consumer-facing platforms. The questionnaire cannot isolate country restrictions, routing, account rules, skills, or virtual private networks. The pattern used for later discussion is that QQ and Chaoxing were frequently marked unusable, while Zoom and WhatsApp were more often marked available. WhatsApp appears only as available; the retained form did not code whether it was used for class. Tencent Meeting was the most used class tool but was marked available by fewer respondents, a discrepancy left as an item-level inconsistency.</w:t>
+        <w:t xml:space="preserve">Table 3 is incomplete by design. Some tools were asked as used for class, some as unusable in my country, and some as can use in my country. QQ and Chaoxing were often marked unusable. Zoom and WhatsApp were more often marked available. WhatsApp has no used-for-class column. Tencent Meeting was marked as used by 71.1% and as available by 57.9%. The table cannot separate blocking, accounts, skill, or a virtual private network.</w:t>
       </w:r>
     </w:p>
     <w:p>
@@ -1484,7 +1246,7 @@
           <w:iCs/>
           <w:i/>
         </w:rPr>
-        <w:t xml:space="preserve">Reported use and perceived availability of platforms (multiple response, N = 38)</w:t>
+        <w:t xml:space="preserve">Named platforms as asked (multiple response, N = 38)</w:t>
       </w:r>
     </w:p>
     <w:tbl>
@@ -1987,35 +1749,17 @@
         <w:t xml:space="preserve"> </w:t>
       </w:r>
       <w:r>
-        <w:t xml:space="preserve">is the stem wording. QQ, Chaoxing, DingTalk, and Chinese MOOC are platforms often used in Chinese-university teaching; they are not exclusively campus systems.</w:t>
-      </w:r>
-      <w:r>
-        <w:t xml:space="preserve"> </w:t>
-      </w:r>
-      <w:r>
-        <w:t xml:space="preserve">“</w:t>
-      </w:r>
-      <w:r>
-        <w:t xml:space="preserve">Marked unusable</w:t>
-      </w:r>
-      <w:r>
-        <w:t xml:space="preserve">”</w:t>
-      </w:r>
-      <w:r>
-        <w:t xml:space="preserve"> </w:t>
-      </w:r>
-      <w:r>
-        <w:t xml:space="preserve">follows the item wording and is not a technical claim that the platform was blocked.</w:t>
+        <w:t xml:space="preserve">is the stem wording.</w:t>
       </w:r>
     </w:p>
-    <w:bookmarkEnd w:id="33"/>
-    <w:bookmarkStart w:id="34" w:name="stress-and-appraisals"/>
+    <w:bookmarkEnd w:id="24"/>
+    <w:bookmarkStart w:id="25" w:name="X30468b93f95d42c3798a667c045b85c0e9d1c4d"/>
     <w:p>
       <w:pPr>
         <w:pStyle w:val="Heading3"/>
       </w:pPr>
       <w:r>
-        <w:t xml:space="preserve">4.3 Stress and appraisals</w:t>
+        <w:t xml:space="preserve">Theme 3. Stress, appraisal, and replacement</w:t>
       </w:r>
     </w:p>
     <w:p>
@@ -2023,25 +1767,7 @@
         <w:pStyle w:val="FirstParagraph"/>
       </w:pPr>
       <w:r>
-        <w:t xml:space="preserve">Among those who said the home affected study very much, 11 of 14 also selected</w:t>
-      </w:r>
-      <w:r>
-        <w:t xml:space="preserve"> </w:t>
-      </w:r>
-      <w:r>
-        <w:t xml:space="preserve">“</w:t>
-      </w:r>
-      <w:r>
-        <w:t xml:space="preserve">very high</w:t>
-      </w:r>
-      <w:r>
-        <w:t xml:space="preserve">”</w:t>
-      </w:r>
-      <w:r>
-        <w:t xml:space="preserve"> </w:t>
-      </w:r>
-      <w:r>
-        <w:t xml:space="preserve">psychological stress; among the others, 3 of 24 did (two-sided Fisher’s exact</w:t>
+        <w:t xml:space="preserve">Among those who said the home affected study very much, 11 of 14 also selected very high stress; among the others, 3 of 24 did (two-sided Fisher’s exact</w:t>
       </w:r>
       <w:r>
         <w:t xml:space="preserve"> </w:t>
@@ -2057,15 +1783,7 @@
         <w:t xml:space="preserve"> </w:t>
       </w:r>
       <w:r>
-        <w:t xml:space="preserve">= .00008). That is a co-occurrence in this dataset, not evidence that the household caused stress.</w:t>
-      </w:r>
-    </w:p>
-    <w:p>
-      <w:pPr>
-        <w:pStyle w:val="BodyText"/>
-      </w:pPr>
-      <w:r>
-        <w:t xml:space="preserve">Worse internet speed was associated with a worse appraisal index (ρ = .65,</w:t>
+        <w:t xml:space="preserve">= .00008). Worse internet speed went with a worse appraisal mean (ρ = .65, percentile bootstrap 95% CI [.36, .84],</w:t>
       </w:r>
       <w:r>
         <w:t xml:space="preserve"> </w:t>
@@ -2081,45 +1799,7 @@
         <w:t xml:space="preserve"> </w:t>
       </w:r>
       <w:r>
-        <w:t xml:space="preserve">&lt; .001, percentile bootstrap 95% CI [.36, .84]; Table 4). An unvalidated post hoc count of selected infrastructure-problem options (unstable network, power interruptions, no signal) was not associated with the index (ρ = .02). That count is not interpreted as evidence against the role of infrastructure.</w:t>
-      </w:r>
-    </w:p>
-    <w:p>
-      <w:pPr>
-        <w:pStyle w:val="BodyText"/>
-      </w:pPr>
-      <w:r>
-        <w:t xml:space="preserve">Active interaction with the teacher</w:t>
-      </w:r>
-      <w:r>
-        <w:t xml:space="preserve"> </w:t>
-      </w:r>
-      <w:r>
-        <w:t xml:space="preserve">“</w:t>
-      </w:r>
-      <w:r>
-        <w:t xml:space="preserve">very much</w:t>
-      </w:r>
-      <w:r>
-        <w:t xml:space="preserve">”</w:t>
-      </w:r>
-      <w:r>
-        <w:t xml:space="preserve"> </w:t>
-      </w:r>
-      <w:r>
-        <w:t xml:space="preserve">was uncommon (6 of 38). Preferred live length was 45 minutes for half of the respondents and 30 minutes for 28.9%. One open comment said that even one minute online was</w:t>
-      </w:r>
-      <w:r>
-        <w:t xml:space="preserve"> </w:t>
-      </w:r>
-      <w:r>
-        <w:t xml:space="preserve">“</w:t>
-      </w:r>
-      <w:r>
-        <w:t xml:space="preserve">not suitable.</w:t>
-      </w:r>
-      <w:r>
-        <w:t xml:space="preserve">”</w:t>
+        <w:t xml:space="preserve">&lt; .001). Both pairs come from the same form. They are reported as co-occurrence, not as cause.</w:t>
       </w:r>
     </w:p>
     <w:p>
@@ -2143,7 +1823,7 @@
           <w:iCs/>
           <w:i/>
         </w:rPr>
-        <w:t xml:space="preserve">Focal associations (N = 38)</w:t>
+        <w:t xml:space="preserve">Associations in this sample (N = 38)</w:t>
       </w:r>
     </w:p>
     <w:tbl>
@@ -2270,65 +1950,49 @@
           </w:p>
         </w:tc>
       </w:tr>
-      <w:tr>
-        <w:tc>
-          <w:tcPr/>
-          <w:p>
-            <w:pPr>
-              <w:pStyle w:val="Compact"/>
-              <w:jc w:val="left"/>
-            </w:pPr>
-            <w:r>
-              <w:t xml:space="preserve">Infrastructure-problem count × appraisal index (exploratory post hoc)</w:t>
-            </w:r>
-          </w:p>
-        </w:tc>
-        <w:tc>
-          <w:tcPr/>
-          <w:p>
-            <w:pPr>
-              <w:pStyle w:val="Compact"/>
-              <w:jc w:val="left"/>
-            </w:pPr>
-            <w:r>
-              <w:t xml:space="preserve">ρ = .02, percentile bootstrap 95% CI [−.32, .37],</w:t>
-            </w:r>
-            <w:r>
-              <w:t xml:space="preserve"> </w:t>
-            </w:r>
-            <w:r>
-              <w:rPr>
-                <w:iCs/>
-                <w:i/>
-              </w:rPr>
-              <w:t xml:space="preserve">p</w:t>
-            </w:r>
-            <w:r>
-              <w:t xml:space="preserve"> </w:t>
-            </w:r>
-            <w:r>
-              <w:t xml:space="preserve">= .91</w:t>
-            </w:r>
-          </w:p>
-        </w:tc>
-      </w:tr>
     </w:tbl>
     <w:p>
       <w:pPr>
         <w:pStyle w:val="BodyText"/>
       </w:pPr>
       <w:r>
-        <w:rPr>
-          <w:iCs/>
-          <w:i/>
-        </w:rPr>
-        <w:t xml:space="preserve">Note.</w:t>
+        <w:t xml:space="preserve">Active interaction with the teacher</w:t>
       </w:r>
       <w:r>
         <w:t xml:space="preserve"> </w:t>
       </w:r>
       <w:r>
-        <w:t xml:space="preserve">Analyses are exploratory. Odds ratios are omitted. The infrastructure-problem count is an unvalidated post hoc indicator and is not treated as a parallel scale.</w:t>
+        <w:t xml:space="preserve">“</w:t>
+      </w:r>
+      <w:r>
+        <w:t xml:space="preserve">very much</w:t>
+      </w:r>
+      <w:r>
+        <w:t xml:space="preserve">”</w:t>
+      </w:r>
+      <w:r>
+        <w:t xml:space="preserve"> </w:t>
+      </w:r>
+      <w:r>
+        <w:t xml:space="preserve">was marked by 6 of 38. Preferred live length was 45 minutes for 19 respondents and 30 minutes for 11. One open comment said that even one minute online was</w:t>
+      </w:r>
+      <w:r>
+        <w:t xml:space="preserve"> </w:t>
+      </w:r>
+      <w:r>
+        <w:t xml:space="preserve">“</w:t>
+      </w:r>
+      <w:r>
+        <w:t xml:space="preserve">not suitable.</w:t>
+      </w:r>
+      <w:r>
+        <w:t xml:space="preserve">”</w:t>
+      </w:r>
+      <w:r>
+        <w:t xml:space="preserve"> </w:t>
+      </w:r>
+      <w:r>
+        <w:t xml:space="preserve">Nineteen said online study could replace campus classes, and 19 said it could not.</w:t>
       </w:r>
     </w:p>
     <w:p>
@@ -2336,33 +2000,18 @@
         <w:pStyle w:val="BodyText"/>
       </w:pPr>
       <w:r>
-        <w:t xml:space="preserve">Among Pakistani-nationality respondents only (n = 37), the home and stress table remained 11/14 versus 3/23 (two-sided Fisher’s exact</w:t>
-      </w:r>
-      <w:r>
-        <w:t xml:space="preserve"> </w:t>
-      </w:r>
-      <w:r>
-        <w:rPr>
-          <w:iCs/>
-          <w:i/>
-        </w:rPr>
-        <w:t xml:space="preserve">p</w:t>
-      </w:r>
-      <w:r>
-        <w:t xml:space="preserve"> </w:t>
-      </w:r>
-      <w:r>
-        <w:t xml:space="preserve">= .00011) and speed × appraisal was ρ = .67 (percentile bootstrap 95% CI [.39, .85]).</w:t>
+        <w:t xml:space="preserve">Among Pakistani-nationality respondents only (n = 37), the home and stress table remained 11/14 versus 3/23 and speed × appraisal was ρ = .67.</w:t>
       </w:r>
     </w:p>
-    <w:bookmarkEnd w:id="34"/>
-    <w:bookmarkStart w:id="35" w:name="replacement-judgments"/>
+    <w:bookmarkEnd w:id="25"/>
+    <w:bookmarkEnd w:id="26"/>
+    <w:bookmarkStart w:id="27" w:name="discussion"/>
     <w:p>
       <w:pPr>
-        <w:pStyle w:val="Heading3"/>
-      </w:pPr>
-      <w:r>
-        <w:t xml:space="preserve">4.4 Replacement judgments</w:t>
+        <w:pStyle w:val="Heading2"/>
+      </w:pPr>
+      <w:r>
+        <w:t xml:space="preserve">4. Discussion</w:t>
       </w:r>
     </w:p>
     <w:p>
@@ -2370,62 +2019,15 @@
         <w:pStyle w:val="FirstParagraph"/>
       </w:pPr>
       <w:r>
-        <w:t xml:space="preserve">Nineteen of 38 said online study could replace campus classes, and 19 said it could not. The form was split. That count is reported here because the item was on the questionnaire. It is not treated as a test of gender or of household type.</w:t>
-      </w:r>
-    </w:p>
-    <w:bookmarkEnd w:id="35"/>
-    <w:bookmarkEnd w:id="36"/>
-    <w:bookmarkStart w:id="37" w:name="discussion"/>
-    <w:p>
-      <w:pPr>
-        <w:pStyle w:val="Heading2"/>
-      </w:pPr>
-      <w:r>
-        <w:t xml:space="preserve">5. Discussion</w:t>
+        <w:t xml:space="preserve">The 38 rows show home trouble, unused platforms, and stress sitting together in this sample. That list matches difficulties the field has already named (Tao &amp; Gao, 2022; Xu et al., 2022). Yu and Xu (2022) found overall positive online learning status in a larger South Asian sample. Their questionnaire and this form are not the same sample and are not read here as a single test. The present data add counts of power, quiet, speed, and named tools from February 2022.</w:t>
       </w:r>
     </w:p>
     <w:p>
       <w:pPr>
-        <w:pStyle w:val="FirstParagraph"/>
-      </w:pPr>
-      <w:r>
-        <w:t xml:space="preserve">The data show the difficulties the field has named, networks, platforms, interaction, and strain, as learner-side reports in this sample. Those who said the home affected study</w:t>
-      </w:r>
-      <w:r>
-        <w:t xml:space="preserve"> </w:t>
-      </w:r>
-      <w:r>
-        <w:t xml:space="preserve">“</w:t>
-      </w:r>
-      <w:r>
-        <w:t xml:space="preserve">very much</w:t>
-      </w:r>
-      <w:r>
-        <w:t xml:space="preserve">”</w:t>
-      </w:r>
-      <w:r>
-        <w:t xml:space="preserve"> </w:t>
-      </w:r>
-      <w:r>
-        <w:t xml:space="preserve">more often selected</w:t>
-      </w:r>
-      <w:r>
-        <w:t xml:space="preserve"> </w:t>
-      </w:r>
-      <w:r>
-        <w:t xml:space="preserve">“</w:t>
-      </w:r>
-      <w:r>
-        <w:t xml:space="preserve">very high stress,</w:t>
-      </w:r>
-      <w:r>
-        <w:t xml:space="preserve">”</w:t>
-      </w:r>
-      <w:r>
-        <w:t xml:space="preserve"> </w:t>
-      </w:r>
-      <w:r>
-        <w:t xml:space="preserve">and worse reported internet speed was associated with a more negative appraisal of online learning. Both tests are exploratory. They do not prove that the household caused stress or that speed caused a worse view of the class. They do show that those answers travelled together in these 38 rows.</w:t>
+        <w:pStyle w:val="BodyText"/>
+      </w:pPr>
+      <w:r>
+        <w:t xml:space="preserve">A better textbook would not, by itself, have answered a live session on an unstable connection, or a required application that respondents marked unusable. QQ and Chaoxing were often marked unusable; Zoom and WhatsApp were more often marked available. A teacher who requires one campus application can at least ask whether that application opens. The data do not recommend WhatsApp as a class tool: the form never asked whether it was used for class.</w:t>
       </w:r>
     </w:p>
     <w:p>
@@ -2433,7 +2035,7 @@
         <w:pStyle w:val="BodyText"/>
       </w:pPr>
       <w:r>
-        <w:t xml:space="preserve">Xu et al. (2022) show how character teaching was adapted on the sending side. Yu and Xu (2022) show learner-side ratings of online learning status among South Asian students in China, with overall positive reports in that larger sample. Zhang and Liu (2023) show designed online Chinese work. The present data add the home and platform conditions the 38 respondents marked in February 2022. A better textbook would not, by itself, have answered a live session on an unstable connection, or a required application that they marked unusable. The Yu and Xu questionnaire and this form are not the same sample and are not read here as a single test.</w:t>
+        <w:t xml:space="preserve">A live oral hour that needs a quiet room and a steady line will treat many of the ticks in Table 2 as absence or weak performance. Preferred live length here was 45 or 30 minutes. Those are reports from this sample, not a national rule.</w:t>
       </w:r>
     </w:p>
     <w:p>
@@ -2441,658 +2043,19 @@
         <w:pStyle w:val="BodyText"/>
       </w:pPr>
       <w:r>
-        <w:t xml:space="preserve">QQ, Chaoxing, DingTalk, and Chinese MOOC were often marked unusable, while Zoom and WhatsApp were more often marked available. The items cannot separate country restrictions, routing, account rules, skills, or virtual private networks. They can show that a single required toolkit was not equally marked as usable in this sample.</w:t>
-      </w:r>
-    </w:p>
-    <w:bookmarkEnd w:id="37"/>
-    <w:bookmarkStart w:id="42" w:name="pedagogical-implications"/>
-    <w:p>
-      <w:pPr>
-        <w:pStyle w:val="Heading2"/>
-      </w:pPr>
-      <w:r>
-        <w:t xml:space="preserve">6. Pedagogical implications</w:t>
+        <w:t xml:space="preserve">The sample is 38 self-selected rows from four days in February 2022. Recruitment is unknown. Enrollment was not verified. The instrument was not piloted. Several platform columns were never asked. There is no ethics-committee number for the original collection. The results are not a picture of current hybrid teaching (Stockwell &amp; Wang, 2023).</w:t>
       </w:r>
     </w:p>
     <w:p>
       <w:pPr>
-        <w:pStyle w:val="FirstParagraph"/>
-      </w:pPr>
-      <w:r>
-        <w:t xml:space="preserve">In this sample, the questionnaire can support only a small set of classroom decisions.</w:t>
+        <w:pStyle w:val="BodyText"/>
+      </w:pPr>
+      <w:r>
+        <w:t xml:space="preserve">Online Chinese teaching is not only a content problem. In these data it is also a delivery problem.</w:t>
       </w:r>
     </w:p>
-    <w:bookmarkStart w:id="38" w:name="platform-selection"/>
-    <w:p>
-      <w:pPr>
-        <w:pStyle w:val="Heading3"/>
-      </w:pPr>
-      <w:r>
-        <w:t xml:space="preserve">Platform selection</w:t>
-      </w:r>
-    </w:p>
-    <w:p>
-      <w:pPr>
-        <w:pStyle w:val="FirstParagraph"/>
-      </w:pPr>
-      <w:r>
-        <w:t xml:space="preserve">Because QQ and Chaoxing were frequently marked unusable (Table 3), a program should not treat the sending-side toolkit as given. Before it requires a platform, it has to ask whether learners can open it where they sit, and it has to name a usable alternative. WhatsApp was marked available here, but it was not recorded as used for class, so the data do not recommend it as a replacement.</w:t>
-      </w:r>
-    </w:p>
-    <w:bookmarkEnd w:id="38"/>
-    <w:bookmarkStart w:id="39" w:name="assessment-modes"/>
-    <w:p>
-      <w:pPr>
-        <w:pStyle w:val="Heading3"/>
-      </w:pPr>
-      <w:r>
-        <w:t xml:space="preserve">Assessment modes</w:t>
-      </w:r>
-    </w:p>
-    <w:p>
-      <w:pPr>
-        <w:pStyle w:val="FirstParagraph"/>
-      </w:pPr>
-      <w:r>
-        <w:t xml:space="preserve">Because only 28.9% described the home as quiet, 42.1% reported power interruptions, and 76.3% reported unstable networks (Table 2), institutions should not treat a live oral hour as the only assessable performance. Assessment that assumes a quiet, continuous campus hour will mark some of those conditions as learner failure.</w:t>
-      </w:r>
-    </w:p>
-    <w:bookmarkEnd w:id="39"/>
-    <w:bookmarkStart w:id="40" w:name="live-session-duration"/>
-    <w:p>
-      <w:pPr>
-        <w:pStyle w:val="Heading3"/>
-      </w:pPr>
-      <w:r>
-        <w:t xml:space="preserve">Live session duration</w:t>
-      </w:r>
-    </w:p>
-    <w:p>
-      <w:pPr>
-        <w:pStyle w:val="FirstParagraph"/>
-      </w:pPr>
-      <w:r>
-        <w:t xml:space="preserve">Preferred live length here was 45 minutes for half of the respondents and 30 minutes for 28.9%. One open comment said that even one minute online was</w:t>
-      </w:r>
-      <w:r>
-        <w:t xml:space="preserve"> </w:t>
-      </w:r>
-      <w:r>
-        <w:t xml:space="preserve">“</w:t>
-      </w:r>
-      <w:r>
-        <w:t xml:space="preserve">not suitable.</w:t>
-      </w:r>
-      <w:r>
-        <w:t xml:space="preserve">”</w:t>
-      </w:r>
-      <w:r>
-        <w:t xml:space="preserve"> </w:t>
-      </w:r>
-      <w:r>
-        <w:t xml:space="preserve">A shorter live slot or an asynchronous oral alternative is the suggestion the data can support.</w:t>
-      </w:r>
-    </w:p>
-    <w:bookmarkEnd w:id="40"/>
-    <w:bookmarkStart w:id="41" w:name="collecting-access-data"/>
-    <w:p>
-      <w:pPr>
-        <w:pStyle w:val="Heading3"/>
-      </w:pPr>
-      <w:r>
-        <w:t xml:space="preserve">Collecting access data</w:t>
-      </w:r>
-    </w:p>
-    <w:p>
-      <w:pPr>
-        <w:pStyle w:val="FirstParagraph"/>
-      </w:pPr>
-      <w:r>
-        <w:t xml:space="preserve">The form shows household and access conditions. It does not show how institutions adapted. Those conditions should be collected as part of course design, not after complaints.</w:t>
-      </w:r>
-    </w:p>
-    <w:p>
-      <w:pPr>
-        <w:pStyle w:val="BodyText"/>
-      </w:pPr>
-      <w:r>
-        <w:t xml:space="preserve">These suggestions are bound to this sample. They are not a national policy, and they are not evidence that later hybrid teaching has repeated this pattern (Stockwell &amp; Wang, 2023).</w:t>
-      </w:r>
-    </w:p>
-    <w:bookmarkEnd w:id="41"/>
-    <w:bookmarkEnd w:id="42"/>
-    <w:bookmarkStart w:id="43" w:name="limitations"/>
-    <w:p>
-      <w:pPr>
-        <w:pStyle w:val="Heading2"/>
-      </w:pPr>
-      <w:r>
-        <w:t xml:space="preserve">7. Limitations</w:t>
-      </w:r>
-    </w:p>
-    <w:p>
-      <w:pPr>
-        <w:pStyle w:val="FirstParagraph"/>
-      </w:pPr>
-      <w:r>
-        <w:t xml:space="preserve">The sample is small (N = 38), network-recruited, and majority male; recruitment channel, host university, program type, and place of residence were not recorded, so all outcomes are self-report from a convenience group whose enrollment was not independently verified. The data are from February 2022 and concern emergency remote teaching; they are not evidence about current hybrid education. The appraisal index is descriptive rather than a validated scale, the infrastructure-problem count is an unvalidated post hoc indicator, the form did not measure institutional adaptation, IP metadata are not a location measure, and no ethics-committee number is available for the 2022 collection (Section 3.5).</w:t>
-      </w:r>
-    </w:p>
-    <w:bookmarkEnd w:id="43"/>
-    <w:bookmarkStart w:id="44" w:name="conclusion"/>
-    <w:p>
-      <w:pPr>
-        <w:pStyle w:val="Heading2"/>
-      </w:pPr>
-      <w:r>
-        <w:t xml:space="preserve">8. Conclusion</w:t>
-      </w:r>
-    </w:p>
-    <w:p>
-      <w:pPr>
-        <w:pStyle w:val="FirstParagraph"/>
-      </w:pPr>
-      <w:r>
-        <w:t xml:space="preserve">This study used questionnaire data from 38 respondents who reported online Chinese study. Unstable networks, power interruptions, and uneven platform access were common in the sample. Home conditions that</w:t>
-      </w:r>
-      <w:r>
-        <w:t xml:space="preserve"> </w:t>
-      </w:r>
-      <w:r>
-        <w:t xml:space="preserve">“</w:t>
-      </w:r>
-      <w:r>
-        <w:t xml:space="preserve">affected study very much</w:t>
-      </w:r>
-      <w:r>
-        <w:t xml:space="preserve">”</w:t>
-      </w:r>
-      <w:r>
-        <w:t xml:space="preserve"> </w:t>
-      </w:r>
-      <w:r>
-        <w:t xml:space="preserve">co-occurred with</w:t>
-      </w:r>
-      <w:r>
-        <w:t xml:space="preserve"> </w:t>
-      </w:r>
-      <w:r>
-        <w:t xml:space="preserve">“</w:t>
-      </w:r>
-      <w:r>
-        <w:t xml:space="preserve">very high stress,</w:t>
-      </w:r>
-      <w:r>
-        <w:t xml:space="preserve">”</w:t>
-      </w:r>
-      <w:r>
-        <w:t xml:space="preserve"> </w:t>
-      </w:r>
-      <w:r>
-        <w:t xml:space="preserve">and worse reported speed went with a more negative appraisal of online learning. Online Chinese teaching is not only a content problem. In these data it is also a delivery problem.</w:t>
-      </w:r>
-    </w:p>
-    <w:bookmarkEnd w:id="44"/>
-    <w:bookmarkStart w:id="45" w:name="appendix-a.-appraisal-items-and-coding"/>
-    <w:p>
-      <w:pPr>
-        <w:pStyle w:val="Heading2"/>
-      </w:pPr>
-      <w:r>
-        <w:t xml:space="preserve">Appendix A. Appraisal items and coding</w:t>
-      </w:r>
-    </w:p>
-    <w:p>
-      <w:pPr>
-        <w:pStyle w:val="FirstParagraph"/>
-      </w:pPr>
-      <w:r>
-        <w:t xml:space="preserve">English glosses of the item stems.</w:t>
-      </w:r>
-    </w:p>
-    <w:tbl>
-      <w:tblPr>
-        <w:tblStyle w:val="Table"/>
-        <w:tblW w:type="pct" w:w="5000"/>
-        <w:tblLook w:firstRow="1" w:lastRow="0" w:firstColumn="0" w:lastColumn="0" w:noHBand="0" w:noVBand="0" w:val="0020"/>
-        <w:jc w:val="start"/>
-      </w:tblPr>
-      <w:tblGrid>
-        <w:gridCol w:w="1980"/>
-        <w:gridCol w:w="1980"/>
-        <w:gridCol w:w="1980"/>
-        <w:gridCol w:w="1980"/>
-      </w:tblGrid>
-      <w:tr>
-        <w:trPr>
-          <w:tblHeader w:val="true"/>
-        </w:trPr>
-        <w:tc>
-          <w:tcPr/>
-          <w:p>
-            <w:pPr>
-              <w:pStyle w:val="Compact"/>
-              <w:jc w:val="left"/>
-            </w:pPr>
-            <w:r>
-              <w:t xml:space="preserve">Item</w:t>
-            </w:r>
-          </w:p>
-        </w:tc>
-        <w:tc>
-          <w:tcPr/>
-          <w:p>
-            <w:pPr>
-              <w:pStyle w:val="Compact"/>
-              <w:jc w:val="left"/>
-            </w:pPr>
-            <w:r>
-              <w:t xml:space="preserve">Stem (gloss)</w:t>
-            </w:r>
-          </w:p>
-        </w:tc>
-        <w:tc>
-          <w:tcPr/>
-          <w:p>
-            <w:pPr>
-              <w:pStyle w:val="Compact"/>
-              <w:jc w:val="left"/>
-            </w:pPr>
-            <w:r>
-              <w:t xml:space="preserve">1</w:t>
-            </w:r>
-          </w:p>
-        </w:tc>
-        <w:tc>
-          <w:tcPr/>
-          <w:p>
-            <w:pPr>
-              <w:pStyle w:val="Compact"/>
-              <w:jc w:val="left"/>
-            </w:pPr>
-            <w:r>
-              <w:t xml:space="preserve">Higher</w:t>
-            </w:r>
-          </w:p>
-        </w:tc>
-      </w:tr>
-      <w:tr>
-        <w:tc>
-          <w:tcPr/>
-          <w:p>
-            <w:pPr>
-              <w:pStyle w:val="Compact"/>
-              <w:jc w:val="left"/>
-            </w:pPr>
-            <w:r>
-              <w:t xml:space="preserve">Learned (Q8)</w:t>
-            </w:r>
-          </w:p>
-        </w:tc>
-        <w:tc>
-          <w:tcPr/>
-          <w:p>
-            <w:pPr>
-              <w:pStyle w:val="Compact"/>
-              <w:jc w:val="left"/>
-            </w:pPr>
-            <w:r>
-              <w:t xml:space="preserve">Can you learn a lot in online class?</w:t>
-            </w:r>
-          </w:p>
-        </w:tc>
-        <w:tc>
-          <w:tcPr/>
-          <w:p>
-            <w:pPr>
-              <w:pStyle w:val="Compact"/>
-              <w:jc w:val="left"/>
-            </w:pPr>
-            <w:r>
-              <w:t xml:space="preserve">a lot</w:t>
-            </w:r>
-          </w:p>
-        </w:tc>
-        <w:tc>
-          <w:tcPr/>
-          <w:p>
-            <w:pPr>
-              <w:pStyle w:val="Compact"/>
-              <w:jc w:val="left"/>
-            </w:pPr>
-            <w:r>
-              <w:t xml:space="preserve">worse appraisal</w:t>
-            </w:r>
-          </w:p>
-        </w:tc>
-      </w:tr>
-      <w:tr>
-        <w:tc>
-          <w:tcPr/>
-          <w:p>
-            <w:pPr>
-              <w:pStyle w:val="Compact"/>
-              <w:jc w:val="left"/>
-            </w:pPr>
-            <w:r>
-              <w:t xml:space="preserve">Improve (Q9)</w:t>
-            </w:r>
-          </w:p>
-        </w:tc>
-        <w:tc>
-          <w:tcPr/>
-          <w:p>
-            <w:pPr>
-              <w:pStyle w:val="Compact"/>
-              <w:jc w:val="left"/>
-            </w:pPr>
-            <w:r>
-              <w:t xml:space="preserve">Can online study improve Chinese?</w:t>
-            </w:r>
-          </w:p>
-        </w:tc>
-        <w:tc>
-          <w:tcPr/>
-          <w:p>
-            <w:pPr>
-              <w:pStyle w:val="Compact"/>
-              <w:jc w:val="left"/>
-            </w:pPr>
-            <w:r>
-              <w:t xml:space="preserve">very much</w:t>
-            </w:r>
-          </w:p>
-        </w:tc>
-        <w:tc>
-          <w:tcPr/>
-          <w:p>
-            <w:pPr>
-              <w:pStyle w:val="Compact"/>
-              <w:jc w:val="left"/>
-            </w:pPr>
-            <w:r>
-              <w:t xml:space="preserve">worse appraisal</w:t>
-            </w:r>
-          </w:p>
-        </w:tc>
-      </w:tr>
-      <w:tr>
-        <w:tc>
-          <w:tcPr/>
-          <w:p>
-            <w:pPr>
-              <w:pStyle w:val="Compact"/>
-              <w:jc w:val="left"/>
-            </w:pPr>
-            <w:r>
-              <w:t xml:space="preserve">Interest (Q10)</w:t>
-            </w:r>
-          </w:p>
-        </w:tc>
-        <w:tc>
-          <w:tcPr/>
-          <w:p>
-            <w:pPr>
-              <w:pStyle w:val="Compact"/>
-              <w:jc w:val="left"/>
-            </w:pPr>
-            <w:r>
-              <w:t xml:space="preserve">Does it spark learning interest?</w:t>
-            </w:r>
-          </w:p>
-        </w:tc>
-        <w:tc>
-          <w:tcPr/>
-          <w:p>
-            <w:pPr>
-              <w:pStyle w:val="Compact"/>
-              <w:jc w:val="left"/>
-            </w:pPr>
-            <w:r>
-              <w:t xml:space="preserve">very much</w:t>
-            </w:r>
-          </w:p>
-        </w:tc>
-        <w:tc>
-          <w:tcPr/>
-          <w:p>
-            <w:pPr>
-              <w:pStyle w:val="Compact"/>
-              <w:jc w:val="left"/>
-            </w:pPr>
-            <w:r>
-              <w:t xml:space="preserve">worse appraisal</w:t>
-            </w:r>
-          </w:p>
-        </w:tc>
-      </w:tr>
-      <w:tr>
-        <w:tc>
-          <w:tcPr/>
-          <w:p>
-            <w:pPr>
-              <w:pStyle w:val="Compact"/>
-              <w:jc w:val="left"/>
-            </w:pPr>
-            <w:r>
-              <w:t xml:space="preserve">Speed (Q14)</w:t>
-            </w:r>
-          </w:p>
-        </w:tc>
-        <w:tc>
-          <w:tcPr/>
-          <w:p>
-            <w:pPr>
-              <w:pStyle w:val="Compact"/>
-              <w:jc w:val="left"/>
-            </w:pPr>
-            <w:r>
-              <w:t xml:space="preserve">Internet speed</w:t>
-            </w:r>
-          </w:p>
-        </w:tc>
-        <w:tc>
-          <w:tcPr/>
-          <w:p>
-            <w:pPr>
-              <w:pStyle w:val="Compact"/>
-              <w:jc w:val="left"/>
-            </w:pPr>
-            <w:r>
-              <w:t xml:space="preserve">very good</w:t>
-            </w:r>
-          </w:p>
-        </w:tc>
-        <w:tc>
-          <w:tcPr/>
-          <w:p>
-            <w:pPr>
-              <w:pStyle w:val="Compact"/>
-              <w:jc w:val="left"/>
-            </w:pPr>
-            <w:r>
-              <w:t xml:space="preserve">worse speed</w:t>
-            </w:r>
-          </w:p>
-        </w:tc>
-      </w:tr>
-      <w:tr>
-        <w:tc>
-          <w:tcPr/>
-          <w:p>
-            <w:pPr>
-              <w:pStyle w:val="Compact"/>
-              <w:jc w:val="left"/>
-            </w:pPr>
-            <w:r>
-              <w:t xml:space="preserve">Stress (Q24)</w:t>
-            </w:r>
-          </w:p>
-        </w:tc>
-        <w:tc>
-          <w:tcPr/>
-          <w:p>
-            <w:pPr>
-              <w:pStyle w:val="Compact"/>
-              <w:jc w:val="left"/>
-            </w:pPr>
-            <w:r>
-              <w:t xml:space="preserve">Psychological stress</w:t>
-            </w:r>
-          </w:p>
-        </w:tc>
-        <w:tc>
-          <w:tcPr/>
-          <w:p>
-            <w:pPr>
-              <w:pStyle w:val="Compact"/>
-              <w:jc w:val="left"/>
-            </w:pPr>
-            <w:r>
-              <w:t xml:space="preserve">very high</w:t>
-            </w:r>
-          </w:p>
-        </w:tc>
-        <w:tc>
-          <w:tcPr/>
-          <w:p>
-            <w:pPr>
-              <w:pStyle w:val="Compact"/>
-              <w:jc w:val="left"/>
-            </w:pPr>
-            <w:r>
-              <w:t xml:space="preserve">less stress</w:t>
-            </w:r>
-          </w:p>
-        </w:tc>
-      </w:tr>
-      <w:tr>
-        <w:tc>
-          <w:tcPr/>
-          <w:p>
-            <w:pPr>
-              <w:pStyle w:val="Compact"/>
-              <w:jc w:val="left"/>
-            </w:pPr>
-            <w:r>
-              <w:t xml:space="preserve">Interaction (Q25)</w:t>
-            </w:r>
-          </w:p>
-        </w:tc>
-        <w:tc>
-          <w:tcPr/>
-          <w:p>
-            <w:pPr>
-              <w:pStyle w:val="Compact"/>
-              <w:jc w:val="left"/>
-            </w:pPr>
-            <w:r>
-              <w:t xml:space="preserve">Active interaction with teacher</w:t>
-            </w:r>
-          </w:p>
-        </w:tc>
-        <w:tc>
-          <w:tcPr/>
-          <w:p>
-            <w:pPr>
-              <w:pStyle w:val="Compact"/>
-              <w:jc w:val="left"/>
-            </w:pPr>
-            <w:r>
-              <w:t xml:space="preserve">very much</w:t>
-            </w:r>
-          </w:p>
-        </w:tc>
-        <w:tc>
-          <w:tcPr/>
-          <w:p>
-            <w:pPr>
-              <w:pStyle w:val="Compact"/>
-              <w:jc w:val="left"/>
-            </w:pPr>
-            <w:r>
-              <w:t xml:space="preserve">thinner interaction</w:t>
-            </w:r>
-          </w:p>
-        </w:tc>
-      </w:tr>
-    </w:tbl>
-    <w:p>
-      <w:pPr>
-        <w:pStyle w:val="BodyText"/>
-      </w:pPr>
-      <w:r>
-        <w:t xml:space="preserve">Index = mean of Q8, Q9, and Q10 (n = 38; no missing on these three).</w:t>
-      </w:r>
-    </w:p>
-    <w:bookmarkEnd w:id="45"/>
-    <w:bookmarkStart w:id="46" w:name="appendix-b.-secondary-statistics"/>
-    <w:p>
-      <w:pPr>
-        <w:pStyle w:val="Heading2"/>
-      </w:pPr>
-      <w:r>
-        <w:t xml:space="preserve">Appendix B. Secondary statistics</w:t>
-      </w:r>
-    </w:p>
-    <w:p>
-      <w:pPr>
-        <w:pStyle w:val="FirstParagraph"/>
-      </w:pPr>
-      <w:r>
-        <w:t xml:space="preserve">Female × cannot-replace and learned-little × cannot-replace have identical cell counts (9/11 vs 10/27; Fisher’s exact</w:t>
-      </w:r>
-      <w:r>
-        <w:t xml:space="preserve"> </w:t>
-      </w:r>
-      <w:r>
-        <w:rPr>
-          <w:iCs/>
-          <w:i/>
-        </w:rPr>
-        <w:t xml:space="preserve">p</w:t>
-      </w:r>
-      <w:r>
-        <w:t xml:space="preserve"> </w:t>
-      </w:r>
-      <w:r>
-        <w:t xml:space="preserve">= .029). Poor internet × cannot-replace: 8/10 vs 11/28, Fisher’s exact</w:t>
-      </w:r>
-      <w:r>
-        <w:t xml:space="preserve"> </w:t>
-      </w:r>
-      <w:r>
-        <w:rPr>
-          <w:iCs/>
-          <w:i/>
-        </w:rPr>
-        <w:t xml:space="preserve">p</w:t>
-      </w:r>
-      <w:r>
-        <w:t xml:space="preserve"> </w:t>
-      </w:r>
-      <w:r>
-        <w:t xml:space="preserve">= .062. Mann–Whitney tests by gender on ordinals all had</w:t>
-      </w:r>
-      <w:r>
-        <w:t xml:space="preserve"> </w:t>
-      </w:r>
-      <w:r>
-        <w:rPr>
-          <w:iCs/>
-          <w:i/>
-        </w:rPr>
-        <w:t xml:space="preserve">p</w:t>
-      </w:r>
-      <w:r>
-        <w:t xml:space="preserve"> </w:t>
-      </w:r>
-      <w:r>
-        <w:t xml:space="preserve">≥ .36.</w:t>
-      </w:r>
-    </w:p>
-    <w:bookmarkEnd w:id="46"/>
-    <w:bookmarkStart w:id="47" w:name="references"/>
+    <w:bookmarkEnd w:id="27"/>
+    <w:bookmarkStart w:id="28" w:name="references"/>
     <w:p>
       <w:pPr>
         <w:pStyle w:val="Heading2"/>
@@ -3169,27 +2132,6 @@
         <w:pStyle w:val="BodyText"/>
       </w:pPr>
       <w:r>
-        <w:t xml:space="preserve">Gong, Y., Gao, X., &amp; Lyu, B. (2020b). Teaching Chinese as a second or foreign language to non-Chinese learners in mainland China (2014-2018).</w:t>
-      </w:r>
-      <w:r>
-        <w:t xml:space="preserve"> </w:t>
-      </w:r>
-      <w:r>
-        <w:rPr>
-          <w:iCs/>
-          <w:i/>
-        </w:rPr>
-        <w:t xml:space="preserve">Language Teaching, 53</w:t>
-      </w:r>
-      <w:r>
-        <w:t xml:space="preserve">(1), 44-62. https://doi.org/10.1017/S0261444819000387</w:t>
-      </w:r>
-    </w:p>
-    <w:p>
-      <w:pPr>
-        <w:pStyle w:val="BodyText"/>
-      </w:pPr>
-      <w:r>
         <w:t xml:space="preserve">González-Lloret, M. (2020). Collaborative tasks for online language teaching.</w:t>
       </w:r>
       <w:r>
@@ -3211,27 +2153,6 @@
         <w:pStyle w:val="BodyText"/>
       </w:pPr>
       <w:r>
-        <w:t xml:space="preserve">Guenier, A. W., Xing, M., &amp; Yan, J. (2026). From barriers to breakthroughs: Communicating Chinese culture to Irish learners with a multimodality online course.</w:t>
-      </w:r>
-      <w:r>
-        <w:t xml:space="preserve"> </w:t>
-      </w:r>
-      <w:r>
-        <w:rPr>
-          <w:iCs/>
-          <w:i/>
-        </w:rPr>
-        <w:t xml:space="preserve">Language, Culture and Curriculum</w:t>
-      </w:r>
-      <w:r>
-        <w:t xml:space="preserve">. Advance online publication. https://doi.org/10.1080/07908318.2026.2626775</w:t>
-      </w:r>
-    </w:p>
-    <w:p>
-      <w:pPr>
-        <w:pStyle w:val="BodyText"/>
-      </w:pPr>
-      <w:r>
         <w:t xml:space="preserve">Guerrettaz, A. M., Engman, M. M., &amp; Matsumoto, Y. (2021). Empirically defining language learning and teaching materials in use through sociomaterial perspectives.</w:t>
       </w:r>
       <w:r>
@@ -3358,7 +2279,49 @@
         <w:pStyle w:val="BodyText"/>
       </w:pPr>
       <w:r>
-        <w:t xml:space="preserve">Lomicka, L. (2020). Creating and sustaining virtual language communities.</w:t>
+        <w:t xml:space="preserve">MacIntyre, P. D., Gregersen, T., &amp; Mercer, S. (2020). Language teachers’ coping strategies during the Covid-19 conversion to online teaching: Correlations with stress, wellbeing and negative emotions.</w:t>
+      </w:r>
+      <w:r>
+        <w:t xml:space="preserve"> </w:t>
+      </w:r>
+      <w:r>
+        <w:rPr>
+          <w:iCs/>
+          <w:i/>
+        </w:rPr>
+        <w:t xml:space="preserve">System, 94</w:t>
+      </w:r>
+      <w:r>
+        <w:t xml:space="preserve">, Article 102352. https://doi.org/10.1016/j.system.2020.102352</w:t>
+      </w:r>
+    </w:p>
+    <w:p>
+      <w:pPr>
+        <w:pStyle w:val="BodyText"/>
+      </w:pPr>
+      <w:r>
+        <w:t xml:space="preserve">Moser, K. M., Wei, T., &amp; Brenner, D. (2021). Remote teaching during COVID-19: Implications from a national survey of language educators.</w:t>
+      </w:r>
+      <w:r>
+        <w:t xml:space="preserve"> </w:t>
+      </w:r>
+      <w:r>
+        <w:rPr>
+          <w:iCs/>
+          <w:i/>
+        </w:rPr>
+        <w:t xml:space="preserve">System, 97</w:t>
+      </w:r>
+      <w:r>
+        <w:t xml:space="preserve">, Article 102431. https://doi.org/10.1016/j.system.2020.102431</w:t>
+      </w:r>
+    </w:p>
+    <w:p>
+      <w:pPr>
+        <w:pStyle w:val="BodyText"/>
+      </w:pPr>
+      <w:r>
+        <w:t xml:space="preserve">Payne, J. S. (2020). Developing L2 productive language skills online and the strategic use of instructional tools.</w:t>
       </w:r>
       <w:r>
         <w:t xml:space="preserve"> </w:t>
@@ -3371,7 +2334,7 @@
         <w:t xml:space="preserve">Foreign Language Annals, 53</w:t>
       </w:r>
       <w:r>
-        <w:t xml:space="preserve">(2), 306-313. https://doi.org/10.1111/flan.12456</w:t>
+        <w:t xml:space="preserve">(2), 243-249. https://doi.org/10.1111/flan.12457</w:t>
       </w:r>
     </w:p>
     <w:p>
@@ -3379,7 +2342,22 @@
         <w:pStyle w:val="BodyText"/>
       </w:pPr>
       <w:r>
-        <w:t xml:space="preserve">MacIntyre, P. D., Gregersen, T., &amp; Mercer, S. (2020). Language teachers’ coping strategies during the Covid-19 conversion to online teaching: Correlations with stress, wellbeing and negative emotions.</w:t>
+        <w:t xml:space="preserve">Qi, X. (2025).</w:t>
+      </w:r>
+      <w:r>
+        <w:t xml:space="preserve"> </w:t>
+      </w:r>
+      <w:r>
+        <w:t xml:space="preserve">‘</w:t>
+      </w:r>
+      <w:r>
+        <w:t xml:space="preserve">My speech becomes just a voice, a picture</w:t>
+      </w:r>
+      <w:r>
+        <w:t xml:space="preserve">’</w:t>
+      </w:r>
+      <w:r>
+        <w:t xml:space="preserve">: Exploring language anxiety in Chinese as a second language learning in online environments.</w:t>
       </w:r>
       <w:r>
         <w:t xml:space="preserve"> </w:t>
@@ -3389,10 +2367,10 @@
           <w:iCs/>
           <w:i/>
         </w:rPr>
-        <w:t xml:space="preserve">System, 94</w:t>
-      </w:r>
-      <w:r>
-        <w:t xml:space="preserve">, Article 102352. https://doi.org/10.1016/j.system.2020.102352</w:t>
+        <w:t xml:space="preserve">Language Teaching Research</w:t>
+      </w:r>
+      <w:r>
+        <w:t xml:space="preserve">. Advance online publication. https://doi.org/10.1177/13621688251387320</w:t>
       </w:r>
     </w:p>
     <w:p>
@@ -3400,49 +2378,7 @@
         <w:pStyle w:val="BodyText"/>
       </w:pPr>
       <w:r>
-        <w:t xml:space="preserve">Moorhouse, B. L. (2023). Teachers’ digital technology use after a period of online teaching.</w:t>
-      </w:r>
-      <w:r>
-        <w:t xml:space="preserve"> </w:t>
-      </w:r>
-      <w:r>
-        <w:rPr>
-          <w:iCs/>
-          <w:i/>
-        </w:rPr>
-        <w:t xml:space="preserve">ELT Journal, 77</w:t>
-      </w:r>
-      <w:r>
-        <w:t xml:space="preserve">(4), 445-457. https://doi.org/10.1093/elt/ccac050</w:t>
-      </w:r>
-    </w:p>
-    <w:p>
-      <w:pPr>
-        <w:pStyle w:val="BodyText"/>
-      </w:pPr>
-      <w:r>
-        <w:t xml:space="preserve">Moser, K. M., Wei, T., &amp; Brenner, D. (2021). Remote teaching during COVID-19: Implications from a national survey of language educators.</w:t>
-      </w:r>
-      <w:r>
-        <w:t xml:space="preserve"> </w:t>
-      </w:r>
-      <w:r>
-        <w:rPr>
-          <w:iCs/>
-          <w:i/>
-        </w:rPr>
-        <w:t xml:space="preserve">System, 97</w:t>
-      </w:r>
-      <w:r>
-        <w:t xml:space="preserve">, Article 102431. https://doi.org/10.1016/j.system.2020.102431</w:t>
-      </w:r>
-    </w:p>
-    <w:p>
-      <w:pPr>
-        <w:pStyle w:val="BodyText"/>
-      </w:pPr>
-      <w:r>
-        <w:t xml:space="preserve">Payne, J. S. (2020). Developing L2 productive language skills online and the strategic use of instructional tools.</w:t>
+        <w:t xml:space="preserve">Russell, V. (2020). Language anxiety and the online learner.</w:t>
       </w:r>
       <w:r>
         <w:t xml:space="preserve"> </w:t>
@@ -3455,7 +2391,7 @@
         <w:t xml:space="preserve">Foreign Language Annals, 53</w:t>
       </w:r>
       <w:r>
-        <w:t xml:space="preserve">(2), 243-249. https://doi.org/10.1111/flan.12457</w:t>
+        <w:t xml:space="preserve">(2), 338-352. https://doi.org/10.1111/flan.12461</w:t>
       </w:r>
     </w:p>
     <w:p>
@@ -3463,22 +2399,133 @@
         <w:pStyle w:val="BodyText"/>
       </w:pPr>
       <w:r>
-        <w:t xml:space="preserve">Qi, X. (2025).</w:t>
+        <w:t xml:space="preserve">Stockwell, G., &amp; Wang, Y. (2023). Exploring the challenges of technology in language teaching in the aftermath of the pandemic.</w:t>
       </w:r>
       <w:r>
         <w:t xml:space="preserve"> </w:t>
       </w:r>
       <w:r>
-        <w:t xml:space="preserve">‘</w:t>
-      </w:r>
-      <w:r>
-        <w:t xml:space="preserve">My speech becomes just a voice, a picture</w:t>
-      </w:r>
-      <w:r>
-        <w:t xml:space="preserve">’</w:t>
-      </w:r>
-      <w:r>
-        <w:t xml:space="preserve">: Exploring language anxiety in Chinese as a second language learning in online environments.</w:t>
+        <w:rPr>
+          <w:iCs/>
+          <w:i/>
+        </w:rPr>
+        <w:t xml:space="preserve">RELC Journal, 54</w:t>
+      </w:r>
+      <w:r>
+        <w:t xml:space="preserve">(2), 474-482. https://doi.org/10.1177/00336882231168438</w:t>
+      </w:r>
+    </w:p>
+    <w:p>
+      <w:pPr>
+        <w:pStyle w:val="BodyText"/>
+      </w:pPr>
+      <w:r>
+        <w:t xml:space="preserve">Tao, J., &amp; Gao, X. (2022). Teaching and learning languages online: Challenges and responses.</w:t>
+      </w:r>
+      <w:r>
+        <w:t xml:space="preserve"> </w:t>
+      </w:r>
+      <w:r>
+        <w:rPr>
+          <w:iCs/>
+          <w:i/>
+        </w:rPr>
+        <w:t xml:space="preserve">System, 107</w:t>
+      </w:r>
+      <w:r>
+        <w:t xml:space="preserve">, Article 102819. https://doi.org/10.1016/j.system.2022.102819</w:t>
+      </w:r>
+    </w:p>
+    <w:p>
+      <w:pPr>
+        <w:pStyle w:val="BodyText"/>
+      </w:pPr>
+      <w:r>
+        <w:t xml:space="preserve">van Dijk, J. (2020).</w:t>
+      </w:r>
+      <w:r>
+        <w:t xml:space="preserve"> </w:t>
+      </w:r>
+      <w:r>
+        <w:rPr>
+          <w:iCs/>
+          <w:i/>
+        </w:rPr>
+        <w:t xml:space="preserve">The digital divide</w:t>
+      </w:r>
+      <w:r>
+        <w:t xml:space="preserve">. Polity.</w:t>
+      </w:r>
+    </w:p>
+    <w:p>
+      <w:pPr>
+        <w:pStyle w:val="BodyText"/>
+      </w:pPr>
+      <w:r>
+        <w:t xml:space="preserve">van Lier, L. (2004).</w:t>
+      </w:r>
+      <w:r>
+        <w:t xml:space="preserve"> </w:t>
+      </w:r>
+      <w:r>
+        <w:rPr>
+          <w:iCs/>
+          <w:i/>
+        </w:rPr>
+        <w:t xml:space="preserve">The ecology and semiotics of language learning: A sociocultural perspective</w:t>
+      </w:r>
+      <w:r>
+        <w:t xml:space="preserve">. Kluwer.</w:t>
+      </w:r>
+    </w:p>
+    <w:p>
+      <w:pPr>
+        <w:pStyle w:val="BodyText"/>
+      </w:pPr>
+      <w:r>
+        <w:t xml:space="preserve">Warschauer, M. (2003).</w:t>
+      </w:r>
+      <w:r>
+        <w:t xml:space="preserve"> </w:t>
+      </w:r>
+      <w:r>
+        <w:rPr>
+          <w:iCs/>
+          <w:i/>
+        </w:rPr>
+        <w:t xml:space="preserve">Technology and social inclusion: Rethinking the digital divide</w:t>
+      </w:r>
+      <w:r>
+        <w:t xml:space="preserve">. MIT Press.</w:t>
+      </w:r>
+    </w:p>
+    <w:p>
+      <w:pPr>
+        <w:pStyle w:val="BodyText"/>
+      </w:pPr>
+      <w:r>
+        <w:t xml:space="preserve">White, C. (2006). Distance learning of foreign languages.</w:t>
+      </w:r>
+      <w:r>
+        <w:t xml:space="preserve"> </w:t>
+      </w:r>
+      <w:r>
+        <w:rPr>
+          <w:iCs/>
+          <w:i/>
+        </w:rPr>
+        <w:t xml:space="preserve">Language Teaching, 39</w:t>
+      </w:r>
+      <w:r>
+        <w:t xml:space="preserve">(4), 247-264. https://doi.org/10.1017/S0261444806003727</w:t>
+      </w:r>
+    </w:p>
+    <w:p>
+      <w:pPr>
+        <w:pStyle w:val="BodyText"/>
+      </w:pPr>
+      <w:r>
+        <w:t xml:space="preserve">Xu, B. (2024). Technology integration into Chinese as a foreign language learning in higher education: An integrated bibliometric analysis and systematic review (2000–2024).</w:t>
       </w:r>
       <w:r>
         <w:t xml:space="preserve"> </w:t>
@@ -3491,216 +2538,6 @@
         <w:t xml:space="preserve">Language Teaching Research</w:t>
       </w:r>
       <w:r>
-        <w:t xml:space="preserve">. Advance online publication. https://doi.org/10.1177/13621688251387320</w:t>
-      </w:r>
-    </w:p>
-    <w:p>
-      <w:pPr>
-        <w:pStyle w:val="BodyText"/>
-      </w:pPr>
-      <w:r>
-        <w:t xml:space="preserve">Russell, V. (2020). Language anxiety and the online learner.</w:t>
-      </w:r>
-      <w:r>
-        <w:t xml:space="preserve"> </w:t>
-      </w:r>
-      <w:r>
-        <w:rPr>
-          <w:iCs/>
-          <w:i/>
-        </w:rPr>
-        <w:t xml:space="preserve">Foreign Language Annals, 53</w:t>
-      </w:r>
-      <w:r>
-        <w:t xml:space="preserve">(2), 338-352. https://doi.org/10.1111/flan.12461</w:t>
-      </w:r>
-    </w:p>
-    <w:p>
-      <w:pPr>
-        <w:pStyle w:val="BodyText"/>
-      </w:pPr>
-      <w:r>
-        <w:t xml:space="preserve">Stockwell, G., &amp; Wang, Y. (2023). Exploring the challenges of technology in language teaching in the aftermath of the pandemic.</w:t>
-      </w:r>
-      <w:r>
-        <w:t xml:space="preserve"> </w:t>
-      </w:r>
-      <w:r>
-        <w:rPr>
-          <w:iCs/>
-          <w:i/>
-        </w:rPr>
-        <w:t xml:space="preserve">RELC Journal, 54</w:t>
-      </w:r>
-      <w:r>
-        <w:t xml:space="preserve">(2), 474-482. https://doi.org/10.1177/00336882231168438</w:t>
-      </w:r>
-    </w:p>
-    <w:p>
-      <w:pPr>
-        <w:pStyle w:val="BodyText"/>
-      </w:pPr>
-      <w:r>
-        <w:t xml:space="preserve">Tao, J., &amp; Gao, X. (2022). Teaching and learning languages online: Challenges and responses.</w:t>
-      </w:r>
-      <w:r>
-        <w:t xml:space="preserve"> </w:t>
-      </w:r>
-      <w:r>
-        <w:rPr>
-          <w:iCs/>
-          <w:i/>
-        </w:rPr>
-        <w:t xml:space="preserve">System, 107</w:t>
-      </w:r>
-      <w:r>
-        <w:t xml:space="preserve">, Article 102819. https://doi.org/10.1016/j.system.2022.102819</w:t>
-      </w:r>
-    </w:p>
-    <w:p>
-      <w:pPr>
-        <w:pStyle w:val="BodyText"/>
-      </w:pPr>
-      <w:r>
-        <w:t xml:space="preserve">van Dijk, J. (2020).</w:t>
-      </w:r>
-      <w:r>
-        <w:t xml:space="preserve"> </w:t>
-      </w:r>
-      <w:r>
-        <w:rPr>
-          <w:iCs/>
-          <w:i/>
-        </w:rPr>
-        <w:t xml:space="preserve">The digital divide</w:t>
-      </w:r>
-      <w:r>
-        <w:t xml:space="preserve">. Polity.</w:t>
-      </w:r>
-    </w:p>
-    <w:p>
-      <w:pPr>
-        <w:pStyle w:val="BodyText"/>
-      </w:pPr>
-      <w:r>
-        <w:t xml:space="preserve">van Lier, L. (2004).</w:t>
-      </w:r>
-      <w:r>
-        <w:t xml:space="preserve"> </w:t>
-      </w:r>
-      <w:r>
-        <w:rPr>
-          <w:iCs/>
-          <w:i/>
-        </w:rPr>
-        <w:t xml:space="preserve">The ecology and semiotics of language learning: A sociocultural perspective</w:t>
-      </w:r>
-      <w:r>
-        <w:t xml:space="preserve">. Kluwer.</w:t>
-      </w:r>
-    </w:p>
-    <w:p>
-      <w:pPr>
-        <w:pStyle w:val="BodyText"/>
-      </w:pPr>
-      <w:r>
-        <w:t xml:space="preserve">Vishnu, S., Tengli, M. B., Ramadas, S., Sathyan, A. R., &amp; Bhatt, A. (2024). Bridging the divide: Assessing digital infrastructure for higher education online learning.</w:t>
-      </w:r>
-      <w:r>
-        <w:t xml:space="preserve"> </w:t>
-      </w:r>
-      <w:r>
-        <w:rPr>
-          <w:iCs/>
-          <w:i/>
-        </w:rPr>
-        <w:t xml:space="preserve">TechTrends, 68</w:t>
-      </w:r>
-      <w:r>
-        <w:t xml:space="preserve">(6), 1107-1116. https://doi.org/10.1007/s11528-024-00997-4</w:t>
-      </w:r>
-    </w:p>
-    <w:p>
-      <w:pPr>
-        <w:pStyle w:val="BodyText"/>
-      </w:pPr>
-      <w:r>
-        <w:t xml:space="preserve">Warschauer, M. (2003).</w:t>
-      </w:r>
-      <w:r>
-        <w:t xml:space="preserve"> </w:t>
-      </w:r>
-      <w:r>
-        <w:rPr>
-          <w:iCs/>
-          <w:i/>
-        </w:rPr>
-        <w:t xml:space="preserve">Technology and social inclusion: Rethinking the digital divide</w:t>
-      </w:r>
-      <w:r>
-        <w:t xml:space="preserve">. MIT Press.</w:t>
-      </w:r>
-    </w:p>
-    <w:p>
-      <w:pPr>
-        <w:pStyle w:val="BodyText"/>
-      </w:pPr>
-      <w:r>
-        <w:t xml:space="preserve">Wen, X., &amp; Liu, F. (2025). Emotional dynamics of advanced Chinese as a second language learners: A Q methodology study.</w:t>
-      </w:r>
-      <w:r>
-        <w:t xml:space="preserve"> </w:t>
-      </w:r>
-      <w:r>
-        <w:rPr>
-          <w:iCs/>
-          <w:i/>
-        </w:rPr>
-        <w:t xml:space="preserve">Language, Culture and Curriculum, 38</w:t>
-      </w:r>
-      <w:r>
-        <w:t xml:space="preserve">(3), 380-400. https://doi.org/10.1080/07908318.2025.2486449</w:t>
-      </w:r>
-    </w:p>
-    <w:p>
-      <w:pPr>
-        <w:pStyle w:val="BodyText"/>
-      </w:pPr>
-      <w:r>
-        <w:t xml:space="preserve">White, C. (2006). Distance learning of foreign languages.</w:t>
-      </w:r>
-      <w:r>
-        <w:t xml:space="preserve"> </w:t>
-      </w:r>
-      <w:r>
-        <w:rPr>
-          <w:iCs/>
-          <w:i/>
-        </w:rPr>
-        <w:t xml:space="preserve">Language Teaching, 39</w:t>
-      </w:r>
-      <w:r>
-        <w:t xml:space="preserve">(4), 247-264. https://doi.org/10.1017/S0261444806003727</w:t>
-      </w:r>
-    </w:p>
-    <w:p>
-      <w:pPr>
-        <w:pStyle w:val="BodyText"/>
-      </w:pPr>
-      <w:r>
-        <w:t xml:space="preserve">Xu, B. (2024). Technology integration into Chinese as a foreign language learning in higher education: An integrated bibliometric analysis and systematic review (2000–2024).</w:t>
-      </w:r>
-      <w:r>
-        <w:t xml:space="preserve"> </w:t>
-      </w:r>
-      <w:r>
-        <w:rPr>
-          <w:iCs/>
-          <w:i/>
-        </w:rPr>
-        <w:t xml:space="preserve">Language Teaching Research</w:t>
-      </w:r>
-      <w:r>
         <w:t xml:space="preserve">. Advance online publication. https://doi.org/10.1177/13621688241277911</w:t>
       </w:r>
     </w:p>
@@ -3746,71 +2583,8 @@
         <w:t xml:space="preserve">(S1), 45-60. https://doi.org/10.32674/jis.v12iS1.4607</w:t>
       </w:r>
     </w:p>
-    <w:p>
-      <w:pPr>
-        <w:pStyle w:val="BodyText"/>
-      </w:pPr>
-      <w:r>
-        <w:t xml:space="preserve">Zhang, M., &amp; Liu, Q. (2023). Synchronous and asynchronous online collaborative writing: A study on Chinese language learners.</w:t>
-      </w:r>
-      <w:r>
-        <w:t xml:space="preserve"> </w:t>
-      </w:r>
-      <w:r>
-        <w:rPr>
-          <w:iCs/>
-          <w:i/>
-        </w:rPr>
-        <w:t xml:space="preserve">Foreign Language Annals, 56</w:t>
-      </w:r>
-      <w:r>
-        <w:t xml:space="preserve">(3), 740-763. https://doi.org/10.1111/flan.12704</w:t>
-      </w:r>
-    </w:p>
-    <w:p>
-      <w:pPr>
-        <w:pStyle w:val="BodyText"/>
-      </w:pPr>
-      <w:r>
-        <w:t xml:space="preserve">Zhang, Q., &amp; Osborne, C. (2026). Readiness for digital transformation in Chinese as a foreign language education: A semi-systematic review.</w:t>
-      </w:r>
-      <w:r>
-        <w:t xml:space="preserve"> </w:t>
-      </w:r>
-      <w:r>
-        <w:rPr>
-          <w:iCs/>
-          <w:i/>
-        </w:rPr>
-        <w:t xml:space="preserve">Chinese as a Second Language Research, 15</w:t>
-      </w:r>
-      <w:r>
-        <w:t xml:space="preserve">(1), 11-43. https://doi.org/10.1515/caslar-2026-2002</w:t>
-      </w:r>
-    </w:p>
-    <w:p>
-      <w:pPr>
-        <w:pStyle w:val="BodyText"/>
-      </w:pPr>
-      <w:r>
-        <w:t xml:space="preserve">Zhang, W., Wang, Y., Yang, L., &amp; Wang, C. (2020). Suspending classes without stopping learning: China’s education emergency management policy in the COVID-19 outbreak.</w:t>
-      </w:r>
-      <w:r>
-        <w:t xml:space="preserve"> </w:t>
-      </w:r>
-      <w:r>
-        <w:rPr>
-          <w:iCs/>
-          <w:i/>
-        </w:rPr>
-        <w:t xml:space="preserve">Journal of Risk and Financial Management, 13</w:t>
-      </w:r>
-      <w:r>
-        <w:t xml:space="preserve">(3), 55. https://doi.org/10.3390/jrfm13030055</w:t>
-      </w:r>
-    </w:p>
-    <w:bookmarkEnd w:id="47"/>
-    <w:bookmarkEnd w:id="48"/>
+    <w:bookmarkEnd w:id="28"/>
+    <w:bookmarkEnd w:id="29"/>
     <w:sectPr>
       <w:pgSz w:h="15840" w:w="12240"/>
       <w:pgMar w:bottom="1440" w:footer="720" w:gutter="0" w:header="720" w:left="1440" w:right="1440" w:top="1440"/>

</xml_diff>

<commit_message>
Stop stacking several sources in one parenthesis
Cite one paper per claim in the introduction and discussion.

Co-authored-by: kristinehina23-rgb <kristinehina23-rgb@users.noreply.github.com>
</commit_message>
<xml_diff>
--- a/papers/q1-masters-covid/word/manuscript.docx
+++ b/papers/q1-masters-covid/word/manuscript.docx
@@ -79,7 +79,7 @@
         <w:pStyle w:val="FirstParagraph"/>
       </w:pPr>
       <w:r>
-        <w:t xml:space="preserve">When Chinese teaching moved online, many programs kept the sending class’s timetable and classroom tasks. Task guides still assume that students can join a live session (Gacs et al., 2020; González-Lloret, 2020; Hodges et al., 2020; Payne, 2020). That assumption often fails. Studies of online language teaching, including online Chinese, have already noted unstable networks, platforms that are hard to open, thinner talk, and strain (Li &amp; Li, 2024; Moser et al., 2021; Qi, 2025; Russell, 2020; Tao &amp; Gao, 2022). A device in the house is not enough if there is no power, little speed, or no usable application (Ali, 2020; Beaunoyer et al., 2020; Guo &amp; Wan, 2022; Warschauer, 2003). Distance language learning had already asked whether a remote class was even feasible (White, 2006). When those conditions do not hold, the content may still be sound, but the class is closed.</w:t>
+        <w:t xml:space="preserve">When Chinese teaching moved online, many programs kept the sending class’s timetable and classroom tasks. Hodges et al. (2020) called that emergency remote teaching, not a planned online course. Gacs, Goertler, and Spasova (2020) made the same point for language classes: a live hour still assumes that students can join. That assumption often fails. Tao and Gao (2022) read the emergency literature as a story of technical disruption and thinner talk. A device in the house is not enough if there is no power, little speed, or no usable application (Warschauer, 2003). When those conditions do not hold, the content may still be sound, but the class is closed.</w:t>
       </w:r>
     </w:p>
     <w:p>
@@ -87,7 +87,7 @@
         <w:pStyle w:val="BodyText"/>
       </w:pPr>
       <w:r>
-        <w:t xml:space="preserve">Those difficulties are often named. They are less often counted from the learner’s side. Emergency papers used them as a backdrop for teacher workload or sending-side adaptation (MacIntyre et al., 2020; Xu et al., 2022). Yu and Xu (2022) surveyed 153 South Asian students in China on online learning during the pandemic. They reported generally positive learning status, and they linked autonomous learning to how students judged the effect. Their form did not count household power, network speed, or whether named applications were marked unusable. Xu et al. (2022) show how character teaching was adapted on the sending side. Jin et al. (2023) report faculty views of pandemic online teaching. Later reviews still say more about tools than about household access (Li &amp; Li, 2024; Xu, 2024). Owning a device is not the same as being able to take part (Helsper, 2021; van Dijk, 2020). The home, the power supply, and the application are part of the setting in which language work was asked to happen (Guerrettaz et al., 2021; van Lier, 2004).</w:t>
+        <w:t xml:space="preserve">Those difficulties are often named. They are less often counted from the learner’s side. Xu, Jin, Deifell, and Angus (2022) showed how character teaching was adapted on the sending side. Yu and Xu (2022) surveyed 153 South Asian students in China on online learning during the pandemic. They reported generally positive learning status, and they linked autonomous learning to how students judged the effect. Their form did not count household power, network speed, or whether named applications were marked unusable. Jin, Xu, and Deifell (2023) reported what faculty thought about pandemic online teaching. Li and Li (2024) still say more about tools than about household access.</w:t>
       </w:r>
     </w:p>
     <w:p>
@@ -2019,7 +2019,7 @@
         <w:pStyle w:val="FirstParagraph"/>
       </w:pPr>
       <w:r>
-        <w:t xml:space="preserve">The 38 rows show home trouble, unused platforms, and stress sitting together in this sample. That list matches difficulties the field has already named (Tao &amp; Gao, 2022; Xu et al., 2022). Yu and Xu (2022) found overall positive online learning status in a larger South Asian sample. Their questionnaire and this form are not the same sample and are not read here as a single test. The present data add counts of power, quiet, speed, and named tools from February 2022.</w:t>
+        <w:t xml:space="preserve">The 38 rows show home trouble, unused platforms, and stress sitting together in this sample. Tao and Gao (2022) had already named networks, platforms, and strain. Yu and Xu (2022) found overall positive online learning status in a larger South Asian sample. Their questionnaire and this form are not the same sample and are not read here as a single test. The present data add counts of power, quiet, speed, and named tools from February 2022.</w:t>
       </w:r>
     </w:p>
     <w:p>
@@ -2043,7 +2043,7 @@
         <w:pStyle w:val="BodyText"/>
       </w:pPr>
       <w:r>
-        <w:t xml:space="preserve">The sample is 38 self-selected rows from four days in February 2022. Recruitment is unknown. Enrollment was not verified. The instrument was not piloted. Several platform columns were never asked. There is no ethics-committee number for the original collection. The results are not a picture of current hybrid teaching (Stockwell &amp; Wang, 2023).</w:t>
+        <w:t xml:space="preserve">The sample is 38 self-selected rows from four days in February 2022. Recruitment is unknown. Enrollment was not verified. The instrument was not piloted. Several platform columns were never asked. There is no ethics-committee number for the original collection. The results are not a picture of current hybrid teaching.</w:t>
       </w:r>
     </w:p>
     <w:p>
@@ -2069,48 +2069,6 @@
         <w:pStyle w:val="FirstParagraph"/>
       </w:pPr>
       <w:r>
-        <w:t xml:space="preserve">Ali, W. (2020). Online and remote learning in higher education institutes: A necessity in light of COVID-19 pandemic.</w:t>
-      </w:r>
-      <w:r>
-        <w:t xml:space="preserve"> </w:t>
-      </w:r>
-      <w:r>
-        <w:rPr>
-          <w:iCs/>
-          <w:i/>
-        </w:rPr>
-        <w:t xml:space="preserve">Higher Education Studies, 10</w:t>
-      </w:r>
-      <w:r>
-        <w:t xml:space="preserve">(3), 16-25. https://doi.org/10.5539/hes.v10n3p16</w:t>
-      </w:r>
-    </w:p>
-    <w:p>
-      <w:pPr>
-        <w:pStyle w:val="BodyText"/>
-      </w:pPr>
-      <w:r>
-        <w:t xml:space="preserve">Beaunoyer, E., Dupéré, S., &amp; Guitton, M. J. (2020). COVID-19 and digital inequalities: Reciprocal impacts and mitigation strategies.</w:t>
-      </w:r>
-      <w:r>
-        <w:t xml:space="preserve"> </w:t>
-      </w:r>
-      <w:r>
-        <w:rPr>
-          <w:iCs/>
-          <w:i/>
-        </w:rPr>
-        <w:t xml:space="preserve">Computers in Human Behavior, 111</w:t>
-      </w:r>
-      <w:r>
-        <w:t xml:space="preserve">, Article 106424. https://doi.org/10.1016/j.chb.2020.106424</w:t>
-      </w:r>
-    </w:p>
-    <w:p>
-      <w:pPr>
-        <w:pStyle w:val="BodyText"/>
-      </w:pPr>
-      <w:r>
         <w:t xml:space="preserve">Gacs, A., Goertler, S., &amp; Spasova, S. (2020). Planned online language education versus crisis-prompted online language teaching: Lessons for the future.</w:t>
       </w:r>
       <w:r>
@@ -2125,90 +2083,6 @@
       </w:r>
       <w:r>
         <w:t xml:space="preserve">(2), 380-392. https://doi.org/10.1111/flan.12460</w:t>
-      </w:r>
-    </w:p>
-    <w:p>
-      <w:pPr>
-        <w:pStyle w:val="BodyText"/>
-      </w:pPr>
-      <w:r>
-        <w:t xml:space="preserve">González-Lloret, M. (2020). Collaborative tasks for online language teaching.</w:t>
-      </w:r>
-      <w:r>
-        <w:t xml:space="preserve"> </w:t>
-      </w:r>
-      <w:r>
-        <w:rPr>
-          <w:iCs/>
-          <w:i/>
-        </w:rPr>
-        <w:t xml:space="preserve">Foreign Language Annals, 53</w:t>
-      </w:r>
-      <w:r>
-        <w:t xml:space="preserve">(2), 260-269. https://doi.org/10.1111/flan.12466</w:t>
-      </w:r>
-    </w:p>
-    <w:p>
-      <w:pPr>
-        <w:pStyle w:val="BodyText"/>
-      </w:pPr>
-      <w:r>
-        <w:t xml:space="preserve">Guerrettaz, A. M., Engman, M. M., &amp; Matsumoto, Y. (2021). Empirically defining language learning and teaching materials in use through sociomaterial perspectives.</w:t>
-      </w:r>
-      <w:r>
-        <w:t xml:space="preserve"> </w:t>
-      </w:r>
-      <w:r>
-        <w:rPr>
-          <w:iCs/>
-          <w:i/>
-        </w:rPr>
-        <w:t xml:space="preserve">The Modern Language Journal, 105</w:t>
-      </w:r>
-      <w:r>
-        <w:t xml:space="preserve">(S1), 3-20. https://doi.org/10.1111/modl.12691</w:t>
-      </w:r>
-    </w:p>
-    <w:p>
-      <w:pPr>
-        <w:pStyle w:val="BodyText"/>
-      </w:pPr>
-      <w:r>
-        <w:t xml:space="preserve">Guo, C., &amp; Wan, B. (2022). The digital divide in online learning in China during the COVID-19 pandemic.</w:t>
-      </w:r>
-      <w:r>
-        <w:t xml:space="preserve"> </w:t>
-      </w:r>
-      <w:r>
-        <w:rPr>
-          <w:iCs/>
-          <w:i/>
-        </w:rPr>
-        <w:t xml:space="preserve">Technology in Society, 71</w:t>
-      </w:r>
-      <w:r>
-        <w:t xml:space="preserve">, Article 102122. https://doi.org/10.1016/j.techsoc.2022.102122</w:t>
-      </w:r>
-    </w:p>
-    <w:p>
-      <w:pPr>
-        <w:pStyle w:val="BodyText"/>
-      </w:pPr>
-      <w:r>
-        <w:t xml:space="preserve">Helsper, E. (2021).</w:t>
-      </w:r>
-      <w:r>
-        <w:t xml:space="preserve"> </w:t>
-      </w:r>
-      <w:r>
-        <w:rPr>
-          <w:iCs/>
-          <w:i/>
-        </w:rPr>
-        <w:t xml:space="preserve">The digital disconnect: The social causes and consequences of digital inequalities</w:t>
-      </w:r>
-      <w:r>
-        <w:t xml:space="preserve">. SAGE.</w:t>
       </w:r>
     </w:p>
     <w:p>
@@ -2279,147 +2153,6 @@
         <w:pStyle w:val="BodyText"/>
       </w:pPr>
       <w:r>
-        <w:t xml:space="preserve">MacIntyre, P. D., Gregersen, T., &amp; Mercer, S. (2020). Language teachers’ coping strategies during the Covid-19 conversion to online teaching: Correlations with stress, wellbeing and negative emotions.</w:t>
-      </w:r>
-      <w:r>
-        <w:t xml:space="preserve"> </w:t>
-      </w:r>
-      <w:r>
-        <w:rPr>
-          <w:iCs/>
-          <w:i/>
-        </w:rPr>
-        <w:t xml:space="preserve">System, 94</w:t>
-      </w:r>
-      <w:r>
-        <w:t xml:space="preserve">, Article 102352. https://doi.org/10.1016/j.system.2020.102352</w:t>
-      </w:r>
-    </w:p>
-    <w:p>
-      <w:pPr>
-        <w:pStyle w:val="BodyText"/>
-      </w:pPr>
-      <w:r>
-        <w:t xml:space="preserve">Moser, K. M., Wei, T., &amp; Brenner, D. (2021). Remote teaching during COVID-19: Implications from a national survey of language educators.</w:t>
-      </w:r>
-      <w:r>
-        <w:t xml:space="preserve"> </w:t>
-      </w:r>
-      <w:r>
-        <w:rPr>
-          <w:iCs/>
-          <w:i/>
-        </w:rPr>
-        <w:t xml:space="preserve">System, 97</w:t>
-      </w:r>
-      <w:r>
-        <w:t xml:space="preserve">, Article 102431. https://doi.org/10.1016/j.system.2020.102431</w:t>
-      </w:r>
-    </w:p>
-    <w:p>
-      <w:pPr>
-        <w:pStyle w:val="BodyText"/>
-      </w:pPr>
-      <w:r>
-        <w:t xml:space="preserve">Payne, J. S. (2020). Developing L2 productive language skills online and the strategic use of instructional tools.</w:t>
-      </w:r>
-      <w:r>
-        <w:t xml:space="preserve"> </w:t>
-      </w:r>
-      <w:r>
-        <w:rPr>
-          <w:iCs/>
-          <w:i/>
-        </w:rPr>
-        <w:t xml:space="preserve">Foreign Language Annals, 53</w:t>
-      </w:r>
-      <w:r>
-        <w:t xml:space="preserve">(2), 243-249. https://doi.org/10.1111/flan.12457</w:t>
-      </w:r>
-    </w:p>
-    <w:p>
-      <w:pPr>
-        <w:pStyle w:val="BodyText"/>
-      </w:pPr>
-      <w:r>
-        <w:t xml:space="preserve">Qi, X. (2025).</w:t>
-      </w:r>
-      <w:r>
-        <w:t xml:space="preserve"> </w:t>
-      </w:r>
-      <w:r>
-        <w:t xml:space="preserve">‘</w:t>
-      </w:r>
-      <w:r>
-        <w:t xml:space="preserve">My speech becomes just a voice, a picture</w:t>
-      </w:r>
-      <w:r>
-        <w:t xml:space="preserve">’</w:t>
-      </w:r>
-      <w:r>
-        <w:t xml:space="preserve">: Exploring language anxiety in Chinese as a second language learning in online environments.</w:t>
-      </w:r>
-      <w:r>
-        <w:t xml:space="preserve"> </w:t>
-      </w:r>
-      <w:r>
-        <w:rPr>
-          <w:iCs/>
-          <w:i/>
-        </w:rPr>
-        <w:t xml:space="preserve">Language Teaching Research</w:t>
-      </w:r>
-      <w:r>
-        <w:t xml:space="preserve">. Advance online publication. https://doi.org/10.1177/13621688251387320</w:t>
-      </w:r>
-    </w:p>
-    <w:p>
-      <w:pPr>
-        <w:pStyle w:val="BodyText"/>
-      </w:pPr>
-      <w:r>
-        <w:t xml:space="preserve">Russell, V. (2020). Language anxiety and the online learner.</w:t>
-      </w:r>
-      <w:r>
-        <w:t xml:space="preserve"> </w:t>
-      </w:r>
-      <w:r>
-        <w:rPr>
-          <w:iCs/>
-          <w:i/>
-        </w:rPr>
-        <w:t xml:space="preserve">Foreign Language Annals, 53</w:t>
-      </w:r>
-      <w:r>
-        <w:t xml:space="preserve">(2), 338-352. https://doi.org/10.1111/flan.12461</w:t>
-      </w:r>
-    </w:p>
-    <w:p>
-      <w:pPr>
-        <w:pStyle w:val="BodyText"/>
-      </w:pPr>
-      <w:r>
-        <w:t xml:space="preserve">Stockwell, G., &amp; Wang, Y. (2023). Exploring the challenges of technology in language teaching in the aftermath of the pandemic.</w:t>
-      </w:r>
-      <w:r>
-        <w:t xml:space="preserve"> </w:t>
-      </w:r>
-      <w:r>
-        <w:rPr>
-          <w:iCs/>
-          <w:i/>
-        </w:rPr>
-        <w:t xml:space="preserve">RELC Journal, 54</w:t>
-      </w:r>
-      <w:r>
-        <w:t xml:space="preserve">(2), 474-482. https://doi.org/10.1177/00336882231168438</w:t>
-      </w:r>
-    </w:p>
-    <w:p>
-      <w:pPr>
-        <w:pStyle w:val="BodyText"/>
-      </w:pPr>
-      <w:r>
         <w:t xml:space="preserve">Tao, J., &amp; Gao, X. (2022). Teaching and learning languages online: Challenges and responses.</w:t>
       </w:r>
       <w:r>
@@ -2441,48 +2174,6 @@
         <w:pStyle w:val="BodyText"/>
       </w:pPr>
       <w:r>
-        <w:t xml:space="preserve">van Dijk, J. (2020).</w:t>
-      </w:r>
-      <w:r>
-        <w:t xml:space="preserve"> </w:t>
-      </w:r>
-      <w:r>
-        <w:rPr>
-          <w:iCs/>
-          <w:i/>
-        </w:rPr>
-        <w:t xml:space="preserve">The digital divide</w:t>
-      </w:r>
-      <w:r>
-        <w:t xml:space="preserve">. Polity.</w:t>
-      </w:r>
-    </w:p>
-    <w:p>
-      <w:pPr>
-        <w:pStyle w:val="BodyText"/>
-      </w:pPr>
-      <w:r>
-        <w:t xml:space="preserve">van Lier, L. (2004).</w:t>
-      </w:r>
-      <w:r>
-        <w:t xml:space="preserve"> </w:t>
-      </w:r>
-      <w:r>
-        <w:rPr>
-          <w:iCs/>
-          <w:i/>
-        </w:rPr>
-        <w:t xml:space="preserve">The ecology and semiotics of language learning: A sociocultural perspective</w:t>
-      </w:r>
-      <w:r>
-        <w:t xml:space="preserve">. Kluwer.</w:t>
-      </w:r>
-    </w:p>
-    <w:p>
-      <w:pPr>
-        <w:pStyle w:val="BodyText"/>
-      </w:pPr>
-      <w:r>
         <w:t xml:space="preserve">Warschauer, M. (2003).</w:t>
       </w:r>
       <w:r>
@@ -2497,48 +2188,6 @@
       </w:r>
       <w:r>
         <w:t xml:space="preserve">. MIT Press.</w:t>
-      </w:r>
-    </w:p>
-    <w:p>
-      <w:pPr>
-        <w:pStyle w:val="BodyText"/>
-      </w:pPr>
-      <w:r>
-        <w:t xml:space="preserve">White, C. (2006). Distance learning of foreign languages.</w:t>
-      </w:r>
-      <w:r>
-        <w:t xml:space="preserve"> </w:t>
-      </w:r>
-      <w:r>
-        <w:rPr>
-          <w:iCs/>
-          <w:i/>
-        </w:rPr>
-        <w:t xml:space="preserve">Language Teaching, 39</w:t>
-      </w:r>
-      <w:r>
-        <w:t xml:space="preserve">(4), 247-264. https://doi.org/10.1017/S0261444806003727</w:t>
-      </w:r>
-    </w:p>
-    <w:p>
-      <w:pPr>
-        <w:pStyle w:val="BodyText"/>
-      </w:pPr>
-      <w:r>
-        <w:t xml:space="preserve">Xu, B. (2024). Technology integration into Chinese as a foreign language learning in higher education: An integrated bibliometric analysis and systematic review (2000–2024).</w:t>
-      </w:r>
-      <w:r>
-        <w:t xml:space="preserve"> </w:t>
-      </w:r>
-      <w:r>
-        <w:rPr>
-          <w:iCs/>
-          <w:i/>
-        </w:rPr>
-        <w:t xml:space="preserve">Language Teaching Research</w:t>
-      </w:r>
-      <w:r>
-        <w:t xml:space="preserve">. Advance online publication. https://doi.org/10.1177/13621688241277911</w:t>
       </w:r>
     </w:p>
     <w:p>

</xml_diff>